<commit_message>
Deploying to gh-pages from @ Morrison-Lab/psw@358f54c8a147ff6cf8d4e2d2c9566b23640ac547 🚀
</commit_message>
<xml_diff>
--- a/chapters/teaching.docx
+++ b/chapters/teaching.docx
@@ -15,7 +15,7 @@
         <w:pStyle w:val="Date"/>
       </w:pPr>
       <w:r>
-        <w:t xml:space="preserve">Last modified: 2026-10-06 23:46:06 (UTC)</w:t>
+        <w:t xml:space="preserve">Last modified: 2026-10-08 05:04:00 (UTC)</w:t>
       </w:r>
     </w:p>
     <w:tbl>
@@ -1659,6 +1659,144 @@
       </w:r>
       <w:r>
         <w:t xml:space="preserve">div.</w:t>
+      </w:r>
+    </w:p>
+    <w:p>
+      <w:pPr>
+        <w:pStyle w:val="Compact"/>
+        <w:numPr>
+          <w:ilvl w:val="0"/>
+          <w:numId w:val="1005"/>
+        </w:numPr>
+      </w:pPr>
+      <w:r>
+        <w:t xml:space="preserve">Put on a slide only what you want the audience to look at.</w:t>
+      </w:r>
+      <w:r>
+        <w:t xml:space="preserve"> </w:t>
+      </w:r>
+      <w:r>
+        <w:t xml:space="preserve">Put an example in an</w:t>
+      </w:r>
+      <w:r>
+        <w:t xml:space="preserve"> </w:t>
+      </w:r>
+      <w:r>
+        <w:rPr>
+          <w:rStyle w:val="VerbatimChar"/>
+        </w:rPr>
+        <w:t xml:space="preserve">#exm-</w:t>
+      </w:r>
+      <w:r>
+        <w:t xml:space="preserve"> </w:t>
+      </w:r>
+      <w:r>
+        <w:t xml:space="preserve">div and short commentary in a</w:t>
+      </w:r>
+      <w:r>
+        <w:t xml:space="preserve"> </w:t>
+      </w:r>
+      <w:r>
+        <w:rPr>
+          <w:rStyle w:val="VerbatimChar"/>
+        </w:rPr>
+        <w:t xml:space="preserve">#rem-</w:t>
+      </w:r>
+      <w:r>
+        <w:t xml:space="preserve"> </w:t>
+      </w:r>
+      <w:r>
+        <w:t xml:space="preserve">div,</w:t>
+      </w:r>
+      <w:r>
+        <w:t xml:space="preserve"> </w:t>
+      </w:r>
+      <w:r>
+        <w:t xml:space="preserve">because a</w:t>
+      </w:r>
+      <w:r>
+        <w:t xml:space="preserve"> </w:t>
+      </w:r>
+      <w:r>
+        <w:rPr>
+          <w:rStyle w:val="VerbatimChar"/>
+        </w:rPr>
+        <w:t xml:space="preserve">::: notes</w:t>
+      </w:r>
+      <w:r>
+        <w:t xml:space="preserve"> </w:t>
+      </w:r>
+      <w:r>
+        <w:t xml:space="preserve">div is plain text without a box on the web page.</w:t>
+      </w:r>
+    </w:p>
+    <w:p>
+      <w:pPr>
+        <w:pStyle w:val="Compact"/>
+        <w:numPr>
+          <w:ilvl w:val="0"/>
+          <w:numId w:val="1005"/>
+        </w:numPr>
+      </w:pPr>
+      <w:r>
+        <w:t xml:space="preserve">Put a long paragraph of commentary in a remark that is also speaker notes:</w:t>
+      </w:r>
+      <w:r>
+        <w:t xml:space="preserve"> </w:t>
+      </w:r>
+      <w:r>
+        <w:rPr>
+          <w:rStyle w:val="VerbatimChar"/>
+        </w:rPr>
+        <w:t xml:space="preserve">::: {#rem-name .remark .notes}</w:t>
+      </w:r>
+      <w:r>
+        <w:t xml:space="preserve">.</w:t>
+      </w:r>
+      <w:r>
+        <w:t xml:space="preserve"> </w:t>
+      </w:r>
+      <w:r>
+        <w:t xml:space="preserve">Reveal.js shows it only in speaker view, so the audience does not have to read it,</w:t>
+      </w:r>
+      <w:r>
+        <w:t xml:space="preserve"> </w:t>
+      </w:r>
+      <w:r>
+        <w:t xml:space="preserve">and the web page shows it as a boxed remark.</w:t>
+      </w:r>
+      <w:r>
+        <w:t xml:space="preserve"> </w:t>
+      </w:r>
+      <w:r>
+        <w:t xml:space="preserve">Readers who did not attend the lecture use the web page,</w:t>
+      </w:r>
+      <w:r>
+        <w:t xml:space="preserve"> </w:t>
+      </w:r>
+      <w:r>
+        <w:t xml:space="preserve">so nothing is lost, and nothing is said twice.</w:t>
+      </w:r>
+      <w:r>
+        <w:t xml:space="preserve"> </w:t>
+      </w:r>
+      <w:r>
+        <w:t xml:space="preserve">Give a long paragraph a separate short</w:t>
+      </w:r>
+      <w:r>
+        <w:t xml:space="preserve"> </w:t>
+      </w:r>
+      <w:r>
+        <w:rPr>
+          <w:rStyle w:val="VerbatimChar"/>
+        </w:rPr>
+        <w:t xml:space="preserve">#rem-</w:t>
+      </w:r>
+      <w:r>
+        <w:t xml:space="preserve"> </w:t>
+      </w:r>
+      <w:r>
+        <w:t xml:space="preserve">div only when the slide needs a takeaway to look at.</w:t>
       </w:r>
     </w:p>
     <w:p>

</xml_diff>

<commit_message>
Deploying to gh-pages from @ Morrison-Lab/psw@6d419f9c2ee7c4328fe4bb6cf5da1fffe7d39a10 🚀
</commit_message>
<xml_diff>
--- a/chapters/teaching.docx
+++ b/chapters/teaching.docx
@@ -15,7 +15,7 @@
         <w:pStyle w:val="Date"/>
       </w:pPr>
       <w:r>
-        <w:t xml:space="preserve">Last modified: 2026-10-08 05:04:00 (UTC)</w:t>
+        <w:t xml:space="preserve">Last modified: 2026-10-08 08:34:17 (UTC)</w:t>
       </w:r>
     </w:p>
     <w:tbl>
@@ -1424,13 +1424,13 @@
       </w:r>
     </w:p>
     <w:bookmarkEnd w:id="19"/>
-    <w:bookmarkStart w:id="20" w:name="make-figures-accessible"/>
+    <w:bookmarkStart w:id="20" w:name="show-each-idea-applied-and-in-a-figure"/>
     <w:p>
       <w:pPr>
         <w:pStyle w:val="Heading2"/>
       </w:pPr>
       <w:r>
-        <w:t xml:space="preserve">7 Make figures accessible</w:t>
+        <w:t xml:space="preserve">7 Show each idea applied and in a figure</w:t>
       </w:r>
     </w:p>
     <w:p>
@@ -1442,22 +1442,19 @@
         </w:numPr>
       </w:pPr>
       <w:r>
-        <w:t xml:space="preserve">Wrap each figure, including an interactive one, in a</w:t>
-      </w:r>
-      <w:r>
-        <w:t xml:space="preserve"> </w:t>
-      </w:r>
-      <w:r>
-        <w:rPr>
-          <w:rStyle w:val="VerbatimChar"/>
-        </w:rPr>
-        <w:t xml:space="preserve">#fig-</w:t>
-      </w:r>
-      <w:r>
-        <w:t xml:space="preserve"> </w:t>
-      </w:r>
-      <w:r>
-        <w:t xml:space="preserve">div with a caption.</w:t>
+        <w:t xml:space="preserve">Give every definition, method and result at least one applied example</w:t>
+      </w:r>
+      <w:r>
+        <w:t xml:space="preserve"> </w:t>
+      </w:r>
+      <w:r>
+        <w:t xml:space="preserve">that computes it on real data,</w:t>
+      </w:r>
+      <w:r>
+        <w:t xml:space="preserve"> </w:t>
+      </w:r>
+      <w:r>
+        <w:t xml:space="preserve">so the reader sees what the idea does before or beside the algebra.</w:t>
       </w:r>
     </w:p>
     <w:p>
@@ -1469,25 +1466,19 @@
         </w:numPr>
       </w:pPr>
       <w:r>
-        <w:t xml:space="preserve">Give every plot alt text.</w:t>
-      </w:r>
-      <w:r>
-        <w:t xml:space="preserve"> </w:t>
-      </w:r>
-      <w:r>
-        <w:t xml:space="preserve">For Observable Plot, set</w:t>
-      </w:r>
-      <w:r>
-        <w:t xml:space="preserve"> </w:t>
-      </w:r>
-      <w:r>
-        <w:rPr>
-          <w:rStyle w:val="VerbatimChar"/>
-        </w:rPr>
-        <w:t xml:space="preserve">ariaLabel</w:t>
-      </w:r>
-      <w:r>
-        <w:t xml:space="preserve">.</w:t>
+        <w:t xml:space="preserve">Give every topic at least one figure that shows the idea,</w:t>
+      </w:r>
+      <w:r>
+        <w:t xml:space="preserve"> </w:t>
+      </w:r>
+      <w:r>
+        <w:t xml:space="preserve">such as the data with a fitted curve, a distribution, or a diagram of the procedure.</w:t>
+      </w:r>
+      <w:r>
+        <w:t xml:space="preserve"> </w:t>
+      </w:r>
+      <w:r>
+        <w:t xml:space="preserve">A page of definitions with no figure and no data is incomplete.</w:t>
       </w:r>
     </w:p>
     <w:p>
@@ -1499,34 +1490,13 @@
         </w:numPr>
       </w:pPr>
       <w:r>
-        <w:t xml:space="preserve">Show the code that makes each figure, and let readers fold it away.</w:t>
-      </w:r>
-      <w:r>
-        <w:t xml:space="preserve"> </w:t>
-      </w:r>
-      <w:r>
-        <w:t xml:space="preserve">Code folding does nothing for a cell that does not echo its code,</w:t>
-      </w:r>
-      <w:r>
-        <w:t xml:space="preserve"> </w:t>
-      </w:r>
-      <w:r>
-        <w:t xml:space="preserve">so do not set</w:t>
-      </w:r>
-      <w:r>
-        <w:t xml:space="preserve"> </w:t>
-      </w:r>
-      <w:r>
-        <w:rPr>
-          <w:rStyle w:val="VerbatimChar"/>
-        </w:rPr>
-        <w:t xml:space="preserve">echo: false</w:t>
-      </w:r>
-      <w:r>
-        <w:t xml:space="preserve"> </w:t>
-      </w:r>
-      <w:r>
-        <w:t xml:space="preserve">on a cell you want students to read.</w:t>
+        <w:t xml:space="preserve">Prerequisite notes follow the same rule as course lectures.</w:t>
+      </w:r>
+      <w:r>
+        <w:t xml:space="preserve"> </w:t>
+      </w:r>
+      <w:r>
+        <w:t xml:space="preserve">A prerequisite page that is only definitions and algebra needs an applied example and a figure.</w:t>
       </w:r>
     </w:p>
     <w:p>
@@ -1538,35 +1508,17 @@
         </w:numPr>
       </w:pPr>
       <w:r>
-        <w:t xml:space="preserve">Do not cross-reference an interactive figure from prose,</w:t>
-      </w:r>
-      <w:r>
-        <w:t xml:space="preserve"> </w:t>
-      </w:r>
-      <w:r>
-        <w:t xml:space="preserve">because the PDF format renders no figure for it,</w:t>
-      </w:r>
-      <w:r>
-        <w:t xml:space="preserve"> </w:t>
-      </w:r>
-      <w:r>
-        <w:t xml:space="preserve">so the reference has no target there</w:t>
-      </w:r>
-      <w:r>
-        <w:t xml:space="preserve"> </w:t>
-      </w:r>
-      <w:r>
-        <w:t xml:space="preserve">(observed when rendering lecture notes to PDF).</w:t>
+        <w:t xml:space="preserve">Make each figure follow the accessibility rules below.</w:t>
       </w:r>
     </w:p>
     <w:bookmarkEnd w:id="20"/>
-    <w:bookmarkStart w:id="22" w:name="structure-slides-for-the-reader"/>
+    <w:bookmarkStart w:id="21" w:name="Xf27331f4c36c8d578e5fa29a37312484cc3343a"/>
     <w:p>
       <w:pPr>
         <w:pStyle w:val="Heading2"/>
       </w:pPr>
       <w:r>
-        <w:t xml:space="preserve">8 Structure slides for the reader</w:t>
+        <w:t xml:space="preserve">8 Write labs for both languages and any computer</w:t>
       </w:r>
     </w:p>
     <w:p>
@@ -1578,25 +1530,7 @@
         </w:numPr>
       </w:pPr>
       <w:r>
-        <w:t xml:space="preserve">Check the rendered slides, not only the web page.</w:t>
-      </w:r>
-      <w:r>
-        <w:t xml:space="preserve"> </w:t>
-      </w:r>
-      <w:r>
-        <w:t xml:space="preserve">Slides need the same boxes and colors on theorem-type and callout divs</w:t>
-      </w:r>
-      <w:r>
-        <w:t xml:space="preserve"> </w:t>
-      </w:r>
-      <w:r>
-        <w:t xml:space="preserve">that the web page has,</w:t>
-      </w:r>
-      <w:r>
-        <w:t xml:space="preserve"> </w:t>
-      </w:r>
-      <w:r>
-        <w:t xml:space="preserve">so a reader can see where a definition ends and the commentary begins.</w:t>
+        <w:t xml:space="preserve">Give labs and code exercises in both R and Python, side by side.</w:t>
       </w:r>
     </w:p>
     <w:p>
@@ -1608,6 +1542,206 @@
         </w:numPr>
       </w:pPr>
       <w:r>
+        <w:t xml:space="preserve">Do not assume that students own a laptop.</w:t>
+      </w:r>
+      <w:r>
+        <w:t xml:space="preserve"> </w:t>
+      </w:r>
+      <w:r>
+        <w:t xml:space="preserve">Assume only that they can use some computer,</w:t>
+      </w:r>
+      <w:r>
+        <w:t xml:space="preserve"> </w:t>
+      </w:r>
+      <w:r>
+        <w:t xml:space="preserve">so setup steps must work on a shared or hosted machine.</w:t>
+      </w:r>
+    </w:p>
+    <w:bookmarkEnd w:id="21"/>
+    <w:bookmarkStart w:id="22" w:name="make-figures-accessible"/>
+    <w:p>
+      <w:pPr>
+        <w:pStyle w:val="Heading2"/>
+      </w:pPr>
+      <w:r>
+        <w:t xml:space="preserve">9 Make figures accessible</w:t>
+      </w:r>
+    </w:p>
+    <w:p>
+      <w:pPr>
+        <w:pStyle w:val="Compact"/>
+        <w:numPr>
+          <w:ilvl w:val="0"/>
+          <w:numId w:val="1006"/>
+        </w:numPr>
+      </w:pPr>
+      <w:r>
+        <w:t xml:space="preserve">Wrap each figure, including an interactive one, in a</w:t>
+      </w:r>
+      <w:r>
+        <w:t xml:space="preserve"> </w:t>
+      </w:r>
+      <w:r>
+        <w:rPr>
+          <w:rStyle w:val="VerbatimChar"/>
+        </w:rPr>
+        <w:t xml:space="preserve">#fig-</w:t>
+      </w:r>
+      <w:r>
+        <w:t xml:space="preserve"> </w:t>
+      </w:r>
+      <w:r>
+        <w:t xml:space="preserve">div with a caption.</w:t>
+      </w:r>
+    </w:p>
+    <w:p>
+      <w:pPr>
+        <w:pStyle w:val="Compact"/>
+        <w:numPr>
+          <w:ilvl w:val="0"/>
+          <w:numId w:val="1006"/>
+        </w:numPr>
+      </w:pPr>
+      <w:r>
+        <w:t xml:space="preserve">Give every plot alt text.</w:t>
+      </w:r>
+      <w:r>
+        <w:t xml:space="preserve"> </w:t>
+      </w:r>
+      <w:r>
+        <w:t xml:space="preserve">For Observable Plot, set</w:t>
+      </w:r>
+      <w:r>
+        <w:t xml:space="preserve"> </w:t>
+      </w:r>
+      <w:r>
+        <w:rPr>
+          <w:rStyle w:val="VerbatimChar"/>
+        </w:rPr>
+        <w:t xml:space="preserve">ariaLabel</w:t>
+      </w:r>
+      <w:r>
+        <w:t xml:space="preserve">.</w:t>
+      </w:r>
+    </w:p>
+    <w:p>
+      <w:pPr>
+        <w:pStyle w:val="Compact"/>
+        <w:numPr>
+          <w:ilvl w:val="0"/>
+          <w:numId w:val="1006"/>
+        </w:numPr>
+      </w:pPr>
+      <w:r>
+        <w:t xml:space="preserve">Show the code that makes each figure, and let readers fold it away.</w:t>
+      </w:r>
+      <w:r>
+        <w:t xml:space="preserve"> </w:t>
+      </w:r>
+      <w:r>
+        <w:t xml:space="preserve">Code folding does nothing for a cell that does not echo its code,</w:t>
+      </w:r>
+      <w:r>
+        <w:t xml:space="preserve"> </w:t>
+      </w:r>
+      <w:r>
+        <w:t xml:space="preserve">so do not set</w:t>
+      </w:r>
+      <w:r>
+        <w:t xml:space="preserve"> </w:t>
+      </w:r>
+      <w:r>
+        <w:rPr>
+          <w:rStyle w:val="VerbatimChar"/>
+        </w:rPr>
+        <w:t xml:space="preserve">echo: false</w:t>
+      </w:r>
+      <w:r>
+        <w:t xml:space="preserve"> </w:t>
+      </w:r>
+      <w:r>
+        <w:t xml:space="preserve">on a cell you want students to read.</w:t>
+      </w:r>
+    </w:p>
+    <w:p>
+      <w:pPr>
+        <w:pStyle w:val="Compact"/>
+        <w:numPr>
+          <w:ilvl w:val="0"/>
+          <w:numId w:val="1006"/>
+        </w:numPr>
+      </w:pPr>
+      <w:r>
+        <w:t xml:space="preserve">Do not cross-reference an interactive figure from prose,</w:t>
+      </w:r>
+      <w:r>
+        <w:t xml:space="preserve"> </w:t>
+      </w:r>
+      <w:r>
+        <w:t xml:space="preserve">because the PDF format renders no figure for it,</w:t>
+      </w:r>
+      <w:r>
+        <w:t xml:space="preserve"> </w:t>
+      </w:r>
+      <w:r>
+        <w:t xml:space="preserve">so the reference has no target there</w:t>
+      </w:r>
+      <w:r>
+        <w:t xml:space="preserve"> </w:t>
+      </w:r>
+      <w:r>
+        <w:t xml:space="preserve">(observed when rendering lecture notes to PDF).</w:t>
+      </w:r>
+    </w:p>
+    <w:bookmarkEnd w:id="22"/>
+    <w:bookmarkStart w:id="24" w:name="structure-slides-for-the-reader"/>
+    <w:p>
+      <w:pPr>
+        <w:pStyle w:val="Heading2"/>
+      </w:pPr>
+      <w:r>
+        <w:t xml:space="preserve">10 Structure slides for the reader</w:t>
+      </w:r>
+    </w:p>
+    <w:p>
+      <w:pPr>
+        <w:pStyle w:val="Compact"/>
+        <w:numPr>
+          <w:ilvl w:val="0"/>
+          <w:numId w:val="1007"/>
+        </w:numPr>
+      </w:pPr>
+      <w:r>
+        <w:t xml:space="preserve">Check the rendered slides, not only the web page.</w:t>
+      </w:r>
+      <w:r>
+        <w:t xml:space="preserve"> </w:t>
+      </w:r>
+      <w:r>
+        <w:t xml:space="preserve">Slides need the same boxes and colors on theorem-type and callout divs</w:t>
+      </w:r>
+      <w:r>
+        <w:t xml:space="preserve"> </w:t>
+      </w:r>
+      <w:r>
+        <w:t xml:space="preserve">that the web page has,</w:t>
+      </w:r>
+      <w:r>
+        <w:t xml:space="preserve"> </w:t>
+      </w:r>
+      <w:r>
+        <w:t xml:space="preserve">so a reader can see where a definition ends and the commentary begins.</w:t>
+      </w:r>
+    </w:p>
+    <w:p>
+      <w:pPr>
+        <w:pStyle w:val="Compact"/>
+        <w:numPr>
+          <w:ilvl w:val="0"/>
+          <w:numId w:val="1007"/>
+        </w:numPr>
+      </w:pPr>
+      <w:r>
         <w:t xml:space="preserve">Put a list of three or more phrases in a bullet list,</w:t>
       </w:r>
       <w:r>
@@ -1619,7 +1753,7 @@
       <w:r>
         <w:t xml:space="preserve"> </w:t>
       </w:r>
-      <w:hyperlink r:id="rId21">
+      <w:hyperlink r:id="rId23">
         <w:r>
           <w:rPr>
             <w:rStyle w:val="Hyperlink"/>
@@ -1639,7 +1773,7 @@
         <w:pStyle w:val="Compact"/>
         <w:numPr>
           <w:ilvl w:val="0"/>
-          <w:numId w:val="1005"/>
+          <w:numId w:val="1007"/>
         </w:numPr>
       </w:pPr>
       <w:r>
@@ -1666,7 +1800,7 @@
         <w:pStyle w:val="Compact"/>
         <w:numPr>
           <w:ilvl w:val="0"/>
-          <w:numId w:val="1005"/>
+          <w:numId w:val="1007"/>
         </w:numPr>
       </w:pPr>
       <w:r>
@@ -1735,7 +1869,7 @@
         <w:pStyle w:val="Compact"/>
         <w:numPr>
           <w:ilvl w:val="0"/>
-          <w:numId w:val="1005"/>
+          <w:numId w:val="1007"/>
         </w:numPr>
       </w:pPr>
       <w:r>
@@ -1804,7 +1938,7 @@
         <w:pStyle w:val="Compact"/>
         <w:numPr>
           <w:ilvl w:val="0"/>
-          <w:numId w:val="1005"/>
+          <w:numId w:val="1007"/>
         </w:numPr>
       </w:pPr>
       <w:r>
@@ -1828,7 +1962,7 @@
         <w:pStyle w:val="Compact"/>
         <w:numPr>
           <w:ilvl w:val="0"/>
-          <w:numId w:val="1005"/>
+          <w:numId w:val="1007"/>
         </w:numPr>
       </w:pPr>
       <w:r>
@@ -1859,14 +1993,14 @@
         <w:t xml:space="preserve">Put a slide break after the heading and move the text onto content slides.</w:t>
       </w:r>
     </w:p>
-    <w:bookmarkEnd w:id="22"/>
-    <w:bookmarkStart w:id="26" w:name="Xcb579568ef754486ebde8b41ba4528bdf380eec"/>
+    <w:bookmarkEnd w:id="24"/>
+    <w:bookmarkStart w:id="28" w:name="Xcb579568ef754486ebde8b41ba4528bdf380eec"/>
     <w:p>
       <w:pPr>
         <w:pStyle w:val="Heading2"/>
       </w:pPr>
       <w:r>
-        <w:t xml:space="preserve">9 Credit other courses without summarizing them</w:t>
+        <w:t xml:space="preserve">11 Credit other courses without summarizing them</w:t>
       </w:r>
     </w:p>
     <w:p>
@@ -1874,7 +2008,7 @@
         <w:pStyle w:val="Compact"/>
         <w:numPr>
           <w:ilvl w:val="0"/>
-          <w:numId w:val="1006"/>
+          <w:numId w:val="1008"/>
         </w:numPr>
       </w:pPr>
       <w:r>
@@ -1919,7 +2053,7 @@
       <w:r>
         <w:t xml:space="preserve"> </w:t>
       </w:r>
-      <w:hyperlink r:id="rId23">
+      <w:hyperlink r:id="rId25">
         <w:r>
           <w:rPr>
             <w:rStyle w:val="Hyperlink"/>
@@ -1960,7 +2094,7 @@
         <w:pStyle w:val="Compact"/>
         <w:numPr>
           <w:ilvl w:val="0"/>
-          <w:numId w:val="1006"/>
+          <w:numId w:val="1008"/>
         </w:numPr>
       </w:pPr>
       <w:r>
@@ -1975,7 +2109,7 @@
       <w:r>
         <w:t xml:space="preserve"> </w:t>
       </w:r>
-      <w:hyperlink r:id="rId24">
+      <w:hyperlink r:id="rId26">
         <w:r>
           <w:rPr>
             <w:rStyle w:val="Hyperlink"/>
@@ -1995,7 +2129,7 @@
         <w:pStyle w:val="Compact"/>
         <w:numPr>
           <w:ilvl w:val="0"/>
-          <w:numId w:val="1006"/>
+          <w:numId w:val="1008"/>
         </w:numPr>
       </w:pPr>
       <w:r>
@@ -2004,7 +2138,7 @@
       <w:r>
         <w:t xml:space="preserve"> </w:t>
       </w:r>
-      <w:hyperlink r:id="rId25">
+      <w:hyperlink r:id="rId27">
         <w:r>
           <w:rPr>
             <w:rStyle w:val="Hyperlink"/>
@@ -2024,7 +2158,7 @@
         <w:pStyle w:val="Compact"/>
         <w:numPr>
           <w:ilvl w:val="0"/>
-          <w:numId w:val="1006"/>
+          <w:numId w:val="1008"/>
         </w:numPr>
       </w:pPr>
       <w:r>
@@ -2037,14 +2171,14 @@
         <w:t xml:space="preserve">because a bare citation key renders as the author list.</w:t>
       </w:r>
     </w:p>
-    <w:bookmarkEnd w:id="26"/>
-    <w:bookmarkStart w:id="35" w:name="rules-that-apply-to-all-writing"/>
+    <w:bookmarkEnd w:id="28"/>
+    <w:bookmarkStart w:id="37" w:name="rules-that-apply-to-all-writing"/>
     <w:p>
       <w:pPr>
         <w:pStyle w:val="Heading2"/>
       </w:pPr>
       <w:r>
-        <w:t xml:space="preserve">10 Rules that apply to all writing</w:t>
+        <w:t xml:space="preserve">12 Rules that apply to all writing</w:t>
       </w:r>
     </w:p>
     <w:p>
@@ -2060,10 +2194,10 @@
         <w:pStyle w:val="Compact"/>
         <w:numPr>
           <w:ilvl w:val="0"/>
-          <w:numId w:val="1007"/>
+          <w:numId w:val="1009"/>
         </w:numPr>
       </w:pPr>
-      <w:hyperlink r:id="rId27">
+      <w:hyperlink r:id="rId29">
         <w:r>
           <w:rPr>
             <w:rStyle w:val="Hyperlink"/>
@@ -2080,10 +2214,10 @@
         <w:pStyle w:val="Compact"/>
         <w:numPr>
           <w:ilvl w:val="0"/>
-          <w:numId w:val="1007"/>
+          <w:numId w:val="1009"/>
         </w:numPr>
       </w:pPr>
-      <w:hyperlink r:id="rId28">
+      <w:hyperlink r:id="rId30">
         <w:r>
           <w:rPr>
             <w:rStyle w:val="Hyperlink"/>
@@ -2103,10 +2237,10 @@
         <w:pStyle w:val="Compact"/>
         <w:numPr>
           <w:ilvl w:val="0"/>
-          <w:numId w:val="1007"/>
+          <w:numId w:val="1009"/>
         </w:numPr>
       </w:pPr>
-      <w:hyperlink r:id="rId29">
+      <w:hyperlink r:id="rId31">
         <w:r>
           <w:rPr>
             <w:rStyle w:val="Hyperlink"/>
@@ -2123,10 +2257,10 @@
         <w:pStyle w:val="Compact"/>
         <w:numPr>
           <w:ilvl w:val="0"/>
-          <w:numId w:val="1007"/>
+          <w:numId w:val="1009"/>
         </w:numPr>
       </w:pPr>
-      <w:hyperlink r:id="rId30">
+      <w:hyperlink r:id="rId32">
         <w:r>
           <w:rPr>
             <w:rStyle w:val="Hyperlink"/>
@@ -2146,10 +2280,10 @@
         <w:pStyle w:val="Compact"/>
         <w:numPr>
           <w:ilvl w:val="0"/>
-          <w:numId w:val="1007"/>
+          <w:numId w:val="1009"/>
         </w:numPr>
       </w:pPr>
-      <w:hyperlink r:id="rId31">
+      <w:hyperlink r:id="rId33">
         <w:r>
           <w:rPr>
             <w:rStyle w:val="Hyperlink"/>
@@ -2161,8 +2295,8 @@
         <w:t xml:space="preserve">.</w:t>
       </w:r>
     </w:p>
-    <w:bookmarkStart w:id="34" w:name="refs"/>
-    <w:bookmarkStart w:id="33" w:name="ref-freeman2014active"/>
+    <w:bookmarkStart w:id="36" w:name="refs"/>
+    <w:bookmarkStart w:id="35" w:name="ref-freeman2014active"/>
     <w:p>
       <w:pPr>
         <w:pStyle w:val="Bibliography"/>
@@ -2195,7 +2329,7 @@
       <w:r>
         <w:t xml:space="preserve"> </w:t>
       </w:r>
-      <w:hyperlink r:id="rId32">
+      <w:hyperlink r:id="rId34">
         <w:r>
           <w:rPr>
             <w:rStyle w:val="Hyperlink"/>
@@ -2207,9 +2341,9 @@
         <w:t xml:space="preserve">.</w:t>
       </w:r>
     </w:p>
-    <w:bookmarkEnd w:id="33"/>
-    <w:bookmarkEnd w:id="34"/>
     <w:bookmarkEnd w:id="35"/>
+    <w:bookmarkEnd w:id="36"/>
+    <w:bookmarkEnd w:id="37"/>
     <w:sectPr>
       <w:footnotePr>
         <w:numRestart w:val="eachSect"/>
@@ -2445,6 +2579,12 @@
     <w:abstractNumId w:val="991"/>
   </w:num>
   <w:num w:numId="1007">
+    <w:abstractNumId w:val="991"/>
+  </w:num>
+  <w:num w:numId="1008">
+    <w:abstractNumId w:val="991"/>
+  </w:num>
+  <w:num w:numId="1009">
     <w:abstractNumId w:val="991"/>
   </w:num>
 </w:numbering>

</xml_diff>

<commit_message>
Deploying to gh-pages from @ Morrison-Lab/psw@46dcbce745263495df09006d848e2a18ccedac8f 🚀
</commit_message>
<xml_diff>
--- a/chapters/teaching.docx
+++ b/chapters/teaching.docx
@@ -15,7 +15,7 @@
         <w:pStyle w:val="Date"/>
       </w:pPr>
       <w:r>
-        <w:t xml:space="preserve">Last modified: 2026-10-08 08:34:17 (UTC)</w:t>
+        <w:t xml:space="preserve">Last modified: 2026-10-08 08:43:12 (UTC)</w:t>
       </w:r>
     </w:p>
     <w:tbl>
@@ -1424,7 +1424,7 @@
       </w:r>
     </w:p>
     <w:bookmarkEnd w:id="19"/>
-    <w:bookmarkStart w:id="20" w:name="show-each-idea-applied-and-in-a-figure"/>
+    <w:bookmarkStart w:id="21" w:name="show-each-idea-applied-and-in-a-figure"/>
     <w:p>
       <w:pPr>
         <w:pStyle w:val="Heading2"/>
@@ -1466,19 +1466,120 @@
         </w:numPr>
       </w:pPr>
       <w:r>
-        <w:t xml:space="preserve">Give every topic at least one figure that shows the idea,</w:t>
-      </w:r>
-      <w:r>
-        <w:t xml:space="preserve"> </w:t>
-      </w:r>
-      <w:r>
-        <w:t xml:space="preserve">such as the data with a fitted curve, a distribution, or a diagram of the procedure.</w:t>
-      </w:r>
-      <w:r>
-        <w:t xml:space="preserve"> </w:t>
-      </w:r>
-      <w:r>
-        <w:t xml:space="preserve">A page of definitions with no figure and no data is incomplete.</w:t>
+        <w:t xml:space="preserve">Follow every abstract div directly with a concrete</w:t>
+      </w:r>
+      <w:r>
+        <w:t xml:space="preserve"> </w:t>
+      </w:r>
+      <w:r>
+        <w:rPr>
+          <w:rStyle w:val="VerbatimChar"/>
+        </w:rPr>
+        <w:t xml:space="preserve">#exm-</w:t>
+      </w:r>
+      <w:r>
+        <w:t xml:space="preserve"> </w:t>
+      </w:r>
+      <w:r>
+        <w:t xml:space="preserve">div.</w:t>
+      </w:r>
+      <w:r>
+        <w:t xml:space="preserve"> </w:t>
+      </w:r>
+      <w:r>
+        <w:t xml:space="preserve">The rule covers each</w:t>
+      </w:r>
+      <w:r>
+        <w:t xml:space="preserve"> </w:t>
+      </w:r>
+      <w:r>
+        <w:rPr>
+          <w:rStyle w:val="VerbatimChar"/>
+        </w:rPr>
+        <w:t xml:space="preserve">#def-</w:t>
+      </w:r>
+      <w:r>
+        <w:t xml:space="preserve">,</w:t>
+      </w:r>
+      <w:r>
+        <w:t xml:space="preserve"> </w:t>
+      </w:r>
+      <w:r>
+        <w:rPr>
+          <w:rStyle w:val="VerbatimChar"/>
+        </w:rPr>
+        <w:t xml:space="preserve">#thm-</w:t>
+      </w:r>
+      <w:r>
+        <w:t xml:space="preserve">,</w:t>
+      </w:r>
+      <w:r>
+        <w:t xml:space="preserve"> </w:t>
+      </w:r>
+      <w:r>
+        <w:rPr>
+          <w:rStyle w:val="VerbatimChar"/>
+        </w:rPr>
+        <w:t xml:space="preserve">#lem-</w:t>
+      </w:r>
+      <w:r>
+        <w:t xml:space="preserve">,</w:t>
+      </w:r>
+      <w:r>
+        <w:t xml:space="preserve"> </w:t>
+      </w:r>
+      <w:r>
+        <w:rPr>
+          <w:rStyle w:val="VerbatimChar"/>
+        </w:rPr>
+        <w:t xml:space="preserve">#cor-</w:t>
+      </w:r>
+      <w:r>
+        <w:t xml:space="preserve"> </w:t>
+      </w:r>
+      <w:r>
+        <w:t xml:space="preserve">and similar div.</w:t>
+      </w:r>
+      <w:r>
+        <w:t xml:space="preserve"> </w:t>
+      </w:r>
+      <w:r>
+        <w:t xml:space="preserve">The example of a related result does not exempt a definition:</w:t>
+      </w:r>
+      <w:r>
+        <w:t xml:space="preserve"> </w:t>
+      </w:r>
+      <w:r>
+        <w:t xml:space="preserve">a theorem that uses a definition gets its own example,</w:t>
+      </w:r>
+      <w:r>
+        <w:t xml:space="preserve"> </w:t>
+      </w:r>
+      <w:r>
+        <w:t xml:space="preserve">and so does the definition.</w:t>
+      </w:r>
+      <w:r>
+        <w:t xml:space="preserve"> </w:t>
+      </w:r>
+      <w:r>
+        <w:t xml:space="preserve">The</w:t>
+      </w:r>
+      <w:r>
+        <w:t xml:space="preserve"> </w:t>
+      </w:r>
+      <w:hyperlink r:id="rId20">
+        <w:r>
+          <w:rPr>
+            <w:rStyle w:val="Hyperlink"/>
+          </w:rPr>
+          <w:t xml:space="preserve">ai-config rule</w:t>
+        </w:r>
+      </w:hyperlink>
+      <w:r>
+        <w:t xml:space="preserve"> </w:t>
+      </w:r>
+      <w:r>
+        <w:t xml:space="preserve">links here.</w:t>
       </w:r>
     </w:p>
     <w:p>
@@ -1490,13 +1591,19 @@
         </w:numPr>
       </w:pPr>
       <w:r>
-        <w:t xml:space="preserve">Prerequisite notes follow the same rule as course lectures.</w:t>
-      </w:r>
-      <w:r>
-        <w:t xml:space="preserve"> </w:t>
-      </w:r>
-      <w:r>
-        <w:t xml:space="preserve">A prerequisite page that is only definitions and algebra needs an applied example and a figure.</w:t>
+        <w:t xml:space="preserve">Give every topic at least one figure that shows the idea,</w:t>
+      </w:r>
+      <w:r>
+        <w:t xml:space="preserve"> </w:t>
+      </w:r>
+      <w:r>
+        <w:t xml:space="preserve">such as the data with a fitted curve, a distribution, or a diagram of the procedure.</w:t>
+      </w:r>
+      <w:r>
+        <w:t xml:space="preserve"> </w:t>
+      </w:r>
+      <w:r>
+        <w:t xml:space="preserve">A page of definitions with no figure and no data is incomplete.</w:t>
       </w:r>
     </w:p>
     <w:p>
@@ -1508,11 +1615,29 @@
         </w:numPr>
       </w:pPr>
       <w:r>
+        <w:t xml:space="preserve">Prerequisite notes follow the same rule as course lectures.</w:t>
+      </w:r>
+      <w:r>
+        <w:t xml:space="preserve"> </w:t>
+      </w:r>
+      <w:r>
+        <w:t xml:space="preserve">A prerequisite page that is only definitions and algebra needs an applied example and a figure.</w:t>
+      </w:r>
+    </w:p>
+    <w:p>
+      <w:pPr>
+        <w:pStyle w:val="Compact"/>
+        <w:numPr>
+          <w:ilvl w:val="0"/>
+          <w:numId w:val="1004"/>
+        </w:numPr>
+      </w:pPr>
+      <w:r>
         <w:t xml:space="preserve">Make each figure follow the accessibility rules below.</w:t>
       </w:r>
     </w:p>
-    <w:bookmarkEnd w:id="20"/>
-    <w:bookmarkStart w:id="21" w:name="Xf27331f4c36c8d578e5fa29a37312484cc3343a"/>
+    <w:bookmarkEnd w:id="21"/>
+    <w:bookmarkStart w:id="22" w:name="Xf27331f4c36c8d578e5fa29a37312484cc3343a"/>
     <w:p>
       <w:pPr>
         <w:pStyle w:val="Heading2"/>
@@ -1557,8 +1682,8 @@
         <w:t xml:space="preserve">so setup steps must work on a shared or hosted machine.</w:t>
       </w:r>
     </w:p>
-    <w:bookmarkEnd w:id="21"/>
-    <w:bookmarkStart w:id="22" w:name="make-figures-accessible"/>
+    <w:bookmarkEnd w:id="22"/>
+    <w:bookmarkStart w:id="23" w:name="make-figures-accessible"/>
     <w:p>
       <w:pPr>
         <w:pStyle w:val="Heading2"/>
@@ -1693,8 +1818,8 @@
         <w:t xml:space="preserve">(observed when rendering lecture notes to PDF).</w:t>
       </w:r>
     </w:p>
-    <w:bookmarkEnd w:id="22"/>
-    <w:bookmarkStart w:id="24" w:name="structure-slides-for-the-reader"/>
+    <w:bookmarkEnd w:id="23"/>
+    <w:bookmarkStart w:id="25" w:name="structure-slides-for-the-reader"/>
     <w:p>
       <w:pPr>
         <w:pStyle w:val="Heading2"/>
@@ -1753,7 +1878,7 @@
       <w:r>
         <w:t xml:space="preserve"> </w:t>
       </w:r>
-      <w:hyperlink r:id="rId23">
+      <w:hyperlink r:id="rId24">
         <w:r>
           <w:rPr>
             <w:rStyle w:val="Hyperlink"/>
@@ -1993,8 +2118,8 @@
         <w:t xml:space="preserve">Put a slide break after the heading and move the text onto content slides.</w:t>
       </w:r>
     </w:p>
-    <w:bookmarkEnd w:id="24"/>
-    <w:bookmarkStart w:id="28" w:name="Xcb579568ef754486ebde8b41ba4528bdf380eec"/>
+    <w:bookmarkEnd w:id="25"/>
+    <w:bookmarkStart w:id="29" w:name="Xcb579568ef754486ebde8b41ba4528bdf380eec"/>
     <w:p>
       <w:pPr>
         <w:pStyle w:val="Heading2"/>
@@ -2053,7 +2178,7 @@
       <w:r>
         <w:t xml:space="preserve"> </w:t>
       </w:r>
-      <w:hyperlink r:id="rId25">
+      <w:hyperlink r:id="rId26">
         <w:r>
           <w:rPr>
             <w:rStyle w:val="Hyperlink"/>
@@ -2109,7 +2234,7 @@
       <w:r>
         <w:t xml:space="preserve"> </w:t>
       </w:r>
-      <w:hyperlink r:id="rId26">
+      <w:hyperlink r:id="rId27">
         <w:r>
           <w:rPr>
             <w:rStyle w:val="Hyperlink"/>
@@ -2138,7 +2263,7 @@
       <w:r>
         <w:t xml:space="preserve"> </w:t>
       </w:r>
-      <w:hyperlink r:id="rId27">
+      <w:hyperlink r:id="rId28">
         <w:r>
           <w:rPr>
             <w:rStyle w:val="Hyperlink"/>
@@ -2171,8 +2296,8 @@
         <w:t xml:space="preserve">because a bare citation key renders as the author list.</w:t>
       </w:r>
     </w:p>
-    <w:bookmarkEnd w:id="28"/>
-    <w:bookmarkStart w:id="37" w:name="rules-that-apply-to-all-writing"/>
+    <w:bookmarkEnd w:id="29"/>
+    <w:bookmarkStart w:id="38" w:name="rules-that-apply-to-all-writing"/>
     <w:p>
       <w:pPr>
         <w:pStyle w:val="Heading2"/>
@@ -2197,7 +2322,7 @@
           <w:numId w:val="1009"/>
         </w:numPr>
       </w:pPr>
-      <w:hyperlink r:id="rId29">
+      <w:hyperlink r:id="rId30">
         <w:r>
           <w:rPr>
             <w:rStyle w:val="Hyperlink"/>
@@ -2217,7 +2342,7 @@
           <w:numId w:val="1009"/>
         </w:numPr>
       </w:pPr>
-      <w:hyperlink r:id="rId30">
+      <w:hyperlink r:id="rId31">
         <w:r>
           <w:rPr>
             <w:rStyle w:val="Hyperlink"/>
@@ -2240,7 +2365,7 @@
           <w:numId w:val="1009"/>
         </w:numPr>
       </w:pPr>
-      <w:hyperlink r:id="rId31">
+      <w:hyperlink r:id="rId32">
         <w:r>
           <w:rPr>
             <w:rStyle w:val="Hyperlink"/>
@@ -2260,7 +2385,7 @@
           <w:numId w:val="1009"/>
         </w:numPr>
       </w:pPr>
-      <w:hyperlink r:id="rId32">
+      <w:hyperlink r:id="rId33">
         <w:r>
           <w:rPr>
             <w:rStyle w:val="Hyperlink"/>
@@ -2283,7 +2408,7 @@
           <w:numId w:val="1009"/>
         </w:numPr>
       </w:pPr>
-      <w:hyperlink r:id="rId33">
+      <w:hyperlink r:id="rId34">
         <w:r>
           <w:rPr>
             <w:rStyle w:val="Hyperlink"/>
@@ -2295,8 +2420,8 @@
         <w:t xml:space="preserve">.</w:t>
       </w:r>
     </w:p>
-    <w:bookmarkStart w:id="36" w:name="refs"/>
-    <w:bookmarkStart w:id="35" w:name="ref-freeman2014active"/>
+    <w:bookmarkStart w:id="37" w:name="refs"/>
+    <w:bookmarkStart w:id="36" w:name="ref-freeman2014active"/>
     <w:p>
       <w:pPr>
         <w:pStyle w:val="Bibliography"/>
@@ -2329,7 +2454,7 @@
       <w:r>
         <w:t xml:space="preserve"> </w:t>
       </w:r>
-      <w:hyperlink r:id="rId34">
+      <w:hyperlink r:id="rId35">
         <w:r>
           <w:rPr>
             <w:rStyle w:val="Hyperlink"/>
@@ -2341,9 +2466,9 @@
         <w:t xml:space="preserve">.</w:t>
       </w:r>
     </w:p>
-    <w:bookmarkEnd w:id="35"/>
     <w:bookmarkEnd w:id="36"/>
     <w:bookmarkEnd w:id="37"/>
+    <w:bookmarkEnd w:id="38"/>
     <w:sectPr>
       <w:footnotePr>
         <w:numRestart w:val="eachSect"/>

</xml_diff>

<commit_message>
Deploying to gh-pages from @ Morrison-Lab/psw@45eb707e2e5a060fca2a12a5ed612f20db4c2b20 🚀
</commit_message>
<xml_diff>
--- a/chapters/teaching.docx
+++ b/chapters/teaching.docx
@@ -15,7 +15,7 @@
         <w:pStyle w:val="Date"/>
       </w:pPr>
       <w:r>
-        <w:t xml:space="preserve">Last modified: 2026-10-08 08:43:12 (UTC)</w:t>
+        <w:t xml:space="preserve">Last modified: 2026-10-08 08:59:02 (UTC)</w:t>
       </w:r>
     </w:p>
     <w:tbl>
@@ -1648,6 +1648,20 @@
     </w:p>
     <w:p>
       <w:pPr>
+        <w:pStyle w:val="FirstParagraph"/>
+      </w:pPr>
+      <w:r>
+        <w:t xml:space="preserve">These rules apply to all teaching materials,</w:t>
+      </w:r>
+      <w:r>
+        <w:t xml:space="preserve"> </w:t>
+      </w:r>
+      <w:r>
+        <w:t xml:space="preserve">in every course and every teaching repository, not only to one course.</w:t>
+      </w:r>
+    </w:p>
+    <w:p>
+      <w:pPr>
         <w:pStyle w:val="Compact"/>
         <w:numPr>
           <w:ilvl w:val="0"/>
@@ -1656,6 +1670,18 @@
       </w:pPr>
       <w:r>
         <w:t xml:space="preserve">Give labs and code exercises in both R and Python, side by side.</w:t>
+      </w:r>
+    </w:p>
+    <w:p>
+      <w:pPr>
+        <w:pStyle w:val="Compact"/>
+        <w:numPr>
+          <w:ilvl w:val="0"/>
+          <w:numId w:val="1005"/>
+        </w:numPr>
+      </w:pPr>
+      <w:r>
+        <w:t xml:space="preserve">Tell students where to get the data.</w:t>
       </w:r>
     </w:p>
     <w:p>

</xml_diff>

<commit_message>
Deploying to gh-pages from @ Morrison-Lab/psw@2ec0630a5f620240103d59d887bd11c94da92192 🚀
</commit_message>
<xml_diff>
--- a/chapters/teaching.docx
+++ b/chapters/teaching.docx
@@ -15,7 +15,7 @@
         <w:pStyle w:val="Date"/>
       </w:pPr>
       <w:r>
-        <w:t xml:space="preserve">Last modified: 2026-10-08 08:59:02 (UTC)</w:t>
+        <w:t xml:space="preserve">Last modified: 2026-10-08 09:16:48 (UTC)</w:t>
       </w:r>
     </w:p>
     <w:tbl>
@@ -1424,7 +1424,7 @@
       </w:r>
     </w:p>
     <w:bookmarkEnd w:id="19"/>
-    <w:bookmarkStart w:id="21" w:name="show-each-idea-applied-and-in-a-figure"/>
+    <w:bookmarkStart w:id="22" w:name="show-each-idea-applied-and-in-a-figure"/>
     <w:p>
       <w:pPr>
         <w:pStyle w:val="Heading2"/>
@@ -1633,11 +1633,70 @@
         </w:numPr>
       </w:pPr>
       <w:r>
+        <w:t xml:space="preserve">Place each figure directly after the sentence that first refers to it.</w:t>
+      </w:r>
+      <w:r>
+        <w:t xml:space="preserve"> </w:t>
+      </w:r>
+      <w:r>
+        <w:t xml:space="preserve">Do not refer to a figure, table, or result that appears later in the document,</w:t>
+      </w:r>
+      <w:r>
+        <w:t xml:space="preserve"> </w:t>
+      </w:r>
+      <w:r>
+        <w:t xml:space="preserve">because the reader meets the reference before the thing it points to.</w:t>
+      </w:r>
+      <w:r>
+        <w:t xml:space="preserve"> </w:t>
+      </w:r>
+      <w:r>
+        <w:t xml:space="preserve">This rule is for teaching materials, which are reading copies.</w:t>
+      </w:r>
+      <w:r>
+        <w:t xml:space="preserve"> </w:t>
+      </w:r>
+      <w:r>
+        <w:t xml:space="preserve">A journal submission may collect its figures at the end,</w:t>
+      </w:r>
+      <w:r>
+        <w:t xml:space="preserve"> </w:t>
+      </w:r>
+      <w:r>
+        <w:t xml:space="preserve">as</w:t>
+      </w:r>
+      <w:r>
+        <w:t xml:space="preserve"> </w:t>
+      </w:r>
+      <w:hyperlink r:id="rId21">
+        <w:r>
+          <w:rPr>
+            <w:rStyle w:val="Hyperlink"/>
+          </w:rPr>
+          <w:t xml:space="preserve">Figures and tables</w:t>
+        </w:r>
+      </w:hyperlink>
+      <w:r>
+        <w:t xml:space="preserve"> </w:t>
+      </w:r>
+      <w:r>
+        <w:t xml:space="preserve">describes.</w:t>
+      </w:r>
+    </w:p>
+    <w:p>
+      <w:pPr>
+        <w:pStyle w:val="Compact"/>
+        <w:numPr>
+          <w:ilvl w:val="0"/>
+          <w:numId w:val="1004"/>
+        </w:numPr>
+      </w:pPr>
+      <w:r>
         <w:t xml:space="preserve">Make each figure follow the accessibility rules below.</w:t>
       </w:r>
     </w:p>
-    <w:bookmarkEnd w:id="21"/>
-    <w:bookmarkStart w:id="22" w:name="Xf27331f4c36c8d578e5fa29a37312484cc3343a"/>
+    <w:bookmarkEnd w:id="22"/>
+    <w:bookmarkStart w:id="23" w:name="Xf27331f4c36c8d578e5fa29a37312484cc3343a"/>
     <w:p>
       <w:pPr>
         <w:pStyle w:val="Heading2"/>
@@ -1708,8 +1767,8 @@
         <w:t xml:space="preserve">so setup steps must work on a shared or hosted machine.</w:t>
       </w:r>
     </w:p>
-    <w:bookmarkEnd w:id="22"/>
-    <w:bookmarkStart w:id="23" w:name="make-figures-accessible"/>
+    <w:bookmarkEnd w:id="23"/>
+    <w:bookmarkStart w:id="24" w:name="make-figures-accessible"/>
     <w:p>
       <w:pPr>
         <w:pStyle w:val="Heading2"/>
@@ -1844,8 +1903,8 @@
         <w:t xml:space="preserve">(observed when rendering lecture notes to PDF).</w:t>
       </w:r>
     </w:p>
-    <w:bookmarkEnd w:id="23"/>
-    <w:bookmarkStart w:id="25" w:name="structure-slides-for-the-reader"/>
+    <w:bookmarkEnd w:id="24"/>
+    <w:bookmarkStart w:id="26" w:name="structure-slides-for-the-reader"/>
     <w:p>
       <w:pPr>
         <w:pStyle w:val="Heading2"/>
@@ -1904,7 +1963,7 @@
       <w:r>
         <w:t xml:space="preserve"> </w:t>
       </w:r>
-      <w:hyperlink r:id="rId24">
+      <w:hyperlink r:id="rId25">
         <w:r>
           <w:rPr>
             <w:rStyle w:val="Hyperlink"/>
@@ -2144,8 +2203,8 @@
         <w:t xml:space="preserve">Put a slide break after the heading and move the text onto content slides.</w:t>
       </w:r>
     </w:p>
-    <w:bookmarkEnd w:id="25"/>
-    <w:bookmarkStart w:id="29" w:name="Xcb579568ef754486ebde8b41ba4528bdf380eec"/>
+    <w:bookmarkEnd w:id="26"/>
+    <w:bookmarkStart w:id="30" w:name="Xcb579568ef754486ebde8b41ba4528bdf380eec"/>
     <w:p>
       <w:pPr>
         <w:pStyle w:val="Heading2"/>
@@ -2204,7 +2263,7 @@
       <w:r>
         <w:t xml:space="preserve"> </w:t>
       </w:r>
-      <w:hyperlink r:id="rId26">
+      <w:hyperlink r:id="rId27">
         <w:r>
           <w:rPr>
             <w:rStyle w:val="Hyperlink"/>
@@ -2260,7 +2319,7 @@
       <w:r>
         <w:t xml:space="preserve"> </w:t>
       </w:r>
-      <w:hyperlink r:id="rId27">
+      <w:hyperlink r:id="rId28">
         <w:r>
           <w:rPr>
             <w:rStyle w:val="Hyperlink"/>
@@ -2289,7 +2348,7 @@
       <w:r>
         <w:t xml:space="preserve"> </w:t>
       </w:r>
-      <w:hyperlink r:id="rId28">
+      <w:hyperlink r:id="rId29">
         <w:r>
           <w:rPr>
             <w:rStyle w:val="Hyperlink"/>
@@ -2322,8 +2381,8 @@
         <w:t xml:space="preserve">because a bare citation key renders as the author list.</w:t>
       </w:r>
     </w:p>
-    <w:bookmarkEnd w:id="29"/>
-    <w:bookmarkStart w:id="38" w:name="rules-that-apply-to-all-writing"/>
+    <w:bookmarkEnd w:id="30"/>
+    <w:bookmarkStart w:id="39" w:name="rules-that-apply-to-all-writing"/>
     <w:p>
       <w:pPr>
         <w:pStyle w:val="Heading2"/>
@@ -2348,7 +2407,7 @@
           <w:numId w:val="1009"/>
         </w:numPr>
       </w:pPr>
-      <w:hyperlink r:id="rId30">
+      <w:hyperlink r:id="rId31">
         <w:r>
           <w:rPr>
             <w:rStyle w:val="Hyperlink"/>
@@ -2368,7 +2427,7 @@
           <w:numId w:val="1009"/>
         </w:numPr>
       </w:pPr>
-      <w:hyperlink r:id="rId31">
+      <w:hyperlink r:id="rId32">
         <w:r>
           <w:rPr>
             <w:rStyle w:val="Hyperlink"/>
@@ -2391,7 +2450,7 @@
           <w:numId w:val="1009"/>
         </w:numPr>
       </w:pPr>
-      <w:hyperlink r:id="rId32">
+      <w:hyperlink r:id="rId33">
         <w:r>
           <w:rPr>
             <w:rStyle w:val="Hyperlink"/>
@@ -2411,7 +2470,7 @@
           <w:numId w:val="1009"/>
         </w:numPr>
       </w:pPr>
-      <w:hyperlink r:id="rId33">
+      <w:hyperlink r:id="rId34">
         <w:r>
           <w:rPr>
             <w:rStyle w:val="Hyperlink"/>
@@ -2434,7 +2493,7 @@
           <w:numId w:val="1009"/>
         </w:numPr>
       </w:pPr>
-      <w:hyperlink r:id="rId34">
+      <w:hyperlink r:id="rId35">
         <w:r>
           <w:rPr>
             <w:rStyle w:val="Hyperlink"/>
@@ -2446,8 +2505,8 @@
         <w:t xml:space="preserve">.</w:t>
       </w:r>
     </w:p>
-    <w:bookmarkStart w:id="37" w:name="refs"/>
-    <w:bookmarkStart w:id="36" w:name="ref-freeman2014active"/>
+    <w:bookmarkStart w:id="38" w:name="refs"/>
+    <w:bookmarkStart w:id="37" w:name="ref-freeman2014active"/>
     <w:p>
       <w:pPr>
         <w:pStyle w:val="Bibliography"/>
@@ -2480,7 +2539,7 @@
       <w:r>
         <w:t xml:space="preserve"> </w:t>
       </w:r>
-      <w:hyperlink r:id="rId35">
+      <w:hyperlink r:id="rId36">
         <w:r>
           <w:rPr>
             <w:rStyle w:val="Hyperlink"/>
@@ -2492,9 +2551,9 @@
         <w:t xml:space="preserve">.</w:t>
       </w:r>
     </w:p>
-    <w:bookmarkEnd w:id="36"/>
     <w:bookmarkEnd w:id="37"/>
     <w:bookmarkEnd w:id="38"/>
+    <w:bookmarkEnd w:id="39"/>
     <w:sectPr>
       <w:footnotePr>
         <w:numRestart w:val="eachSect"/>

</xml_diff>

<commit_message>
Deploying to gh-pages from @ Morrison-Lab/psw@99ebf63e5eb734c74a571e071c18ebc6c9b6bf75 🚀
</commit_message>
<xml_diff>
--- a/chapters/teaching.docx
+++ b/chapters/teaching.docx
@@ -15,7 +15,7 @@
         <w:pStyle w:val="Date"/>
       </w:pPr>
       <w:r>
-        <w:t xml:space="preserve">Last modified: 2026-10-08 22:40:32 (PDT)</w:t>
+        <w:t xml:space="preserve">Last modified: 2026-10-09 01:07:47 (PDT)</w:t>
       </w:r>
     </w:p>
     <w:tbl>
@@ -1696,7 +1696,7 @@
       </w:r>
     </w:p>
     <w:bookmarkEnd w:id="22"/>
-    <w:bookmarkStart w:id="23" w:name="Xf27331f4c36c8d578e5fa29a37312484cc3343a"/>
+    <w:bookmarkStart w:id="26" w:name="Xf27331f4c36c8d578e5fa29a37312484cc3343a"/>
     <w:p>
       <w:pPr>
         <w:pStyle w:val="Heading2"/>
@@ -1740,6 +1740,162 @@
         </w:numPr>
       </w:pPr>
       <w:r>
+        <w:t xml:space="preserve">Write the R code with</w:t>
+      </w:r>
+      <w:r>
+        <w:t xml:space="preserve"> </w:t>
+      </w:r>
+      <w:hyperlink r:id="rId23">
+        <w:r>
+          <w:rPr>
+            <w:rStyle w:val="Hyperlink"/>
+          </w:rPr>
+          <w:t xml:space="preserve">tidymodels</w:t>
+        </w:r>
+      </w:hyperlink>
+      <w:r>
+        <w:t xml:space="preserve">,</w:t>
+      </w:r>
+      <w:r>
+        <w:t xml:space="preserve"> </w:t>
+      </w:r>
+      <w:r>
+        <w:t xml:space="preserve">or show tidymodels and base R side by side.</w:t>
+      </w:r>
+      <w:r>
+        <w:t xml:space="preserve"> </w:t>
+      </w:r>
+      <w:r>
+        <w:t xml:space="preserve">Do not give base R alone.</w:t>
+      </w:r>
+      <w:r>
+        <w:t xml:space="preserve"> </w:t>
+      </w:r>
+      <w:hyperlink r:id="rId24">
+        <w:r>
+          <w:rPr>
+            <w:rStyle w:val="Hyperlink"/>
+          </w:rPr>
+          <w:t xml:space="preserve">ISLR-tidymodels-labs</w:t>
+        </w:r>
+      </w:hyperlink>
+      <w:r>
+        <w:t xml:space="preserve"> </w:t>
+      </w:r>
+      <w:r>
+        <w:t xml:space="preserve">shows the style.</w:t>
+      </w:r>
+    </w:p>
+    <w:p>
+      <w:pPr>
+        <w:pStyle w:val="Compact"/>
+        <w:numPr>
+          <w:ilvl w:val="0"/>
+          <w:numId w:val="1005"/>
+        </w:numPr>
+      </w:pPr>
+      <w:r>
+        <w:t xml:space="preserve">When a lab follows a textbook’s lab, use the book’s exercises, data and fitting functions,</w:t>
+      </w:r>
+      <w:r>
+        <w:t xml:space="preserve"> </w:t>
+      </w:r>
+      <w:r>
+        <w:t xml:space="preserve">in the book’s order.</w:t>
+      </w:r>
+      <w:r>
+        <w:t xml:space="preserve"> </w:t>
+      </w:r>
+      <w:r>
+        <w:t xml:space="preserve">For the ISL labs, fit Python models with</w:t>
+      </w:r>
+      <w:r>
+        <w:t xml:space="preserve"> </w:t>
+      </w:r>
+      <w:r>
+        <w:rPr>
+          <w:rStyle w:val="VerbatimChar"/>
+        </w:rPr>
+        <w:t xml:space="preserve">statsmodels</w:t>
+      </w:r>
+      <w:r>
+        <w:t xml:space="preserve">’</w:t>
+      </w:r>
+      <w:r>
+        <w:t xml:space="preserve"> </w:t>
+      </w:r>
+      <w:r>
+        <w:rPr>
+          <w:rStyle w:val="VerbatimChar"/>
+        </w:rPr>
+        <w:t xml:space="preserve">sm.OLS</w:t>
+      </w:r>
+      <w:r>
+        <w:t xml:space="preserve">, as</w:t>
+      </w:r>
+      <w:r>
+        <w:t xml:space="preserve"> </w:t>
+      </w:r>
+      <w:hyperlink r:id="rId25">
+        <w:r>
+          <w:rPr>
+            <w:rStyle w:val="Hyperlink"/>
+          </w:rPr>
+          <w:t xml:space="preserve">ISLP_labs</w:t>
+        </w:r>
+      </w:hyperlink>
+      <w:r>
+        <w:t xml:space="preserve"> </w:t>
+      </w:r>
+      <w:r>
+        <w:t xml:space="preserve">does.</w:t>
+      </w:r>
+      <w:r>
+        <w:t xml:space="preserve"> </w:t>
+      </w:r>
+      <w:r>
+        <w:t xml:space="preserve">If an exercise departs from the book, say why in the lab.</w:t>
+      </w:r>
+    </w:p>
+    <w:p>
+      <w:pPr>
+        <w:pStyle w:val="Compact"/>
+        <w:numPr>
+          <w:ilvl w:val="0"/>
+          <w:numId w:val="1005"/>
+        </w:numPr>
+      </w:pPr>
+      <w:r>
+        <w:t xml:space="preserve">Never throw away an exercise you replace.</w:t>
+      </w:r>
+      <w:r>
+        <w:t xml:space="preserve"> </w:t>
+      </w:r>
+      <w:r>
+        <w:t xml:space="preserve">Either keep both exercises,</w:t>
+      </w:r>
+      <w:r>
+        <w:t xml:space="preserve"> </w:t>
+      </w:r>
+      <w:r>
+        <w:t xml:space="preserve">or keep the replaced one as an outtake:</w:t>
+      </w:r>
+      <w:r>
+        <w:t xml:space="preserve"> </w:t>
+      </w:r>
+      <w:r>
+        <w:t xml:space="preserve">leave its file in place and stop including it.</w:t>
+      </w:r>
+    </w:p>
+    <w:p>
+      <w:pPr>
+        <w:pStyle w:val="Compact"/>
+        <w:numPr>
+          <w:ilvl w:val="0"/>
+          <w:numId w:val="1005"/>
+        </w:numPr>
+      </w:pPr>
+      <w:r>
         <w:t xml:space="preserve">Tell students where to get the data.</w:t>
       </w:r>
     </w:p>
@@ -1767,8 +1923,8 @@
         <w:t xml:space="preserve">so setup steps must work on a shared or hosted machine.</w:t>
       </w:r>
     </w:p>
-    <w:bookmarkEnd w:id="23"/>
-    <w:bookmarkStart w:id="24" w:name="make-figures-accessible"/>
+    <w:bookmarkEnd w:id="26"/>
+    <w:bookmarkStart w:id="27" w:name="make-figures-accessible"/>
     <w:p>
       <w:pPr>
         <w:pStyle w:val="Heading2"/>
@@ -1903,8 +2059,8 @@
         <w:t xml:space="preserve">(observed when rendering lecture notes to PDF).</w:t>
       </w:r>
     </w:p>
-    <w:bookmarkEnd w:id="24"/>
-    <w:bookmarkStart w:id="26" w:name="structure-slides-for-the-reader"/>
+    <w:bookmarkEnd w:id="27"/>
+    <w:bookmarkStart w:id="29" w:name="structure-slides-for-the-reader"/>
     <w:p>
       <w:pPr>
         <w:pStyle w:val="Heading2"/>
@@ -1963,7 +2119,7 @@
       <w:r>
         <w:t xml:space="preserve"> </w:t>
       </w:r>
-      <w:hyperlink r:id="rId25">
+      <w:hyperlink r:id="rId28">
         <w:r>
           <w:rPr>
             <w:rStyle w:val="Hyperlink"/>
@@ -2203,8 +2359,8 @@
         <w:t xml:space="preserve">Put a slide break after the heading and move the text onto content slides.</w:t>
       </w:r>
     </w:p>
-    <w:bookmarkEnd w:id="26"/>
-    <w:bookmarkStart w:id="30" w:name="Xcb579568ef754486ebde8b41ba4528bdf380eec"/>
+    <w:bookmarkEnd w:id="29"/>
+    <w:bookmarkStart w:id="33" w:name="Xcb579568ef754486ebde8b41ba4528bdf380eec"/>
     <w:p>
       <w:pPr>
         <w:pStyle w:val="Heading2"/>
@@ -2263,7 +2419,7 @@
       <w:r>
         <w:t xml:space="preserve"> </w:t>
       </w:r>
-      <w:hyperlink r:id="rId27">
+      <w:hyperlink r:id="rId30">
         <w:r>
           <w:rPr>
             <w:rStyle w:val="Hyperlink"/>
@@ -2319,7 +2475,7 @@
       <w:r>
         <w:t xml:space="preserve"> </w:t>
       </w:r>
-      <w:hyperlink r:id="rId28">
+      <w:hyperlink r:id="rId31">
         <w:r>
           <w:rPr>
             <w:rStyle w:val="Hyperlink"/>
@@ -2348,7 +2504,7 @@
       <w:r>
         <w:t xml:space="preserve"> </w:t>
       </w:r>
-      <w:hyperlink r:id="rId29">
+      <w:hyperlink r:id="rId32">
         <w:r>
           <w:rPr>
             <w:rStyle w:val="Hyperlink"/>
@@ -2381,8 +2537,8 @@
         <w:t xml:space="preserve">because a bare citation key renders as the author list.</w:t>
       </w:r>
     </w:p>
-    <w:bookmarkEnd w:id="30"/>
-    <w:bookmarkStart w:id="39" w:name="rules-that-apply-to-all-writing"/>
+    <w:bookmarkEnd w:id="33"/>
+    <w:bookmarkStart w:id="42" w:name="rules-that-apply-to-all-writing"/>
     <w:p>
       <w:pPr>
         <w:pStyle w:val="Heading2"/>
@@ -2407,7 +2563,7 @@
           <w:numId w:val="1009"/>
         </w:numPr>
       </w:pPr>
-      <w:hyperlink r:id="rId31">
+      <w:hyperlink r:id="rId34">
         <w:r>
           <w:rPr>
             <w:rStyle w:val="Hyperlink"/>
@@ -2427,7 +2583,7 @@
           <w:numId w:val="1009"/>
         </w:numPr>
       </w:pPr>
-      <w:hyperlink r:id="rId32">
+      <w:hyperlink r:id="rId35">
         <w:r>
           <w:rPr>
             <w:rStyle w:val="Hyperlink"/>
@@ -2450,7 +2606,7 @@
           <w:numId w:val="1009"/>
         </w:numPr>
       </w:pPr>
-      <w:hyperlink r:id="rId33">
+      <w:hyperlink r:id="rId36">
         <w:r>
           <w:rPr>
             <w:rStyle w:val="Hyperlink"/>
@@ -2470,7 +2626,7 @@
           <w:numId w:val="1009"/>
         </w:numPr>
       </w:pPr>
-      <w:hyperlink r:id="rId34">
+      <w:hyperlink r:id="rId37">
         <w:r>
           <w:rPr>
             <w:rStyle w:val="Hyperlink"/>
@@ -2493,7 +2649,7 @@
           <w:numId w:val="1009"/>
         </w:numPr>
       </w:pPr>
-      <w:hyperlink r:id="rId35">
+      <w:hyperlink r:id="rId38">
         <w:r>
           <w:rPr>
             <w:rStyle w:val="Hyperlink"/>
@@ -2505,8 +2661,8 @@
         <w:t xml:space="preserve">.</w:t>
       </w:r>
     </w:p>
-    <w:bookmarkStart w:id="38" w:name="refs"/>
-    <w:bookmarkStart w:id="37" w:name="ref-freeman2014active"/>
+    <w:bookmarkStart w:id="41" w:name="refs"/>
+    <w:bookmarkStart w:id="40" w:name="ref-freeman2014active"/>
     <w:p>
       <w:pPr>
         <w:pStyle w:val="Bibliography"/>
@@ -2539,7 +2695,7 @@
       <w:r>
         <w:t xml:space="preserve"> </w:t>
       </w:r>
-      <w:hyperlink r:id="rId36">
+      <w:hyperlink r:id="rId39">
         <w:r>
           <w:rPr>
             <w:rStyle w:val="Hyperlink"/>
@@ -2551,9 +2707,9 @@
         <w:t xml:space="preserve">.</w:t>
       </w:r>
     </w:p>
-    <w:bookmarkEnd w:id="37"/>
-    <w:bookmarkEnd w:id="38"/>
-    <w:bookmarkEnd w:id="39"/>
+    <w:bookmarkEnd w:id="40"/>
+    <w:bookmarkEnd w:id="41"/>
+    <w:bookmarkEnd w:id="42"/>
     <w:sectPr>
       <w:footnotePr>
         <w:numRestart w:val="eachSect"/>

</xml_diff>

<commit_message>
Deploying to gh-pages from @ Morrison-Lab/psw@8a40f3ad4b9f1c151a23f174c68d27220997e92f 🚀
</commit_message>
<xml_diff>
--- a/chapters/teaching.docx
+++ b/chapters/teaching.docx
@@ -15,7 +15,7 @@
         <w:pStyle w:val="Date"/>
       </w:pPr>
       <w:r>
-        <w:t xml:space="preserve">Last modified: 2026-10-09 01:07:47 (PDT)</w:t>
+        <w:t xml:space="preserve">Last modified: 2026-10-09 10:05:43 (PDT)</w:t>
       </w:r>
     </w:p>
     <w:tbl>
@@ -1897,6 +1897,90 @@
       </w:pPr>
       <w:r>
         <w:t xml:space="preserve">Tell students where to get the data.</w:t>
+      </w:r>
+    </w:p>
+    <w:p>
+      <w:pPr>
+        <w:pStyle w:val="Compact"/>
+        <w:numPr>
+          <w:ilvl w:val="0"/>
+          <w:numId w:val="1005"/>
+        </w:numPr>
+      </w:pPr>
+      <w:r>
+        <w:t xml:space="preserve">Point students only to places they can open.</w:t>
+      </w:r>
+      <w:r>
+        <w:t xml:space="preserve"> </w:t>
+      </w:r>
+      <w:r>
+        <w:t xml:space="preserve">Students read a course’s published site, not its repository,</w:t>
+      </w:r>
+      <w:r>
+        <w:t xml:space="preserve"> </w:t>
+      </w:r>
+      <w:r>
+        <w:t xml:space="preserve">which is often private.</w:t>
+      </w:r>
+      <w:r>
+        <w:t xml:space="preserve"> </w:t>
+      </w:r>
+      <w:r>
+        <w:t xml:space="preserve">So never send them to a file in the repository,</w:t>
+      </w:r>
+      <w:r>
+        <w:t xml:space="preserve"> </w:t>
+      </w:r>
+      <w:r>
+        <w:t xml:space="preserve">to a</w:t>
+      </w:r>
+      <w:r>
+        <w:t xml:space="preserve"> </w:t>
+      </w:r>
+      <w:r>
+        <w:rPr>
+          <w:rStyle w:val="VerbatimChar"/>
+        </w:rPr>
+        <w:t xml:space="preserve">github.com</w:t>
+      </w:r>
+      <w:r>
+        <w:t xml:space="preserve"> </w:t>
+      </w:r>
+      <w:r>
+        <w:t xml:space="preserve">link into a private repository,</w:t>
+      </w:r>
+      <w:r>
+        <w:t xml:space="preserve"> </w:t>
+      </w:r>
+      <w:r>
+        <w:t xml:space="preserve">or to</w:t>
+      </w:r>
+      <w:r>
+        <w:t xml:space="preserve"> </w:t>
+      </w:r>
+      <w:r>
+        <w:t xml:space="preserve">“the copy in this repository”</w:t>
+      </w:r>
+      <w:r>
+        <w:t xml:space="preserve">.</w:t>
+      </w:r>
+      <w:r>
+        <w:t xml:space="preserve"> </w:t>
+      </w:r>
+      <w:r>
+        <w:t xml:space="preserve">Link a data file from the published site,</w:t>
+      </w:r>
+      <w:r>
+        <w:t xml:space="preserve"> </w:t>
+      </w:r>
+      <w:r>
+        <w:t xml:space="preserve">from a public repository or package,</w:t>
+      </w:r>
+      <w:r>
+        <w:t xml:space="preserve"> </w:t>
+      </w:r>
+      <w:r>
+        <w:t xml:space="preserve">or from the data’s original public source.</w:t>
       </w:r>
     </w:p>
     <w:p>

</xml_diff>

<commit_message>
Deploying to gh-pages from @ Morrison-Lab/psw@1f2b78201c3130332f4db6fd52979a6311151eee 🚀
</commit_message>
<xml_diff>
--- a/chapters/teaching.docx
+++ b/chapters/teaching.docx
@@ -15,7 +15,7 @@
         <w:pStyle w:val="Date"/>
       </w:pPr>
       <w:r>
-        <w:t xml:space="preserve">Last modified: 2026-10-09 10:05:43 (PDT)</w:t>
+        <w:t xml:space="preserve">Last modified: 2026-10-09 10:13:16 (PDT)</w:t>
       </w:r>
     </w:p>
     <w:tbl>
@@ -2008,13 +2008,27 @@
       </w:r>
     </w:p>
     <w:bookmarkEnd w:id="26"/>
-    <w:bookmarkStart w:id="27" w:name="make-figures-accessible"/>
+    <w:bookmarkStart w:id="35" w:name="present-r-results-with-modern-packages"/>
     <w:p>
       <w:pPr>
         <w:pStyle w:val="Heading2"/>
       </w:pPr>
       <w:r>
-        <w:t xml:space="preserve">9 Make figures accessible</w:t>
+        <w:t xml:space="preserve">9 Present R results with modern packages</w:t>
+      </w:r>
+    </w:p>
+    <w:p>
+      <w:pPr>
+        <w:pStyle w:val="FirstParagraph"/>
+      </w:pPr>
+      <w:r>
+        <w:t xml:space="preserve">This rule applies to all R code in teaching materials,</w:t>
+      </w:r>
+      <w:r>
+        <w:t xml:space="preserve"> </w:t>
+      </w:r>
+      <w:r>
+        <w:t xml:space="preserve">in every course and every teaching repository.</w:t>
       </w:r>
     </w:p>
     <w:p>
@@ -2026,6 +2040,401 @@
         </w:numPr>
       </w:pPr>
       <w:r>
+        <w:t xml:space="preserve">Even when you fit a model with a base R function such as</w:t>
+      </w:r>
+      <w:r>
+        <w:t xml:space="preserve"> </w:t>
+      </w:r>
+      <w:r>
+        <w:rPr>
+          <w:rStyle w:val="VerbatimChar"/>
+        </w:rPr>
+        <w:t xml:space="preserve">lm()</w:t>
+      </w:r>
+      <w:r>
+        <w:t xml:space="preserve"> </w:t>
+      </w:r>
+      <w:r>
+        <w:t xml:space="preserve">or</w:t>
+      </w:r>
+      <w:r>
+        <w:t xml:space="preserve"> </w:t>
+      </w:r>
+      <w:r>
+        <w:rPr>
+          <w:rStyle w:val="VerbatimChar"/>
+        </w:rPr>
+        <w:t xml:space="preserve">glm()</w:t>
+      </w:r>
+      <w:r>
+        <w:t xml:space="preserve">,</w:t>
+      </w:r>
+      <w:r>
+        <w:t xml:space="preserve"> </w:t>
+      </w:r>
+      <w:r>
+        <w:t xml:space="preserve">show its results with modern packages, not with base R output.</w:t>
+      </w:r>
+    </w:p>
+    <w:p>
+      <w:pPr>
+        <w:pStyle w:val="Compact"/>
+        <w:numPr>
+          <w:ilvl w:val="0"/>
+          <w:numId w:val="1006"/>
+        </w:numPr>
+      </w:pPr>
+      <w:r>
+        <w:t xml:space="preserve">Show coefficient tables with</w:t>
+      </w:r>
+      <w:r>
+        <w:t xml:space="preserve"> </w:t>
+      </w:r>
+      <w:hyperlink r:id="rId27">
+        <w:r>
+          <w:rPr>
+            <w:rStyle w:val="Hyperlink"/>
+          </w:rPr>
+          <w:t xml:space="preserve">parameters</w:t>
+        </w:r>
+      </w:hyperlink>
+      <w:r>
+        <w:t xml:space="preserve"> </w:t>
+      </w:r>
+      <w:r>
+        <w:t xml:space="preserve">(</w:t>
+      </w:r>
+      <w:r>
+        <w:rPr>
+          <w:rStyle w:val="VerbatimChar"/>
+        </w:rPr>
+        <w:t xml:space="preserve">parameters() |&gt; print_md()</w:t>
+      </w:r>
+      <w:r>
+        <w:t xml:space="preserve">)</w:t>
+      </w:r>
+      <w:r>
+        <w:t xml:space="preserve"> </w:t>
+      </w:r>
+      <w:r>
+        <w:t xml:space="preserve">or</w:t>
+      </w:r>
+      <w:r>
+        <w:t xml:space="preserve"> </w:t>
+      </w:r>
+      <w:hyperlink r:id="rId28">
+        <w:r>
+          <w:rPr>
+            <w:rStyle w:val="Hyperlink"/>
+          </w:rPr>
+          <w:t xml:space="preserve">gtsummary</w:t>
+        </w:r>
+      </w:hyperlink>
+      <w:r>
+        <w:t xml:space="preserve"> </w:t>
+      </w:r>
+      <w:r>
+        <w:t xml:space="preserve">(</w:t>
+      </w:r>
+      <w:r>
+        <w:rPr>
+          <w:rStyle w:val="VerbatimChar"/>
+        </w:rPr>
+        <w:t xml:space="preserve">tbl_regression()</w:t>
+      </w:r>
+      <w:r>
+        <w:t xml:space="preserve">),</w:t>
+      </w:r>
+      <w:r>
+        <w:t xml:space="preserve"> </w:t>
+      </w:r>
+      <w:r>
+        <w:t xml:space="preserve">not with</w:t>
+      </w:r>
+      <w:r>
+        <w:t xml:space="preserve"> </w:t>
+      </w:r>
+      <w:r>
+        <w:rPr>
+          <w:rStyle w:val="VerbatimChar"/>
+        </w:rPr>
+        <w:t xml:space="preserve">summary()</w:t>
+      </w:r>
+      <w:r>
+        <w:t xml:space="preserve"> </w:t>
+      </w:r>
+      <w:r>
+        <w:t xml:space="preserve">or</w:t>
+      </w:r>
+      <w:r>
+        <w:t xml:space="preserve"> </w:t>
+      </w:r>
+      <w:r>
+        <w:rPr>
+          <w:rStyle w:val="VerbatimChar"/>
+        </w:rPr>
+        <w:t xml:space="preserve">coef(summary())</w:t>
+      </w:r>
+      <w:r>
+        <w:t xml:space="preserve"> </w:t>
+      </w:r>
+      <w:r>
+        <w:t xml:space="preserve">printouts.</w:t>
+      </w:r>
+    </w:p>
+    <w:p>
+      <w:pPr>
+        <w:pStyle w:val="Compact"/>
+        <w:numPr>
+          <w:ilvl w:val="0"/>
+          <w:numId w:val="1006"/>
+        </w:numPr>
+      </w:pPr>
+      <w:r>
+        <w:t xml:space="preserve">Draw figures with</w:t>
+      </w:r>
+      <w:r>
+        <w:t xml:space="preserve"> </w:t>
+      </w:r>
+      <w:hyperlink r:id="rId29">
+        <w:r>
+          <w:rPr>
+            <w:rStyle w:val="Hyperlink"/>
+          </w:rPr>
+          <w:t xml:space="preserve">ggplot2</w:t>
+        </w:r>
+      </w:hyperlink>
+      <w:r>
+        <w:t xml:space="preserve">,</w:t>
+      </w:r>
+      <w:r>
+        <w:t xml:space="preserve"> </w:t>
+      </w:r>
+      <w:r>
+        <w:t xml:space="preserve">not with base graphics such as</w:t>
+      </w:r>
+      <w:r>
+        <w:t xml:space="preserve"> </w:t>
+      </w:r>
+      <w:r>
+        <w:rPr>
+          <w:rStyle w:val="VerbatimChar"/>
+        </w:rPr>
+        <w:t xml:space="preserve">plot()</w:t>
+      </w:r>
+      <w:r>
+        <w:t xml:space="preserve">,</w:t>
+      </w:r>
+      <w:r>
+        <w:t xml:space="preserve"> </w:t>
+      </w:r>
+      <w:r>
+        <w:rPr>
+          <w:rStyle w:val="VerbatimChar"/>
+        </w:rPr>
+        <w:t xml:space="preserve">lines()</w:t>
+      </w:r>
+      <w:r>
+        <w:t xml:space="preserve"> </w:t>
+      </w:r>
+      <w:r>
+        <w:t xml:space="preserve">and</w:t>
+      </w:r>
+      <w:r>
+        <w:t xml:space="preserve"> </w:t>
+      </w:r>
+      <w:r>
+        <w:rPr>
+          <w:rStyle w:val="VerbatimChar"/>
+        </w:rPr>
+        <w:t xml:space="preserve">abline()</w:t>
+      </w:r>
+      <w:r>
+        <w:t xml:space="preserve">.</w:t>
+      </w:r>
+    </w:p>
+    <w:p>
+      <w:pPr>
+        <w:pStyle w:val="Compact"/>
+        <w:numPr>
+          <w:ilvl w:val="0"/>
+          <w:numId w:val="1006"/>
+        </w:numPr>
+      </w:pPr>
+      <w:r>
+        <w:t xml:space="preserve">Draw model plots with packages built on ggplot2:</w:t>
+      </w:r>
+      <w:r>
+        <w:t xml:space="preserve"> </w:t>
+      </w:r>
+      <w:hyperlink r:id="rId30">
+        <w:r>
+          <w:rPr>
+            <w:rStyle w:val="Hyperlink"/>
+          </w:rPr>
+          <w:t xml:space="preserve">sjPlot</w:t>
+        </w:r>
+      </w:hyperlink>
+      <w:r>
+        <w:t xml:space="preserve"> </w:t>
+      </w:r>
+      <w:r>
+        <w:t xml:space="preserve">or</w:t>
+      </w:r>
+      <w:r>
+        <w:t xml:space="preserve"> </w:t>
+      </w:r>
+      <w:hyperlink r:id="rId31">
+        <w:r>
+          <w:rPr>
+            <w:rStyle w:val="Hyperlink"/>
+          </w:rPr>
+          <w:t xml:space="preserve">ggeffects</w:t>
+        </w:r>
+      </w:hyperlink>
+      <w:r>
+        <w:t xml:space="preserve"> </w:t>
+      </w:r>
+      <w:r>
+        <w:t xml:space="preserve">for predictions,</w:t>
+      </w:r>
+      <w:r>
+        <w:t xml:space="preserve"> </w:t>
+      </w:r>
+      <w:r>
+        <w:t xml:space="preserve">and</w:t>
+      </w:r>
+      <w:r>
+        <w:t xml:space="preserve"> </w:t>
+      </w:r>
+      <w:hyperlink r:id="rId32">
+        <w:r>
+          <w:rPr>
+            <w:rStyle w:val="Hyperlink"/>
+          </w:rPr>
+          <w:t xml:space="preserve">performance</w:t>
+        </w:r>
+      </w:hyperlink>
+      <w:r>
+        <w:t xml:space="preserve">’s</w:t>
+      </w:r>
+      <w:r>
+        <w:t xml:space="preserve"> </w:t>
+      </w:r>
+      <w:r>
+        <w:rPr>
+          <w:rStyle w:val="VerbatimChar"/>
+        </w:rPr>
+        <w:t xml:space="preserve">check_model()</w:t>
+      </w:r>
+      <w:r>
+        <w:t xml:space="preserve"> </w:t>
+      </w:r>
+      <w:r>
+        <w:t xml:space="preserve">for diagnostic plots.</w:t>
+      </w:r>
+    </w:p>
+    <w:p>
+      <w:pPr>
+        <w:pStyle w:val="Compact"/>
+        <w:numPr>
+          <w:ilvl w:val="0"/>
+          <w:numId w:val="1006"/>
+        </w:numPr>
+      </w:pPr>
+      <w:r>
+        <w:t xml:space="preserve">Show model fit statistics with performance’s</w:t>
+      </w:r>
+      <w:r>
+        <w:t xml:space="preserve"> </w:t>
+      </w:r>
+      <w:r>
+        <w:rPr>
+          <w:rStyle w:val="VerbatimChar"/>
+        </w:rPr>
+        <w:t xml:space="preserve">model_performance()</w:t>
+      </w:r>
+      <w:r>
+        <w:t xml:space="preserve"> </w:t>
+      </w:r>
+      <w:r>
+        <w:t xml:space="preserve">or</w:t>
+      </w:r>
+      <w:r>
+        <w:t xml:space="preserve"> </w:t>
+      </w:r>
+      <w:hyperlink r:id="rId33">
+        <w:r>
+          <w:rPr>
+            <w:rStyle w:val="Hyperlink"/>
+          </w:rPr>
+          <w:t xml:space="preserve">broom</w:t>
+        </w:r>
+      </w:hyperlink>
+      <w:r>
+        <w:t xml:space="preserve">’s</w:t>
+      </w:r>
+      <w:r>
+        <w:t xml:space="preserve"> </w:t>
+      </w:r>
+      <w:r>
+        <w:rPr>
+          <w:rStyle w:val="VerbatimChar"/>
+        </w:rPr>
+        <w:t xml:space="preserve">glance()</w:t>
+      </w:r>
+      <w:r>
+        <w:t xml:space="preserve">.</w:t>
+      </w:r>
+    </w:p>
+    <w:p>
+      <w:pPr>
+        <w:pStyle w:val="Compact"/>
+        <w:numPr>
+          <w:ilvl w:val="0"/>
+          <w:numId w:val="1006"/>
+        </w:numPr>
+      </w:pPr>
+      <w:r>
+        <w:t xml:space="preserve">Ezra’s</w:t>
+      </w:r>
+      <w:r>
+        <w:t xml:space="preserve"> </w:t>
+      </w:r>
+      <w:hyperlink r:id="rId34">
+        <w:r>
+          <w:rPr>
+            <w:rStyle w:val="Hyperlink"/>
+          </w:rPr>
+          <w:t xml:space="preserve">rme</w:t>
+        </w:r>
+      </w:hyperlink>
+      <w:r>
+        <w:t xml:space="preserve"> </w:t>
+      </w:r>
+      <w:r>
+        <w:t xml:space="preserve">notes show the style.</w:t>
+      </w:r>
+    </w:p>
+    <w:bookmarkEnd w:id="35"/>
+    <w:bookmarkStart w:id="36" w:name="make-figures-accessible"/>
+    <w:p>
+      <w:pPr>
+        <w:pStyle w:val="Heading2"/>
+      </w:pPr>
+      <w:r>
+        <w:t xml:space="preserve">10 Make figures accessible</w:t>
+      </w:r>
+    </w:p>
+    <w:p>
+      <w:pPr>
+        <w:pStyle w:val="Compact"/>
+        <w:numPr>
+          <w:ilvl w:val="0"/>
+          <w:numId w:val="1007"/>
+        </w:numPr>
+      </w:pPr>
+      <w:r>
         <w:t xml:space="preserve">Wrap each figure, including an interactive one, in a</w:t>
       </w:r>
       <w:r>
@@ -2049,7 +2458,7 @@
         <w:pStyle w:val="Compact"/>
         <w:numPr>
           <w:ilvl w:val="0"/>
-          <w:numId w:val="1006"/>
+          <w:numId w:val="1007"/>
         </w:numPr>
       </w:pPr>
       <w:r>
@@ -2079,7 +2488,7 @@
         <w:pStyle w:val="Compact"/>
         <w:numPr>
           <w:ilvl w:val="0"/>
-          <w:numId w:val="1006"/>
+          <w:numId w:val="1007"/>
         </w:numPr>
       </w:pPr>
       <w:r>
@@ -2118,7 +2527,7 @@
         <w:pStyle w:val="Compact"/>
         <w:numPr>
           <w:ilvl w:val="0"/>
-          <w:numId w:val="1006"/>
+          <w:numId w:val="1007"/>
         </w:numPr>
       </w:pPr>
       <w:r>
@@ -2143,22 +2552,22 @@
         <w:t xml:space="preserve">(observed when rendering lecture notes to PDF).</w:t>
       </w:r>
     </w:p>
-    <w:bookmarkEnd w:id="27"/>
-    <w:bookmarkStart w:id="29" w:name="structure-slides-for-the-reader"/>
+    <w:bookmarkEnd w:id="36"/>
+    <w:bookmarkStart w:id="38" w:name="structure-slides-for-the-reader"/>
     <w:p>
       <w:pPr>
         <w:pStyle w:val="Heading2"/>
       </w:pPr>
       <w:r>
-        <w:t xml:space="preserve">10 Structure slides for the reader</w:t>
-      </w:r>
-    </w:p>
-    <w:p>
-      <w:pPr>
-        <w:pStyle w:val="Compact"/>
-        <w:numPr>
-          <w:ilvl w:val="0"/>
-          <w:numId w:val="1007"/>
+        <w:t xml:space="preserve">11 Structure slides for the reader</w:t>
+      </w:r>
+    </w:p>
+    <w:p>
+      <w:pPr>
+        <w:pStyle w:val="Compact"/>
+        <w:numPr>
+          <w:ilvl w:val="0"/>
+          <w:numId w:val="1008"/>
         </w:numPr>
       </w:pPr>
       <w:r>
@@ -2188,7 +2597,7 @@
         <w:pStyle w:val="Compact"/>
         <w:numPr>
           <w:ilvl w:val="0"/>
-          <w:numId w:val="1007"/>
+          <w:numId w:val="1008"/>
         </w:numPr>
       </w:pPr>
       <w:r>
@@ -2203,7 +2612,7 @@
       <w:r>
         <w:t xml:space="preserve"> </w:t>
       </w:r>
-      <w:hyperlink r:id="rId28">
+      <w:hyperlink r:id="rId37">
         <w:r>
           <w:rPr>
             <w:rStyle w:val="Hyperlink"/>
@@ -2223,7 +2632,7 @@
         <w:pStyle w:val="Compact"/>
         <w:numPr>
           <w:ilvl w:val="0"/>
-          <w:numId w:val="1007"/>
+          <w:numId w:val="1008"/>
         </w:numPr>
       </w:pPr>
       <w:r>
@@ -2250,7 +2659,7 @@
         <w:pStyle w:val="Compact"/>
         <w:numPr>
           <w:ilvl w:val="0"/>
-          <w:numId w:val="1007"/>
+          <w:numId w:val="1008"/>
         </w:numPr>
       </w:pPr>
       <w:r>
@@ -2319,7 +2728,7 @@
         <w:pStyle w:val="Compact"/>
         <w:numPr>
           <w:ilvl w:val="0"/>
-          <w:numId w:val="1007"/>
+          <w:numId w:val="1008"/>
         </w:numPr>
       </w:pPr>
       <w:r>
@@ -2388,7 +2797,7 @@
         <w:pStyle w:val="Compact"/>
         <w:numPr>
           <w:ilvl w:val="0"/>
-          <w:numId w:val="1007"/>
+          <w:numId w:val="1008"/>
         </w:numPr>
       </w:pPr>
       <w:r>
@@ -2412,7 +2821,7 @@
         <w:pStyle w:val="Compact"/>
         <w:numPr>
           <w:ilvl w:val="0"/>
-          <w:numId w:val="1007"/>
+          <w:numId w:val="1008"/>
         </w:numPr>
       </w:pPr>
       <w:r>
@@ -2443,22 +2852,22 @@
         <w:t xml:space="preserve">Put a slide break after the heading and move the text onto content slides.</w:t>
       </w:r>
     </w:p>
-    <w:bookmarkEnd w:id="29"/>
-    <w:bookmarkStart w:id="33" w:name="Xcb579568ef754486ebde8b41ba4528bdf380eec"/>
+    <w:bookmarkEnd w:id="38"/>
+    <w:bookmarkStart w:id="42" w:name="Xcb579568ef754486ebde8b41ba4528bdf380eec"/>
     <w:p>
       <w:pPr>
         <w:pStyle w:val="Heading2"/>
       </w:pPr>
       <w:r>
-        <w:t xml:space="preserve">11 Credit other courses without summarizing them</w:t>
-      </w:r>
-    </w:p>
-    <w:p>
-      <w:pPr>
-        <w:pStyle w:val="Compact"/>
-        <w:numPr>
-          <w:ilvl w:val="0"/>
-          <w:numId w:val="1008"/>
+        <w:t xml:space="preserve">12 Credit other courses without summarizing them</w:t>
+      </w:r>
+    </w:p>
+    <w:p>
+      <w:pPr>
+        <w:pStyle w:val="Compact"/>
+        <w:numPr>
+          <w:ilvl w:val="0"/>
+          <w:numId w:val="1009"/>
         </w:numPr>
       </w:pPr>
       <w:r>
@@ -2503,7 +2912,7 @@
       <w:r>
         <w:t xml:space="preserve"> </w:t>
       </w:r>
-      <w:hyperlink r:id="rId30">
+      <w:hyperlink r:id="rId39">
         <w:r>
           <w:rPr>
             <w:rStyle w:val="Hyperlink"/>
@@ -2544,7 +2953,7 @@
         <w:pStyle w:val="Compact"/>
         <w:numPr>
           <w:ilvl w:val="0"/>
-          <w:numId w:val="1008"/>
+          <w:numId w:val="1009"/>
         </w:numPr>
       </w:pPr>
       <w:r>
@@ -2559,7 +2968,7 @@
       <w:r>
         <w:t xml:space="preserve"> </w:t>
       </w:r>
-      <w:hyperlink r:id="rId31">
+      <w:hyperlink r:id="rId40">
         <w:r>
           <w:rPr>
             <w:rStyle w:val="Hyperlink"/>
@@ -2579,7 +2988,7 @@
         <w:pStyle w:val="Compact"/>
         <w:numPr>
           <w:ilvl w:val="0"/>
-          <w:numId w:val="1008"/>
+          <w:numId w:val="1009"/>
         </w:numPr>
       </w:pPr>
       <w:r>
@@ -2588,7 +2997,7 @@
       <w:r>
         <w:t xml:space="preserve"> </w:t>
       </w:r>
-      <w:hyperlink r:id="rId32">
+      <w:hyperlink r:id="rId41">
         <w:r>
           <w:rPr>
             <w:rStyle w:val="Hyperlink"/>
@@ -2608,7 +3017,7 @@
         <w:pStyle w:val="Compact"/>
         <w:numPr>
           <w:ilvl w:val="0"/>
-          <w:numId w:val="1008"/>
+          <w:numId w:val="1009"/>
         </w:numPr>
       </w:pPr>
       <w:r>
@@ -2621,14 +3030,14 @@
         <w:t xml:space="preserve">because a bare citation key renders as the author list.</w:t>
       </w:r>
     </w:p>
-    <w:bookmarkEnd w:id="33"/>
-    <w:bookmarkStart w:id="42" w:name="rules-that-apply-to-all-writing"/>
+    <w:bookmarkEnd w:id="42"/>
+    <w:bookmarkStart w:id="51" w:name="rules-that-apply-to-all-writing"/>
     <w:p>
       <w:pPr>
         <w:pStyle w:val="Heading2"/>
       </w:pPr>
       <w:r>
-        <w:t xml:space="preserve">12 Rules that apply to all writing</w:t>
+        <w:t xml:space="preserve">13 Rules that apply to all writing</w:t>
       </w:r>
     </w:p>
     <w:p>
@@ -2644,10 +3053,10 @@
         <w:pStyle w:val="Compact"/>
         <w:numPr>
           <w:ilvl w:val="0"/>
-          <w:numId w:val="1009"/>
-        </w:numPr>
-      </w:pPr>
-      <w:hyperlink r:id="rId34">
+          <w:numId w:val="1010"/>
+        </w:numPr>
+      </w:pPr>
+      <w:hyperlink r:id="rId43">
         <w:r>
           <w:rPr>
             <w:rStyle w:val="Hyperlink"/>
@@ -2664,10 +3073,10 @@
         <w:pStyle w:val="Compact"/>
         <w:numPr>
           <w:ilvl w:val="0"/>
-          <w:numId w:val="1009"/>
-        </w:numPr>
-      </w:pPr>
-      <w:hyperlink r:id="rId35">
+          <w:numId w:val="1010"/>
+        </w:numPr>
+      </w:pPr>
+      <w:hyperlink r:id="rId44">
         <w:r>
           <w:rPr>
             <w:rStyle w:val="Hyperlink"/>
@@ -2687,10 +3096,10 @@
         <w:pStyle w:val="Compact"/>
         <w:numPr>
           <w:ilvl w:val="0"/>
-          <w:numId w:val="1009"/>
-        </w:numPr>
-      </w:pPr>
-      <w:hyperlink r:id="rId36">
+          <w:numId w:val="1010"/>
+        </w:numPr>
+      </w:pPr>
+      <w:hyperlink r:id="rId45">
         <w:r>
           <w:rPr>
             <w:rStyle w:val="Hyperlink"/>
@@ -2707,10 +3116,10 @@
         <w:pStyle w:val="Compact"/>
         <w:numPr>
           <w:ilvl w:val="0"/>
-          <w:numId w:val="1009"/>
-        </w:numPr>
-      </w:pPr>
-      <w:hyperlink r:id="rId37">
+          <w:numId w:val="1010"/>
+        </w:numPr>
+      </w:pPr>
+      <w:hyperlink r:id="rId46">
         <w:r>
           <w:rPr>
             <w:rStyle w:val="Hyperlink"/>
@@ -2730,10 +3139,10 @@
         <w:pStyle w:val="Compact"/>
         <w:numPr>
           <w:ilvl w:val="0"/>
-          <w:numId w:val="1009"/>
-        </w:numPr>
-      </w:pPr>
-      <w:hyperlink r:id="rId38">
+          <w:numId w:val="1010"/>
+        </w:numPr>
+      </w:pPr>
+      <w:hyperlink r:id="rId47">
         <w:r>
           <w:rPr>
             <w:rStyle w:val="Hyperlink"/>
@@ -2745,8 +3154,8 @@
         <w:t xml:space="preserve">.</w:t>
       </w:r>
     </w:p>
-    <w:bookmarkStart w:id="41" w:name="refs"/>
-    <w:bookmarkStart w:id="40" w:name="ref-freeman2014active"/>
+    <w:bookmarkStart w:id="50" w:name="refs"/>
+    <w:bookmarkStart w:id="49" w:name="ref-freeman2014active"/>
     <w:p>
       <w:pPr>
         <w:pStyle w:val="Bibliography"/>
@@ -2779,7 +3188,7 @@
       <w:r>
         <w:t xml:space="preserve"> </w:t>
       </w:r>
-      <w:hyperlink r:id="rId39">
+      <w:hyperlink r:id="rId48">
         <w:r>
           <w:rPr>
             <w:rStyle w:val="Hyperlink"/>
@@ -2791,9 +3200,9 @@
         <w:t xml:space="preserve">.</w:t>
       </w:r>
     </w:p>
-    <w:bookmarkEnd w:id="40"/>
-    <w:bookmarkEnd w:id="41"/>
-    <w:bookmarkEnd w:id="42"/>
+    <w:bookmarkEnd w:id="49"/>
+    <w:bookmarkEnd w:id="50"/>
+    <w:bookmarkEnd w:id="51"/>
     <w:sectPr>
       <w:footnotePr>
         <w:numRestart w:val="eachSect"/>
@@ -3035,6 +3444,9 @@
     <w:abstractNumId w:val="991"/>
   </w:num>
   <w:num w:numId="1009">
+    <w:abstractNumId w:val="991"/>
+  </w:num>
+  <w:num w:numId="1010">
     <w:abstractNumId w:val="991"/>
   </w:num>
 </w:numbering>

</xml_diff>

<commit_message>
Deploying to gh-pages from @ Morrison-Lab/psw@6f2dcd3d9d45edea25521a03ae5d4cfab9495a05 🚀
</commit_message>
<xml_diff>
--- a/chapters/teaching.docx
+++ b/chapters/teaching.docx
@@ -15,7 +15,7 @@
         <w:pStyle w:val="Date"/>
       </w:pPr>
       <w:r>
-        <w:t xml:space="preserve">Last modified: 2026-10-09 10:37:21 (PDT)</w:t>
+        <w:t xml:space="preserve">Last modified: 2026-10-09 11:38:54 (PDT)</w:t>
       </w:r>
     </w:p>
     <w:tbl>
@@ -2417,13 +2417,27 @@
       </w:r>
     </w:p>
     <w:bookmarkEnd w:id="35"/>
-    <w:bookmarkStart w:id="36" w:name="make-figures-accessible"/>
+    <w:bookmarkStart w:id="39" w:name="manipulate-data-with-dplyr-not-base-r"/>
     <w:p>
       <w:pPr>
         <w:pStyle w:val="Heading2"/>
       </w:pPr>
       <w:r>
-        <w:t xml:space="preserve">10 Make figures accessible</w:t>
+        <w:t xml:space="preserve">10 Manipulate data with dplyr, not base R</w:t>
+      </w:r>
+    </w:p>
+    <w:p>
+      <w:pPr>
+        <w:pStyle w:val="FirstParagraph"/>
+      </w:pPr>
+      <w:r>
+        <w:t xml:space="preserve">This rule applies to all R code in teaching materials,</w:t>
+      </w:r>
+      <w:r>
+        <w:t xml:space="preserve"> </w:t>
+      </w:r>
+      <w:r>
+        <w:t xml:space="preserve">in every course and every teaching repository.</w:t>
       </w:r>
     </w:p>
     <w:p>
@@ -2435,6 +2449,370 @@
         </w:numPr>
       </w:pPr>
       <w:r>
+        <w:t xml:space="preserve">Select columns with</w:t>
+      </w:r>
+      <w:r>
+        <w:t xml:space="preserve"> </w:t>
+      </w:r>
+      <w:hyperlink r:id="rId36">
+        <w:r>
+          <w:rPr>
+            <w:rStyle w:val="Hyperlink"/>
+          </w:rPr>
+          <w:t xml:space="preserve">dplyr</w:t>
+        </w:r>
+      </w:hyperlink>
+      <w:r>
+        <w:t xml:space="preserve">’s</w:t>
+      </w:r>
+      <w:r>
+        <w:t xml:space="preserve"> </w:t>
+      </w:r>
+      <w:r>
+        <w:rPr>
+          <w:rStyle w:val="VerbatimChar"/>
+        </w:rPr>
+        <w:t xml:space="preserve">select()</w:t>
+      </w:r>
+      <w:r>
+        <w:t xml:space="preserve">,</w:t>
+      </w:r>
+      <w:r>
+        <w:t xml:space="preserve"> </w:t>
+      </w:r>
+      <w:r>
+        <w:t xml:space="preserve">not with</w:t>
+      </w:r>
+      <w:r>
+        <w:t xml:space="preserve"> </w:t>
+      </w:r>
+      <w:r>
+        <w:rPr>
+          <w:rStyle w:val="VerbatimChar"/>
+        </w:rPr>
+        <w:t xml:space="preserve">df[, c("a", "b")]</w:t>
+      </w:r>
+      <w:r>
+        <w:t xml:space="preserve"> </w:t>
+      </w:r>
+      <w:r>
+        <w:t xml:space="preserve">or</w:t>
+      </w:r>
+      <w:r>
+        <w:t xml:space="preserve"> </w:t>
+      </w:r>
+      <w:r>
+        <w:rPr>
+          <w:rStyle w:val="VerbatimChar"/>
+        </w:rPr>
+        <w:t xml:space="preserve">df[c("a", "b")]</w:t>
+      </w:r>
+      <w:r>
+        <w:t xml:space="preserve">.</w:t>
+      </w:r>
+    </w:p>
+    <w:p>
+      <w:pPr>
+        <w:pStyle w:val="Compact"/>
+        <w:numPr>
+          <w:ilvl w:val="0"/>
+          <w:numId w:val="1007"/>
+        </w:numPr>
+      </w:pPr>
+      <w:r>
+        <w:t xml:space="preserve">Filter rows with</w:t>
+      </w:r>
+      <w:r>
+        <w:t xml:space="preserve"> </w:t>
+      </w:r>
+      <w:r>
+        <w:rPr>
+          <w:rStyle w:val="VerbatimChar"/>
+        </w:rPr>
+        <w:t xml:space="preserve">filter()</w:t>
+      </w:r>
+      <w:r>
+        <w:t xml:space="preserve">, not with</w:t>
+      </w:r>
+      <w:r>
+        <w:t xml:space="preserve"> </w:t>
+      </w:r>
+      <w:r>
+        <w:rPr>
+          <w:rStyle w:val="VerbatimChar"/>
+        </w:rPr>
+        <w:t xml:space="preserve">df[df$x &gt; 0, ]</w:t>
+      </w:r>
+      <w:r>
+        <w:t xml:space="preserve"> </w:t>
+      </w:r>
+      <w:r>
+        <w:t xml:space="preserve">or</w:t>
+      </w:r>
+      <w:r>
+        <w:t xml:space="preserve"> </w:t>
+      </w:r>
+      <w:r>
+        <w:rPr>
+          <w:rStyle w:val="VerbatimChar"/>
+        </w:rPr>
+        <w:t xml:space="preserve">subset()</w:t>
+      </w:r>
+      <w:r>
+        <w:t xml:space="preserve">.</w:t>
+      </w:r>
+    </w:p>
+    <w:p>
+      <w:pPr>
+        <w:pStyle w:val="Compact"/>
+        <w:numPr>
+          <w:ilvl w:val="0"/>
+          <w:numId w:val="1007"/>
+        </w:numPr>
+      </w:pPr>
+      <w:r>
+        <w:t xml:space="preserve">Add or change columns with</w:t>
+      </w:r>
+      <w:r>
+        <w:t xml:space="preserve"> </w:t>
+      </w:r>
+      <w:r>
+        <w:rPr>
+          <w:rStyle w:val="VerbatimChar"/>
+        </w:rPr>
+        <w:t xml:space="preserve">mutate()</w:t>
+      </w:r>
+      <w:r>
+        <w:t xml:space="preserve">, not with</w:t>
+      </w:r>
+      <w:r>
+        <w:t xml:space="preserve"> </w:t>
+      </w:r>
+      <w:r>
+        <w:rPr>
+          <w:rStyle w:val="VerbatimChar"/>
+        </w:rPr>
+        <w:t xml:space="preserve">df$new &lt;- ...</w:t>
+      </w:r>
+      <w:r>
+        <w:t xml:space="preserve">.</w:t>
+      </w:r>
+    </w:p>
+    <w:p>
+      <w:pPr>
+        <w:pStyle w:val="Compact"/>
+        <w:numPr>
+          <w:ilvl w:val="0"/>
+          <w:numId w:val="1007"/>
+        </w:numPr>
+      </w:pPr>
+      <w:r>
+        <w:t xml:space="preserve">Drop rows with missing values with</w:t>
+      </w:r>
+      <w:r>
+        <w:t xml:space="preserve"> </w:t>
+      </w:r>
+      <w:hyperlink r:id="rId37">
+        <w:r>
+          <w:rPr>
+            <w:rStyle w:val="Hyperlink"/>
+          </w:rPr>
+          <w:t xml:space="preserve">tidyr</w:t>
+        </w:r>
+      </w:hyperlink>
+      <w:r>
+        <w:t xml:space="preserve">’s</w:t>
+      </w:r>
+      <w:r>
+        <w:t xml:space="preserve"> </w:t>
+      </w:r>
+      <w:r>
+        <w:rPr>
+          <w:rStyle w:val="VerbatimChar"/>
+        </w:rPr>
+        <w:t xml:space="preserve">drop_na()</w:t>
+      </w:r>
+      <w:r>
+        <w:t xml:space="preserve">,</w:t>
+      </w:r>
+      <w:r>
+        <w:t xml:space="preserve"> </w:t>
+      </w:r>
+      <w:r>
+        <w:t xml:space="preserve">not with</w:t>
+      </w:r>
+      <w:r>
+        <w:t xml:space="preserve"> </w:t>
+      </w:r>
+      <w:r>
+        <w:rPr>
+          <w:rStyle w:val="VerbatimChar"/>
+        </w:rPr>
+        <w:t xml:space="preserve">df[complete.cases(df), ]</w:t>
+      </w:r>
+      <w:r>
+        <w:t xml:space="preserve">.</w:t>
+      </w:r>
+    </w:p>
+    <w:p>
+      <w:pPr>
+        <w:pStyle w:val="Compact"/>
+        <w:numPr>
+          <w:ilvl w:val="0"/>
+          <w:numId w:val="1007"/>
+        </w:numPr>
+      </w:pPr>
+      <w:r>
+        <w:t xml:space="preserve">Stack data frames with</w:t>
+      </w:r>
+      <w:r>
+        <w:t xml:space="preserve"> </w:t>
+      </w:r>
+      <w:r>
+        <w:rPr>
+          <w:rStyle w:val="VerbatimChar"/>
+        </w:rPr>
+        <w:t xml:space="preserve">bind_rows()</w:t>
+      </w:r>
+      <w:r>
+        <w:t xml:space="preserve">, not with</w:t>
+      </w:r>
+      <w:r>
+        <w:t xml:space="preserve"> </w:t>
+      </w:r>
+      <w:r>
+        <w:rPr>
+          <w:rStyle w:val="VerbatimChar"/>
+        </w:rPr>
+        <w:t xml:space="preserve">rbind()</w:t>
+      </w:r>
+      <w:r>
+        <w:t xml:space="preserve">.</w:t>
+      </w:r>
+    </w:p>
+    <w:p>
+      <w:pPr>
+        <w:pStyle w:val="Compact"/>
+        <w:numPr>
+          <w:ilvl w:val="0"/>
+          <w:numId w:val="1007"/>
+        </w:numPr>
+      </w:pPr>
+      <w:r>
+        <w:t xml:space="preserve">Build data frames with</w:t>
+      </w:r>
+      <w:r>
+        <w:t xml:space="preserve"> </w:t>
+      </w:r>
+      <w:hyperlink r:id="rId38">
+        <w:r>
+          <w:rPr>
+            <w:rStyle w:val="Hyperlink"/>
+          </w:rPr>
+          <w:t xml:space="preserve">tibble</w:t>
+        </w:r>
+      </w:hyperlink>
+      <w:r>
+        <w:t xml:space="preserve">’s</w:t>
+      </w:r>
+      <w:r>
+        <w:t xml:space="preserve"> </w:t>
+      </w:r>
+      <w:r>
+        <w:rPr>
+          <w:rStyle w:val="VerbatimChar"/>
+        </w:rPr>
+        <w:t xml:space="preserve">tibble()</w:t>
+      </w:r>
+      <w:r>
+        <w:t xml:space="preserve">,</w:t>
+      </w:r>
+      <w:r>
+        <w:t xml:space="preserve"> </w:t>
+      </w:r>
+      <w:r>
+        <w:t xml:space="preserve">not with</w:t>
+      </w:r>
+      <w:r>
+        <w:t xml:space="preserve"> </w:t>
+      </w:r>
+      <w:r>
+        <w:rPr>
+          <w:rStyle w:val="VerbatimChar"/>
+        </w:rPr>
+        <w:t xml:space="preserve">data.frame()</w:t>
+      </w:r>
+      <w:r>
+        <w:t xml:space="preserve">.</w:t>
+      </w:r>
+    </w:p>
+    <w:p>
+      <w:pPr>
+        <w:pStyle w:val="Compact"/>
+        <w:numPr>
+          <w:ilvl w:val="0"/>
+          <w:numId w:val="1007"/>
+        </w:numPr>
+      </w:pPr>
+      <w:r>
+        <w:t xml:space="preserve">Chain steps with the native pipe</w:t>
+      </w:r>
+      <w:r>
+        <w:t xml:space="preserve"> </w:t>
+      </w:r>
+      <w:r>
+        <w:rPr>
+          <w:rStyle w:val="VerbatimChar"/>
+        </w:rPr>
+        <w:t xml:space="preserve">|&gt;</w:t>
+      </w:r>
+      <w:r>
+        <w:t xml:space="preserve">.</w:t>
+      </w:r>
+    </w:p>
+    <w:p>
+      <w:pPr>
+        <w:pStyle w:val="Compact"/>
+        <w:numPr>
+          <w:ilvl w:val="0"/>
+          <w:numId w:val="1007"/>
+        </w:numPr>
+      </w:pPr>
+      <w:r>
+        <w:t xml:space="preserve">Reading one value out of a data frame for inline code is fine,</w:t>
+      </w:r>
+      <w:r>
+        <w:t xml:space="preserve"> </w:t>
+      </w:r>
+      <w:r>
+        <w:t xml:space="preserve">as is indexing a matrix or a vector.</w:t>
+      </w:r>
+      <w:r>
+        <w:t xml:space="preserve"> </w:t>
+      </w:r>
+      <w:r>
+        <w:t xml:space="preserve">The rule is about selecting, filtering and building data frames.</w:t>
+      </w:r>
+    </w:p>
+    <w:bookmarkEnd w:id="39"/>
+    <w:bookmarkStart w:id="40" w:name="make-figures-accessible"/>
+    <w:p>
+      <w:pPr>
+        <w:pStyle w:val="Heading2"/>
+      </w:pPr>
+      <w:r>
+        <w:t xml:space="preserve">11 Make figures accessible</w:t>
+      </w:r>
+    </w:p>
+    <w:p>
+      <w:pPr>
+        <w:pStyle w:val="Compact"/>
+        <w:numPr>
+          <w:ilvl w:val="0"/>
+          <w:numId w:val="1008"/>
+        </w:numPr>
+      </w:pPr>
+      <w:r>
         <w:t xml:space="preserve">Wrap each figure, including an interactive one, in a</w:t>
       </w:r>
       <w:r>
@@ -2458,7 +2836,7 @@
         <w:pStyle w:val="Compact"/>
         <w:numPr>
           <w:ilvl w:val="0"/>
-          <w:numId w:val="1007"/>
+          <w:numId w:val="1008"/>
         </w:numPr>
       </w:pPr>
       <w:r>
@@ -2488,7 +2866,7 @@
         <w:pStyle w:val="Compact"/>
         <w:numPr>
           <w:ilvl w:val="0"/>
-          <w:numId w:val="1007"/>
+          <w:numId w:val="1008"/>
         </w:numPr>
       </w:pPr>
       <w:r>
@@ -2527,7 +2905,7 @@
         <w:pStyle w:val="Compact"/>
         <w:numPr>
           <w:ilvl w:val="0"/>
-          <w:numId w:val="1007"/>
+          <w:numId w:val="1008"/>
         </w:numPr>
       </w:pPr>
       <w:r>
@@ -2552,22 +2930,22 @@
         <w:t xml:space="preserve">(observed when rendering lecture notes to PDF).</w:t>
       </w:r>
     </w:p>
-    <w:bookmarkEnd w:id="36"/>
-    <w:bookmarkStart w:id="38" w:name="structure-slides-for-the-reader"/>
+    <w:bookmarkEnd w:id="40"/>
+    <w:bookmarkStart w:id="42" w:name="structure-slides-for-the-reader"/>
     <w:p>
       <w:pPr>
         <w:pStyle w:val="Heading2"/>
       </w:pPr>
       <w:r>
-        <w:t xml:space="preserve">11 Structure slides for the reader</w:t>
-      </w:r>
-    </w:p>
-    <w:p>
-      <w:pPr>
-        <w:pStyle w:val="Compact"/>
-        <w:numPr>
-          <w:ilvl w:val="0"/>
-          <w:numId w:val="1008"/>
+        <w:t xml:space="preserve">12 Structure slides for the reader</w:t>
+      </w:r>
+    </w:p>
+    <w:p>
+      <w:pPr>
+        <w:pStyle w:val="Compact"/>
+        <w:numPr>
+          <w:ilvl w:val="0"/>
+          <w:numId w:val="1009"/>
         </w:numPr>
       </w:pPr>
       <w:r>
@@ -2597,7 +2975,7 @@
         <w:pStyle w:val="Compact"/>
         <w:numPr>
           <w:ilvl w:val="0"/>
-          <w:numId w:val="1008"/>
+          <w:numId w:val="1009"/>
         </w:numPr>
       </w:pPr>
       <w:r>
@@ -2612,7 +2990,7 @@
       <w:r>
         <w:t xml:space="preserve"> </w:t>
       </w:r>
-      <w:hyperlink r:id="rId37">
+      <w:hyperlink r:id="rId41">
         <w:r>
           <w:rPr>
             <w:rStyle w:val="Hyperlink"/>
@@ -2632,7 +3010,7 @@
         <w:pStyle w:val="Compact"/>
         <w:numPr>
           <w:ilvl w:val="0"/>
-          <w:numId w:val="1008"/>
+          <w:numId w:val="1009"/>
         </w:numPr>
       </w:pPr>
       <w:r>
@@ -2659,7 +3037,7 @@
         <w:pStyle w:val="Compact"/>
         <w:numPr>
           <w:ilvl w:val="0"/>
-          <w:numId w:val="1008"/>
+          <w:numId w:val="1009"/>
         </w:numPr>
       </w:pPr>
       <w:r>
@@ -2728,7 +3106,7 @@
         <w:pStyle w:val="Compact"/>
         <w:numPr>
           <w:ilvl w:val="0"/>
-          <w:numId w:val="1008"/>
+          <w:numId w:val="1009"/>
         </w:numPr>
       </w:pPr>
       <w:r>
@@ -2797,7 +3175,7 @@
         <w:pStyle w:val="Compact"/>
         <w:numPr>
           <w:ilvl w:val="0"/>
-          <w:numId w:val="1008"/>
+          <w:numId w:val="1009"/>
         </w:numPr>
       </w:pPr>
       <w:r>
@@ -2821,7 +3199,7 @@
         <w:pStyle w:val="Compact"/>
         <w:numPr>
           <w:ilvl w:val="0"/>
-          <w:numId w:val="1008"/>
+          <w:numId w:val="1009"/>
         </w:numPr>
       </w:pPr>
       <w:r>
@@ -2852,22 +3230,22 @@
         <w:t xml:space="preserve">Put a slide break after the heading and move the text onto content slides.</w:t>
       </w:r>
     </w:p>
-    <w:bookmarkEnd w:id="38"/>
-    <w:bookmarkStart w:id="42" w:name="Xcb579568ef754486ebde8b41ba4528bdf380eec"/>
+    <w:bookmarkEnd w:id="42"/>
+    <w:bookmarkStart w:id="46" w:name="Xcb579568ef754486ebde8b41ba4528bdf380eec"/>
     <w:p>
       <w:pPr>
         <w:pStyle w:val="Heading2"/>
       </w:pPr>
       <w:r>
-        <w:t xml:space="preserve">12 Credit other courses without summarizing them</w:t>
-      </w:r>
-    </w:p>
-    <w:p>
-      <w:pPr>
-        <w:pStyle w:val="Compact"/>
-        <w:numPr>
-          <w:ilvl w:val="0"/>
-          <w:numId w:val="1009"/>
+        <w:t xml:space="preserve">13 Credit other courses without summarizing them</w:t>
+      </w:r>
+    </w:p>
+    <w:p>
+      <w:pPr>
+        <w:pStyle w:val="Compact"/>
+        <w:numPr>
+          <w:ilvl w:val="0"/>
+          <w:numId w:val="1010"/>
         </w:numPr>
       </w:pPr>
       <w:r>
@@ -2912,7 +3290,7 @@
       <w:r>
         <w:t xml:space="preserve"> </w:t>
       </w:r>
-      <w:hyperlink r:id="rId39">
+      <w:hyperlink r:id="rId43">
         <w:r>
           <w:rPr>
             <w:rStyle w:val="Hyperlink"/>
@@ -2953,7 +3331,7 @@
         <w:pStyle w:val="Compact"/>
         <w:numPr>
           <w:ilvl w:val="0"/>
-          <w:numId w:val="1009"/>
+          <w:numId w:val="1010"/>
         </w:numPr>
       </w:pPr>
       <w:r>
@@ -2968,7 +3346,7 @@
       <w:r>
         <w:t xml:space="preserve"> </w:t>
       </w:r>
-      <w:hyperlink r:id="rId40">
+      <w:hyperlink r:id="rId44">
         <w:r>
           <w:rPr>
             <w:rStyle w:val="Hyperlink"/>
@@ -2988,7 +3366,7 @@
         <w:pStyle w:val="Compact"/>
         <w:numPr>
           <w:ilvl w:val="0"/>
-          <w:numId w:val="1009"/>
+          <w:numId w:val="1010"/>
         </w:numPr>
       </w:pPr>
       <w:r>
@@ -2997,7 +3375,7 @@
       <w:r>
         <w:t xml:space="preserve"> </w:t>
       </w:r>
-      <w:hyperlink r:id="rId41">
+      <w:hyperlink r:id="rId45">
         <w:r>
           <w:rPr>
             <w:rStyle w:val="Hyperlink"/>
@@ -3017,7 +3395,7 @@
         <w:pStyle w:val="Compact"/>
         <w:numPr>
           <w:ilvl w:val="0"/>
-          <w:numId w:val="1009"/>
+          <w:numId w:val="1010"/>
         </w:numPr>
       </w:pPr>
       <w:r>
@@ -3030,14 +3408,14 @@
         <w:t xml:space="preserve">because a bare citation key renders as the author list.</w:t>
       </w:r>
     </w:p>
-    <w:bookmarkEnd w:id="42"/>
-    <w:bookmarkStart w:id="51" w:name="rules-that-apply-to-all-writing"/>
+    <w:bookmarkEnd w:id="46"/>
+    <w:bookmarkStart w:id="55" w:name="rules-that-apply-to-all-writing"/>
     <w:p>
       <w:pPr>
         <w:pStyle w:val="Heading2"/>
       </w:pPr>
       <w:r>
-        <w:t xml:space="preserve">13 Rules that apply to all writing</w:t>
+        <w:t xml:space="preserve">14 Rules that apply to all writing</w:t>
       </w:r>
     </w:p>
     <w:p>
@@ -3053,10 +3431,10 @@
         <w:pStyle w:val="Compact"/>
         <w:numPr>
           <w:ilvl w:val="0"/>
-          <w:numId w:val="1010"/>
-        </w:numPr>
-      </w:pPr>
-      <w:hyperlink r:id="rId43">
+          <w:numId w:val="1011"/>
+        </w:numPr>
+      </w:pPr>
+      <w:hyperlink r:id="rId47">
         <w:r>
           <w:rPr>
             <w:rStyle w:val="Hyperlink"/>
@@ -3073,10 +3451,10 @@
         <w:pStyle w:val="Compact"/>
         <w:numPr>
           <w:ilvl w:val="0"/>
-          <w:numId w:val="1010"/>
-        </w:numPr>
-      </w:pPr>
-      <w:hyperlink r:id="rId44">
+          <w:numId w:val="1011"/>
+        </w:numPr>
+      </w:pPr>
+      <w:hyperlink r:id="rId48">
         <w:r>
           <w:rPr>
             <w:rStyle w:val="Hyperlink"/>
@@ -3096,10 +3474,10 @@
         <w:pStyle w:val="Compact"/>
         <w:numPr>
           <w:ilvl w:val="0"/>
-          <w:numId w:val="1010"/>
-        </w:numPr>
-      </w:pPr>
-      <w:hyperlink r:id="rId45">
+          <w:numId w:val="1011"/>
+        </w:numPr>
+      </w:pPr>
+      <w:hyperlink r:id="rId49">
         <w:r>
           <w:rPr>
             <w:rStyle w:val="Hyperlink"/>
@@ -3116,10 +3494,10 @@
         <w:pStyle w:val="Compact"/>
         <w:numPr>
           <w:ilvl w:val="0"/>
-          <w:numId w:val="1010"/>
-        </w:numPr>
-      </w:pPr>
-      <w:hyperlink r:id="rId46">
+          <w:numId w:val="1011"/>
+        </w:numPr>
+      </w:pPr>
+      <w:hyperlink r:id="rId50">
         <w:r>
           <w:rPr>
             <w:rStyle w:val="Hyperlink"/>
@@ -3139,10 +3517,10 @@
         <w:pStyle w:val="Compact"/>
         <w:numPr>
           <w:ilvl w:val="0"/>
-          <w:numId w:val="1010"/>
-        </w:numPr>
-      </w:pPr>
-      <w:hyperlink r:id="rId47">
+          <w:numId w:val="1011"/>
+        </w:numPr>
+      </w:pPr>
+      <w:hyperlink r:id="rId51">
         <w:r>
           <w:rPr>
             <w:rStyle w:val="Hyperlink"/>
@@ -3154,8 +3532,8 @@
         <w:t xml:space="preserve">.</w:t>
       </w:r>
     </w:p>
-    <w:bookmarkStart w:id="50" w:name="refs"/>
-    <w:bookmarkStart w:id="49" w:name="ref-freeman2014active"/>
+    <w:bookmarkStart w:id="54" w:name="refs"/>
+    <w:bookmarkStart w:id="53" w:name="ref-freeman2014active"/>
     <w:p>
       <w:pPr>
         <w:pStyle w:val="Bibliography"/>
@@ -3188,7 +3566,7 @@
       <w:r>
         <w:t xml:space="preserve"> </w:t>
       </w:r>
-      <w:hyperlink r:id="rId48">
+      <w:hyperlink r:id="rId52">
         <w:r>
           <w:rPr>
             <w:rStyle w:val="Hyperlink"/>
@@ -3200,9 +3578,9 @@
         <w:t xml:space="preserve">.</w:t>
       </w:r>
     </w:p>
-    <w:bookmarkEnd w:id="49"/>
-    <w:bookmarkEnd w:id="50"/>
-    <w:bookmarkEnd w:id="51"/>
+    <w:bookmarkEnd w:id="53"/>
+    <w:bookmarkEnd w:id="54"/>
+    <w:bookmarkEnd w:id="55"/>
     <w:sectPr>
       <w:footnotePr>
         <w:numRestart w:val="eachSect"/>
@@ -3447,6 +3825,9 @@
     <w:abstractNumId w:val="991"/>
   </w:num>
   <w:num w:numId="1010">
+    <w:abstractNumId w:val="991"/>
+  </w:num>
+  <w:num w:numId="1011">
     <w:abstractNumId w:val="991"/>
   </w:num>
 </w:numbering>

</xml_diff>

<commit_message>
Deploying to gh-pages from @ Morrison-Lab/psw@6fb723778a9108d5a27c2d64524fc1ea2c52e31d 🚀
</commit_message>
<xml_diff>
--- a/chapters/teaching.docx
+++ b/chapters/teaching.docx
@@ -15,7 +15,7 @@
         <w:pStyle w:val="Date"/>
       </w:pPr>
       <w:r>
-        <w:t xml:space="preserve">Last modified: 2026-10-09 12:00:07 (PDT)</w:t>
+        <w:t xml:space="preserve">Last modified: 2026-10-09 13:01:06 (PDT)</w:t>
       </w:r>
     </w:p>
     <w:tbl>
@@ -2768,6 +2768,105 @@
       </w:r>
       <w:r>
         <w:t xml:space="preserve">.</w:t>
+      </w:r>
+    </w:p>
+    <w:p>
+      <w:pPr>
+        <w:pStyle w:val="Compact"/>
+        <w:numPr>
+          <w:ilvl w:val="0"/>
+          <w:numId w:val="1007"/>
+        </w:numPr>
+      </w:pPr>
+      <w:r>
+        <w:t xml:space="preserve">Do not nest function calls.</w:t>
+      </w:r>
+      <w:r>
+        <w:t xml:space="preserve"> </w:t>
+      </w:r>
+      <w:r>
+        <w:t xml:space="preserve">Write</w:t>
+      </w:r>
+      <w:r>
+        <w:t xml:space="preserve"> </w:t>
+      </w:r>
+      <w:r>
+        <w:rPr>
+          <w:rStyle w:val="VerbatimChar"/>
+        </w:rPr>
+        <w:t xml:space="preserve">tibble(x, y) |&gt; pander()</w:t>
+      </w:r>
+      <w:r>
+        <w:t xml:space="preserve">, not</w:t>
+      </w:r>
+      <w:r>
+        <w:t xml:space="preserve"> </w:t>
+      </w:r>
+      <w:r>
+        <w:rPr>
+          <w:rStyle w:val="VerbatimChar"/>
+        </w:rPr>
+        <w:t xml:space="preserve">pander(tibble(x, y))</w:t>
+      </w:r>
+      <w:r>
+        <w:t xml:space="preserve">,</w:t>
+      </w:r>
+      <w:r>
+        <w:t xml:space="preserve"> </w:t>
+      </w:r>
+      <w:r>
+        <w:t xml:space="preserve">and</w:t>
+      </w:r>
+      <w:r>
+        <w:t xml:space="preserve"> </w:t>
+      </w:r>
+      <w:r>
+        <w:rPr>
+          <w:rStyle w:val="VerbatimChar"/>
+        </w:rPr>
+        <w:t xml:space="preserve">sizes |&gt; lapply(f) |&gt; bind_rows()</w:t>
+      </w:r>
+      <w:r>
+        <w:t xml:space="preserve">, not</w:t>
+      </w:r>
+      <w:r>
+        <w:t xml:space="preserve"> </w:t>
+      </w:r>
+      <w:r>
+        <w:rPr>
+          <w:rStyle w:val="VerbatimChar"/>
+        </w:rPr>
+        <w:t xml:space="preserve">bind_rows(lapply(sizes, f))</w:t>
+      </w:r>
+      <w:r>
+        <w:t xml:space="preserve">.</w:t>
+      </w:r>
+      <w:r>
+        <w:t xml:space="preserve"> </w:t>
+      </w:r>
+      <w:r>
+        <w:t xml:space="preserve">Give a call that would sit inside an argument,</w:t>
+      </w:r>
+      <w:r>
+        <w:t xml:space="preserve"> </w:t>
+      </w:r>
+      <w:r>
+        <w:t xml:space="preserve">such as</w:t>
+      </w:r>
+      <w:r>
+        <w:t xml:space="preserve"> </w:t>
+      </w:r>
+      <w:r>
+        <w:rPr>
+          <w:rStyle w:val="VerbatimChar"/>
+        </w:rPr>
+        <w:t xml:space="preserve">data = filter(df, train)</w:t>
+      </w:r>
+      <w:r>
+        <w:t xml:space="preserve"> </w:t>
+      </w:r>
+      <w:r>
+        <w:t xml:space="preserve">in a model call, a name on its own line first.</w:t>
       </w:r>
     </w:p>
     <w:p>

</xml_diff>

<commit_message>
Deploying to gh-pages from @ Morrison-Lab/psw@289f6edf6980f017ebf055498d27f95a89a9bdbc 🚀
</commit_message>
<xml_diff>
--- a/chapters/teaching.docx
+++ b/chapters/teaching.docx
@@ -15,7 +15,7 @@
         <w:pStyle w:val="Date"/>
       </w:pPr>
       <w:r>
-        <w:t xml:space="preserve">Last modified: 2026-10-09 13:01:06 (PDT)</w:t>
+        <w:t xml:space="preserve">Last modified: 2026-10-09 13:05:53 (PDT)</w:t>
       </w:r>
     </w:p>
     <w:tbl>
@@ -646,7 +646,7 @@
         <w:t xml:space="preserve"> </w:t>
       </w:r>
       <w:r>
-        <w:t xml:space="preserve">For teaching materials, three further rules keep definitions findable.</w:t>
+        <w:t xml:space="preserve">For teaching materials, four further rules keep definitions findable.</w:t>
       </w:r>
     </w:p>
     <w:p>
@@ -881,6 +881,93 @@
       </w:r>
       <w:r>
         <w:t xml:space="preserve">gets its own div after the general case, and the two link to each other.</w:t>
+      </w:r>
+    </w:p>
+    <w:p>
+      <w:pPr>
+        <w:pStyle w:val="Compact"/>
+        <w:numPr>
+          <w:ilvl w:val="0"/>
+          <w:numId w:val="1002"/>
+        </w:numPr>
+      </w:pPr>
+      <w:r>
+        <w:t xml:space="preserve">Keep only the definition in a</w:t>
+      </w:r>
+      <w:r>
+        <w:t xml:space="preserve"> </w:t>
+      </w:r>
+      <w:r>
+        <w:rPr>
+          <w:rStyle w:val="VerbatimChar"/>
+        </w:rPr>
+        <w:t xml:space="preserve">#def-</w:t>
+      </w:r>
+      <w:r>
+        <w:t xml:space="preserve"> </w:t>
+      </w:r>
+      <w:r>
+        <w:t xml:space="preserve">div.</w:t>
+      </w:r>
+      <w:r>
+        <w:t xml:space="preserve"> </w:t>
+      </w:r>
+      <w:r>
+        <w:t xml:space="preserve">Put the properties of the defined object, such as the symmetry and idempotence of a matrix,</w:t>
+      </w:r>
+      <w:r>
+        <w:t xml:space="preserve"> </w:t>
+      </w:r>
+      <w:r>
+        <w:t xml:space="preserve">in a separate</w:t>
+      </w:r>
+      <w:r>
+        <w:t xml:space="preserve"> </w:t>
+      </w:r>
+      <w:r>
+        <w:rPr>
+          <w:rStyle w:val="VerbatimChar"/>
+        </w:rPr>
+        <w:t xml:space="preserve">#thm-</w:t>
+      </w:r>
+      <w:r>
+        <w:t xml:space="preserve">,</w:t>
+      </w:r>
+      <w:r>
+        <w:t xml:space="preserve"> </w:t>
+      </w:r>
+      <w:r>
+        <w:rPr>
+          <w:rStyle w:val="VerbatimChar"/>
+        </w:rPr>
+        <w:t xml:space="preserve">#lem-</w:t>
+      </w:r>
+      <w:r>
+        <w:t xml:space="preserve"> </w:t>
+      </w:r>
+      <w:r>
+        <w:t xml:space="preserve">or</w:t>
+      </w:r>
+      <w:r>
+        <w:t xml:space="preserve"> </w:t>
+      </w:r>
+      <w:r>
+        <w:rPr>
+          <w:rStyle w:val="VerbatimChar"/>
+        </w:rPr>
+        <w:t xml:space="preserve">#prp-</w:t>
+      </w:r>
+      <w:r>
+        <w:t xml:space="preserve"> </w:t>
+      </w:r>
+      <w:r>
+        <w:t xml:space="preserve">div after it, with a proof where one is known.</w:t>
+      </w:r>
+      <w:r>
+        <w:t xml:space="preserve"> </w:t>
+      </w:r>
+      <w:r>
+        <w:t xml:space="preserve">Each abstract div then gets its own example, as the rule below requires.</w:t>
       </w:r>
     </w:p>
     <w:p>

</xml_diff>

<commit_message>
Deploying to gh-pages from @ Morrison-Lab/psw@7424d97810e01c4253c9a9b8790b4b80f8a2755f 🚀
</commit_message>
<xml_diff>
--- a/chapters/teaching.docx
+++ b/chapters/teaching.docx
@@ -15,7 +15,7 @@
         <w:pStyle w:val="Date"/>
       </w:pPr>
       <w:r>
-        <w:t xml:space="preserve">Last modified: 2026-10-09 13:05:53 (PDT)</w:t>
+        <w:t xml:space="preserve">Last modified: 2026-10-10 00:01:24 (PDT)</w:t>
       </w:r>
     </w:p>
     <w:tbl>
@@ -2981,13 +2981,27 @@
       </w:r>
     </w:p>
     <w:bookmarkEnd w:id="39"/>
-    <w:bookmarkStart w:id="40" w:name="make-figures-accessible"/>
+    <w:bookmarkStart w:id="40" w:name="X7c0de8eaf50a5b2644eabf66f1f9b734b8a4a71"/>
     <w:p>
       <w:pPr>
         <w:pStyle w:val="Heading2"/>
       </w:pPr>
       <w:r>
-        <w:t xml:space="preserve">11 Make figures accessible</w:t>
+        <w:t xml:space="preserve">11 Comment every code chunk to say what and why</w:t>
+      </w:r>
+    </w:p>
+    <w:p>
+      <w:pPr>
+        <w:pStyle w:val="FirstParagraph"/>
+      </w:pPr>
+      <w:r>
+        <w:t xml:space="preserve">This rule applies to all reader-facing code in teaching materials,</w:t>
+      </w:r>
+      <w:r>
+        <w:t xml:space="preserve"> </w:t>
+      </w:r>
+      <w:r>
+        <w:t xml:space="preserve">in every course and every teaching repository, in every language.</w:t>
       </w:r>
     </w:p>
     <w:p>
@@ -2999,6 +3013,168 @@
         </w:numPr>
       </w:pPr>
       <w:r>
+        <w:t xml:space="preserve">Put comments in each code chunk that explain both</w:t>
+      </w:r>
+      <w:r>
+        <w:t xml:space="preserve"> </w:t>
+      </w:r>
+      <w:r>
+        <w:t xml:space="preserve">what the code is doing and why it does it.</w:t>
+      </w:r>
+    </w:p>
+    <w:p>
+      <w:pPr>
+        <w:pStyle w:val="Compact"/>
+        <w:numPr>
+          <w:ilvl w:val="0"/>
+          <w:numId w:val="1008"/>
+        </w:numPr>
+      </w:pPr>
+      <w:r>
+        <w:t xml:space="preserve">Leave out a comment that would give away the solution in an exercise prompt.</w:t>
+      </w:r>
+      <w:r>
+        <w:t xml:space="preserve"> </w:t>
+      </w:r>
+      <w:r>
+        <w:t xml:space="preserve">Add the comments to the solution’s code instead.</w:t>
+      </w:r>
+    </w:p>
+    <w:p>
+      <w:pPr>
+        <w:pStyle w:val="Compact"/>
+        <w:numPr>
+          <w:ilvl w:val="0"/>
+          <w:numId w:val="1008"/>
+        </w:numPr>
+      </w:pPr>
+      <w:r>
+        <w:t xml:space="preserve">A comment that only restates the code, such as</w:t>
+      </w:r>
+      <w:r>
+        <w:t xml:space="preserve"> </w:t>
+      </w:r>
+      <w:r>
+        <w:rPr>
+          <w:rStyle w:val="VerbatimChar"/>
+        </w:rPr>
+        <w:t xml:space="preserve"># add 1 to x</w:t>
+      </w:r>
+      <w:r>
+        <w:t xml:space="preserve"> </w:t>
+      </w:r>
+      <w:r>
+        <w:t xml:space="preserve">above</w:t>
+      </w:r>
+      <w:r>
+        <w:t xml:space="preserve"> </w:t>
+      </w:r>
+      <w:r>
+        <w:rPr>
+          <w:rStyle w:val="VerbatimChar"/>
+        </w:rPr>
+        <w:t xml:space="preserve">x &lt;- x + 1</w:t>
+      </w:r>
+      <w:r>
+        <w:t xml:space="preserve">,</w:t>
+      </w:r>
+      <w:r>
+        <w:t xml:space="preserve"> </w:t>
+      </w:r>
+      <w:r>
+        <w:t xml:space="preserve">gives the</w:t>
+      </w:r>
+      <w:r>
+        <w:t xml:space="preserve"> </w:t>
+      </w:r>
+      <w:r>
+        <w:rPr>
+          <w:i/>
+          <w:iCs/>
+        </w:rPr>
+        <w:t xml:space="preserve">what</w:t>
+      </w:r>
+      <w:r>
+        <w:t xml:space="preserve"> </w:t>
+      </w:r>
+      <w:r>
+        <w:t xml:space="preserve">without the</w:t>
+      </w:r>
+      <w:r>
+        <w:t xml:space="preserve"> </w:t>
+      </w:r>
+      <w:r>
+        <w:rPr>
+          <w:i/>
+          <w:iCs/>
+        </w:rPr>
+        <w:t xml:space="preserve">why</w:t>
+      </w:r>
+      <w:r>
+        <w:t xml:space="preserve">.</w:t>
+      </w:r>
+      <w:r>
+        <w:t xml:space="preserve"> </w:t>
+      </w:r>
+      <w:r>
+        <w:t xml:space="preserve">Say what the step accomplishes and why the analysis needs it,</w:t>
+      </w:r>
+      <w:r>
+        <w:t xml:space="preserve"> </w:t>
+      </w:r>
+      <w:r>
+        <w:t xml:space="preserve">for example</w:t>
+      </w:r>
+      <w:r>
+        <w:t xml:space="preserve"> </w:t>
+      </w:r>
+      <w:r>
+        <w:rPr>
+          <w:rStyle w:val="VerbatimChar"/>
+        </w:rPr>
+        <w:t xml:space="preserve"># center age so the intercept is the mean outcome at the average age</w:t>
+      </w:r>
+      <w:r>
+        <w:t xml:space="preserve">.</w:t>
+      </w:r>
+    </w:p>
+    <w:p>
+      <w:pPr>
+        <w:pStyle w:val="Compact"/>
+        <w:numPr>
+          <w:ilvl w:val="0"/>
+          <w:numId w:val="1008"/>
+        </w:numPr>
+      </w:pPr>
+      <w:r>
+        <w:t xml:space="preserve">Comment each step that a student could not reconstruct from its name,</w:t>
+      </w:r>
+      <w:r>
+        <w:t xml:space="preserve"> </w:t>
+      </w:r>
+      <w:r>
+        <w:t xml:space="preserve">such as a transformation, a modeling choice, a tuning value or a random seed.</w:t>
+      </w:r>
+    </w:p>
+    <w:bookmarkEnd w:id="40"/>
+    <w:bookmarkStart w:id="41" w:name="make-figures-accessible"/>
+    <w:p>
+      <w:pPr>
+        <w:pStyle w:val="Heading2"/>
+      </w:pPr>
+      <w:r>
+        <w:t xml:space="preserve">12 Make figures accessible</w:t>
+      </w:r>
+    </w:p>
+    <w:p>
+      <w:pPr>
+        <w:pStyle w:val="Compact"/>
+        <w:numPr>
+          <w:ilvl w:val="0"/>
+          <w:numId w:val="1009"/>
+        </w:numPr>
+      </w:pPr>
+      <w:r>
         <w:t xml:space="preserve">Wrap each figure, including an interactive one, in a</w:t>
       </w:r>
       <w:r>
@@ -3022,7 +3198,7 @@
         <w:pStyle w:val="Compact"/>
         <w:numPr>
           <w:ilvl w:val="0"/>
-          <w:numId w:val="1008"/>
+          <w:numId w:val="1009"/>
         </w:numPr>
       </w:pPr>
       <w:r>
@@ -3052,7 +3228,7 @@
         <w:pStyle w:val="Compact"/>
         <w:numPr>
           <w:ilvl w:val="0"/>
-          <w:numId w:val="1008"/>
+          <w:numId w:val="1009"/>
         </w:numPr>
       </w:pPr>
       <w:r>
@@ -3091,7 +3267,7 @@
         <w:pStyle w:val="Compact"/>
         <w:numPr>
           <w:ilvl w:val="0"/>
-          <w:numId w:val="1008"/>
+          <w:numId w:val="1009"/>
         </w:numPr>
       </w:pPr>
       <w:r>
@@ -3116,22 +3292,22 @@
         <w:t xml:space="preserve">(observed when rendering lecture notes to PDF).</w:t>
       </w:r>
     </w:p>
-    <w:bookmarkEnd w:id="40"/>
-    <w:bookmarkStart w:id="42" w:name="structure-slides-for-the-reader"/>
+    <w:bookmarkEnd w:id="41"/>
+    <w:bookmarkStart w:id="43" w:name="structure-slides-for-the-reader"/>
     <w:p>
       <w:pPr>
         <w:pStyle w:val="Heading2"/>
       </w:pPr>
       <w:r>
-        <w:t xml:space="preserve">12 Structure slides for the reader</w:t>
-      </w:r>
-    </w:p>
-    <w:p>
-      <w:pPr>
-        <w:pStyle w:val="Compact"/>
-        <w:numPr>
-          <w:ilvl w:val="0"/>
-          <w:numId w:val="1009"/>
+        <w:t xml:space="preserve">13 Structure slides for the reader</w:t>
+      </w:r>
+    </w:p>
+    <w:p>
+      <w:pPr>
+        <w:pStyle w:val="Compact"/>
+        <w:numPr>
+          <w:ilvl w:val="0"/>
+          <w:numId w:val="1010"/>
         </w:numPr>
       </w:pPr>
       <w:r>
@@ -3161,7 +3337,7 @@
         <w:pStyle w:val="Compact"/>
         <w:numPr>
           <w:ilvl w:val="0"/>
-          <w:numId w:val="1009"/>
+          <w:numId w:val="1010"/>
         </w:numPr>
       </w:pPr>
       <w:r>
@@ -3176,7 +3352,7 @@
       <w:r>
         <w:t xml:space="preserve"> </w:t>
       </w:r>
-      <w:hyperlink r:id="rId41">
+      <w:hyperlink r:id="rId42">
         <w:r>
           <w:rPr>
             <w:rStyle w:val="Hyperlink"/>
@@ -3196,7 +3372,7 @@
         <w:pStyle w:val="Compact"/>
         <w:numPr>
           <w:ilvl w:val="0"/>
-          <w:numId w:val="1009"/>
+          <w:numId w:val="1010"/>
         </w:numPr>
       </w:pPr>
       <w:r>
@@ -3223,7 +3399,7 @@
         <w:pStyle w:val="Compact"/>
         <w:numPr>
           <w:ilvl w:val="0"/>
-          <w:numId w:val="1009"/>
+          <w:numId w:val="1010"/>
         </w:numPr>
       </w:pPr>
       <w:r>
@@ -3292,7 +3468,7 @@
         <w:pStyle w:val="Compact"/>
         <w:numPr>
           <w:ilvl w:val="0"/>
-          <w:numId w:val="1009"/>
+          <w:numId w:val="1010"/>
         </w:numPr>
       </w:pPr>
       <w:r>
@@ -3361,7 +3537,7 @@
         <w:pStyle w:val="Compact"/>
         <w:numPr>
           <w:ilvl w:val="0"/>
-          <w:numId w:val="1009"/>
+          <w:numId w:val="1010"/>
         </w:numPr>
       </w:pPr>
       <w:r>
@@ -3385,7 +3561,7 @@
         <w:pStyle w:val="Compact"/>
         <w:numPr>
           <w:ilvl w:val="0"/>
-          <w:numId w:val="1009"/>
+          <w:numId w:val="1010"/>
         </w:numPr>
       </w:pPr>
       <w:r>
@@ -3416,22 +3592,22 @@
         <w:t xml:space="preserve">Put a slide break after the heading and move the text onto content slides.</w:t>
       </w:r>
     </w:p>
-    <w:bookmarkEnd w:id="42"/>
-    <w:bookmarkStart w:id="46" w:name="Xcb579568ef754486ebde8b41ba4528bdf380eec"/>
+    <w:bookmarkEnd w:id="43"/>
+    <w:bookmarkStart w:id="47" w:name="Xcb579568ef754486ebde8b41ba4528bdf380eec"/>
     <w:p>
       <w:pPr>
         <w:pStyle w:val="Heading2"/>
       </w:pPr>
       <w:r>
-        <w:t xml:space="preserve">13 Credit other courses without summarizing them</w:t>
-      </w:r>
-    </w:p>
-    <w:p>
-      <w:pPr>
-        <w:pStyle w:val="Compact"/>
-        <w:numPr>
-          <w:ilvl w:val="0"/>
-          <w:numId w:val="1010"/>
+        <w:t xml:space="preserve">14 Credit other courses without summarizing them</w:t>
+      </w:r>
+    </w:p>
+    <w:p>
+      <w:pPr>
+        <w:pStyle w:val="Compact"/>
+        <w:numPr>
+          <w:ilvl w:val="0"/>
+          <w:numId w:val="1011"/>
         </w:numPr>
       </w:pPr>
       <w:r>
@@ -3476,7 +3652,7 @@
       <w:r>
         <w:t xml:space="preserve"> </w:t>
       </w:r>
-      <w:hyperlink r:id="rId43">
+      <w:hyperlink r:id="rId44">
         <w:r>
           <w:rPr>
             <w:rStyle w:val="Hyperlink"/>
@@ -3517,7 +3693,7 @@
         <w:pStyle w:val="Compact"/>
         <w:numPr>
           <w:ilvl w:val="0"/>
-          <w:numId w:val="1010"/>
+          <w:numId w:val="1011"/>
         </w:numPr>
       </w:pPr>
       <w:r>
@@ -3532,7 +3708,7 @@
       <w:r>
         <w:t xml:space="preserve"> </w:t>
       </w:r>
-      <w:hyperlink r:id="rId44">
+      <w:hyperlink r:id="rId45">
         <w:r>
           <w:rPr>
             <w:rStyle w:val="Hyperlink"/>
@@ -3552,7 +3728,7 @@
         <w:pStyle w:val="Compact"/>
         <w:numPr>
           <w:ilvl w:val="0"/>
-          <w:numId w:val="1010"/>
+          <w:numId w:val="1011"/>
         </w:numPr>
       </w:pPr>
       <w:r>
@@ -3561,7 +3737,7 @@
       <w:r>
         <w:t xml:space="preserve"> </w:t>
       </w:r>
-      <w:hyperlink r:id="rId45">
+      <w:hyperlink r:id="rId46">
         <w:r>
           <w:rPr>
             <w:rStyle w:val="Hyperlink"/>
@@ -3581,7 +3757,7 @@
         <w:pStyle w:val="Compact"/>
         <w:numPr>
           <w:ilvl w:val="0"/>
-          <w:numId w:val="1010"/>
+          <w:numId w:val="1011"/>
         </w:numPr>
       </w:pPr>
       <w:r>
@@ -3594,14 +3770,14 @@
         <w:t xml:space="preserve">because a bare citation key renders as the author list.</w:t>
       </w:r>
     </w:p>
-    <w:bookmarkEnd w:id="46"/>
-    <w:bookmarkStart w:id="55" w:name="rules-that-apply-to-all-writing"/>
+    <w:bookmarkEnd w:id="47"/>
+    <w:bookmarkStart w:id="56" w:name="rules-that-apply-to-all-writing"/>
     <w:p>
       <w:pPr>
         <w:pStyle w:val="Heading2"/>
       </w:pPr>
       <w:r>
-        <w:t xml:space="preserve">14 Rules that apply to all writing</w:t>
+        <w:t xml:space="preserve">15 Rules that apply to all writing</w:t>
       </w:r>
     </w:p>
     <w:p>
@@ -3617,10 +3793,10 @@
         <w:pStyle w:val="Compact"/>
         <w:numPr>
           <w:ilvl w:val="0"/>
-          <w:numId w:val="1011"/>
-        </w:numPr>
-      </w:pPr>
-      <w:hyperlink r:id="rId47">
+          <w:numId w:val="1012"/>
+        </w:numPr>
+      </w:pPr>
+      <w:hyperlink r:id="rId48">
         <w:r>
           <w:rPr>
             <w:rStyle w:val="Hyperlink"/>
@@ -3637,10 +3813,10 @@
         <w:pStyle w:val="Compact"/>
         <w:numPr>
           <w:ilvl w:val="0"/>
-          <w:numId w:val="1011"/>
-        </w:numPr>
-      </w:pPr>
-      <w:hyperlink r:id="rId48">
+          <w:numId w:val="1012"/>
+        </w:numPr>
+      </w:pPr>
+      <w:hyperlink r:id="rId49">
         <w:r>
           <w:rPr>
             <w:rStyle w:val="Hyperlink"/>
@@ -3660,10 +3836,10 @@
         <w:pStyle w:val="Compact"/>
         <w:numPr>
           <w:ilvl w:val="0"/>
-          <w:numId w:val="1011"/>
-        </w:numPr>
-      </w:pPr>
-      <w:hyperlink r:id="rId49">
+          <w:numId w:val="1012"/>
+        </w:numPr>
+      </w:pPr>
+      <w:hyperlink r:id="rId50">
         <w:r>
           <w:rPr>
             <w:rStyle w:val="Hyperlink"/>
@@ -3680,10 +3856,10 @@
         <w:pStyle w:val="Compact"/>
         <w:numPr>
           <w:ilvl w:val="0"/>
-          <w:numId w:val="1011"/>
-        </w:numPr>
-      </w:pPr>
-      <w:hyperlink r:id="rId50">
+          <w:numId w:val="1012"/>
+        </w:numPr>
+      </w:pPr>
+      <w:hyperlink r:id="rId51">
         <w:r>
           <w:rPr>
             <w:rStyle w:val="Hyperlink"/>
@@ -3703,10 +3879,10 @@
         <w:pStyle w:val="Compact"/>
         <w:numPr>
           <w:ilvl w:val="0"/>
-          <w:numId w:val="1011"/>
-        </w:numPr>
-      </w:pPr>
-      <w:hyperlink r:id="rId51">
+          <w:numId w:val="1012"/>
+        </w:numPr>
+      </w:pPr>
+      <w:hyperlink r:id="rId52">
         <w:r>
           <w:rPr>
             <w:rStyle w:val="Hyperlink"/>
@@ -3718,8 +3894,8 @@
         <w:t xml:space="preserve">.</w:t>
       </w:r>
     </w:p>
-    <w:bookmarkStart w:id="54" w:name="refs"/>
-    <w:bookmarkStart w:id="53" w:name="ref-freeman2014active"/>
+    <w:bookmarkStart w:id="55" w:name="refs"/>
+    <w:bookmarkStart w:id="54" w:name="ref-freeman2014active"/>
     <w:p>
       <w:pPr>
         <w:pStyle w:val="Bibliography"/>
@@ -3752,7 +3928,7 @@
       <w:r>
         <w:t xml:space="preserve"> </w:t>
       </w:r>
-      <w:hyperlink r:id="rId52">
+      <w:hyperlink r:id="rId53">
         <w:r>
           <w:rPr>
             <w:rStyle w:val="Hyperlink"/>
@@ -3764,9 +3940,9 @@
         <w:t xml:space="preserve">.</w:t>
       </w:r>
     </w:p>
-    <w:bookmarkEnd w:id="53"/>
     <w:bookmarkEnd w:id="54"/>
     <w:bookmarkEnd w:id="55"/>
+    <w:bookmarkEnd w:id="56"/>
     <w:sectPr>
       <w:footnotePr>
         <w:numRestart w:val="eachSect"/>
@@ -4014,6 +4190,9 @@
     <w:abstractNumId w:val="991"/>
   </w:num>
   <w:num w:numId="1011">
+    <w:abstractNumId w:val="991"/>
+  </w:num>
+  <w:num w:numId="1012">
     <w:abstractNumId w:val="991"/>
   </w:num>
 </w:numbering>

</xml_diff>

<commit_message>
Deploying to gh-pages from @ Morrison-Lab/psw@51e4614c21af9414529cff60818230603bf300ef 🚀
</commit_message>
<xml_diff>
--- a/chapters/teaching.docx
+++ b/chapters/teaching.docx
@@ -15,7 +15,7 @@
         <w:pStyle w:val="Date"/>
       </w:pPr>
       <w:r>
-        <w:t xml:space="preserve">Last modified: 2026-10-13 10:56:24 (PDT)</w:t>
+        <w:t xml:space="preserve">Last modified: 2026-10-13 13:17:16 (PDT)</w:t>
       </w:r>
     </w:p>
     <w:tbl>
@@ -3163,13 +3163,27 @@
       </w:r>
     </w:p>
     <w:bookmarkEnd w:id="40"/>
-    <w:bookmarkStart w:id="41" w:name="make-figures-accessible"/>
+    <w:bookmarkStart w:id="41" w:name="Xffa5a3357c8672d830c88e1e58a0ef107550647"/>
     <w:p>
       <w:pPr>
         <w:pStyle w:val="Heading2"/>
       </w:pPr>
       <w:r>
-        <w:t xml:space="preserve">12 Make figures accessible</w:t>
+        <w:t xml:space="preserve">12 Introduce every function in a programming primer</w:t>
+      </w:r>
+    </w:p>
+    <w:p>
+      <w:pPr>
+        <w:pStyle w:val="FirstParagraph"/>
+      </w:pPr>
+      <w:r>
+        <w:t xml:space="preserve">This rule applies to all teaching materials that run code,</w:t>
+      </w:r>
+      <w:r>
+        <w:t xml:space="preserve"> </w:t>
+      </w:r>
+      <w:r>
+        <w:t xml:space="preserve">in every course and every teaching repository.</w:t>
       </w:r>
     </w:p>
     <w:p>
@@ -3181,6 +3195,112 @@
         </w:numPr>
       </w:pPr>
       <w:r>
+        <w:t xml:space="preserve">Give the course a programming primer that introduces each package function the course’s chapters call.</w:t>
+      </w:r>
+      <w:r>
+        <w:t xml:space="preserve"> </w:t>
+      </w:r>
+      <w:r>
+        <w:t xml:space="preserve">A student meets the function there first, in a short note, a worked example and an exercise,</w:t>
+      </w:r>
+      <w:r>
+        <w:t xml:space="preserve"> </w:t>
+      </w:r>
+      <w:r>
+        <w:t xml:space="preserve">and then sees it used in the chapters.</w:t>
+      </w:r>
+    </w:p>
+    <w:p>
+      <w:pPr>
+        <w:pStyle w:val="Compact"/>
+        <w:numPr>
+          <w:ilvl w:val="0"/>
+          <w:numId w:val="1009"/>
+        </w:numPr>
+      </w:pPr>
+      <w:r>
+        <w:t xml:space="preserve">Keep the primer complete by computing the list of functions, not by remembering it.</w:t>
+      </w:r>
+      <w:r>
+        <w:t xml:space="preserve"> </w:t>
+      </w:r>
+      <w:r>
+        <w:t xml:space="preserve">Scan the code chunks of the chapters for the functions they call,</w:t>
+      </w:r>
+      <w:r>
+        <w:t xml:space="preserve"> </w:t>
+      </w:r>
+      <w:r>
+        <w:t xml:space="preserve">and compare the list with the functions the primer mentions.</w:t>
+      </w:r>
+      <w:r>
+        <w:t xml:space="preserve"> </w:t>
+      </w:r>
+      <w:r>
+        <w:t xml:space="preserve">Run the scan when a chapter adds a function, and again before a term starts.</w:t>
+      </w:r>
+    </w:p>
+    <w:p>
+      <w:pPr>
+        <w:pStyle w:val="Compact"/>
+        <w:numPr>
+          <w:ilvl w:val="0"/>
+          <w:numId w:val="1009"/>
+        </w:numPr>
+      </w:pPr>
+      <w:r>
+        <w:t xml:space="preserve">Add the missing functions in separate pull requests, one per package.</w:t>
+      </w:r>
+      <w:r>
+        <w:t xml:space="preserve"> </w:t>
+      </w:r>
+      <w:r>
+        <w:t xml:space="preserve">A pull request that adds a function to a chapter adds it to the primer too,</w:t>
+      </w:r>
+      <w:r>
+        <w:t xml:space="preserve"> </w:t>
+      </w:r>
+      <w:r>
+        <w:t xml:space="preserve">or links the primer entry that already introduces it.</w:t>
+      </w:r>
+    </w:p>
+    <w:p>
+      <w:pPr>
+        <w:pStyle w:val="Compact"/>
+        <w:numPr>
+          <w:ilvl w:val="0"/>
+          <w:numId w:val="1009"/>
+        </w:numPr>
+      </w:pPr>
+      <w:r>
+        <w:t xml:space="preserve">Functions that a chapter defines for itself are not package functions.</w:t>
+      </w:r>
+      <w:r>
+        <w:t xml:space="preserve"> </w:t>
+      </w:r>
+      <w:r>
+        <w:t xml:space="preserve">A chapter introduces those where it defines them.</w:t>
+      </w:r>
+    </w:p>
+    <w:bookmarkEnd w:id="41"/>
+    <w:bookmarkStart w:id="42" w:name="make-figures-accessible"/>
+    <w:p>
+      <w:pPr>
+        <w:pStyle w:val="Heading2"/>
+      </w:pPr>
+      <w:r>
+        <w:t xml:space="preserve">13 Make figures accessible</w:t>
+      </w:r>
+    </w:p>
+    <w:p>
+      <w:pPr>
+        <w:pStyle w:val="Compact"/>
+        <w:numPr>
+          <w:ilvl w:val="0"/>
+          <w:numId w:val="1010"/>
+        </w:numPr>
+      </w:pPr>
+      <w:r>
         <w:t xml:space="preserve">Wrap each figure, including an interactive one, in a</w:t>
       </w:r>
       <w:r>
@@ -3204,7 +3324,7 @@
         <w:pStyle w:val="Compact"/>
         <w:numPr>
           <w:ilvl w:val="0"/>
-          <w:numId w:val="1009"/>
+          <w:numId w:val="1010"/>
         </w:numPr>
       </w:pPr>
       <w:r>
@@ -3234,7 +3354,7 @@
         <w:pStyle w:val="Compact"/>
         <w:numPr>
           <w:ilvl w:val="0"/>
-          <w:numId w:val="1009"/>
+          <w:numId w:val="1010"/>
         </w:numPr>
       </w:pPr>
       <w:r>
@@ -3273,7 +3393,7 @@
         <w:pStyle w:val="Compact"/>
         <w:numPr>
           <w:ilvl w:val="0"/>
-          <w:numId w:val="1009"/>
+          <w:numId w:val="1010"/>
         </w:numPr>
       </w:pPr>
       <w:r>
@@ -3298,22 +3418,22 @@
         <w:t xml:space="preserve">(observed when rendering lecture notes to PDF).</w:t>
       </w:r>
     </w:p>
-    <w:bookmarkEnd w:id="41"/>
-    <w:bookmarkStart w:id="43" w:name="structure-slides-for-the-reader"/>
+    <w:bookmarkEnd w:id="42"/>
+    <w:bookmarkStart w:id="44" w:name="structure-slides-for-the-reader"/>
     <w:p>
       <w:pPr>
         <w:pStyle w:val="Heading2"/>
       </w:pPr>
       <w:r>
-        <w:t xml:space="preserve">13 Structure slides for the reader</w:t>
-      </w:r>
-    </w:p>
-    <w:p>
-      <w:pPr>
-        <w:pStyle w:val="Compact"/>
-        <w:numPr>
-          <w:ilvl w:val="0"/>
-          <w:numId w:val="1010"/>
+        <w:t xml:space="preserve">14 Structure slides for the reader</w:t>
+      </w:r>
+    </w:p>
+    <w:p>
+      <w:pPr>
+        <w:pStyle w:val="Compact"/>
+        <w:numPr>
+          <w:ilvl w:val="0"/>
+          <w:numId w:val="1011"/>
         </w:numPr>
       </w:pPr>
       <w:r>
@@ -3343,7 +3463,7 @@
         <w:pStyle w:val="Compact"/>
         <w:numPr>
           <w:ilvl w:val="0"/>
-          <w:numId w:val="1010"/>
+          <w:numId w:val="1011"/>
         </w:numPr>
       </w:pPr>
       <w:r>
@@ -3358,7 +3478,7 @@
       <w:r>
         <w:t xml:space="preserve"> </w:t>
       </w:r>
-      <w:hyperlink r:id="rId42">
+      <w:hyperlink r:id="rId43">
         <w:r>
           <w:rPr>
             <w:rStyle w:val="Hyperlink"/>
@@ -3378,7 +3498,7 @@
         <w:pStyle w:val="Compact"/>
         <w:numPr>
           <w:ilvl w:val="0"/>
-          <w:numId w:val="1010"/>
+          <w:numId w:val="1011"/>
         </w:numPr>
       </w:pPr>
       <w:r>
@@ -3405,7 +3525,7 @@
         <w:pStyle w:val="Compact"/>
         <w:numPr>
           <w:ilvl w:val="0"/>
-          <w:numId w:val="1010"/>
+          <w:numId w:val="1011"/>
         </w:numPr>
       </w:pPr>
       <w:r>
@@ -3474,7 +3594,7 @@
         <w:pStyle w:val="Compact"/>
         <w:numPr>
           <w:ilvl w:val="0"/>
-          <w:numId w:val="1010"/>
+          <w:numId w:val="1011"/>
         </w:numPr>
       </w:pPr>
       <w:r>
@@ -3543,7 +3663,7 @@
         <w:pStyle w:val="Compact"/>
         <w:numPr>
           <w:ilvl w:val="0"/>
-          <w:numId w:val="1010"/>
+          <w:numId w:val="1011"/>
         </w:numPr>
       </w:pPr>
       <w:r>
@@ -3567,7 +3687,7 @@
         <w:pStyle w:val="Compact"/>
         <w:numPr>
           <w:ilvl w:val="0"/>
-          <w:numId w:val="1010"/>
+          <w:numId w:val="1011"/>
         </w:numPr>
       </w:pPr>
       <w:r>
@@ -3598,22 +3718,22 @@
         <w:t xml:space="preserve">Put a slide break after the heading and move the text onto content slides.</w:t>
       </w:r>
     </w:p>
-    <w:bookmarkEnd w:id="43"/>
-    <w:bookmarkStart w:id="47" w:name="Xcb579568ef754486ebde8b41ba4528bdf380eec"/>
+    <w:bookmarkEnd w:id="44"/>
+    <w:bookmarkStart w:id="48" w:name="Xcb579568ef754486ebde8b41ba4528bdf380eec"/>
     <w:p>
       <w:pPr>
         <w:pStyle w:val="Heading2"/>
       </w:pPr>
       <w:r>
-        <w:t xml:space="preserve">14 Credit other courses without summarizing them</w:t>
-      </w:r>
-    </w:p>
-    <w:p>
-      <w:pPr>
-        <w:pStyle w:val="Compact"/>
-        <w:numPr>
-          <w:ilvl w:val="0"/>
-          <w:numId w:val="1011"/>
+        <w:t xml:space="preserve">15 Credit other courses without summarizing them</w:t>
+      </w:r>
+    </w:p>
+    <w:p>
+      <w:pPr>
+        <w:pStyle w:val="Compact"/>
+        <w:numPr>
+          <w:ilvl w:val="0"/>
+          <w:numId w:val="1012"/>
         </w:numPr>
       </w:pPr>
       <w:r>
@@ -3658,7 +3778,7 @@
       <w:r>
         <w:t xml:space="preserve"> </w:t>
       </w:r>
-      <w:hyperlink r:id="rId44">
+      <w:hyperlink r:id="rId45">
         <w:r>
           <w:rPr>
             <w:rStyle w:val="Hyperlink"/>
@@ -3699,7 +3819,7 @@
         <w:pStyle w:val="Compact"/>
         <w:numPr>
           <w:ilvl w:val="0"/>
-          <w:numId w:val="1011"/>
+          <w:numId w:val="1012"/>
         </w:numPr>
       </w:pPr>
       <w:r>
@@ -3714,7 +3834,7 @@
       <w:r>
         <w:t xml:space="preserve"> </w:t>
       </w:r>
-      <w:hyperlink r:id="rId45">
+      <w:hyperlink r:id="rId46">
         <w:r>
           <w:rPr>
             <w:rStyle w:val="Hyperlink"/>
@@ -3734,7 +3854,7 @@
         <w:pStyle w:val="Compact"/>
         <w:numPr>
           <w:ilvl w:val="0"/>
-          <w:numId w:val="1011"/>
+          <w:numId w:val="1012"/>
         </w:numPr>
       </w:pPr>
       <w:r>
@@ -3743,7 +3863,7 @@
       <w:r>
         <w:t xml:space="preserve"> </w:t>
       </w:r>
-      <w:hyperlink r:id="rId46">
+      <w:hyperlink r:id="rId47">
         <w:r>
           <w:rPr>
             <w:rStyle w:val="Hyperlink"/>
@@ -3763,7 +3883,7 @@
         <w:pStyle w:val="Compact"/>
         <w:numPr>
           <w:ilvl w:val="0"/>
-          <w:numId w:val="1011"/>
+          <w:numId w:val="1012"/>
         </w:numPr>
       </w:pPr>
       <w:r>
@@ -3776,14 +3896,14 @@
         <w:t xml:space="preserve">because a bare citation key renders as the author list.</w:t>
       </w:r>
     </w:p>
-    <w:bookmarkEnd w:id="47"/>
-    <w:bookmarkStart w:id="56" w:name="rules-that-apply-to-all-writing"/>
+    <w:bookmarkEnd w:id="48"/>
+    <w:bookmarkStart w:id="57" w:name="rules-that-apply-to-all-writing"/>
     <w:p>
       <w:pPr>
         <w:pStyle w:val="Heading2"/>
       </w:pPr>
       <w:r>
-        <w:t xml:space="preserve">15 Rules that apply to all writing</w:t>
+        <w:t xml:space="preserve">16 Rules that apply to all writing</w:t>
       </w:r>
     </w:p>
     <w:p>
@@ -3799,10 +3919,10 @@
         <w:pStyle w:val="Compact"/>
         <w:numPr>
           <w:ilvl w:val="0"/>
-          <w:numId w:val="1012"/>
-        </w:numPr>
-      </w:pPr>
-      <w:hyperlink r:id="rId48">
+          <w:numId w:val="1013"/>
+        </w:numPr>
+      </w:pPr>
+      <w:hyperlink r:id="rId49">
         <w:r>
           <w:rPr>
             <w:rStyle w:val="Hyperlink"/>
@@ -3819,10 +3939,10 @@
         <w:pStyle w:val="Compact"/>
         <w:numPr>
           <w:ilvl w:val="0"/>
-          <w:numId w:val="1012"/>
-        </w:numPr>
-      </w:pPr>
-      <w:hyperlink r:id="rId49">
+          <w:numId w:val="1013"/>
+        </w:numPr>
+      </w:pPr>
+      <w:hyperlink r:id="rId50">
         <w:r>
           <w:rPr>
             <w:rStyle w:val="Hyperlink"/>
@@ -3842,10 +3962,10 @@
         <w:pStyle w:val="Compact"/>
         <w:numPr>
           <w:ilvl w:val="0"/>
-          <w:numId w:val="1012"/>
-        </w:numPr>
-      </w:pPr>
-      <w:hyperlink r:id="rId50">
+          <w:numId w:val="1013"/>
+        </w:numPr>
+      </w:pPr>
+      <w:hyperlink r:id="rId51">
         <w:r>
           <w:rPr>
             <w:rStyle w:val="Hyperlink"/>
@@ -3862,10 +3982,10 @@
         <w:pStyle w:val="Compact"/>
         <w:numPr>
           <w:ilvl w:val="0"/>
-          <w:numId w:val="1012"/>
-        </w:numPr>
-      </w:pPr>
-      <w:hyperlink r:id="rId51">
+          <w:numId w:val="1013"/>
+        </w:numPr>
+      </w:pPr>
+      <w:hyperlink r:id="rId52">
         <w:r>
           <w:rPr>
             <w:rStyle w:val="Hyperlink"/>
@@ -3885,10 +4005,10 @@
         <w:pStyle w:val="Compact"/>
         <w:numPr>
           <w:ilvl w:val="0"/>
-          <w:numId w:val="1012"/>
-        </w:numPr>
-      </w:pPr>
-      <w:hyperlink r:id="rId52">
+          <w:numId w:val="1013"/>
+        </w:numPr>
+      </w:pPr>
+      <w:hyperlink r:id="rId53">
         <w:r>
           <w:rPr>
             <w:rStyle w:val="Hyperlink"/>
@@ -3900,8 +4020,8 @@
         <w:t xml:space="preserve">.</w:t>
       </w:r>
     </w:p>
-    <w:bookmarkStart w:id="55" w:name="refs"/>
-    <w:bookmarkStart w:id="54" w:name="ref-freeman2014active"/>
+    <w:bookmarkStart w:id="56" w:name="refs"/>
+    <w:bookmarkStart w:id="55" w:name="ref-freeman2014active"/>
     <w:p>
       <w:pPr>
         <w:pStyle w:val="Bibliography"/>
@@ -3934,7 +4054,7 @@
       <w:r>
         <w:t xml:space="preserve"> </w:t>
       </w:r>
-      <w:hyperlink r:id="rId53">
+      <w:hyperlink r:id="rId54">
         <w:r>
           <w:rPr>
             <w:rStyle w:val="Hyperlink"/>
@@ -3946,9 +4066,9 @@
         <w:t xml:space="preserve">.</w:t>
       </w:r>
     </w:p>
-    <w:bookmarkEnd w:id="54"/>
     <w:bookmarkEnd w:id="55"/>
     <w:bookmarkEnd w:id="56"/>
+    <w:bookmarkEnd w:id="57"/>
     <w:sectPr>
       <w:footnotePr>
         <w:numRestart w:val="eachSect"/>
@@ -4199,6 +4319,9 @@
     <w:abstractNumId w:val="991"/>
   </w:num>
   <w:num w:numId="1012">
+    <w:abstractNumId w:val="991"/>
+  </w:num>
+  <w:num w:numId="1013">
     <w:abstractNumId w:val="991"/>
   </w:num>
 </w:numbering>

</xml_diff>

<commit_message>
Deploying to gh-pages from @ Morrison-Lab/psw@d7a5b66003f61e8e0f98010a1b3079912025957e 🚀
</commit_message>
<xml_diff>
--- a/chapters/teaching.docx
+++ b/chapters/teaching.docx
@@ -15,7 +15,7 @@
         <w:pStyle w:val="Date"/>
       </w:pPr>
       <w:r>
-        <w:t xml:space="preserve">Last modified: 2026-10-13 15:24:59 (PDT)</w:t>
+        <w:t xml:space="preserve">Last modified: 2026-10-13 16:39:58 (PDT)</w:t>
       </w:r>
     </w:p>
     <w:tbl>
@@ -1517,13 +1517,21 @@
       </w:r>
     </w:p>
     <w:bookmarkEnd w:id="19"/>
-    <w:bookmarkStart w:id="22" w:name="show-each-idea-applied-and-in-a-figure"/>
+    <w:bookmarkStart w:id="20" w:name="Xa214254a94aa6db868b5b9577007bf4e27699b1"/>
     <w:p>
       <w:pPr>
         <w:pStyle w:val="Heading2"/>
       </w:pPr>
       <w:r>
-        <w:t xml:space="preserve">7 Show each idea applied and in a figure</w:t>
+        <w:t xml:space="preserve">7 Store structured data in structured formats</w:t>
+      </w:r>
+    </w:p>
+    <w:p>
+      <w:pPr>
+        <w:pStyle w:val="FirstParagraph"/>
+      </w:pPr>
+      <w:r>
+        <w:t xml:space="preserve">This rule applies to all teaching materials, in every course and every teaching repository.</w:t>
       </w:r>
     </w:p>
     <w:p>
@@ -1535,6 +1543,121 @@
         </w:numPr>
       </w:pPr>
       <w:r>
+        <w:t xml:space="preserve">Keep a list or table of like items, such as courses, readings, channels or glossary terms,</w:t>
+      </w:r>
+      <w:r>
+        <w:t xml:space="preserve"> </w:t>
+      </w:r>
+      <w:r>
+        <w:t xml:space="preserve">in a CSV, YAML or JSON file with one record per item.</w:t>
+      </w:r>
+      <w:r>
+        <w:t xml:space="preserve"> </w:t>
+      </w:r>
+      <w:r>
+        <w:t xml:space="preserve">The page reads the file and builds the table or list with a short function,</w:t>
+      </w:r>
+      <w:r>
+        <w:t xml:space="preserve"> </w:t>
+      </w:r>
+      <w:r>
+        <w:t xml:space="preserve">instead of holding a hand-written Markdown table.</w:t>
+      </w:r>
+    </w:p>
+    <w:p>
+      <w:pPr>
+        <w:pStyle w:val="Compact"/>
+        <w:numPr>
+          <w:ilvl w:val="0"/>
+          <w:numId w:val="1004"/>
+        </w:numPr>
+      </w:pPr>
+      <w:r>
+        <w:t xml:space="preserve">A data file can be counted, filtered, sorted and reused by another page,</w:t>
+      </w:r>
+      <w:r>
+        <w:t xml:space="preserve"> </w:t>
+      </w:r>
+      <w:r>
+        <w:t xml:space="preserve">and a new row is a one-line change that a reviewer reads as data.</w:t>
+      </w:r>
+    </w:p>
+    <w:p>
+      <w:pPr>
+        <w:pStyle w:val="Compact"/>
+        <w:numPr>
+          <w:ilvl w:val="0"/>
+          <w:numId w:val="1004"/>
+        </w:numPr>
+      </w:pPr>
+      <w:r>
+        <w:t xml:space="preserve">List the file under the page’s</w:t>
+      </w:r>
+      <w:r>
+        <w:t xml:space="preserve"> </w:t>
+      </w:r>
+      <w:r>
+        <w:rPr>
+          <w:rStyle w:val="VerbatimChar"/>
+        </w:rPr>
+        <w:t xml:space="preserve">resources:</w:t>
+      </w:r>
+      <w:r>
+        <w:t xml:space="preserve"> </w:t>
+      </w:r>
+      <w:r>
+        <w:t xml:space="preserve">when the site publishes it.</w:t>
+      </w:r>
+    </w:p>
+    <w:p>
+      <w:pPr>
+        <w:pStyle w:val="Compact"/>
+        <w:numPr>
+          <w:ilvl w:val="0"/>
+          <w:numId w:val="1004"/>
+        </w:numPr>
+      </w:pPr>
+      <w:r>
+        <w:t xml:space="preserve">Convert an existing hand-written table in its own pull request,</w:t>
+      </w:r>
+      <w:r>
+        <w:t xml:space="preserve"> </w:t>
+      </w:r>
+      <w:r>
+        <w:t xml:space="preserve">and render the page before and after to confirm that the output text is identical.</w:t>
+      </w:r>
+    </w:p>
+    <w:p>
+      <w:pPr>
+        <w:pStyle w:val="Compact"/>
+        <w:numPr>
+          <w:ilvl w:val="0"/>
+          <w:numId w:val="1004"/>
+        </w:numPr>
+      </w:pPr>
+      <w:r>
+        <w:t xml:space="preserve">A short list that no other page reads can stay as prose.</w:t>
+      </w:r>
+    </w:p>
+    <w:bookmarkEnd w:id="20"/>
+    <w:bookmarkStart w:id="23" w:name="show-each-idea-applied-and-in-a-figure"/>
+    <w:p>
+      <w:pPr>
+        <w:pStyle w:val="Heading2"/>
+      </w:pPr>
+      <w:r>
+        <w:t xml:space="preserve">8 Show each idea applied and in a figure</w:t>
+      </w:r>
+    </w:p>
+    <w:p>
+      <w:pPr>
+        <w:pStyle w:val="Compact"/>
+        <w:numPr>
+          <w:ilvl w:val="0"/>
+          <w:numId w:val="1005"/>
+        </w:numPr>
+      </w:pPr>
+      <w:r>
         <w:t xml:space="preserve">Give every definition, method and result at least one applied example</w:t>
       </w:r>
       <w:r>
@@ -1555,7 +1678,7 @@
         <w:pStyle w:val="Compact"/>
         <w:numPr>
           <w:ilvl w:val="0"/>
-          <w:numId w:val="1004"/>
+          <w:numId w:val="1005"/>
         </w:numPr>
       </w:pPr>
       <w:r>
@@ -1660,7 +1783,7 @@
       <w:r>
         <w:t xml:space="preserve"> </w:t>
       </w:r>
-      <w:hyperlink r:id="rId20">
+      <w:hyperlink r:id="rId21">
         <w:r>
           <w:rPr>
             <w:rStyle w:val="Hyperlink"/>
@@ -1680,7 +1803,7 @@
         <w:pStyle w:val="Compact"/>
         <w:numPr>
           <w:ilvl w:val="0"/>
-          <w:numId w:val="1004"/>
+          <w:numId w:val="1005"/>
         </w:numPr>
       </w:pPr>
       <w:r>
@@ -1704,7 +1827,7 @@
         <w:pStyle w:val="Compact"/>
         <w:numPr>
           <w:ilvl w:val="0"/>
-          <w:numId w:val="1004"/>
+          <w:numId w:val="1005"/>
         </w:numPr>
       </w:pPr>
       <w:r>
@@ -1722,7 +1845,7 @@
         <w:pStyle w:val="Compact"/>
         <w:numPr>
           <w:ilvl w:val="0"/>
-          <w:numId w:val="1004"/>
+          <w:numId w:val="1005"/>
         </w:numPr>
       </w:pPr>
       <w:r>
@@ -1761,7 +1884,7 @@
       <w:r>
         <w:t xml:space="preserve"> </w:t>
       </w:r>
-      <w:hyperlink r:id="rId21">
+      <w:hyperlink r:id="rId22">
         <w:r>
           <w:rPr>
             <w:rStyle w:val="Hyperlink"/>
@@ -1781,21 +1904,21 @@
         <w:pStyle w:val="Compact"/>
         <w:numPr>
           <w:ilvl w:val="0"/>
-          <w:numId w:val="1004"/>
+          <w:numId w:val="1005"/>
         </w:numPr>
       </w:pPr>
       <w:r>
         <w:t xml:space="preserve">Make each figure follow the accessibility rules below.</w:t>
       </w:r>
     </w:p>
-    <w:bookmarkEnd w:id="22"/>
-    <w:bookmarkStart w:id="26" w:name="Xf27331f4c36c8d578e5fa29a37312484cc3343a"/>
+    <w:bookmarkEnd w:id="23"/>
+    <w:bookmarkStart w:id="27" w:name="Xf27331f4c36c8d578e5fa29a37312484cc3343a"/>
     <w:p>
       <w:pPr>
         <w:pStyle w:val="Heading2"/>
       </w:pPr>
       <w:r>
-        <w:t xml:space="preserve">8 Write labs for both languages and any computer</w:t>
+        <w:t xml:space="preserve">9 Write labs for both languages and any computer</w:t>
       </w:r>
     </w:p>
     <w:p>
@@ -1817,7 +1940,7 @@
         <w:pStyle w:val="Compact"/>
         <w:numPr>
           <w:ilvl w:val="0"/>
-          <w:numId w:val="1005"/>
+          <w:numId w:val="1006"/>
         </w:numPr>
       </w:pPr>
       <w:r>
@@ -1829,7 +1952,7 @@
         <w:pStyle w:val="Compact"/>
         <w:numPr>
           <w:ilvl w:val="0"/>
-          <w:numId w:val="1005"/>
+          <w:numId w:val="1006"/>
         </w:numPr>
       </w:pPr>
       <w:r>
@@ -1838,7 +1961,7 @@
       <w:r>
         <w:t xml:space="preserve"> </w:t>
       </w:r>
-      <w:hyperlink r:id="rId23">
+      <w:hyperlink r:id="rId24">
         <w:r>
           <w:rPr>
             <w:rStyle w:val="Hyperlink"/>
@@ -1864,7 +1987,7 @@
       <w:r>
         <w:t xml:space="preserve"> </w:t>
       </w:r>
-      <w:hyperlink r:id="rId24">
+      <w:hyperlink r:id="rId25">
         <w:r>
           <w:rPr>
             <w:rStyle w:val="Hyperlink"/>
@@ -1884,7 +2007,7 @@
         <w:pStyle w:val="Compact"/>
         <w:numPr>
           <w:ilvl w:val="0"/>
-          <w:numId w:val="1005"/>
+          <w:numId w:val="1006"/>
         </w:numPr>
       </w:pPr>
       <w:r>
@@ -1929,7 +2052,7 @@
       <w:r>
         <w:t xml:space="preserve"> </w:t>
       </w:r>
-      <w:hyperlink r:id="rId25">
+      <w:hyperlink r:id="rId26">
         <w:r>
           <w:rPr>
             <w:rStyle w:val="Hyperlink"/>
@@ -1955,7 +2078,7 @@
         <w:pStyle w:val="Compact"/>
         <w:numPr>
           <w:ilvl w:val="0"/>
-          <w:numId w:val="1005"/>
+          <w:numId w:val="1006"/>
         </w:numPr>
       </w:pPr>
       <w:r>
@@ -1985,7 +2108,7 @@
         <w:pStyle w:val="Compact"/>
         <w:numPr>
           <w:ilvl w:val="0"/>
-          <w:numId w:val="1005"/>
+          <w:numId w:val="1006"/>
         </w:numPr>
       </w:pPr>
       <w:r>
@@ -1997,7 +2120,7 @@
         <w:pStyle w:val="Compact"/>
         <w:numPr>
           <w:ilvl w:val="0"/>
-          <w:numId w:val="1005"/>
+          <w:numId w:val="1006"/>
         </w:numPr>
       </w:pPr>
       <w:r>
@@ -2081,7 +2204,7 @@
         <w:pStyle w:val="Compact"/>
         <w:numPr>
           <w:ilvl w:val="0"/>
-          <w:numId w:val="1005"/>
+          <w:numId w:val="1006"/>
         </w:numPr>
       </w:pPr>
       <w:r>
@@ -2100,14 +2223,14 @@
         <w:t xml:space="preserve">so setup steps must work on a shared or hosted machine.</w:t>
       </w:r>
     </w:p>
-    <w:bookmarkEnd w:id="26"/>
-    <w:bookmarkStart w:id="35" w:name="present-r-results-with-modern-packages"/>
+    <w:bookmarkEnd w:id="27"/>
+    <w:bookmarkStart w:id="36" w:name="present-r-results-with-modern-packages"/>
     <w:p>
       <w:pPr>
         <w:pStyle w:val="Heading2"/>
       </w:pPr>
       <w:r>
-        <w:t xml:space="preserve">9 Present R results with modern packages</w:t>
+        <w:t xml:space="preserve">10 Present R results with modern packages</w:t>
       </w:r>
     </w:p>
     <w:p>
@@ -2129,7 +2252,7 @@
         <w:pStyle w:val="Compact"/>
         <w:numPr>
           <w:ilvl w:val="0"/>
-          <w:numId w:val="1006"/>
+          <w:numId w:val="1007"/>
         </w:numPr>
       </w:pPr>
       <w:r>
@@ -2174,7 +2297,7 @@
         <w:pStyle w:val="Compact"/>
         <w:numPr>
           <w:ilvl w:val="0"/>
-          <w:numId w:val="1006"/>
+          <w:numId w:val="1007"/>
         </w:numPr>
       </w:pPr>
       <w:r>
@@ -2183,7 +2306,7 @@
       <w:r>
         <w:t xml:space="preserve"> </w:t>
       </w:r>
-      <w:hyperlink r:id="rId27">
+      <w:hyperlink r:id="rId28">
         <w:r>
           <w:rPr>
             <w:rStyle w:val="Hyperlink"/>
@@ -2215,7 +2338,7 @@
       <w:r>
         <w:t xml:space="preserve"> </w:t>
       </w:r>
-      <w:hyperlink r:id="rId28">
+      <w:hyperlink r:id="rId29">
         <w:r>
           <w:rPr>
             <w:rStyle w:val="Hyperlink"/>
@@ -2280,7 +2403,7 @@
         <w:pStyle w:val="Compact"/>
         <w:numPr>
           <w:ilvl w:val="0"/>
-          <w:numId w:val="1006"/>
+          <w:numId w:val="1007"/>
         </w:numPr>
       </w:pPr>
       <w:r>
@@ -2289,7 +2412,7 @@
       <w:r>
         <w:t xml:space="preserve"> </w:t>
       </w:r>
-      <w:hyperlink r:id="rId29">
+      <w:hyperlink r:id="rId30">
         <w:r>
           <w:rPr>
             <w:rStyle w:val="Hyperlink"/>
@@ -2351,7 +2474,7 @@
         <w:pStyle w:val="Compact"/>
         <w:numPr>
           <w:ilvl w:val="0"/>
-          <w:numId w:val="1006"/>
+          <w:numId w:val="1007"/>
         </w:numPr>
       </w:pPr>
       <w:r>
@@ -2360,7 +2483,7 @@
       <w:r>
         <w:t xml:space="preserve"> </w:t>
       </w:r>
-      <w:hyperlink r:id="rId30">
+      <w:hyperlink r:id="rId31">
         <w:r>
           <w:rPr>
             <w:rStyle w:val="Hyperlink"/>
@@ -2377,7 +2500,7 @@
       <w:r>
         <w:t xml:space="preserve"> </w:t>
       </w:r>
-      <w:hyperlink r:id="rId31">
+      <w:hyperlink r:id="rId32">
         <w:r>
           <w:rPr>
             <w:rStyle w:val="Hyperlink"/>
@@ -2400,7 +2523,7 @@
       <w:r>
         <w:t xml:space="preserve"> </w:t>
       </w:r>
-      <w:hyperlink r:id="rId32">
+      <w:hyperlink r:id="rId33">
         <w:r>
           <w:rPr>
             <w:rStyle w:val="Hyperlink"/>
@@ -2432,7 +2555,7 @@
         <w:pStyle w:val="Compact"/>
         <w:numPr>
           <w:ilvl w:val="0"/>
-          <w:numId w:val="1006"/>
+          <w:numId w:val="1007"/>
         </w:numPr>
       </w:pPr>
       <w:r>
@@ -2456,7 +2579,7 @@
       <w:r>
         <w:t xml:space="preserve"> </w:t>
       </w:r>
-      <w:hyperlink r:id="rId33">
+      <w:hyperlink r:id="rId34">
         <w:r>
           <w:rPr>
             <w:rStyle w:val="Hyperlink"/>
@@ -2485,7 +2608,7 @@
         <w:pStyle w:val="Compact"/>
         <w:numPr>
           <w:ilvl w:val="0"/>
-          <w:numId w:val="1006"/>
+          <w:numId w:val="1007"/>
         </w:numPr>
       </w:pPr>
       <w:r>
@@ -2494,7 +2617,7 @@
       <w:r>
         <w:t xml:space="preserve"> </w:t>
       </w:r>
-      <w:hyperlink r:id="rId34">
+      <w:hyperlink r:id="rId35">
         <w:r>
           <w:rPr>
             <w:rStyle w:val="Hyperlink"/>
@@ -2509,14 +2632,14 @@
         <w:t xml:space="preserve">notes show the style.</w:t>
       </w:r>
     </w:p>
-    <w:bookmarkEnd w:id="35"/>
-    <w:bookmarkStart w:id="39" w:name="manipulate-data-with-dplyr-not-base-r"/>
+    <w:bookmarkEnd w:id="36"/>
+    <w:bookmarkStart w:id="40" w:name="manipulate-data-with-dplyr-not-base-r"/>
     <w:p>
       <w:pPr>
         <w:pStyle w:val="Heading2"/>
       </w:pPr>
       <w:r>
-        <w:t xml:space="preserve">10 Manipulate data with dplyr, not base R</w:t>
+        <w:t xml:space="preserve">11 Manipulate data with dplyr, not base R</w:t>
       </w:r>
     </w:p>
     <w:p>
@@ -2538,7 +2661,7 @@
         <w:pStyle w:val="Compact"/>
         <w:numPr>
           <w:ilvl w:val="0"/>
-          <w:numId w:val="1007"/>
+          <w:numId w:val="1008"/>
         </w:numPr>
       </w:pPr>
       <w:r>
@@ -2547,7 +2670,7 @@
       <w:r>
         <w:t xml:space="preserve"> </w:t>
       </w:r>
-      <w:hyperlink r:id="rId36">
+      <w:hyperlink r:id="rId37">
         <w:r>
           <w:rPr>
             <w:rStyle w:val="Hyperlink"/>
@@ -2609,7 +2732,7 @@
         <w:pStyle w:val="Compact"/>
         <w:numPr>
           <w:ilvl w:val="0"/>
-          <w:numId w:val="1007"/>
+          <w:numId w:val="1008"/>
         </w:numPr>
       </w:pPr>
       <w:r>
@@ -2660,7 +2783,7 @@
         <w:pStyle w:val="Compact"/>
         <w:numPr>
           <w:ilvl w:val="0"/>
-          <w:numId w:val="1007"/>
+          <w:numId w:val="1008"/>
         </w:numPr>
       </w:pPr>
       <w:r>
@@ -2696,7 +2819,7 @@
         <w:pStyle w:val="Compact"/>
         <w:numPr>
           <w:ilvl w:val="0"/>
-          <w:numId w:val="1007"/>
+          <w:numId w:val="1008"/>
         </w:numPr>
       </w:pPr>
       <w:r>
@@ -2705,7 +2828,7 @@
       <w:r>
         <w:t xml:space="preserve"> </w:t>
       </w:r>
-      <w:hyperlink r:id="rId37">
+      <w:hyperlink r:id="rId38">
         <w:r>
           <w:rPr>
             <w:rStyle w:val="Hyperlink"/>
@@ -2752,7 +2875,7 @@
         <w:pStyle w:val="Compact"/>
         <w:numPr>
           <w:ilvl w:val="0"/>
-          <w:numId w:val="1007"/>
+          <w:numId w:val="1008"/>
         </w:numPr>
       </w:pPr>
       <w:r>
@@ -2788,7 +2911,7 @@
         <w:pStyle w:val="Compact"/>
         <w:numPr>
           <w:ilvl w:val="0"/>
-          <w:numId w:val="1007"/>
+          <w:numId w:val="1008"/>
         </w:numPr>
       </w:pPr>
       <w:r>
@@ -2797,7 +2920,7 @@
       <w:r>
         <w:t xml:space="preserve"> </w:t>
       </w:r>
-      <w:hyperlink r:id="rId38">
+      <w:hyperlink r:id="rId39">
         <w:r>
           <w:rPr>
             <w:rStyle w:val="Hyperlink"/>
@@ -2844,7 +2967,7 @@
         <w:pStyle w:val="Compact"/>
         <w:numPr>
           <w:ilvl w:val="0"/>
-          <w:numId w:val="1007"/>
+          <w:numId w:val="1008"/>
         </w:numPr>
       </w:pPr>
       <w:r>
@@ -2868,7 +2991,7 @@
         <w:pStyle w:val="Compact"/>
         <w:numPr>
           <w:ilvl w:val="0"/>
-          <w:numId w:val="1007"/>
+          <w:numId w:val="1008"/>
         </w:numPr>
       </w:pPr>
       <w:r>
@@ -2967,7 +3090,7 @@
         <w:pStyle w:val="Compact"/>
         <w:numPr>
           <w:ilvl w:val="0"/>
-          <w:numId w:val="1007"/>
+          <w:numId w:val="1008"/>
         </w:numPr>
       </w:pPr>
       <w:r>
@@ -2986,14 +3109,14 @@
         <w:t xml:space="preserve">The rule is about selecting, filtering and building data frames.</w:t>
       </w:r>
     </w:p>
-    <w:bookmarkEnd w:id="39"/>
-    <w:bookmarkStart w:id="40" w:name="X7c0de8eaf50a5b2644eabf66f1f9b734b8a4a71"/>
+    <w:bookmarkEnd w:id="40"/>
+    <w:bookmarkStart w:id="41" w:name="X7c0de8eaf50a5b2644eabf66f1f9b734b8a4a71"/>
     <w:p>
       <w:pPr>
         <w:pStyle w:val="Heading2"/>
       </w:pPr>
       <w:r>
-        <w:t xml:space="preserve">11 Comment every code chunk to say what and why</w:t>
+        <w:t xml:space="preserve">12 Comment every code chunk to say what and why</w:t>
       </w:r>
     </w:p>
     <w:p>
@@ -3015,7 +3138,7 @@
         <w:pStyle w:val="Compact"/>
         <w:numPr>
           <w:ilvl w:val="0"/>
-          <w:numId w:val="1008"/>
+          <w:numId w:val="1009"/>
         </w:numPr>
       </w:pPr>
       <w:r>
@@ -3033,7 +3156,7 @@
         <w:pStyle w:val="Compact"/>
         <w:numPr>
           <w:ilvl w:val="0"/>
-          <w:numId w:val="1008"/>
+          <w:numId w:val="1009"/>
         </w:numPr>
       </w:pPr>
       <w:r>
@@ -3051,7 +3174,7 @@
         <w:pStyle w:val="Compact"/>
         <w:numPr>
           <w:ilvl w:val="0"/>
-          <w:numId w:val="1008"/>
+          <w:numId w:val="1009"/>
         </w:numPr>
       </w:pPr>
       <w:r>
@@ -3149,7 +3272,7 @@
         <w:pStyle w:val="Compact"/>
         <w:numPr>
           <w:ilvl w:val="0"/>
-          <w:numId w:val="1008"/>
+          <w:numId w:val="1009"/>
         </w:numPr>
       </w:pPr>
       <w:r>
@@ -3162,14 +3285,14 @@
         <w:t xml:space="preserve">such as a transformation, a modeling choice, a tuning value or a random seed.</w:t>
       </w:r>
     </w:p>
-    <w:bookmarkEnd w:id="40"/>
-    <w:bookmarkStart w:id="41" w:name="Xffa5a3357c8672d830c88e1e58a0ef107550647"/>
+    <w:bookmarkEnd w:id="41"/>
+    <w:bookmarkStart w:id="42" w:name="Xffa5a3357c8672d830c88e1e58a0ef107550647"/>
     <w:p>
       <w:pPr>
         <w:pStyle w:val="Heading2"/>
       </w:pPr>
       <w:r>
-        <w:t xml:space="preserve">12 Introduce every function in a programming primer</w:t>
+        <w:t xml:space="preserve">13 Introduce every function in a programming primer</w:t>
       </w:r>
     </w:p>
     <w:p>
@@ -3191,7 +3314,7 @@
         <w:pStyle w:val="Compact"/>
         <w:numPr>
           <w:ilvl w:val="0"/>
-          <w:numId w:val="1009"/>
+          <w:numId w:val="1010"/>
         </w:numPr>
       </w:pPr>
       <w:r>
@@ -3215,7 +3338,7 @@
         <w:pStyle w:val="Compact"/>
         <w:numPr>
           <w:ilvl w:val="0"/>
-          <w:numId w:val="1009"/>
+          <w:numId w:val="1010"/>
         </w:numPr>
       </w:pPr>
       <w:r>
@@ -3245,7 +3368,7 @@
         <w:pStyle w:val="Compact"/>
         <w:numPr>
           <w:ilvl w:val="0"/>
-          <w:numId w:val="1009"/>
+          <w:numId w:val="1010"/>
         </w:numPr>
       </w:pPr>
       <w:r>
@@ -3269,7 +3392,7 @@
         <w:pStyle w:val="Compact"/>
         <w:numPr>
           <w:ilvl w:val="0"/>
-          <w:numId w:val="1009"/>
+          <w:numId w:val="1010"/>
         </w:numPr>
       </w:pPr>
       <w:r>
@@ -3282,22 +3405,22 @@
         <w:t xml:space="preserve">A chapter introduces those where it defines them.</w:t>
       </w:r>
     </w:p>
-    <w:bookmarkEnd w:id="41"/>
-    <w:bookmarkStart w:id="42" w:name="make-figures-accessible"/>
+    <w:bookmarkEnd w:id="42"/>
+    <w:bookmarkStart w:id="43" w:name="make-figures-accessible"/>
     <w:p>
       <w:pPr>
         <w:pStyle w:val="Heading2"/>
       </w:pPr>
       <w:r>
-        <w:t xml:space="preserve">13 Make figures accessible</w:t>
-      </w:r>
-    </w:p>
-    <w:p>
-      <w:pPr>
-        <w:pStyle w:val="Compact"/>
-        <w:numPr>
-          <w:ilvl w:val="0"/>
-          <w:numId w:val="1010"/>
+        <w:t xml:space="preserve">14 Make figures accessible</w:t>
+      </w:r>
+    </w:p>
+    <w:p>
+      <w:pPr>
+        <w:pStyle w:val="Compact"/>
+        <w:numPr>
+          <w:ilvl w:val="0"/>
+          <w:numId w:val="1011"/>
         </w:numPr>
       </w:pPr>
       <w:r>
@@ -3324,7 +3447,7 @@
         <w:pStyle w:val="Compact"/>
         <w:numPr>
           <w:ilvl w:val="0"/>
-          <w:numId w:val="1010"/>
+          <w:numId w:val="1011"/>
         </w:numPr>
       </w:pPr>
       <w:r>
@@ -3354,7 +3477,7 @@
         <w:pStyle w:val="Compact"/>
         <w:numPr>
           <w:ilvl w:val="0"/>
-          <w:numId w:val="1010"/>
+          <w:numId w:val="1011"/>
         </w:numPr>
       </w:pPr>
       <w:r>
@@ -3393,7 +3516,7 @@
         <w:pStyle w:val="Compact"/>
         <w:numPr>
           <w:ilvl w:val="0"/>
-          <w:numId w:val="1010"/>
+          <w:numId w:val="1011"/>
         </w:numPr>
       </w:pPr>
       <w:r>
@@ -3418,22 +3541,22 @@
         <w:t xml:space="preserve">(observed when rendering lecture notes to PDF).</w:t>
       </w:r>
     </w:p>
-    <w:bookmarkEnd w:id="42"/>
-    <w:bookmarkStart w:id="44" w:name="structure-slides-for-the-reader"/>
+    <w:bookmarkEnd w:id="43"/>
+    <w:bookmarkStart w:id="45" w:name="structure-slides-for-the-reader"/>
     <w:p>
       <w:pPr>
         <w:pStyle w:val="Heading2"/>
       </w:pPr>
       <w:r>
-        <w:t xml:space="preserve">14 Structure slides for the reader</w:t>
-      </w:r>
-    </w:p>
-    <w:p>
-      <w:pPr>
-        <w:pStyle w:val="Compact"/>
-        <w:numPr>
-          <w:ilvl w:val="0"/>
-          <w:numId w:val="1011"/>
+        <w:t xml:space="preserve">15 Structure slides for the reader</w:t>
+      </w:r>
+    </w:p>
+    <w:p>
+      <w:pPr>
+        <w:pStyle w:val="Compact"/>
+        <w:numPr>
+          <w:ilvl w:val="0"/>
+          <w:numId w:val="1012"/>
         </w:numPr>
       </w:pPr>
       <w:r>
@@ -3463,7 +3586,7 @@
         <w:pStyle w:val="Compact"/>
         <w:numPr>
           <w:ilvl w:val="0"/>
-          <w:numId w:val="1011"/>
+          <w:numId w:val="1012"/>
         </w:numPr>
       </w:pPr>
       <w:r>
@@ -3478,7 +3601,7 @@
       <w:r>
         <w:t xml:space="preserve"> </w:t>
       </w:r>
-      <w:hyperlink r:id="rId43">
+      <w:hyperlink r:id="rId44">
         <w:r>
           <w:rPr>
             <w:rStyle w:val="Hyperlink"/>
@@ -3498,7 +3621,7 @@
         <w:pStyle w:val="Compact"/>
         <w:numPr>
           <w:ilvl w:val="0"/>
-          <w:numId w:val="1011"/>
+          <w:numId w:val="1012"/>
         </w:numPr>
       </w:pPr>
       <w:r>
@@ -3525,7 +3648,7 @@
         <w:pStyle w:val="Compact"/>
         <w:numPr>
           <w:ilvl w:val="0"/>
-          <w:numId w:val="1011"/>
+          <w:numId w:val="1012"/>
         </w:numPr>
       </w:pPr>
       <w:r>
@@ -3594,7 +3717,7 @@
         <w:pStyle w:val="Compact"/>
         <w:numPr>
           <w:ilvl w:val="0"/>
-          <w:numId w:val="1011"/>
+          <w:numId w:val="1012"/>
         </w:numPr>
       </w:pPr>
       <w:r>
@@ -3663,7 +3786,7 @@
         <w:pStyle w:val="Compact"/>
         <w:numPr>
           <w:ilvl w:val="0"/>
-          <w:numId w:val="1011"/>
+          <w:numId w:val="1012"/>
         </w:numPr>
       </w:pPr>
       <w:r>
@@ -3687,7 +3810,7 @@
         <w:pStyle w:val="Compact"/>
         <w:numPr>
           <w:ilvl w:val="0"/>
-          <w:numId w:val="1011"/>
+          <w:numId w:val="1012"/>
         </w:numPr>
       </w:pPr>
       <w:r>
@@ -3718,22 +3841,22 @@
         <w:t xml:space="preserve">Put a slide break after the heading and move the text onto content slides.</w:t>
       </w:r>
     </w:p>
-    <w:bookmarkEnd w:id="44"/>
-    <w:bookmarkStart w:id="48" w:name="Xcb579568ef754486ebde8b41ba4528bdf380eec"/>
+    <w:bookmarkEnd w:id="45"/>
+    <w:bookmarkStart w:id="49" w:name="Xcb579568ef754486ebde8b41ba4528bdf380eec"/>
     <w:p>
       <w:pPr>
         <w:pStyle w:val="Heading2"/>
       </w:pPr>
       <w:r>
-        <w:t xml:space="preserve">15 Credit other courses without summarizing them</w:t>
-      </w:r>
-    </w:p>
-    <w:p>
-      <w:pPr>
-        <w:pStyle w:val="Compact"/>
-        <w:numPr>
-          <w:ilvl w:val="0"/>
-          <w:numId w:val="1012"/>
+        <w:t xml:space="preserve">16 Credit other courses without summarizing them</w:t>
+      </w:r>
+    </w:p>
+    <w:p>
+      <w:pPr>
+        <w:pStyle w:val="Compact"/>
+        <w:numPr>
+          <w:ilvl w:val="0"/>
+          <w:numId w:val="1013"/>
         </w:numPr>
       </w:pPr>
       <w:r>
@@ -3778,7 +3901,7 @@
       <w:r>
         <w:t xml:space="preserve"> </w:t>
       </w:r>
-      <w:hyperlink r:id="rId45">
+      <w:hyperlink r:id="rId46">
         <w:r>
           <w:rPr>
             <w:rStyle w:val="Hyperlink"/>
@@ -3819,7 +3942,7 @@
         <w:pStyle w:val="Compact"/>
         <w:numPr>
           <w:ilvl w:val="0"/>
-          <w:numId w:val="1012"/>
+          <w:numId w:val="1013"/>
         </w:numPr>
       </w:pPr>
       <w:r>
@@ -3834,7 +3957,7 @@
       <w:r>
         <w:t xml:space="preserve"> </w:t>
       </w:r>
-      <w:hyperlink r:id="rId46">
+      <w:hyperlink r:id="rId47">
         <w:r>
           <w:rPr>
             <w:rStyle w:val="Hyperlink"/>
@@ -3854,7 +3977,7 @@
         <w:pStyle w:val="Compact"/>
         <w:numPr>
           <w:ilvl w:val="0"/>
-          <w:numId w:val="1012"/>
+          <w:numId w:val="1013"/>
         </w:numPr>
       </w:pPr>
       <w:r>
@@ -3863,7 +3986,7 @@
       <w:r>
         <w:t xml:space="preserve"> </w:t>
       </w:r>
-      <w:hyperlink r:id="rId47">
+      <w:hyperlink r:id="rId48">
         <w:r>
           <w:rPr>
             <w:rStyle w:val="Hyperlink"/>
@@ -3883,7 +4006,7 @@
         <w:pStyle w:val="Compact"/>
         <w:numPr>
           <w:ilvl w:val="0"/>
-          <w:numId w:val="1012"/>
+          <w:numId w:val="1013"/>
         </w:numPr>
       </w:pPr>
       <w:r>
@@ -3896,14 +4019,14 @@
         <w:t xml:space="preserve">because a bare citation key renders as the author list.</w:t>
       </w:r>
     </w:p>
-    <w:bookmarkEnd w:id="48"/>
-    <w:bookmarkStart w:id="57" w:name="rules-that-apply-to-all-writing"/>
+    <w:bookmarkEnd w:id="49"/>
+    <w:bookmarkStart w:id="58" w:name="rules-that-apply-to-all-writing"/>
     <w:p>
       <w:pPr>
         <w:pStyle w:val="Heading2"/>
       </w:pPr>
       <w:r>
-        <w:t xml:space="preserve">16 Rules that apply to all writing</w:t>
+        <w:t xml:space="preserve">17 Rules that apply to all writing</w:t>
       </w:r>
     </w:p>
     <w:p>
@@ -3919,10 +4042,10 @@
         <w:pStyle w:val="Compact"/>
         <w:numPr>
           <w:ilvl w:val="0"/>
-          <w:numId w:val="1013"/>
-        </w:numPr>
-      </w:pPr>
-      <w:hyperlink r:id="rId49">
+          <w:numId w:val="1014"/>
+        </w:numPr>
+      </w:pPr>
+      <w:hyperlink r:id="rId50">
         <w:r>
           <w:rPr>
             <w:rStyle w:val="Hyperlink"/>
@@ -3939,10 +4062,10 @@
         <w:pStyle w:val="Compact"/>
         <w:numPr>
           <w:ilvl w:val="0"/>
-          <w:numId w:val="1013"/>
-        </w:numPr>
-      </w:pPr>
-      <w:hyperlink r:id="rId50">
+          <w:numId w:val="1014"/>
+        </w:numPr>
+      </w:pPr>
+      <w:hyperlink r:id="rId51">
         <w:r>
           <w:rPr>
             <w:rStyle w:val="Hyperlink"/>
@@ -3962,10 +4085,10 @@
         <w:pStyle w:val="Compact"/>
         <w:numPr>
           <w:ilvl w:val="0"/>
-          <w:numId w:val="1013"/>
-        </w:numPr>
-      </w:pPr>
-      <w:hyperlink r:id="rId51">
+          <w:numId w:val="1014"/>
+        </w:numPr>
+      </w:pPr>
+      <w:hyperlink r:id="rId52">
         <w:r>
           <w:rPr>
             <w:rStyle w:val="Hyperlink"/>
@@ -3982,10 +4105,10 @@
         <w:pStyle w:val="Compact"/>
         <w:numPr>
           <w:ilvl w:val="0"/>
-          <w:numId w:val="1013"/>
-        </w:numPr>
-      </w:pPr>
-      <w:hyperlink r:id="rId52">
+          <w:numId w:val="1014"/>
+        </w:numPr>
+      </w:pPr>
+      <w:hyperlink r:id="rId53">
         <w:r>
           <w:rPr>
             <w:rStyle w:val="Hyperlink"/>
@@ -4005,10 +4128,10 @@
         <w:pStyle w:val="Compact"/>
         <w:numPr>
           <w:ilvl w:val="0"/>
-          <w:numId w:val="1013"/>
-        </w:numPr>
-      </w:pPr>
-      <w:hyperlink r:id="rId53">
+          <w:numId w:val="1014"/>
+        </w:numPr>
+      </w:pPr>
+      <w:hyperlink r:id="rId54">
         <w:r>
           <w:rPr>
             <w:rStyle w:val="Hyperlink"/>
@@ -4020,8 +4143,8 @@
         <w:t xml:space="preserve">.</w:t>
       </w:r>
     </w:p>
-    <w:bookmarkStart w:id="56" w:name="refs"/>
-    <w:bookmarkStart w:id="55" w:name="ref-freeman2014active"/>
+    <w:bookmarkStart w:id="57" w:name="refs"/>
+    <w:bookmarkStart w:id="56" w:name="ref-freeman2014active"/>
     <w:p>
       <w:pPr>
         <w:pStyle w:val="Bibliography"/>
@@ -4054,7 +4177,7 @@
       <w:r>
         <w:t xml:space="preserve"> </w:t>
       </w:r>
-      <w:hyperlink r:id="rId54">
+      <w:hyperlink r:id="rId55">
         <w:r>
           <w:rPr>
             <w:rStyle w:val="Hyperlink"/>
@@ -4066,9 +4189,9 @@
         <w:t xml:space="preserve">.</w:t>
       </w:r>
     </w:p>
-    <w:bookmarkEnd w:id="55"/>
     <w:bookmarkEnd w:id="56"/>
     <w:bookmarkEnd w:id="57"/>
+    <w:bookmarkEnd w:id="58"/>
     <w:sectPr>
       <w:footnotePr>
         <w:numRestart w:val="eachSect"/>
@@ -4322,6 +4445,9 @@
     <w:abstractNumId w:val="991"/>
   </w:num>
   <w:num w:numId="1013">
+    <w:abstractNumId w:val="991"/>
+  </w:num>
+  <w:num w:numId="1014">
     <w:abstractNumId w:val="991"/>
   </w:num>
 </w:numbering>

</xml_diff>

<commit_message>
Deploying to gh-pages from @ Morrison-Lab/psw@d399d2cd98e9cd9b861f9834b8a50fa41066b59e 🚀
</commit_message>
<xml_diff>
--- a/chapters/teaching.docx
+++ b/chapters/teaching.docx
@@ -15,7 +15,7 @@
         <w:pStyle w:val="Date"/>
       </w:pPr>
       <w:r>
-        <w:t xml:space="preserve">Last modified: 2026-10-14 03:04:15 (PDT)</w:t>
+        <w:t xml:space="preserve">Last modified: 2026-10-14 03:09:08 (PDT)</w:t>
       </w:r>
     </w:p>
     <w:tbl>
@@ -3110,13 +3110,13 @@
       </w:r>
     </w:p>
     <w:bookmarkEnd w:id="40"/>
-    <w:bookmarkStart w:id="41" w:name="X7c0de8eaf50a5b2644eabf66f1f9b734b8a4a71"/>
+    <w:bookmarkStart w:id="42" w:name="X2bc6121e3a2f39a37d8a6591d77df16bd22bd0b"/>
     <w:p>
       <w:pPr>
         <w:pStyle w:val="Heading2"/>
       </w:pPr>
       <w:r>
-        <w:t xml:space="preserve">12 Comment every code chunk to say what and why</w:t>
+        <w:t xml:space="preserve">12 Include code from files instead of copying it</w:t>
       </w:r>
     </w:p>
     <w:p>
@@ -3124,6 +3124,277 @@
         <w:pStyle w:val="FirstParagraph"/>
       </w:pPr>
       <w:r>
+        <w:t xml:space="preserve">This rule applies to code that appears in more than one place in teaching materials.</w:t>
+      </w:r>
+    </w:p>
+    <w:p>
+      <w:pPr>
+        <w:pStyle w:val="Compact"/>
+        <w:numPr>
+          <w:ilvl w:val="0"/>
+          <w:numId w:val="1009"/>
+        </w:numPr>
+      </w:pPr>
+      <w:r>
+        <w:t xml:space="preserve">When the same code appears in several pages, or in a page and a script,</w:t>
+      </w:r>
+      <w:r>
+        <w:t xml:space="preserve"> </w:t>
+      </w:r>
+      <w:r>
+        <w:t xml:space="preserve">keep one source file and include it where it is shown.</w:t>
+      </w:r>
+      <w:r>
+        <w:t xml:space="preserve"> </w:t>
+      </w:r>
+      <w:r>
+        <w:t xml:space="preserve">A copy in each place drifts when one copy is fixed and the others are not</w:t>
+      </w:r>
+      <w:r>
+        <w:t xml:space="preserve"> </w:t>
+      </w:r>
+      <w:r>
+        <w:t xml:space="preserve">(see</w:t>
+      </w:r>
+      <w:r>
+        <w:t xml:space="preserve"> </w:t>
+      </w:r>
+      <w:hyperlink w:anchor="reuse-one-written-version-of-each-result">
+        <w:r>
+          <w:rPr>
+            <w:rStyle w:val="Hyperlink"/>
+          </w:rPr>
+          <w:t xml:space="preserve">Reuse one written version of each result</w:t>
+        </w:r>
+      </w:hyperlink>
+      <w:r>
+        <w:t xml:space="preserve">).</w:t>
+      </w:r>
+    </w:p>
+    <w:p>
+      <w:pPr>
+        <w:pStyle w:val="Compact"/>
+        <w:numPr>
+          <w:ilvl w:val="0"/>
+          <w:numId w:val="1009"/>
+        </w:numPr>
+      </w:pPr>
+      <w:r>
+        <w:t xml:space="preserve">Code that the page runs should be an executed chunk, as above.</w:t>
+      </w:r>
+      <w:r>
+        <w:t xml:space="preserve"> </w:t>
+      </w:r>
+      <w:r>
+        <w:t xml:space="preserve">For code that is displayed but not executed on the page,</w:t>
+      </w:r>
+      <w:r>
+        <w:t xml:space="preserve"> </w:t>
+      </w:r>
+      <w:r>
+        <w:t xml:space="preserve">such as a standalone script or a configuration file,</w:t>
+      </w:r>
+      <w:r>
+        <w:t xml:space="preserve"> </w:t>
+      </w:r>
+      <w:r>
+        <w:t xml:space="preserve">Quarto’s</w:t>
+      </w:r>
+      <w:r>
+        <w:t xml:space="preserve"> </w:t>
+      </w:r>
+      <w:hyperlink r:id="rId41">
+        <w:r>
+          <w:rPr>
+            <w:rStyle w:val="Hyperlink"/>
+          </w:rPr>
+          <w:t xml:space="preserve">include-code-files</w:t>
+        </w:r>
+      </w:hyperlink>
+      <w:r>
+        <w:t xml:space="preserve"> </w:t>
+      </w:r>
+      <w:r>
+        <w:t xml:space="preserve">extension</w:t>
+      </w:r>
+      <w:r>
+        <w:t xml:space="preserve"> </w:t>
+      </w:r>
+      <w:r>
+        <w:t xml:space="preserve">fills a code block from a file.</w:t>
+      </w:r>
+      <w:r>
+        <w:t xml:space="preserve"> </w:t>
+      </w:r>
+      <w:r>
+        <w:t xml:space="preserve">Add</w:t>
+      </w:r>
+      <w:r>
+        <w:t xml:space="preserve"> </w:t>
+      </w:r>
+      <w:r>
+        <w:rPr>
+          <w:rStyle w:val="VerbatimChar"/>
+        </w:rPr>
+        <w:t xml:space="preserve">filters: [include-code-files]</w:t>
+      </w:r>
+      <w:r>
+        <w:t xml:space="preserve"> </w:t>
+      </w:r>
+      <w:r>
+        <w:t xml:space="preserve">to the front matter,</w:t>
+      </w:r>
+      <w:r>
+        <w:t xml:space="preserve"> </w:t>
+      </w:r>
+      <w:r>
+        <w:t xml:space="preserve">then write a code block with an</w:t>
+      </w:r>
+      <w:r>
+        <w:t xml:space="preserve"> </w:t>
+      </w:r>
+      <w:r>
+        <w:rPr>
+          <w:rStyle w:val="VerbatimChar"/>
+        </w:rPr>
+        <w:t xml:space="preserve">include</w:t>
+      </w:r>
+      <w:r>
+        <w:t xml:space="preserve"> </w:t>
+      </w:r>
+      <w:r>
+        <w:t xml:space="preserve">attribute,</w:t>
+      </w:r>
+      <w:r>
+        <w:t xml:space="preserve"> </w:t>
+      </w:r>
+      <w:r>
+        <w:t xml:space="preserve">such as</w:t>
+      </w:r>
+      <w:r>
+        <w:t xml:space="preserve"> </w:t>
+      </w:r>
+      <w:r>
+        <w:rPr>
+          <w:rStyle w:val="VerbatimChar"/>
+        </w:rPr>
+        <w:t xml:space="preserve">```{.python include="script.py"}</w:t>
+      </w:r>
+      <w:r>
+        <w:t xml:space="preserve">.</w:t>
+      </w:r>
+    </w:p>
+    <w:p>
+      <w:pPr>
+        <w:pStyle w:val="Compact"/>
+        <w:numPr>
+          <w:ilvl w:val="0"/>
+          <w:numId w:val="1009"/>
+        </w:numPr>
+      </w:pPr>
+      <w:r>
+        <w:t xml:space="preserve">The extension also takes</w:t>
+      </w:r>
+      <w:r>
+        <w:t xml:space="preserve"> </w:t>
+      </w:r>
+      <w:r>
+        <w:rPr>
+          <w:rStyle w:val="VerbatimChar"/>
+        </w:rPr>
+        <w:t xml:space="preserve">start-line</w:t>
+      </w:r>
+      <w:r>
+        <w:t xml:space="preserve"> </w:t>
+      </w:r>
+      <w:r>
+        <w:t xml:space="preserve">and</w:t>
+      </w:r>
+      <w:r>
+        <w:t xml:space="preserve"> </w:t>
+      </w:r>
+      <w:r>
+        <w:rPr>
+          <w:rStyle w:val="VerbatimChar"/>
+        </w:rPr>
+        <w:t xml:space="preserve">end-line</w:t>
+      </w:r>
+      <w:r>
+        <w:t xml:space="preserve">, to show part of a file.</w:t>
+      </w:r>
+      <w:r>
+        <w:t xml:space="preserve"> </w:t>
+      </w:r>
+      <w:r>
+        <w:t xml:space="preserve">Prefer a range that names the lines you want over a copy of those lines.</w:t>
+      </w:r>
+    </w:p>
+    <w:p>
+      <w:pPr>
+        <w:pStyle w:val="Compact"/>
+        <w:numPr>
+          <w:ilvl w:val="0"/>
+          <w:numId w:val="1009"/>
+        </w:numPr>
+      </w:pPr>
+      <w:r>
+        <w:t xml:space="preserve">The extension is a new dependency of the site:</w:t>
+      </w:r>
+      <w:r>
+        <w:t xml:space="preserve"> </w:t>
+      </w:r>
+      <w:r>
+        <w:t xml:space="preserve">install it with</w:t>
+      </w:r>
+      <w:r>
+        <w:t xml:space="preserve"> </w:t>
+      </w:r>
+      <w:r>
+        <w:rPr>
+          <w:rStyle w:val="VerbatimChar"/>
+        </w:rPr>
+        <w:t xml:space="preserve">quarto add quarto-ext/include-code-files</w:t>
+      </w:r>
+      <w:r>
+        <w:t xml:space="preserve">,</w:t>
+      </w:r>
+      <w:r>
+        <w:t xml:space="preserve"> </w:t>
+      </w:r>
+      <w:r>
+        <w:t xml:space="preserve">and commit the</w:t>
+      </w:r>
+      <w:r>
+        <w:t xml:space="preserve"> </w:t>
+      </w:r>
+      <w:r>
+        <w:rPr>
+          <w:rStyle w:val="VerbatimChar"/>
+        </w:rPr>
+        <w:t xml:space="preserve">_extensions</w:t>
+      </w:r>
+      <w:r>
+        <w:t xml:space="preserve"> </w:t>
+      </w:r>
+      <w:r>
+        <w:t xml:space="preserve">directory it creates.</w:t>
+      </w:r>
+    </w:p>
+    <w:bookmarkEnd w:id="42"/>
+    <w:bookmarkStart w:id="43" w:name="X7c0de8eaf50a5b2644eabf66f1f9b734b8a4a71"/>
+    <w:p>
+      <w:pPr>
+        <w:pStyle w:val="Heading2"/>
+      </w:pPr>
+      <w:r>
+        <w:t xml:space="preserve">13 Comment every code chunk to say what and why</w:t>
+      </w:r>
+    </w:p>
+    <w:p>
+      <w:pPr>
+        <w:pStyle w:val="FirstParagraph"/>
+      </w:pPr>
+      <w:r>
         <w:t xml:space="preserve">This rule applies to all reader-facing code in teaching materials,</w:t>
       </w:r>
       <w:r>
@@ -3138,7 +3409,7 @@
         <w:pStyle w:val="Compact"/>
         <w:numPr>
           <w:ilvl w:val="0"/>
-          <w:numId w:val="1009"/>
+          <w:numId w:val="1010"/>
         </w:numPr>
       </w:pPr>
       <w:r>
@@ -3156,7 +3427,7 @@
         <w:pStyle w:val="Compact"/>
         <w:numPr>
           <w:ilvl w:val="0"/>
-          <w:numId w:val="1009"/>
+          <w:numId w:val="1010"/>
         </w:numPr>
       </w:pPr>
       <w:r>
@@ -3174,7 +3445,7 @@
         <w:pStyle w:val="Compact"/>
         <w:numPr>
           <w:ilvl w:val="0"/>
-          <w:numId w:val="1009"/>
+          <w:numId w:val="1010"/>
         </w:numPr>
       </w:pPr>
       <w:r>
@@ -3272,7 +3543,7 @@
         <w:pStyle w:val="Compact"/>
         <w:numPr>
           <w:ilvl w:val="0"/>
-          <w:numId w:val="1009"/>
+          <w:numId w:val="1010"/>
         </w:numPr>
       </w:pPr>
       <w:r>
@@ -3285,14 +3556,14 @@
         <w:t xml:space="preserve">such as a transformation, a modeling choice, a tuning value or a random seed.</w:t>
       </w:r>
     </w:p>
-    <w:bookmarkEnd w:id="41"/>
-    <w:bookmarkStart w:id="42" w:name="Xffa5a3357c8672d830c88e1e58a0ef107550647"/>
+    <w:bookmarkEnd w:id="43"/>
+    <w:bookmarkStart w:id="44" w:name="Xffa5a3357c8672d830c88e1e58a0ef107550647"/>
     <w:p>
       <w:pPr>
         <w:pStyle w:val="Heading2"/>
       </w:pPr>
       <w:r>
-        <w:t xml:space="preserve">13 Introduce every function in a programming primer</w:t>
+        <w:t xml:space="preserve">14 Introduce every function in a programming primer</w:t>
       </w:r>
     </w:p>
     <w:p>
@@ -3314,7 +3585,7 @@
         <w:pStyle w:val="Compact"/>
         <w:numPr>
           <w:ilvl w:val="0"/>
-          <w:numId w:val="1010"/>
+          <w:numId w:val="1011"/>
         </w:numPr>
       </w:pPr>
       <w:r>
@@ -3338,7 +3609,7 @@
         <w:pStyle w:val="Compact"/>
         <w:numPr>
           <w:ilvl w:val="0"/>
-          <w:numId w:val="1010"/>
+          <w:numId w:val="1011"/>
         </w:numPr>
       </w:pPr>
       <w:r>
@@ -3368,7 +3639,7 @@
         <w:pStyle w:val="Compact"/>
         <w:numPr>
           <w:ilvl w:val="0"/>
-          <w:numId w:val="1010"/>
+          <w:numId w:val="1011"/>
         </w:numPr>
       </w:pPr>
       <w:r>
@@ -3392,7 +3663,7 @@
         <w:pStyle w:val="Compact"/>
         <w:numPr>
           <w:ilvl w:val="0"/>
-          <w:numId w:val="1010"/>
+          <w:numId w:val="1011"/>
         </w:numPr>
       </w:pPr>
       <w:r>
@@ -3405,22 +3676,22 @@
         <w:t xml:space="preserve">A chapter introduces those where it defines them.</w:t>
       </w:r>
     </w:p>
-    <w:bookmarkEnd w:id="42"/>
-    <w:bookmarkStart w:id="43" w:name="make-figures-accessible"/>
+    <w:bookmarkEnd w:id="44"/>
+    <w:bookmarkStart w:id="45" w:name="make-figures-accessible"/>
     <w:p>
       <w:pPr>
         <w:pStyle w:val="Heading2"/>
       </w:pPr>
       <w:r>
-        <w:t xml:space="preserve">14 Make figures accessible</w:t>
-      </w:r>
-    </w:p>
-    <w:p>
-      <w:pPr>
-        <w:pStyle w:val="Compact"/>
-        <w:numPr>
-          <w:ilvl w:val="0"/>
-          <w:numId w:val="1011"/>
+        <w:t xml:space="preserve">15 Make figures accessible</w:t>
+      </w:r>
+    </w:p>
+    <w:p>
+      <w:pPr>
+        <w:pStyle w:val="Compact"/>
+        <w:numPr>
+          <w:ilvl w:val="0"/>
+          <w:numId w:val="1012"/>
         </w:numPr>
       </w:pPr>
       <w:r>
@@ -3447,7 +3718,7 @@
         <w:pStyle w:val="Compact"/>
         <w:numPr>
           <w:ilvl w:val="0"/>
-          <w:numId w:val="1011"/>
+          <w:numId w:val="1012"/>
         </w:numPr>
       </w:pPr>
       <w:r>
@@ -3477,7 +3748,7 @@
         <w:pStyle w:val="Compact"/>
         <w:numPr>
           <w:ilvl w:val="0"/>
-          <w:numId w:val="1011"/>
+          <w:numId w:val="1012"/>
         </w:numPr>
       </w:pPr>
       <w:r>
@@ -3516,7 +3787,7 @@
         <w:pStyle w:val="Compact"/>
         <w:numPr>
           <w:ilvl w:val="0"/>
-          <w:numId w:val="1011"/>
+          <w:numId w:val="1012"/>
         </w:numPr>
       </w:pPr>
       <w:r>
@@ -3541,22 +3812,22 @@
         <w:t xml:space="preserve">(observed when rendering lecture notes to PDF).</w:t>
       </w:r>
     </w:p>
-    <w:bookmarkEnd w:id="43"/>
-    <w:bookmarkStart w:id="45" w:name="structure-slides-for-the-reader"/>
+    <w:bookmarkEnd w:id="45"/>
+    <w:bookmarkStart w:id="47" w:name="structure-slides-for-the-reader"/>
     <w:p>
       <w:pPr>
         <w:pStyle w:val="Heading2"/>
       </w:pPr>
       <w:r>
-        <w:t xml:space="preserve">15 Structure slides for the reader</w:t>
-      </w:r>
-    </w:p>
-    <w:p>
-      <w:pPr>
-        <w:pStyle w:val="Compact"/>
-        <w:numPr>
-          <w:ilvl w:val="0"/>
-          <w:numId w:val="1012"/>
+        <w:t xml:space="preserve">16 Structure slides for the reader</w:t>
+      </w:r>
+    </w:p>
+    <w:p>
+      <w:pPr>
+        <w:pStyle w:val="Compact"/>
+        <w:numPr>
+          <w:ilvl w:val="0"/>
+          <w:numId w:val="1013"/>
         </w:numPr>
       </w:pPr>
       <w:r>
@@ -3586,7 +3857,7 @@
         <w:pStyle w:val="Compact"/>
         <w:numPr>
           <w:ilvl w:val="0"/>
-          <w:numId w:val="1012"/>
+          <w:numId w:val="1013"/>
         </w:numPr>
       </w:pPr>
       <w:r>
@@ -3601,7 +3872,7 @@
       <w:r>
         <w:t xml:space="preserve"> </w:t>
       </w:r>
-      <w:hyperlink r:id="rId44">
+      <w:hyperlink r:id="rId46">
         <w:r>
           <w:rPr>
             <w:rStyle w:val="Hyperlink"/>
@@ -3621,7 +3892,7 @@
         <w:pStyle w:val="Compact"/>
         <w:numPr>
           <w:ilvl w:val="0"/>
-          <w:numId w:val="1012"/>
+          <w:numId w:val="1013"/>
         </w:numPr>
       </w:pPr>
       <w:r>
@@ -3648,7 +3919,7 @@
         <w:pStyle w:val="Compact"/>
         <w:numPr>
           <w:ilvl w:val="0"/>
-          <w:numId w:val="1012"/>
+          <w:numId w:val="1013"/>
         </w:numPr>
       </w:pPr>
       <w:r>
@@ -3717,7 +3988,7 @@
         <w:pStyle w:val="Compact"/>
         <w:numPr>
           <w:ilvl w:val="0"/>
-          <w:numId w:val="1012"/>
+          <w:numId w:val="1013"/>
         </w:numPr>
       </w:pPr>
       <w:r>
@@ -3786,7 +4057,7 @@
         <w:pStyle w:val="Compact"/>
         <w:numPr>
           <w:ilvl w:val="0"/>
-          <w:numId w:val="1012"/>
+          <w:numId w:val="1013"/>
         </w:numPr>
       </w:pPr>
       <w:r>
@@ -3810,7 +4081,7 @@
         <w:pStyle w:val="Compact"/>
         <w:numPr>
           <w:ilvl w:val="0"/>
-          <w:numId w:val="1012"/>
+          <w:numId w:val="1013"/>
         </w:numPr>
       </w:pPr>
       <w:r>
@@ -3841,22 +4112,22 @@
         <w:t xml:space="preserve">Put a slide break after the heading and move the text onto content slides.</w:t>
       </w:r>
     </w:p>
-    <w:bookmarkEnd w:id="45"/>
-    <w:bookmarkStart w:id="49" w:name="Xcb579568ef754486ebde8b41ba4528bdf380eec"/>
+    <w:bookmarkEnd w:id="47"/>
+    <w:bookmarkStart w:id="51" w:name="Xcb579568ef754486ebde8b41ba4528bdf380eec"/>
     <w:p>
       <w:pPr>
         <w:pStyle w:val="Heading2"/>
       </w:pPr>
       <w:r>
-        <w:t xml:space="preserve">16 Credit other courses without summarizing them</w:t>
-      </w:r>
-    </w:p>
-    <w:p>
-      <w:pPr>
-        <w:pStyle w:val="Compact"/>
-        <w:numPr>
-          <w:ilvl w:val="0"/>
-          <w:numId w:val="1013"/>
+        <w:t xml:space="preserve">17 Credit other courses without summarizing them</w:t>
+      </w:r>
+    </w:p>
+    <w:p>
+      <w:pPr>
+        <w:pStyle w:val="Compact"/>
+        <w:numPr>
+          <w:ilvl w:val="0"/>
+          <w:numId w:val="1014"/>
         </w:numPr>
       </w:pPr>
       <w:r>
@@ -3901,7 +4172,7 @@
       <w:r>
         <w:t xml:space="preserve"> </w:t>
       </w:r>
-      <w:hyperlink r:id="rId46">
+      <w:hyperlink r:id="rId48">
         <w:r>
           <w:rPr>
             <w:rStyle w:val="Hyperlink"/>
@@ -3942,7 +4213,7 @@
         <w:pStyle w:val="Compact"/>
         <w:numPr>
           <w:ilvl w:val="0"/>
-          <w:numId w:val="1013"/>
+          <w:numId w:val="1014"/>
         </w:numPr>
       </w:pPr>
       <w:r>
@@ -3957,7 +4228,7 @@
       <w:r>
         <w:t xml:space="preserve"> </w:t>
       </w:r>
-      <w:hyperlink r:id="rId47">
+      <w:hyperlink r:id="rId49">
         <w:r>
           <w:rPr>
             <w:rStyle w:val="Hyperlink"/>
@@ -3977,7 +4248,7 @@
         <w:pStyle w:val="Compact"/>
         <w:numPr>
           <w:ilvl w:val="0"/>
-          <w:numId w:val="1013"/>
+          <w:numId w:val="1014"/>
         </w:numPr>
       </w:pPr>
       <w:r>
@@ -3986,7 +4257,7 @@
       <w:r>
         <w:t xml:space="preserve"> </w:t>
       </w:r>
-      <w:hyperlink r:id="rId48">
+      <w:hyperlink r:id="rId50">
         <w:r>
           <w:rPr>
             <w:rStyle w:val="Hyperlink"/>
@@ -4006,7 +4277,7 @@
         <w:pStyle w:val="Compact"/>
         <w:numPr>
           <w:ilvl w:val="0"/>
-          <w:numId w:val="1013"/>
+          <w:numId w:val="1014"/>
         </w:numPr>
       </w:pPr>
       <w:r>
@@ -4019,14 +4290,14 @@
         <w:t xml:space="preserve">because a bare citation key renders as the author list.</w:t>
       </w:r>
     </w:p>
-    <w:bookmarkEnd w:id="49"/>
-    <w:bookmarkStart w:id="58" w:name="rules-that-apply-to-all-writing"/>
+    <w:bookmarkEnd w:id="51"/>
+    <w:bookmarkStart w:id="60" w:name="rules-that-apply-to-all-writing"/>
     <w:p>
       <w:pPr>
         <w:pStyle w:val="Heading2"/>
       </w:pPr>
       <w:r>
-        <w:t xml:space="preserve">17 Rules that apply to all writing</w:t>
+        <w:t xml:space="preserve">18 Rules that apply to all writing</w:t>
       </w:r>
     </w:p>
     <w:p>
@@ -4042,10 +4313,10 @@
         <w:pStyle w:val="Compact"/>
         <w:numPr>
           <w:ilvl w:val="0"/>
-          <w:numId w:val="1014"/>
-        </w:numPr>
-      </w:pPr>
-      <w:hyperlink r:id="rId50">
+          <w:numId w:val="1015"/>
+        </w:numPr>
+      </w:pPr>
+      <w:hyperlink r:id="rId52">
         <w:r>
           <w:rPr>
             <w:rStyle w:val="Hyperlink"/>
@@ -4062,10 +4333,10 @@
         <w:pStyle w:val="Compact"/>
         <w:numPr>
           <w:ilvl w:val="0"/>
-          <w:numId w:val="1014"/>
-        </w:numPr>
-      </w:pPr>
-      <w:hyperlink r:id="rId51">
+          <w:numId w:val="1015"/>
+        </w:numPr>
+      </w:pPr>
+      <w:hyperlink r:id="rId53">
         <w:r>
           <w:rPr>
             <w:rStyle w:val="Hyperlink"/>
@@ -4085,10 +4356,10 @@
         <w:pStyle w:val="Compact"/>
         <w:numPr>
           <w:ilvl w:val="0"/>
-          <w:numId w:val="1014"/>
-        </w:numPr>
-      </w:pPr>
-      <w:hyperlink r:id="rId52">
+          <w:numId w:val="1015"/>
+        </w:numPr>
+      </w:pPr>
+      <w:hyperlink r:id="rId54">
         <w:r>
           <w:rPr>
             <w:rStyle w:val="Hyperlink"/>
@@ -4105,10 +4376,10 @@
         <w:pStyle w:val="Compact"/>
         <w:numPr>
           <w:ilvl w:val="0"/>
-          <w:numId w:val="1014"/>
-        </w:numPr>
-      </w:pPr>
-      <w:hyperlink r:id="rId53">
+          <w:numId w:val="1015"/>
+        </w:numPr>
+      </w:pPr>
+      <w:hyperlink r:id="rId55">
         <w:r>
           <w:rPr>
             <w:rStyle w:val="Hyperlink"/>
@@ -4128,10 +4399,10 @@
         <w:pStyle w:val="Compact"/>
         <w:numPr>
           <w:ilvl w:val="0"/>
-          <w:numId w:val="1014"/>
-        </w:numPr>
-      </w:pPr>
-      <w:hyperlink r:id="rId54">
+          <w:numId w:val="1015"/>
+        </w:numPr>
+      </w:pPr>
+      <w:hyperlink r:id="rId56">
         <w:r>
           <w:rPr>
             <w:rStyle w:val="Hyperlink"/>
@@ -4143,8 +4414,8 @@
         <w:t xml:space="preserve">.</w:t>
       </w:r>
     </w:p>
-    <w:bookmarkStart w:id="57" w:name="refs"/>
-    <w:bookmarkStart w:id="56" w:name="ref-freeman2014active"/>
+    <w:bookmarkStart w:id="59" w:name="refs"/>
+    <w:bookmarkStart w:id="58" w:name="ref-freeman2014active"/>
     <w:p>
       <w:pPr>
         <w:pStyle w:val="Bibliography"/>
@@ -4177,7 +4448,7 @@
       <w:r>
         <w:t xml:space="preserve"> </w:t>
       </w:r>
-      <w:hyperlink r:id="rId55">
+      <w:hyperlink r:id="rId57">
         <w:r>
           <w:rPr>
             <w:rStyle w:val="Hyperlink"/>
@@ -4189,9 +4460,9 @@
         <w:t xml:space="preserve">.</w:t>
       </w:r>
     </w:p>
-    <w:bookmarkEnd w:id="56"/>
-    <w:bookmarkEnd w:id="57"/>
     <w:bookmarkEnd w:id="58"/>
+    <w:bookmarkEnd w:id="59"/>
+    <w:bookmarkEnd w:id="60"/>
     <w:sectPr>
       <w:footnotePr>
         <w:numRestart w:val="eachSect"/>
@@ -4448,6 +4719,9 @@
     <w:abstractNumId w:val="991"/>
   </w:num>
   <w:num w:numId="1014">
+    <w:abstractNumId w:val="991"/>
+  </w:num>
+  <w:num w:numId="1015">
     <w:abstractNumId w:val="991"/>
   </w:num>
 </w:numbering>

</xml_diff>

<commit_message>
Deploying to gh-pages from @ Morrison-Lab/psw@467a6b867cd00171623a6764f3120390ae98c562 🚀
</commit_message>
<xml_diff>
--- a/chapters/teaching.docx
+++ b/chapters/teaching.docx
@@ -15,7 +15,7 @@
         <w:pStyle w:val="Date"/>
       </w:pPr>
       <w:r>
-        <w:t xml:space="preserve">Last modified: 2026-10-15 23:42:45 (PDT)</w:t>
+        <w:t xml:space="preserve">Last modified: 2026-10-16 01:46:24 (PDT)</w:t>
       </w:r>
     </w:p>
     <w:tbl>
@@ -4113,13 +4113,33 @@
       </w:r>
     </w:p>
     <w:bookmarkEnd w:id="47"/>
-    <w:bookmarkStart w:id="51" w:name="Xcb579568ef754486ebde8b41ba4528bdf380eec"/>
+    <w:bookmarkStart w:id="48" w:name="talk-about-the-ideas-not-the-notes"/>
     <w:p>
       <w:pPr>
         <w:pStyle w:val="Heading2"/>
       </w:pPr>
       <w:r>
-        <w:t xml:space="preserve">17 Credit other courses without summarizing them</w:t>
+        <w:t xml:space="preserve">17 Talk about the ideas, not the notes</w:t>
+      </w:r>
+    </w:p>
+    <w:p>
+      <w:pPr>
+        <w:pStyle w:val="FirstParagraph"/>
+      </w:pPr>
+      <w:r>
+        <w:t xml:space="preserve">When a term is defined on another page or in another site,</w:t>
+      </w:r>
+      <w:r>
+        <w:t xml:space="preserve"> </w:t>
+      </w:r>
+      <w:r>
+        <w:t xml:space="preserve">state the idea in the sentence and link the term.</w:t>
+      </w:r>
+      <w:r>
+        <w:t xml:space="preserve"> </w:t>
+      </w:r>
+      <w:r>
+        <w:t xml:space="preserve">Do not write about where the definition lives.</w:t>
       </w:r>
     </w:p>
     <w:p>
@@ -4131,6 +4151,159 @@
         </w:numPr>
       </w:pPr>
       <w:r>
+        <w:t xml:space="preserve">Write</w:t>
+      </w:r>
+      <w:r>
+        <w:t xml:space="preserve"> </w:t>
+      </w:r>
+      <w:r>
+        <w:t xml:space="preserve">“the bias of an estimator”</w:t>
+      </w:r>
+      <w:r>
+        <w:t xml:space="preserve">,</w:t>
+      </w:r>
+      <w:r>
+        <w:t xml:space="preserve"> </w:t>
+      </w:r>
+      <w:r>
+        <w:t xml:space="preserve">linked to its definition,</w:t>
+      </w:r>
+      <w:r>
+        <w:t xml:space="preserve"> </w:t>
+      </w:r>
+      <w:r>
+        <w:t xml:space="preserve">not</w:t>
+      </w:r>
+      <w:r>
+        <w:t xml:space="preserve"> </w:t>
+      </w:r>
+      <w:r>
+        <w:t xml:space="preserve">“the statistics notes define the bias of an estimator”</w:t>
+      </w:r>
+      <w:r>
+        <w:t xml:space="preserve">.</w:t>
+      </w:r>
+    </w:p>
+    <w:p>
+      <w:pPr>
+        <w:pStyle w:val="Compact"/>
+        <w:numPr>
+          <w:ilvl w:val="0"/>
+          <w:numId w:val="1014"/>
+        </w:numPr>
+      </w:pPr>
+      <w:r>
+        <w:t xml:space="preserve">Do not write</w:t>
+      </w:r>
+      <w:r>
+        <w:t xml:space="preserve"> </w:t>
+      </w:r>
+      <w:r>
+        <w:t xml:space="preserve">“see the probability notes”</w:t>
+      </w:r>
+      <w:r>
+        <w:t xml:space="preserve"> </w:t>
+      </w:r>
+      <w:r>
+        <w:t xml:space="preserve">or</w:t>
+      </w:r>
+      <w:r>
+        <w:t xml:space="preserve"> </w:t>
+      </w:r>
+      <w:r>
+        <w:t xml:space="preserve">“as in our notes”</w:t>
+      </w:r>
+      <w:r>
+        <w:t xml:space="preserve">.</w:t>
+      </w:r>
+      <w:r>
+        <w:t xml:space="preserve"> </w:t>
+      </w:r>
+      <w:r>
+        <w:t xml:space="preserve">The link already says where the term lives.</w:t>
+      </w:r>
+    </w:p>
+    <w:p>
+      <w:pPr>
+        <w:pStyle w:val="Compact"/>
+        <w:numPr>
+          <w:ilvl w:val="0"/>
+          <w:numId w:val="1014"/>
+        </w:numPr>
+      </w:pPr>
+      <w:r>
+        <w:t xml:space="preserve">Name a remark by the idea it holds,</w:t>
+      </w:r>
+      <w:r>
+        <w:t xml:space="preserve"> </w:t>
+      </w:r>
+      <w:r>
+        <w:t xml:space="preserve">such as</w:t>
+      </w:r>
+      <w:r>
+        <w:t xml:space="preserve"> </w:t>
+      </w:r>
+      <w:r>
+        <w:t xml:space="preserve">“Bias of a prediction”</w:t>
+      </w:r>
+      <w:r>
+        <w:t xml:space="preserve">,</w:t>
+      </w:r>
+      <w:r>
+        <w:t xml:space="preserve"> </w:t>
+      </w:r>
+      <w:r>
+        <w:t xml:space="preserve">not</w:t>
+      </w:r>
+      <w:r>
+        <w:t xml:space="preserve"> </w:t>
+      </w:r>
+      <w:r>
+        <w:t xml:space="preserve">“Bias of a prediction in the statistics notes”</w:t>
+      </w:r>
+      <w:r>
+        <w:t xml:space="preserve">.</w:t>
+      </w:r>
+    </w:p>
+    <w:p>
+      <w:pPr>
+        <w:pStyle w:val="FirstParagraph"/>
+      </w:pPr>
+      <w:r>
+        <w:t xml:space="preserve">Students read concepts, not the structure of the site.</w:t>
+      </w:r>
+      <w:r>
+        <w:t xml:space="preserve"> </w:t>
+      </w:r>
+      <w:r>
+        <w:t xml:space="preserve">A sentence about which notes define a term adds no content,</w:t>
+      </w:r>
+      <w:r>
+        <w:t xml:space="preserve"> </w:t>
+      </w:r>
+      <w:r>
+        <w:t xml:space="preserve">and it goes stale when the definition moves.</w:t>
+      </w:r>
+    </w:p>
+    <w:bookmarkEnd w:id="48"/>
+    <w:bookmarkStart w:id="52" w:name="Xcb579568ef754486ebde8b41ba4528bdf380eec"/>
+    <w:p>
+      <w:pPr>
+        <w:pStyle w:val="Heading2"/>
+      </w:pPr>
+      <w:r>
+        <w:t xml:space="preserve">18 Credit other courses without summarizing them</w:t>
+      </w:r>
+    </w:p>
+    <w:p>
+      <w:pPr>
+        <w:pStyle w:val="Compact"/>
+        <w:numPr>
+          <w:ilvl w:val="0"/>
+          <w:numId w:val="1015"/>
+        </w:numPr>
+      </w:pPr>
+      <w:r>
         <w:t xml:space="preserve">Write your own version of another course’s material,</w:t>
       </w:r>
       <w:r>
@@ -4172,7 +4345,7 @@
       <w:r>
         <w:t xml:space="preserve"> </w:t>
       </w:r>
-      <w:hyperlink r:id="rId48">
+      <w:hyperlink r:id="rId49">
         <w:r>
           <w:rPr>
             <w:rStyle w:val="Hyperlink"/>
@@ -4213,7 +4386,7 @@
         <w:pStyle w:val="Compact"/>
         <w:numPr>
           <w:ilvl w:val="0"/>
-          <w:numId w:val="1014"/>
+          <w:numId w:val="1015"/>
         </w:numPr>
       </w:pPr>
       <w:r>
@@ -4228,7 +4401,7 @@
       <w:r>
         <w:t xml:space="preserve"> </w:t>
       </w:r>
-      <w:hyperlink r:id="rId49">
+      <w:hyperlink r:id="rId50">
         <w:r>
           <w:rPr>
             <w:rStyle w:val="Hyperlink"/>
@@ -4248,7 +4421,7 @@
         <w:pStyle w:val="Compact"/>
         <w:numPr>
           <w:ilvl w:val="0"/>
-          <w:numId w:val="1014"/>
+          <w:numId w:val="1015"/>
         </w:numPr>
       </w:pPr>
       <w:r>
@@ -4257,7 +4430,7 @@
       <w:r>
         <w:t xml:space="preserve"> </w:t>
       </w:r>
-      <w:hyperlink r:id="rId50">
+      <w:hyperlink r:id="rId51">
         <w:r>
           <w:rPr>
             <w:rStyle w:val="Hyperlink"/>
@@ -4277,7 +4450,7 @@
         <w:pStyle w:val="Compact"/>
         <w:numPr>
           <w:ilvl w:val="0"/>
-          <w:numId w:val="1014"/>
+          <w:numId w:val="1015"/>
         </w:numPr>
       </w:pPr>
       <w:r>
@@ -4290,14 +4463,14 @@
         <w:t xml:space="preserve">because a bare citation key renders as the author list.</w:t>
       </w:r>
     </w:p>
-    <w:bookmarkEnd w:id="51"/>
-    <w:bookmarkStart w:id="60" w:name="rules-that-apply-to-all-writing"/>
+    <w:bookmarkEnd w:id="52"/>
+    <w:bookmarkStart w:id="61" w:name="rules-that-apply-to-all-writing"/>
     <w:p>
       <w:pPr>
         <w:pStyle w:val="Heading2"/>
       </w:pPr>
       <w:r>
-        <w:t xml:space="preserve">18 Rules that apply to all writing</w:t>
+        <w:t xml:space="preserve">19 Rules that apply to all writing</w:t>
       </w:r>
     </w:p>
     <w:p>
@@ -4313,10 +4486,10 @@
         <w:pStyle w:val="Compact"/>
         <w:numPr>
           <w:ilvl w:val="0"/>
-          <w:numId w:val="1015"/>
-        </w:numPr>
-      </w:pPr>
-      <w:hyperlink r:id="rId52">
+          <w:numId w:val="1016"/>
+        </w:numPr>
+      </w:pPr>
+      <w:hyperlink r:id="rId53">
         <w:r>
           <w:rPr>
             <w:rStyle w:val="Hyperlink"/>
@@ -4333,10 +4506,10 @@
         <w:pStyle w:val="Compact"/>
         <w:numPr>
           <w:ilvl w:val="0"/>
-          <w:numId w:val="1015"/>
-        </w:numPr>
-      </w:pPr>
-      <w:hyperlink r:id="rId53">
+          <w:numId w:val="1016"/>
+        </w:numPr>
+      </w:pPr>
+      <w:hyperlink r:id="rId54">
         <w:r>
           <w:rPr>
             <w:rStyle w:val="Hyperlink"/>
@@ -4356,10 +4529,10 @@
         <w:pStyle w:val="Compact"/>
         <w:numPr>
           <w:ilvl w:val="0"/>
-          <w:numId w:val="1015"/>
-        </w:numPr>
-      </w:pPr>
-      <w:hyperlink r:id="rId54">
+          <w:numId w:val="1016"/>
+        </w:numPr>
+      </w:pPr>
+      <w:hyperlink r:id="rId55">
         <w:r>
           <w:rPr>
             <w:rStyle w:val="Hyperlink"/>
@@ -4376,10 +4549,10 @@
         <w:pStyle w:val="Compact"/>
         <w:numPr>
           <w:ilvl w:val="0"/>
-          <w:numId w:val="1015"/>
-        </w:numPr>
-      </w:pPr>
-      <w:hyperlink r:id="rId55">
+          <w:numId w:val="1016"/>
+        </w:numPr>
+      </w:pPr>
+      <w:hyperlink r:id="rId56">
         <w:r>
           <w:rPr>
             <w:rStyle w:val="Hyperlink"/>
@@ -4399,10 +4572,10 @@
         <w:pStyle w:val="Compact"/>
         <w:numPr>
           <w:ilvl w:val="0"/>
-          <w:numId w:val="1015"/>
-        </w:numPr>
-      </w:pPr>
-      <w:hyperlink r:id="rId56">
+          <w:numId w:val="1016"/>
+        </w:numPr>
+      </w:pPr>
+      <w:hyperlink r:id="rId57">
         <w:r>
           <w:rPr>
             <w:rStyle w:val="Hyperlink"/>
@@ -4414,8 +4587,8 @@
         <w:t xml:space="preserve">.</w:t>
       </w:r>
     </w:p>
-    <w:bookmarkStart w:id="59" w:name="refs"/>
-    <w:bookmarkStart w:id="58" w:name="ref-freeman2014active"/>
+    <w:bookmarkStart w:id="60" w:name="refs"/>
+    <w:bookmarkStart w:id="59" w:name="ref-freeman2014active"/>
     <w:p>
       <w:pPr>
         <w:pStyle w:val="Bibliography"/>
@@ -4448,7 +4621,7 @@
       <w:r>
         <w:t xml:space="preserve"> </w:t>
       </w:r>
-      <w:hyperlink r:id="rId57">
+      <w:hyperlink r:id="rId58">
         <w:r>
           <w:rPr>
             <w:rStyle w:val="Hyperlink"/>
@@ -4460,9 +4633,9 @@
         <w:t xml:space="preserve">.</w:t>
       </w:r>
     </w:p>
-    <w:bookmarkEnd w:id="58"/>
     <w:bookmarkEnd w:id="59"/>
     <w:bookmarkEnd w:id="60"/>
+    <w:bookmarkEnd w:id="61"/>
     <w:sectPr>
       <w:footnotePr>
         <w:numRestart w:val="eachSect"/>
@@ -4722,6 +4895,9 @@
     <w:abstractNumId w:val="991"/>
   </w:num>
   <w:num w:numId="1015">
+    <w:abstractNumId w:val="991"/>
+  </w:num>
+  <w:num w:numId="1016">
     <w:abstractNumId w:val="991"/>
   </w:num>
 </w:numbering>

</xml_diff>

<commit_message>
Deploying to gh-pages from @ Morrison-Lab/psw@0bcced887fa37006360fe40c791b403852dcb2b8 🚀
</commit_message>
<xml_diff>
--- a/chapters/teaching.docx
+++ b/chapters/teaching.docx
@@ -15,7 +15,7 @@
         <w:pStyle w:val="Date"/>
       </w:pPr>
       <w:r>
-        <w:t xml:space="preserve">Last modified: 2026-10-16 10:17:24 (PDT)</w:t>
+        <w:t xml:space="preserve">Last modified: 2026-10-16 10:23:00 (PDT)</w:t>
       </w:r>
     </w:p>
     <w:tbl>
@@ -2328,13 +2328,13 @@
       </w:r>
     </w:p>
     <w:bookmarkEnd w:id="28"/>
-    <w:bookmarkStart w:id="32" w:name="Xf27331f4c36c8d578e5fa29a37312484cc3343a"/>
+    <w:bookmarkStart w:id="30" w:name="X7f95f8ec3b796fc99108c37bb45d62741b824c4"/>
     <w:p>
       <w:pPr>
         <w:pStyle w:val="Heading2"/>
       </w:pPr>
       <w:r>
-        <w:t xml:space="preserve">10 Write labs for both languages and any computer</w:t>
+        <w:t xml:space="preserve">10 Follow every example with an exercise and solution</w:t>
       </w:r>
     </w:p>
     <w:p>
@@ -2342,6 +2342,399 @@
         <w:pStyle w:val="FirstParagraph"/>
       </w:pPr>
       <w:r>
+        <w:t xml:space="preserve">Reading a worked example is passive.</w:t>
+      </w:r>
+      <w:r>
+        <w:t xml:space="preserve"> </w:t>
+      </w:r>
+      <w:r>
+        <w:t xml:space="preserve">A reader who has just seen one method applied</w:t>
+      </w:r>
+      <w:r>
+        <w:t xml:space="preserve"> </w:t>
+      </w:r>
+      <w:r>
+        <w:t xml:space="preserve">learns more by applying it to a new case than by reading a second example.</w:t>
+      </w:r>
+      <w:r>
+        <w:t xml:space="preserve"> </w:t>
+      </w:r>
+      <w:r>
+        <w:t xml:space="preserve">So each example gets a practice exercise, with its solution, right after it.</w:t>
+      </w:r>
+    </w:p>
+    <w:p>
+      <w:pPr>
+        <w:pStyle w:val="Compact"/>
+        <w:numPr>
+          <w:ilvl w:val="0"/>
+          <w:numId w:val="1007"/>
+        </w:numPr>
+      </w:pPr>
+      <w:r>
+        <w:t xml:space="preserve">After every</w:t>
+      </w:r>
+      <w:r>
+        <w:t xml:space="preserve"> </w:t>
+      </w:r>
+      <w:r>
+        <w:rPr>
+          <w:rStyle w:val="VerbatimChar"/>
+        </w:rPr>
+        <w:t xml:space="preserve">#exm-</w:t>
+      </w:r>
+      <w:r>
+        <w:t xml:space="preserve"> </w:t>
+      </w:r>
+      <w:r>
+        <w:t xml:space="preserve">div, add an</w:t>
+      </w:r>
+      <w:r>
+        <w:t xml:space="preserve"> </w:t>
+      </w:r>
+      <w:r>
+        <w:rPr>
+          <w:rStyle w:val="VerbatimChar"/>
+        </w:rPr>
+        <w:t xml:space="preserve">#exr-</w:t>
+      </w:r>
+      <w:r>
+        <w:t xml:space="preserve"> </w:t>
+      </w:r>
+      <w:r>
+        <w:t xml:space="preserve">div that asks the reader</w:t>
+      </w:r>
+      <w:r>
+        <w:t xml:space="preserve"> </w:t>
+      </w:r>
+      <w:r>
+        <w:t xml:space="preserve">to do the same thing for a different case,</w:t>
+      </w:r>
+      <w:r>
+        <w:t xml:space="preserve"> </w:t>
+      </w:r>
+      <w:r>
+        <w:t xml:space="preserve">followed by its</w:t>
+      </w:r>
+      <w:r>
+        <w:t xml:space="preserve"> </w:t>
+      </w:r>
+      <w:r>
+        <w:rPr>
+          <w:rStyle w:val="VerbatimChar"/>
+        </w:rPr>
+        <w:t xml:space="preserve">#sol-</w:t>
+      </w:r>
+      <w:r>
+        <w:t xml:space="preserve"> </w:t>
+      </w:r>
+      <w:r>
+        <w:t xml:space="preserve">div.</w:t>
+      </w:r>
+      <w:r>
+        <w:t xml:space="preserve"> </w:t>
+      </w:r>
+      <w:r>
+        <w:t xml:space="preserve">The exercise changes the data, the function or the question,</w:t>
+      </w:r>
+      <w:r>
+        <w:t xml:space="preserve"> </w:t>
+      </w:r>
+      <w:r>
+        <w:t xml:space="preserve">so the solution is not a copy of the example.</w:t>
+      </w:r>
+    </w:p>
+    <w:p>
+      <w:pPr>
+        <w:pStyle w:val="Compact"/>
+        <w:numPr>
+          <w:ilvl w:val="0"/>
+          <w:numId w:val="1007"/>
+        </w:numPr>
+      </w:pPr>
+      <w:r>
+        <w:t xml:space="preserve">The full sequence for a new idea is therefore:</w:t>
+      </w:r>
+      <w:r>
+        <w:t xml:space="preserve"> </w:t>
+      </w:r>
+      <w:r>
+        <w:t xml:space="preserve">the exercise that poses the question and its solution,</w:t>
+      </w:r>
+      <w:r>
+        <w:t xml:space="preserve"> </w:t>
+      </w:r>
+      <w:r>
+        <w:t xml:space="preserve">the definition or theorem,</w:t>
+      </w:r>
+      <w:r>
+        <w:t xml:space="preserve"> </w:t>
+      </w:r>
+      <w:r>
+        <w:t xml:space="preserve">an example,</w:t>
+      </w:r>
+      <w:r>
+        <w:t xml:space="preserve"> </w:t>
+      </w:r>
+      <w:r>
+        <w:t xml:space="preserve">and a practice exercise with its solution.</w:t>
+      </w:r>
+    </w:p>
+    <w:p>
+      <w:pPr>
+        <w:pStyle w:val="Compact"/>
+        <w:numPr>
+          <w:ilvl w:val="0"/>
+          <w:numId w:val="1007"/>
+        </w:numPr>
+      </w:pPr>
+      <w:r>
+        <w:t xml:space="preserve">More generally, give readers an opportunity to think at every stage:</w:t>
+      </w:r>
+      <w:r>
+        <w:t xml:space="preserve"> </w:t>
+      </w:r>
+      <w:r>
+        <w:t xml:space="preserve">a question they can answer before the next paragraph, a calculation to try,</w:t>
+      </w:r>
+      <w:r>
+        <w:t xml:space="preserve"> </w:t>
+      </w:r>
+      <w:r>
+        <w:t xml:space="preserve">a prediction to make before the code runs.</w:t>
+      </w:r>
+    </w:p>
+    <w:p>
+      <w:pPr>
+        <w:pStyle w:val="Compact"/>
+        <w:numPr>
+          <w:ilvl w:val="0"/>
+          <w:numId w:val="1007"/>
+        </w:numPr>
+      </w:pPr>
+      <w:r>
+        <w:t xml:space="preserve">A counterexample (see</w:t>
+      </w:r>
+      <w:r>
+        <w:t xml:space="preserve"> </w:t>
+      </w:r>
+      <w:hyperlink r:id="rId18">
+        <w:r>
+          <w:rPr>
+            <w:rStyle w:val="Hyperlink"/>
+          </w:rPr>
+          <w:t xml:space="preserve">Defining terms clearly</w:t>
+        </w:r>
+      </w:hyperlink>
+      <w:r>
+        <w:t xml:space="preserve">)</w:t>
+      </w:r>
+      <w:r>
+        <w:t xml:space="preserve"> </w:t>
+      </w:r>
+      <w:r>
+        <w:t xml:space="preserve">can stand in for the practice exercise</w:t>
+      </w:r>
+      <w:r>
+        <w:t xml:space="preserve"> </w:t>
+      </w:r>
+      <w:r>
+        <w:t xml:space="preserve">when the exercise would be</w:t>
+      </w:r>
+      <w:r>
+        <w:t xml:space="preserve"> </w:t>
+      </w:r>
+      <w:r>
+        <w:t xml:space="preserve">“decide whether this case fits the definition”</w:t>
+      </w:r>
+      <w:r>
+        <w:t xml:space="preserve">.</w:t>
+      </w:r>
+    </w:p>
+    <w:p>
+      <w:pPr>
+        <w:pStyle w:val="Compact"/>
+        <w:numPr>
+          <w:ilvl w:val="0"/>
+          <w:numId w:val="1007"/>
+        </w:numPr>
+      </w:pPr>
+      <w:r>
+        <w:t xml:space="preserve">Give the practice exercise its own slug and follow the numbering and slide-break rules above.</w:t>
+      </w:r>
+    </w:p>
+    <w:bookmarkStart w:id="29" w:name="exm-practice-after-example"/>
+    <w:p>
+      <w:pPr>
+        <w:pStyle w:val="FirstParagraph"/>
+      </w:pPr>
+      <w:r>
+        <w:rPr>
+          <w:b/>
+          <w:bCs/>
+        </w:rPr>
+        <w:t xml:space="preserve">Example 4 (An example followed by a practice exercise)</w:t>
+      </w:r>
+      <w:r>
+        <w:t xml:space="preserve"> </w:t>
+      </w:r>
+      <w:r>
+        <w:t xml:space="preserve"> </w:t>
+      </w:r>
+    </w:p>
+    <w:p>
+      <w:pPr>
+        <w:pStyle w:val="BlockText"/>
+      </w:pPr>
+      <w:r>
+        <w:t xml:space="preserve">✅</w:t>
+      </w:r>
+    </w:p>
+    <w:p>
+      <w:pPr>
+        <w:pStyle w:val="SourceCode"/>
+      </w:pPr>
+      <w:r>
+        <w:rPr>
+          <w:rStyle w:val="NormalTok"/>
+        </w:rPr>
+        <w:t xml:space="preserve">::: {#exm-sample-mean}</w:t>
+      </w:r>
+      <w:r>
+        <w:br/>
+      </w:r>
+      <w:r>
+        <w:rPr>
+          <w:rStyle w:val="NormalTok"/>
+        </w:rPr>
+        <w:t xml:space="preserve">(the sample mean of one variable in a real dataset, computed by a code chunk)</w:t>
+      </w:r>
+      <w:r>
+        <w:br/>
+      </w:r>
+      <w:r>
+        <w:rPr>
+          <w:rStyle w:val="NormalTok"/>
+        </w:rPr>
+        <w:t xml:space="preserve">:::</w:t>
+      </w:r>
+      <w:r>
+        <w:br/>
+      </w:r>
+      <w:r>
+        <w:br/>
+      </w:r>
+      <w:r>
+        <w:rPr>
+          <w:rStyle w:val="NormalTok"/>
+        </w:rPr>
+        <w:t xml:space="preserve">::: {#exr-sample-mean-new-variable}</w:t>
+      </w:r>
+      <w:r>
+        <w:br/>
+      </w:r>
+      <w:r>
+        <w:rPr>
+          <w:rStyle w:val="NormalTok"/>
+        </w:rPr>
+        <w:t xml:space="preserve">Compute the sample mean of a different variable in the same dataset.</w:t>
+      </w:r>
+      <w:r>
+        <w:br/>
+      </w:r>
+      <w:r>
+        <w:rPr>
+          <w:rStyle w:val="NormalTok"/>
+        </w:rPr>
+        <w:t xml:space="preserve">:::</w:t>
+      </w:r>
+      <w:r>
+        <w:br/>
+      </w:r>
+      <w:r>
+        <w:br/>
+      </w:r>
+      <w:r>
+        <w:rPr>
+          <w:rStyle w:val="NormalTok"/>
+        </w:rPr>
+        <w:t xml:space="preserve">::: {#sol-sample-mean-new-variable}</w:t>
+      </w:r>
+      <w:r>
+        <w:br/>
+      </w:r>
+      <w:r>
+        <w:rPr>
+          <w:rStyle w:val="NormalTok"/>
+        </w:rPr>
+        <w:t xml:space="preserve">(the code chunk and its output)</w:t>
+      </w:r>
+      <w:r>
+        <w:br/>
+      </w:r>
+      <w:r>
+        <w:rPr>
+          <w:rStyle w:val="NormalTok"/>
+        </w:rPr>
+        <w:t xml:space="preserve">:::</w:t>
+      </w:r>
+    </w:p>
+    <w:p>
+      <w:pPr>
+        <w:pStyle w:val="FirstParagraph"/>
+      </w:pPr>
+      <w:r>
+        <w:t xml:space="preserve">The example shows the method once.</w:t>
+      </w:r>
+      <w:r>
+        <w:t xml:space="preserve"> </w:t>
+      </w:r>
+      <w:r>
+        <w:t xml:space="preserve">The exercise asks the reader to repeat it on a new variable</w:t>
+      </w:r>
+      <w:r>
+        <w:t xml:space="preserve"> </w:t>
+      </w:r>
+      <w:r>
+        <w:t xml:space="preserve">before moving on, and the solution’s numbers still come from running code</w:t>
+      </w:r>
+      <w:r>
+        <w:t xml:space="preserve"> </w:t>
+      </w:r>
+      <w:r>
+        <w:t xml:space="preserve">(see</w:t>
+      </w:r>
+      <w:r>
+        <w:t xml:space="preserve"> </w:t>
+      </w:r>
+      <w:hyperlink w:anchor="use-real-data-and-compute-every-number">
+        <w:r>
+          <w:rPr>
+            <w:rStyle w:val="Hyperlink"/>
+          </w:rPr>
+          <w:t xml:space="preserve">Use real data and compute every number</w:t>
+        </w:r>
+      </w:hyperlink>
+      <w:r>
+        <w:t xml:space="preserve">).</w:t>
+      </w:r>
+    </w:p>
+    <w:bookmarkEnd w:id="29"/>
+    <w:bookmarkEnd w:id="30"/>
+    <w:bookmarkStart w:id="34" w:name="Xf27331f4c36c8d578e5fa29a37312484cc3343a"/>
+    <w:p>
+      <w:pPr>
+        <w:pStyle w:val="Heading2"/>
+      </w:pPr>
+      <w:r>
+        <w:t xml:space="preserve">11 Write labs for both languages and any computer</w:t>
+      </w:r>
+    </w:p>
+    <w:p>
+      <w:pPr>
+        <w:pStyle w:val="FirstParagraph"/>
+      </w:pPr>
+      <w:r>
         <w:t xml:space="preserve">These rules apply to all teaching materials,</w:t>
       </w:r>
       <w:r>
@@ -2356,7 +2749,7 @@
         <w:pStyle w:val="Compact"/>
         <w:numPr>
           <w:ilvl w:val="0"/>
-          <w:numId w:val="1007"/>
+          <w:numId w:val="1008"/>
         </w:numPr>
       </w:pPr>
       <w:r>
@@ -2368,7 +2761,7 @@
         <w:pStyle w:val="Compact"/>
         <w:numPr>
           <w:ilvl w:val="0"/>
-          <w:numId w:val="1007"/>
+          <w:numId w:val="1008"/>
         </w:numPr>
       </w:pPr>
       <w:r>
@@ -2377,7 +2770,7 @@
       <w:r>
         <w:t xml:space="preserve"> </w:t>
       </w:r>
-      <w:hyperlink r:id="rId29">
+      <w:hyperlink r:id="rId31">
         <w:r>
           <w:rPr>
             <w:rStyle w:val="Hyperlink"/>
@@ -2403,7 +2796,7 @@
       <w:r>
         <w:t xml:space="preserve"> </w:t>
       </w:r>
-      <w:hyperlink r:id="rId30">
+      <w:hyperlink r:id="rId32">
         <w:r>
           <w:rPr>
             <w:rStyle w:val="Hyperlink"/>
@@ -2423,7 +2816,7 @@
         <w:pStyle w:val="Compact"/>
         <w:numPr>
           <w:ilvl w:val="0"/>
-          <w:numId w:val="1007"/>
+          <w:numId w:val="1008"/>
         </w:numPr>
       </w:pPr>
       <w:r>
@@ -2468,7 +2861,7 @@
       <w:r>
         <w:t xml:space="preserve"> </w:t>
       </w:r>
-      <w:hyperlink r:id="rId31">
+      <w:hyperlink r:id="rId33">
         <w:r>
           <w:rPr>
             <w:rStyle w:val="Hyperlink"/>
@@ -2494,7 +2887,7 @@
         <w:pStyle w:val="Compact"/>
         <w:numPr>
           <w:ilvl w:val="0"/>
-          <w:numId w:val="1007"/>
+          <w:numId w:val="1008"/>
         </w:numPr>
       </w:pPr>
       <w:r>
@@ -2524,7 +2917,7 @@
         <w:pStyle w:val="Compact"/>
         <w:numPr>
           <w:ilvl w:val="0"/>
-          <w:numId w:val="1007"/>
+          <w:numId w:val="1008"/>
         </w:numPr>
       </w:pPr>
       <w:r>
@@ -2536,7 +2929,7 @@
         <w:pStyle w:val="Compact"/>
         <w:numPr>
           <w:ilvl w:val="0"/>
-          <w:numId w:val="1007"/>
+          <w:numId w:val="1008"/>
         </w:numPr>
       </w:pPr>
       <w:r>
@@ -2620,7 +3013,7 @@
         <w:pStyle w:val="Compact"/>
         <w:numPr>
           <w:ilvl w:val="0"/>
-          <w:numId w:val="1007"/>
+          <w:numId w:val="1008"/>
         </w:numPr>
       </w:pPr>
       <w:r>
@@ -2639,14 +3032,14 @@
         <w:t xml:space="preserve">so setup steps must work on a shared or hosted machine.</w:t>
       </w:r>
     </w:p>
-    <w:bookmarkEnd w:id="32"/>
-    <w:bookmarkStart w:id="41" w:name="present-r-results-with-modern-packages"/>
+    <w:bookmarkEnd w:id="34"/>
+    <w:bookmarkStart w:id="43" w:name="present-r-results-with-modern-packages"/>
     <w:p>
       <w:pPr>
         <w:pStyle w:val="Heading2"/>
       </w:pPr>
       <w:r>
-        <w:t xml:space="preserve">11 Present R results with modern packages</w:t>
+        <w:t xml:space="preserve">12 Present R results with modern packages</w:t>
       </w:r>
     </w:p>
     <w:p>
@@ -2668,7 +3061,7 @@
         <w:pStyle w:val="Compact"/>
         <w:numPr>
           <w:ilvl w:val="0"/>
-          <w:numId w:val="1008"/>
+          <w:numId w:val="1009"/>
         </w:numPr>
       </w:pPr>
       <w:r>
@@ -2713,7 +3106,7 @@
         <w:pStyle w:val="Compact"/>
         <w:numPr>
           <w:ilvl w:val="0"/>
-          <w:numId w:val="1008"/>
+          <w:numId w:val="1009"/>
         </w:numPr>
       </w:pPr>
       <w:r>
@@ -2722,7 +3115,7 @@
       <w:r>
         <w:t xml:space="preserve"> </w:t>
       </w:r>
-      <w:hyperlink r:id="rId33">
+      <w:hyperlink r:id="rId35">
         <w:r>
           <w:rPr>
             <w:rStyle w:val="Hyperlink"/>
@@ -2754,7 +3147,7 @@
       <w:r>
         <w:t xml:space="preserve"> </w:t>
       </w:r>
-      <w:hyperlink r:id="rId34">
+      <w:hyperlink r:id="rId36">
         <w:r>
           <w:rPr>
             <w:rStyle w:val="Hyperlink"/>
@@ -2819,7 +3212,7 @@
         <w:pStyle w:val="Compact"/>
         <w:numPr>
           <w:ilvl w:val="0"/>
-          <w:numId w:val="1008"/>
+          <w:numId w:val="1009"/>
         </w:numPr>
       </w:pPr>
       <w:r>
@@ -2828,7 +3221,7 @@
       <w:r>
         <w:t xml:space="preserve"> </w:t>
       </w:r>
-      <w:hyperlink r:id="rId35">
+      <w:hyperlink r:id="rId37">
         <w:r>
           <w:rPr>
             <w:rStyle w:val="Hyperlink"/>
@@ -2890,7 +3283,7 @@
         <w:pStyle w:val="Compact"/>
         <w:numPr>
           <w:ilvl w:val="0"/>
-          <w:numId w:val="1008"/>
+          <w:numId w:val="1009"/>
         </w:numPr>
       </w:pPr>
       <w:r>
@@ -2899,7 +3292,7 @@
       <w:r>
         <w:t xml:space="preserve"> </w:t>
       </w:r>
-      <w:hyperlink r:id="rId36">
+      <w:hyperlink r:id="rId38">
         <w:r>
           <w:rPr>
             <w:rStyle w:val="Hyperlink"/>
@@ -2916,7 +3309,7 @@
       <w:r>
         <w:t xml:space="preserve"> </w:t>
       </w:r>
-      <w:hyperlink r:id="rId37">
+      <w:hyperlink r:id="rId39">
         <w:r>
           <w:rPr>
             <w:rStyle w:val="Hyperlink"/>
@@ -2939,7 +3332,7 @@
       <w:r>
         <w:t xml:space="preserve"> </w:t>
       </w:r>
-      <w:hyperlink r:id="rId38">
+      <w:hyperlink r:id="rId40">
         <w:r>
           <w:rPr>
             <w:rStyle w:val="Hyperlink"/>
@@ -2971,7 +3364,7 @@
         <w:pStyle w:val="Compact"/>
         <w:numPr>
           <w:ilvl w:val="0"/>
-          <w:numId w:val="1008"/>
+          <w:numId w:val="1009"/>
         </w:numPr>
       </w:pPr>
       <w:r>
@@ -2995,7 +3388,7 @@
       <w:r>
         <w:t xml:space="preserve"> </w:t>
       </w:r>
-      <w:hyperlink r:id="rId39">
+      <w:hyperlink r:id="rId41">
         <w:r>
           <w:rPr>
             <w:rStyle w:val="Hyperlink"/>
@@ -3024,7 +3417,7 @@
         <w:pStyle w:val="Compact"/>
         <w:numPr>
           <w:ilvl w:val="0"/>
-          <w:numId w:val="1008"/>
+          <w:numId w:val="1009"/>
         </w:numPr>
       </w:pPr>
       <w:r>
@@ -3033,7 +3426,7 @@
       <w:r>
         <w:t xml:space="preserve"> </w:t>
       </w:r>
-      <w:hyperlink r:id="rId40">
+      <w:hyperlink r:id="rId42">
         <w:r>
           <w:rPr>
             <w:rStyle w:val="Hyperlink"/>
@@ -3048,14 +3441,14 @@
         <w:t xml:space="preserve">notes show the style.</w:t>
       </w:r>
     </w:p>
-    <w:bookmarkEnd w:id="41"/>
-    <w:bookmarkStart w:id="45" w:name="manipulate-data-with-dplyr-not-base-r"/>
+    <w:bookmarkEnd w:id="43"/>
+    <w:bookmarkStart w:id="47" w:name="manipulate-data-with-dplyr-not-base-r"/>
     <w:p>
       <w:pPr>
         <w:pStyle w:val="Heading2"/>
       </w:pPr>
       <w:r>
-        <w:t xml:space="preserve">12 Manipulate data with dplyr, not base R</w:t>
+        <w:t xml:space="preserve">13 Manipulate data with dplyr, not base R</w:t>
       </w:r>
     </w:p>
     <w:p>
@@ -3077,7 +3470,7 @@
         <w:pStyle w:val="Compact"/>
         <w:numPr>
           <w:ilvl w:val="0"/>
-          <w:numId w:val="1009"/>
+          <w:numId w:val="1010"/>
         </w:numPr>
       </w:pPr>
       <w:r>
@@ -3086,7 +3479,7 @@
       <w:r>
         <w:t xml:space="preserve"> </w:t>
       </w:r>
-      <w:hyperlink r:id="rId42">
+      <w:hyperlink r:id="rId44">
         <w:r>
           <w:rPr>
             <w:rStyle w:val="Hyperlink"/>
@@ -3148,7 +3541,7 @@
         <w:pStyle w:val="Compact"/>
         <w:numPr>
           <w:ilvl w:val="0"/>
-          <w:numId w:val="1009"/>
+          <w:numId w:val="1010"/>
         </w:numPr>
       </w:pPr>
       <w:r>
@@ -3199,7 +3592,7 @@
         <w:pStyle w:val="Compact"/>
         <w:numPr>
           <w:ilvl w:val="0"/>
-          <w:numId w:val="1009"/>
+          <w:numId w:val="1010"/>
         </w:numPr>
       </w:pPr>
       <w:r>
@@ -3235,7 +3628,7 @@
         <w:pStyle w:val="Compact"/>
         <w:numPr>
           <w:ilvl w:val="0"/>
-          <w:numId w:val="1009"/>
+          <w:numId w:val="1010"/>
         </w:numPr>
       </w:pPr>
       <w:r>
@@ -3244,7 +3637,7 @@
       <w:r>
         <w:t xml:space="preserve"> </w:t>
       </w:r>
-      <w:hyperlink r:id="rId43">
+      <w:hyperlink r:id="rId45">
         <w:r>
           <w:rPr>
             <w:rStyle w:val="Hyperlink"/>
@@ -3291,7 +3684,7 @@
         <w:pStyle w:val="Compact"/>
         <w:numPr>
           <w:ilvl w:val="0"/>
-          <w:numId w:val="1009"/>
+          <w:numId w:val="1010"/>
         </w:numPr>
       </w:pPr>
       <w:r>
@@ -3327,7 +3720,7 @@
         <w:pStyle w:val="Compact"/>
         <w:numPr>
           <w:ilvl w:val="0"/>
-          <w:numId w:val="1009"/>
+          <w:numId w:val="1010"/>
         </w:numPr>
       </w:pPr>
       <w:r>
@@ -3336,7 +3729,7 @@
       <w:r>
         <w:t xml:space="preserve"> </w:t>
       </w:r>
-      <w:hyperlink r:id="rId44">
+      <w:hyperlink r:id="rId46">
         <w:r>
           <w:rPr>
             <w:rStyle w:val="Hyperlink"/>
@@ -3383,7 +3776,7 @@
         <w:pStyle w:val="Compact"/>
         <w:numPr>
           <w:ilvl w:val="0"/>
-          <w:numId w:val="1009"/>
+          <w:numId w:val="1010"/>
         </w:numPr>
       </w:pPr>
       <w:r>
@@ -3407,7 +3800,7 @@
         <w:pStyle w:val="Compact"/>
         <w:numPr>
           <w:ilvl w:val="0"/>
-          <w:numId w:val="1009"/>
+          <w:numId w:val="1010"/>
         </w:numPr>
       </w:pPr>
       <w:r>
@@ -3506,7 +3899,7 @@
         <w:pStyle w:val="Compact"/>
         <w:numPr>
           <w:ilvl w:val="0"/>
-          <w:numId w:val="1009"/>
+          <w:numId w:val="1010"/>
         </w:numPr>
       </w:pPr>
       <w:r>
@@ -3525,14 +3918,14 @@
         <w:t xml:space="preserve">The rule is about selecting, filtering and building data frames.</w:t>
       </w:r>
     </w:p>
-    <w:bookmarkEnd w:id="45"/>
-    <w:bookmarkStart w:id="47" w:name="X2bc6121e3a2f39a37d8a6591d77df16bd22bd0b"/>
+    <w:bookmarkEnd w:id="47"/>
+    <w:bookmarkStart w:id="49" w:name="X2bc6121e3a2f39a37d8a6591d77df16bd22bd0b"/>
     <w:p>
       <w:pPr>
         <w:pStyle w:val="Heading2"/>
       </w:pPr>
       <w:r>
-        <w:t xml:space="preserve">13 Include code from files instead of copying it</w:t>
+        <w:t xml:space="preserve">14 Include code from files instead of copying it</w:t>
       </w:r>
     </w:p>
     <w:p>
@@ -3548,7 +3941,7 @@
         <w:pStyle w:val="Compact"/>
         <w:numPr>
           <w:ilvl w:val="0"/>
-          <w:numId w:val="1010"/>
+          <w:numId w:val="1011"/>
         </w:numPr>
       </w:pPr>
       <w:r>
@@ -3592,7 +3985,7 @@
         <w:pStyle w:val="Compact"/>
         <w:numPr>
           <w:ilvl w:val="0"/>
-          <w:numId w:val="1010"/>
+          <w:numId w:val="1011"/>
         </w:numPr>
       </w:pPr>
       <w:r>
@@ -3619,7 +4012,7 @@
       <w:r>
         <w:t xml:space="preserve"> </w:t>
       </w:r>
-      <w:hyperlink r:id="rId46">
+      <w:hyperlink r:id="rId48">
         <w:r>
           <w:rPr>
             <w:rStyle w:val="Hyperlink"/>
@@ -3705,7 +4098,7 @@
         <w:pStyle w:val="Compact"/>
         <w:numPr>
           <w:ilvl w:val="0"/>
-          <w:numId w:val="1010"/>
+          <w:numId w:val="1011"/>
         </w:numPr>
       </w:pPr>
       <w:r>
@@ -3750,7 +4143,7 @@
         <w:pStyle w:val="Compact"/>
         <w:numPr>
           <w:ilvl w:val="0"/>
-          <w:numId w:val="1010"/>
+          <w:numId w:val="1011"/>
         </w:numPr>
       </w:pPr>
       <w:r>
@@ -3796,14 +4189,14 @@
         <w:t xml:space="preserve">directory it creates.</w:t>
       </w:r>
     </w:p>
-    <w:bookmarkEnd w:id="47"/>
-    <w:bookmarkStart w:id="48" w:name="X7c0de8eaf50a5b2644eabf66f1f9b734b8a4a71"/>
+    <w:bookmarkEnd w:id="49"/>
+    <w:bookmarkStart w:id="50" w:name="X7c0de8eaf50a5b2644eabf66f1f9b734b8a4a71"/>
     <w:p>
       <w:pPr>
         <w:pStyle w:val="Heading2"/>
       </w:pPr>
       <w:r>
-        <w:t xml:space="preserve">14 Comment every code chunk to say what and why</w:t>
+        <w:t xml:space="preserve">15 Comment every code chunk to say what and why</w:t>
       </w:r>
     </w:p>
     <w:p>
@@ -3825,7 +4218,7 @@
         <w:pStyle w:val="Compact"/>
         <w:numPr>
           <w:ilvl w:val="0"/>
-          <w:numId w:val="1011"/>
+          <w:numId w:val="1012"/>
         </w:numPr>
       </w:pPr>
       <w:r>
@@ -3843,7 +4236,7 @@
         <w:pStyle w:val="Compact"/>
         <w:numPr>
           <w:ilvl w:val="0"/>
-          <w:numId w:val="1011"/>
+          <w:numId w:val="1012"/>
         </w:numPr>
       </w:pPr>
       <w:r>
@@ -3861,7 +4254,7 @@
         <w:pStyle w:val="Compact"/>
         <w:numPr>
           <w:ilvl w:val="0"/>
-          <w:numId w:val="1011"/>
+          <w:numId w:val="1012"/>
         </w:numPr>
       </w:pPr>
       <w:r>
@@ -3959,7 +4352,7 @@
         <w:pStyle w:val="Compact"/>
         <w:numPr>
           <w:ilvl w:val="0"/>
-          <w:numId w:val="1011"/>
+          <w:numId w:val="1012"/>
         </w:numPr>
       </w:pPr>
       <w:r>
@@ -3972,14 +4365,14 @@
         <w:t xml:space="preserve">such as a transformation, a modeling choice, a tuning value or a random seed.</w:t>
       </w:r>
     </w:p>
-    <w:bookmarkEnd w:id="48"/>
-    <w:bookmarkStart w:id="49" w:name="Xffa5a3357c8672d830c88e1e58a0ef107550647"/>
+    <w:bookmarkEnd w:id="50"/>
+    <w:bookmarkStart w:id="51" w:name="Xffa5a3357c8672d830c88e1e58a0ef107550647"/>
     <w:p>
       <w:pPr>
         <w:pStyle w:val="Heading2"/>
       </w:pPr>
       <w:r>
-        <w:t xml:space="preserve">15 Introduce every function in a programming primer</w:t>
+        <w:t xml:space="preserve">16 Introduce every function in a programming primer</w:t>
       </w:r>
     </w:p>
     <w:p>
@@ -4001,7 +4394,7 @@
         <w:pStyle w:val="Compact"/>
         <w:numPr>
           <w:ilvl w:val="0"/>
-          <w:numId w:val="1012"/>
+          <w:numId w:val="1013"/>
         </w:numPr>
       </w:pPr>
       <w:r>
@@ -4025,7 +4418,7 @@
         <w:pStyle w:val="Compact"/>
         <w:numPr>
           <w:ilvl w:val="0"/>
-          <w:numId w:val="1012"/>
+          <w:numId w:val="1013"/>
         </w:numPr>
       </w:pPr>
       <w:r>
@@ -4055,7 +4448,7 @@
         <w:pStyle w:val="Compact"/>
         <w:numPr>
           <w:ilvl w:val="0"/>
-          <w:numId w:val="1012"/>
+          <w:numId w:val="1013"/>
         </w:numPr>
       </w:pPr>
       <w:r>
@@ -4079,7 +4472,7 @@
         <w:pStyle w:val="Compact"/>
         <w:numPr>
           <w:ilvl w:val="0"/>
-          <w:numId w:val="1012"/>
+          <w:numId w:val="1013"/>
         </w:numPr>
       </w:pPr>
       <w:r>
@@ -4092,22 +4485,22 @@
         <w:t xml:space="preserve">A chapter introduces those where it defines them.</w:t>
       </w:r>
     </w:p>
-    <w:bookmarkEnd w:id="49"/>
-    <w:bookmarkStart w:id="50" w:name="make-figures-accessible"/>
+    <w:bookmarkEnd w:id="51"/>
+    <w:bookmarkStart w:id="52" w:name="make-figures-accessible"/>
     <w:p>
       <w:pPr>
         <w:pStyle w:val="Heading2"/>
       </w:pPr>
       <w:r>
-        <w:t xml:space="preserve">16 Make figures accessible</w:t>
-      </w:r>
-    </w:p>
-    <w:p>
-      <w:pPr>
-        <w:pStyle w:val="Compact"/>
-        <w:numPr>
-          <w:ilvl w:val="0"/>
-          <w:numId w:val="1013"/>
+        <w:t xml:space="preserve">17 Make figures accessible</w:t>
+      </w:r>
+    </w:p>
+    <w:p>
+      <w:pPr>
+        <w:pStyle w:val="Compact"/>
+        <w:numPr>
+          <w:ilvl w:val="0"/>
+          <w:numId w:val="1014"/>
         </w:numPr>
       </w:pPr>
       <w:r>
@@ -4134,7 +4527,7 @@
         <w:pStyle w:val="Compact"/>
         <w:numPr>
           <w:ilvl w:val="0"/>
-          <w:numId w:val="1013"/>
+          <w:numId w:val="1014"/>
         </w:numPr>
       </w:pPr>
       <w:r>
@@ -4164,7 +4557,7 @@
         <w:pStyle w:val="Compact"/>
         <w:numPr>
           <w:ilvl w:val="0"/>
-          <w:numId w:val="1013"/>
+          <w:numId w:val="1014"/>
         </w:numPr>
       </w:pPr>
       <w:r>
@@ -4203,7 +4596,7 @@
         <w:pStyle w:val="Compact"/>
         <w:numPr>
           <w:ilvl w:val="0"/>
-          <w:numId w:val="1013"/>
+          <w:numId w:val="1014"/>
         </w:numPr>
       </w:pPr>
       <w:r>
@@ -4228,22 +4621,22 @@
         <w:t xml:space="preserve">(observed when rendering lecture notes to PDF).</w:t>
       </w:r>
     </w:p>
-    <w:bookmarkEnd w:id="50"/>
-    <w:bookmarkStart w:id="52" w:name="structure-slides-for-the-reader"/>
+    <w:bookmarkEnd w:id="52"/>
+    <w:bookmarkStart w:id="54" w:name="structure-slides-for-the-reader"/>
     <w:p>
       <w:pPr>
         <w:pStyle w:val="Heading2"/>
       </w:pPr>
       <w:r>
-        <w:t xml:space="preserve">17 Structure slides for the reader</w:t>
-      </w:r>
-    </w:p>
-    <w:p>
-      <w:pPr>
-        <w:pStyle w:val="Compact"/>
-        <w:numPr>
-          <w:ilvl w:val="0"/>
-          <w:numId w:val="1014"/>
+        <w:t xml:space="preserve">18 Structure slides for the reader</w:t>
+      </w:r>
+    </w:p>
+    <w:p>
+      <w:pPr>
+        <w:pStyle w:val="Compact"/>
+        <w:numPr>
+          <w:ilvl w:val="0"/>
+          <w:numId w:val="1015"/>
         </w:numPr>
       </w:pPr>
       <w:r>
@@ -4273,7 +4666,7 @@
         <w:pStyle w:val="Compact"/>
         <w:numPr>
           <w:ilvl w:val="0"/>
-          <w:numId w:val="1014"/>
+          <w:numId w:val="1015"/>
         </w:numPr>
       </w:pPr>
       <w:r>
@@ -4288,7 +4681,7 @@
       <w:r>
         <w:t xml:space="preserve"> </w:t>
       </w:r>
-      <w:hyperlink r:id="rId51">
+      <w:hyperlink r:id="rId53">
         <w:r>
           <w:rPr>
             <w:rStyle w:val="Hyperlink"/>
@@ -4308,7 +4701,7 @@
         <w:pStyle w:val="Compact"/>
         <w:numPr>
           <w:ilvl w:val="0"/>
-          <w:numId w:val="1014"/>
+          <w:numId w:val="1015"/>
         </w:numPr>
       </w:pPr>
       <w:r>
@@ -4335,7 +4728,7 @@
         <w:pStyle w:val="Compact"/>
         <w:numPr>
           <w:ilvl w:val="0"/>
-          <w:numId w:val="1014"/>
+          <w:numId w:val="1015"/>
         </w:numPr>
       </w:pPr>
       <w:r>
@@ -4404,7 +4797,7 @@
         <w:pStyle w:val="Compact"/>
         <w:numPr>
           <w:ilvl w:val="0"/>
-          <w:numId w:val="1014"/>
+          <w:numId w:val="1015"/>
         </w:numPr>
       </w:pPr>
       <w:r>
@@ -4473,7 +4866,7 @@
         <w:pStyle w:val="Compact"/>
         <w:numPr>
           <w:ilvl w:val="0"/>
-          <w:numId w:val="1014"/>
+          <w:numId w:val="1015"/>
         </w:numPr>
       </w:pPr>
       <w:r>
@@ -4497,7 +4890,7 @@
         <w:pStyle w:val="Compact"/>
         <w:numPr>
           <w:ilvl w:val="0"/>
-          <w:numId w:val="1014"/>
+          <w:numId w:val="1015"/>
         </w:numPr>
       </w:pPr>
       <w:r>
@@ -4528,14 +4921,14 @@
         <w:t xml:space="preserve">Put a slide break after the heading and move the text onto content slides.</w:t>
       </w:r>
     </w:p>
-    <w:bookmarkEnd w:id="52"/>
-    <w:bookmarkStart w:id="53" w:name="talk-about-the-ideas-not-the-notes"/>
+    <w:bookmarkEnd w:id="54"/>
+    <w:bookmarkStart w:id="55" w:name="talk-about-the-ideas-not-the-notes"/>
     <w:p>
       <w:pPr>
         <w:pStyle w:val="Heading2"/>
       </w:pPr>
       <w:r>
-        <w:t xml:space="preserve">18 Talk about the ideas, not the notes</w:t>
+        <w:t xml:space="preserve">19 Talk about the ideas, not the notes</w:t>
       </w:r>
     </w:p>
     <w:p>
@@ -4563,7 +4956,7 @@
         <w:pStyle w:val="Compact"/>
         <w:numPr>
           <w:ilvl w:val="0"/>
-          <w:numId w:val="1015"/>
+          <w:numId w:val="1016"/>
         </w:numPr>
       </w:pPr>
       <w:r>
@@ -4605,7 +4998,7 @@
         <w:pStyle w:val="Compact"/>
         <w:numPr>
           <w:ilvl w:val="0"/>
-          <w:numId w:val="1015"/>
+          <w:numId w:val="1016"/>
         </w:numPr>
       </w:pPr>
       <w:r>
@@ -4644,7 +5037,7 @@
         <w:pStyle w:val="Compact"/>
         <w:numPr>
           <w:ilvl w:val="0"/>
-          <w:numId w:val="1015"/>
+          <w:numId w:val="1016"/>
         </w:numPr>
       </w:pPr>
       <w:r>
@@ -4701,22 +5094,22 @@
         <w:t xml:space="preserve">and it goes stale when the definition moves.</w:t>
       </w:r>
     </w:p>
-    <w:bookmarkEnd w:id="53"/>
-    <w:bookmarkStart w:id="57" w:name="Xcb579568ef754486ebde8b41ba4528bdf380eec"/>
+    <w:bookmarkEnd w:id="55"/>
+    <w:bookmarkStart w:id="59" w:name="Xcb579568ef754486ebde8b41ba4528bdf380eec"/>
     <w:p>
       <w:pPr>
         <w:pStyle w:val="Heading2"/>
       </w:pPr>
       <w:r>
-        <w:t xml:space="preserve">19 Credit other courses without summarizing them</w:t>
-      </w:r>
-    </w:p>
-    <w:p>
-      <w:pPr>
-        <w:pStyle w:val="Compact"/>
-        <w:numPr>
-          <w:ilvl w:val="0"/>
-          <w:numId w:val="1016"/>
+        <w:t xml:space="preserve">20 Credit other courses without summarizing them</w:t>
+      </w:r>
+    </w:p>
+    <w:p>
+      <w:pPr>
+        <w:pStyle w:val="Compact"/>
+        <w:numPr>
+          <w:ilvl w:val="0"/>
+          <w:numId w:val="1017"/>
         </w:numPr>
       </w:pPr>
       <w:r>
@@ -4761,7 +5154,7 @@
       <w:r>
         <w:t xml:space="preserve"> </w:t>
       </w:r>
-      <w:hyperlink r:id="rId54">
+      <w:hyperlink r:id="rId56">
         <w:r>
           <w:rPr>
             <w:rStyle w:val="Hyperlink"/>
@@ -4802,7 +5195,7 @@
         <w:pStyle w:val="Compact"/>
         <w:numPr>
           <w:ilvl w:val="0"/>
-          <w:numId w:val="1016"/>
+          <w:numId w:val="1017"/>
         </w:numPr>
       </w:pPr>
       <w:r>
@@ -4817,7 +5210,7 @@
       <w:r>
         <w:t xml:space="preserve"> </w:t>
       </w:r>
-      <w:hyperlink r:id="rId55">
+      <w:hyperlink r:id="rId57">
         <w:r>
           <w:rPr>
             <w:rStyle w:val="Hyperlink"/>
@@ -4837,7 +5230,7 @@
         <w:pStyle w:val="Compact"/>
         <w:numPr>
           <w:ilvl w:val="0"/>
-          <w:numId w:val="1016"/>
+          <w:numId w:val="1017"/>
         </w:numPr>
       </w:pPr>
       <w:r>
@@ -4846,7 +5239,7 @@
       <w:r>
         <w:t xml:space="preserve"> </w:t>
       </w:r>
-      <w:hyperlink r:id="rId56">
+      <w:hyperlink r:id="rId58">
         <w:r>
           <w:rPr>
             <w:rStyle w:val="Hyperlink"/>
@@ -4866,7 +5259,7 @@
         <w:pStyle w:val="Compact"/>
         <w:numPr>
           <w:ilvl w:val="0"/>
-          <w:numId w:val="1016"/>
+          <w:numId w:val="1017"/>
         </w:numPr>
       </w:pPr>
       <w:r>
@@ -4879,14 +5272,14 @@
         <w:t xml:space="preserve">because a bare citation key renders as the author list.</w:t>
       </w:r>
     </w:p>
-    <w:bookmarkEnd w:id="57"/>
-    <w:bookmarkStart w:id="66" w:name="rules-that-apply-to-all-writing"/>
+    <w:bookmarkEnd w:id="59"/>
+    <w:bookmarkStart w:id="68" w:name="rules-that-apply-to-all-writing"/>
     <w:p>
       <w:pPr>
         <w:pStyle w:val="Heading2"/>
       </w:pPr>
       <w:r>
-        <w:t xml:space="preserve">20 Rules that apply to all writing</w:t>
+        <w:t xml:space="preserve">21 Rules that apply to all writing</w:t>
       </w:r>
     </w:p>
     <w:p>
@@ -4902,10 +5295,10 @@
         <w:pStyle w:val="Compact"/>
         <w:numPr>
           <w:ilvl w:val="0"/>
-          <w:numId w:val="1017"/>
-        </w:numPr>
-      </w:pPr>
-      <w:hyperlink r:id="rId58">
+          <w:numId w:val="1018"/>
+        </w:numPr>
+      </w:pPr>
+      <w:hyperlink r:id="rId60">
         <w:r>
           <w:rPr>
             <w:rStyle w:val="Hyperlink"/>
@@ -4922,10 +5315,10 @@
         <w:pStyle w:val="Compact"/>
         <w:numPr>
           <w:ilvl w:val="0"/>
-          <w:numId w:val="1017"/>
-        </w:numPr>
-      </w:pPr>
-      <w:hyperlink r:id="rId59">
+          <w:numId w:val="1018"/>
+        </w:numPr>
+      </w:pPr>
+      <w:hyperlink r:id="rId61">
         <w:r>
           <w:rPr>
             <w:rStyle w:val="Hyperlink"/>
@@ -4945,10 +5338,10 @@
         <w:pStyle w:val="Compact"/>
         <w:numPr>
           <w:ilvl w:val="0"/>
-          <w:numId w:val="1017"/>
-        </w:numPr>
-      </w:pPr>
-      <w:hyperlink r:id="rId60">
+          <w:numId w:val="1018"/>
+        </w:numPr>
+      </w:pPr>
+      <w:hyperlink r:id="rId62">
         <w:r>
           <w:rPr>
             <w:rStyle w:val="Hyperlink"/>
@@ -4965,10 +5358,10 @@
         <w:pStyle w:val="Compact"/>
         <w:numPr>
           <w:ilvl w:val="0"/>
-          <w:numId w:val="1017"/>
-        </w:numPr>
-      </w:pPr>
-      <w:hyperlink r:id="rId61">
+          <w:numId w:val="1018"/>
+        </w:numPr>
+      </w:pPr>
+      <w:hyperlink r:id="rId63">
         <w:r>
           <w:rPr>
             <w:rStyle w:val="Hyperlink"/>
@@ -4988,10 +5381,10 @@
         <w:pStyle w:val="Compact"/>
         <w:numPr>
           <w:ilvl w:val="0"/>
-          <w:numId w:val="1017"/>
-        </w:numPr>
-      </w:pPr>
-      <w:hyperlink r:id="rId62">
+          <w:numId w:val="1018"/>
+        </w:numPr>
+      </w:pPr>
+      <w:hyperlink r:id="rId64">
         <w:r>
           <w:rPr>
             <w:rStyle w:val="Hyperlink"/>
@@ -5003,8 +5396,8 @@
         <w:t xml:space="preserve">.</w:t>
       </w:r>
     </w:p>
-    <w:bookmarkStart w:id="65" w:name="refs"/>
-    <w:bookmarkStart w:id="64" w:name="ref-freeman2014active"/>
+    <w:bookmarkStart w:id="67" w:name="refs"/>
+    <w:bookmarkStart w:id="66" w:name="ref-freeman2014active"/>
     <w:p>
       <w:pPr>
         <w:pStyle w:val="Bibliography"/>
@@ -5037,7 +5430,7 @@
       <w:r>
         <w:t xml:space="preserve"> </w:t>
       </w:r>
-      <w:hyperlink r:id="rId63">
+      <w:hyperlink r:id="rId65">
         <w:r>
           <w:rPr>
             <w:rStyle w:val="Hyperlink"/>
@@ -5049,9 +5442,9 @@
         <w:t xml:space="preserve">.</w:t>
       </w:r>
     </w:p>
-    <w:bookmarkEnd w:id="64"/>
-    <w:bookmarkEnd w:id="65"/>
     <w:bookmarkEnd w:id="66"/>
+    <w:bookmarkEnd w:id="67"/>
+    <w:bookmarkEnd w:id="68"/>
     <w:sectPr>
       <w:footnotePr>
         <w:numRestart w:val="eachSect"/>
@@ -5317,6 +5710,9 @@
     <w:abstractNumId w:val="991"/>
   </w:num>
   <w:num w:numId="1017">
+    <w:abstractNumId w:val="991"/>
+  </w:num>
+  <w:num w:numId="1018">
     <w:abstractNumId w:val="991"/>
   </w:num>
 </w:numbering>

</xml_diff>

<commit_message>
Deploying to gh-pages from @ Morrison-Lab/psw@799ed0596e7b53b52b4f6eb06a6bffa9613d16bb 🚀
</commit_message>
<xml_diff>
--- a/chapters/teaching.docx
+++ b/chapters/teaching.docx
@@ -15,7 +15,7 @@
         <w:pStyle w:val="Date"/>
       </w:pPr>
       <w:r>
-        <w:t xml:space="preserve">Last modified: 2026-10-16 18:54:21 (PDT)</w:t>
+        <w:t xml:space="preserve">Last modified: 2026-10-16 18:58:42 (PDT)</w:t>
       </w:r>
     </w:p>
     <w:tbl>
@@ -2754,6 +2754,75 @@
       </w:pPr>
       <w:r>
         <w:t xml:space="preserve">Give labs and code exercises in both R and Python, side by side.</w:t>
+      </w:r>
+    </w:p>
+    <w:p>
+      <w:pPr>
+        <w:pStyle w:val="Compact"/>
+        <w:numPr>
+          <w:ilvl w:val="0"/>
+          <w:numId w:val="1008"/>
+        </w:numPr>
+      </w:pPr>
+      <w:r>
+        <w:t xml:space="preserve">Put each step’s Python and R pair in its own tabset with</w:t>
+      </w:r>
+      <w:r>
+        <w:t xml:space="preserve"> </w:t>
+      </w:r>
+      <w:r>
+        <w:rPr>
+          <w:rStyle w:val="VerbatimChar"/>
+        </w:rPr>
+        <w:t xml:space="preserve">group="language"</w:t>
+      </w:r>
+      <w:r>
+        <w:t xml:space="preserve">.</w:t>
+      </w:r>
+      <w:r>
+        <w:t xml:space="preserve"> </w:t>
+      </w:r>
+      <w:r>
+        <w:t xml:space="preserve">Start a new tabset whenever prose or a new step sits between code chunks,</w:t>
+      </w:r>
+      <w:r>
+        <w:t xml:space="preserve"> </w:t>
+      </w:r>
+      <w:r>
+        <w:t xml:space="preserve">so the reader sees one step’s code in one language at a time.</w:t>
+      </w:r>
+      <w:r>
+        <w:t xml:space="preserve"> </w:t>
+      </w:r>
+      <w:r>
+        <w:t xml:space="preserve">The shared group makes one choice of language apply to every tabset on the page,</w:t>
+      </w:r>
+      <w:r>
+        <w:t xml:space="preserve"> </w:t>
+      </w:r>
+      <w:r>
+        <w:t xml:space="preserve">as long as the tab headings use identical text in every tabset, such as always</w:t>
+      </w:r>
+      <w:r>
+        <w:t xml:space="preserve"> </w:t>
+      </w:r>
+      <w:r>
+        <w:t xml:space="preserve">“R”</w:t>
+      </w:r>
+      <w:r>
+        <w:t xml:space="preserve"> </w:t>
+      </w:r>
+      <w:r>
+        <w:t xml:space="preserve">and</w:t>
+      </w:r>
+      <w:r>
+        <w:t xml:space="preserve"> </w:t>
+      </w:r>
+      <w:r>
+        <w:t xml:space="preserve">“Python”</w:t>
+      </w:r>
+      <w:r>
+        <w:t xml:space="preserve">.</w:t>
       </w:r>
     </w:p>
     <w:p>

</xml_diff>

<commit_message>
Deploying to gh-pages from @ Morrison-Lab/psw@64dffa1a8a6752f71ff5141ebe66e7a2eae205e1 🚀
</commit_message>
<xml_diff>
--- a/chapters/teaching.docx
+++ b/chapters/teaching.docx
@@ -15,7 +15,7 @@
         <w:pStyle w:val="Date"/>
       </w:pPr>
       <w:r>
-        <w:t xml:space="preserve">Last modified: 2026-10-17 02:49:55 (PDT)</w:t>
+        <w:t xml:space="preserve">Last modified: 2026-10-17 03:00:38 (PDT)</w:t>
       </w:r>
     </w:p>
     <w:tbl>
@@ -4435,13 +4435,28 @@
       </w:r>
     </w:p>
     <w:bookmarkEnd w:id="50"/>
-    <w:bookmarkStart w:id="51" w:name="Xffa5a3357c8672d830c88e1e58a0ef107550647"/>
+    <w:bookmarkStart w:id="51" w:name="X94063c6448bea82c8f1e8d367c642bbe2eda89b"/>
     <w:p>
       <w:pPr>
         <w:pStyle w:val="Heading2"/>
       </w:pPr>
       <w:r>
-        <w:t xml:space="preserve">16 Introduce every function in a programming primer</w:t>
+        <w:t xml:space="preserve">16 Set</w:t>
+      </w:r>
+      <w:r>
+        <w:t xml:space="preserve"> </w:t>
+      </w:r>
+      <w:r>
+        <w:rPr>
+          <w:rStyle w:val="VerbatimChar"/>
+        </w:rPr>
+        <w:t xml:space="preserve">code-fold</w:t>
+      </w:r>
+      <w:r>
+        <w:t xml:space="preserve"> </w:t>
+      </w:r>
+      <w:r>
+        <w:t xml:space="preserve">by what the code does and whether the prose mentions it</w:t>
       </w:r>
     </w:p>
     <w:p>
@@ -4449,6 +4464,232 @@
         <w:pStyle w:val="FirstParagraph"/>
       </w:pPr>
       <w:r>
+        <w:t xml:space="preserve">This rule applies to every executed code chunk in teaching materials,</w:t>
+      </w:r>
+      <w:r>
+        <w:t xml:space="preserve"> </w:t>
+      </w:r>
+      <w:r>
+        <w:t xml:space="preserve">in every course and every teaching repository.</w:t>
+      </w:r>
+    </w:p>
+    <w:p>
+      <w:pPr>
+        <w:pStyle w:val="BodyText"/>
+      </w:pPr>
+      <w:r>
+        <w:t xml:space="preserve">Set</w:t>
+      </w:r>
+      <w:r>
+        <w:t xml:space="preserve"> </w:t>
+      </w:r>
+      <w:r>
+        <w:rPr>
+          <w:rStyle w:val="VerbatimChar"/>
+        </w:rPr>
+        <w:t xml:space="preserve">#| code-fold:</w:t>
+      </w:r>
+      <w:r>
+        <w:t xml:space="preserve"> </w:t>
+      </w:r>
+      <w:r>
+        <w:t xml:space="preserve">on each chunk by two questions:</w:t>
+      </w:r>
+      <w:r>
+        <w:t xml:space="preserve"> </w:t>
+      </w:r>
+      <w:r>
+        <w:t xml:space="preserve">does the prose mention the code,</w:t>
+      </w:r>
+      <w:r>
+        <w:t xml:space="preserve"> </w:t>
+      </w:r>
+      <w:r>
+        <w:t xml:space="preserve">and does the code produce output outside the chunk,</w:t>
+      </w:r>
+      <w:r>
+        <w:t xml:space="preserve"> </w:t>
+      </w:r>
+      <w:r>
+        <w:t xml:space="preserve">such as a figure, a table, or variables that inline expressions use?</w:t>
+      </w:r>
+    </w:p>
+    <w:p>
+      <w:pPr>
+        <w:pStyle w:val="Compact"/>
+        <w:numPr>
+          <w:ilvl w:val="0"/>
+          <w:numId w:val="1013"/>
+        </w:numPr>
+      </w:pPr>
+      <w:r>
+        <w:rPr>
+          <w:rStyle w:val="VerbatimChar"/>
+        </w:rPr>
+        <w:t xml:space="preserve">#| code-fold: show</w:t>
+      </w:r>
+      <w:r>
+        <w:t xml:space="preserve"> </w:t>
+      </w:r>
+      <w:r>
+        <w:t xml:space="preserve">when the prose mentions the code and the code produces output outside the chunk:</w:t>
+      </w:r>
+      <w:r>
+        <w:t xml:space="preserve"> </w:t>
+      </w:r>
+      <w:r>
+        <w:t xml:space="preserve">a figure, a table, or variables that inline expressions use.</w:t>
+      </w:r>
+      <w:r>
+        <w:t xml:space="preserve"> </w:t>
+      </w:r>
+      <w:r>
+        <w:t xml:space="preserve">The code starts open, and a reader who wants to focus on the output can hide it.</w:t>
+      </w:r>
+    </w:p>
+    <w:p>
+      <w:pPr>
+        <w:pStyle w:val="Compact"/>
+        <w:numPr>
+          <w:ilvl w:val="0"/>
+          <w:numId w:val="1013"/>
+        </w:numPr>
+      </w:pPr>
+      <w:r>
+        <w:rPr>
+          <w:rStyle w:val="VerbatimChar"/>
+        </w:rPr>
+        <w:t xml:space="preserve">#| code-fold: true</w:t>
+      </w:r>
+      <w:r>
+        <w:t xml:space="preserve"> </w:t>
+      </w:r>
+      <w:r>
+        <w:t xml:space="preserve">when the prose does not mention the code.</w:t>
+      </w:r>
+      <w:r>
+        <w:t xml:space="preserve"> </w:t>
+      </w:r>
+      <w:r>
+        <w:t xml:space="preserve">This holds whether the code produces output outside the chunk or no output at all.</w:t>
+      </w:r>
+      <w:r>
+        <w:t xml:space="preserve"> </w:t>
+      </w:r>
+      <w:r>
+        <w:t xml:space="preserve">The code starts hidden, and a reader who wants it can open it.</w:t>
+      </w:r>
+    </w:p>
+    <w:p>
+      <w:pPr>
+        <w:pStyle w:val="Compact"/>
+        <w:numPr>
+          <w:ilvl w:val="0"/>
+          <w:numId w:val="1013"/>
+        </w:numPr>
+      </w:pPr>
+      <w:r>
+        <w:rPr>
+          <w:rStyle w:val="VerbatimChar"/>
+        </w:rPr>
+        <w:t xml:space="preserve">#| code-fold: false</w:t>
+      </w:r>
+      <w:r>
+        <w:t xml:space="preserve"> </w:t>
+      </w:r>
+      <w:r>
+        <w:t xml:space="preserve">when the prose mentions the code and the code produces no output,</w:t>
+      </w:r>
+      <w:r>
+        <w:t xml:space="preserve"> </w:t>
+      </w:r>
+      <w:r>
+        <w:t xml:space="preserve">or only output that the chunk renders inside itself.</w:t>
+      </w:r>
+      <w:r>
+        <w:t xml:space="preserve"> </w:t>
+      </w:r>
+      <w:r>
+        <w:t xml:space="preserve">The code and its output stay together, with no toggle.</w:t>
+      </w:r>
+    </w:p>
+    <w:p>
+      <w:pPr>
+        <w:pStyle w:val="FirstParagraph"/>
+      </w:pPr>
+      <w:r>
+        <w:t xml:space="preserve">For example, a chunk that fits a model the text walks through and prints its coefficients</w:t>
+      </w:r>
+      <w:r>
+        <w:t xml:space="preserve"> </w:t>
+      </w:r>
+      <w:r>
+        <w:t xml:space="preserve">is</w:t>
+      </w:r>
+      <w:r>
+        <w:t xml:space="preserve"> </w:t>
+      </w:r>
+      <w:r>
+        <w:rPr>
+          <w:rStyle w:val="VerbatimChar"/>
+        </w:rPr>
+        <w:t xml:space="preserve">false</w:t>
+      </w:r>
+      <w:r>
+        <w:t xml:space="preserve">,</w:t>
+      </w:r>
+      <w:r>
+        <w:t xml:space="preserve"> </w:t>
+      </w:r>
+      <w:r>
+        <w:t xml:space="preserve">a chunk that draws a figure the text discusses is</w:t>
+      </w:r>
+      <w:r>
+        <w:t xml:space="preserve"> </w:t>
+      </w:r>
+      <w:r>
+        <w:rPr>
+          <w:rStyle w:val="VerbatimChar"/>
+        </w:rPr>
+        <w:t xml:space="preserve">show</w:t>
+      </w:r>
+      <w:r>
+        <w:t xml:space="preserve">,</w:t>
+      </w:r>
+      <w:r>
+        <w:t xml:space="preserve"> </w:t>
+      </w:r>
+      <w:r>
+        <w:t xml:space="preserve">and a chunk that loads a package or builds an object that later chunks use is</w:t>
+      </w:r>
+      <w:r>
+        <w:t xml:space="preserve"> </w:t>
+      </w:r>
+      <w:r>
+        <w:rPr>
+          <w:rStyle w:val="VerbatimChar"/>
+        </w:rPr>
+        <w:t xml:space="preserve">true</w:t>
+      </w:r>
+      <w:r>
+        <w:t xml:space="preserve">.</w:t>
+      </w:r>
+    </w:p>
+    <w:bookmarkEnd w:id="51"/>
+    <w:bookmarkStart w:id="52" w:name="Xffa5a3357c8672d830c88e1e58a0ef107550647"/>
+    <w:p>
+      <w:pPr>
+        <w:pStyle w:val="Heading2"/>
+      </w:pPr>
+      <w:r>
+        <w:t xml:space="preserve">17 Introduce every function in a programming primer</w:t>
+      </w:r>
+    </w:p>
+    <w:p>
+      <w:pPr>
+        <w:pStyle w:val="FirstParagraph"/>
+      </w:pPr>
+      <w:r>
         <w:t xml:space="preserve">This rule applies to all teaching materials that run code,</w:t>
       </w:r>
       <w:r>
@@ -4463,7 +4704,7 @@
         <w:pStyle w:val="Compact"/>
         <w:numPr>
           <w:ilvl w:val="0"/>
-          <w:numId w:val="1013"/>
+          <w:numId w:val="1014"/>
         </w:numPr>
       </w:pPr>
       <w:r>
@@ -4487,7 +4728,7 @@
         <w:pStyle w:val="Compact"/>
         <w:numPr>
           <w:ilvl w:val="0"/>
-          <w:numId w:val="1013"/>
+          <w:numId w:val="1014"/>
         </w:numPr>
       </w:pPr>
       <w:r>
@@ -4517,7 +4758,7 @@
         <w:pStyle w:val="Compact"/>
         <w:numPr>
           <w:ilvl w:val="0"/>
-          <w:numId w:val="1013"/>
+          <w:numId w:val="1014"/>
         </w:numPr>
       </w:pPr>
       <w:r>
@@ -4541,7 +4782,7 @@
         <w:pStyle w:val="Compact"/>
         <w:numPr>
           <w:ilvl w:val="0"/>
-          <w:numId w:val="1013"/>
+          <w:numId w:val="1014"/>
         </w:numPr>
       </w:pPr>
       <w:r>
@@ -4554,22 +4795,22 @@
         <w:t xml:space="preserve">A chapter introduces those where it defines them.</w:t>
       </w:r>
     </w:p>
-    <w:bookmarkEnd w:id="51"/>
-    <w:bookmarkStart w:id="52" w:name="make-figures-accessible"/>
+    <w:bookmarkEnd w:id="52"/>
+    <w:bookmarkStart w:id="53" w:name="make-figures-accessible"/>
     <w:p>
       <w:pPr>
         <w:pStyle w:val="Heading2"/>
       </w:pPr>
       <w:r>
-        <w:t xml:space="preserve">17 Make figures accessible</w:t>
-      </w:r>
-    </w:p>
-    <w:p>
-      <w:pPr>
-        <w:pStyle w:val="Compact"/>
-        <w:numPr>
-          <w:ilvl w:val="0"/>
-          <w:numId w:val="1014"/>
+        <w:t xml:space="preserve">18 Make figures accessible</w:t>
+      </w:r>
+    </w:p>
+    <w:p>
+      <w:pPr>
+        <w:pStyle w:val="Compact"/>
+        <w:numPr>
+          <w:ilvl w:val="0"/>
+          <w:numId w:val="1015"/>
         </w:numPr>
       </w:pPr>
       <w:r>
@@ -4596,7 +4837,7 @@
         <w:pStyle w:val="Compact"/>
         <w:numPr>
           <w:ilvl w:val="0"/>
-          <w:numId w:val="1014"/>
+          <w:numId w:val="1015"/>
         </w:numPr>
       </w:pPr>
       <w:r>
@@ -4626,7 +4867,7 @@
         <w:pStyle w:val="Compact"/>
         <w:numPr>
           <w:ilvl w:val="0"/>
-          <w:numId w:val="1014"/>
+          <w:numId w:val="1015"/>
         </w:numPr>
       </w:pPr>
       <w:r>
@@ -4665,7 +4906,7 @@
         <w:pStyle w:val="Compact"/>
         <w:numPr>
           <w:ilvl w:val="0"/>
-          <w:numId w:val="1014"/>
+          <w:numId w:val="1015"/>
         </w:numPr>
       </w:pPr>
       <w:r>
@@ -4690,22 +4931,22 @@
         <w:t xml:space="preserve">(observed when rendering lecture notes to PDF).</w:t>
       </w:r>
     </w:p>
-    <w:bookmarkEnd w:id="52"/>
-    <w:bookmarkStart w:id="54" w:name="structure-slides-for-the-reader"/>
+    <w:bookmarkEnd w:id="53"/>
+    <w:bookmarkStart w:id="55" w:name="structure-slides-for-the-reader"/>
     <w:p>
       <w:pPr>
         <w:pStyle w:val="Heading2"/>
       </w:pPr>
       <w:r>
-        <w:t xml:space="preserve">18 Structure slides for the reader</w:t>
-      </w:r>
-    </w:p>
-    <w:p>
-      <w:pPr>
-        <w:pStyle w:val="Compact"/>
-        <w:numPr>
-          <w:ilvl w:val="0"/>
-          <w:numId w:val="1015"/>
+        <w:t xml:space="preserve">19 Structure slides for the reader</w:t>
+      </w:r>
+    </w:p>
+    <w:p>
+      <w:pPr>
+        <w:pStyle w:val="Compact"/>
+        <w:numPr>
+          <w:ilvl w:val="0"/>
+          <w:numId w:val="1016"/>
         </w:numPr>
       </w:pPr>
       <w:r>
@@ -4735,7 +4976,7 @@
         <w:pStyle w:val="Compact"/>
         <w:numPr>
           <w:ilvl w:val="0"/>
-          <w:numId w:val="1015"/>
+          <w:numId w:val="1016"/>
         </w:numPr>
       </w:pPr>
       <w:r>
@@ -4750,7 +4991,7 @@
       <w:r>
         <w:t xml:space="preserve"> </w:t>
       </w:r>
-      <w:hyperlink r:id="rId53">
+      <w:hyperlink r:id="rId54">
         <w:r>
           <w:rPr>
             <w:rStyle w:val="Hyperlink"/>
@@ -4770,7 +5011,7 @@
         <w:pStyle w:val="Compact"/>
         <w:numPr>
           <w:ilvl w:val="0"/>
-          <w:numId w:val="1015"/>
+          <w:numId w:val="1016"/>
         </w:numPr>
       </w:pPr>
       <w:r>
@@ -4797,7 +5038,7 @@
         <w:pStyle w:val="Compact"/>
         <w:numPr>
           <w:ilvl w:val="0"/>
-          <w:numId w:val="1015"/>
+          <w:numId w:val="1016"/>
         </w:numPr>
       </w:pPr>
       <w:r>
@@ -4866,7 +5107,7 @@
         <w:pStyle w:val="Compact"/>
         <w:numPr>
           <w:ilvl w:val="0"/>
-          <w:numId w:val="1015"/>
+          <w:numId w:val="1016"/>
         </w:numPr>
       </w:pPr>
       <w:r>
@@ -4935,7 +5176,7 @@
         <w:pStyle w:val="Compact"/>
         <w:numPr>
           <w:ilvl w:val="0"/>
-          <w:numId w:val="1015"/>
+          <w:numId w:val="1016"/>
         </w:numPr>
       </w:pPr>
       <w:r>
@@ -4959,7 +5200,7 @@
         <w:pStyle w:val="Compact"/>
         <w:numPr>
           <w:ilvl w:val="0"/>
-          <w:numId w:val="1015"/>
+          <w:numId w:val="1016"/>
         </w:numPr>
       </w:pPr>
       <w:r>
@@ -4990,14 +5231,14 @@
         <w:t xml:space="preserve">Put a slide break after the heading and move the text onto content slides.</w:t>
       </w:r>
     </w:p>
-    <w:bookmarkEnd w:id="54"/>
-    <w:bookmarkStart w:id="55" w:name="talk-about-the-ideas-not-the-notes"/>
+    <w:bookmarkEnd w:id="55"/>
+    <w:bookmarkStart w:id="56" w:name="talk-about-the-ideas-not-the-notes"/>
     <w:p>
       <w:pPr>
         <w:pStyle w:val="Heading2"/>
       </w:pPr>
       <w:r>
-        <w:t xml:space="preserve">19 Talk about the ideas, not the notes</w:t>
+        <w:t xml:space="preserve">20 Talk about the ideas, not the notes</w:t>
       </w:r>
     </w:p>
     <w:p>
@@ -5025,7 +5266,7 @@
         <w:pStyle w:val="Compact"/>
         <w:numPr>
           <w:ilvl w:val="0"/>
-          <w:numId w:val="1016"/>
+          <w:numId w:val="1017"/>
         </w:numPr>
       </w:pPr>
       <w:r>
@@ -5067,7 +5308,7 @@
         <w:pStyle w:val="Compact"/>
         <w:numPr>
           <w:ilvl w:val="0"/>
-          <w:numId w:val="1016"/>
+          <w:numId w:val="1017"/>
         </w:numPr>
       </w:pPr>
       <w:r>
@@ -5106,7 +5347,7 @@
         <w:pStyle w:val="Compact"/>
         <w:numPr>
           <w:ilvl w:val="0"/>
-          <w:numId w:val="1016"/>
+          <w:numId w:val="1017"/>
         </w:numPr>
       </w:pPr>
       <w:r>
@@ -5163,22 +5404,22 @@
         <w:t xml:space="preserve">and it goes stale when the definition moves.</w:t>
       </w:r>
     </w:p>
-    <w:bookmarkEnd w:id="55"/>
-    <w:bookmarkStart w:id="59" w:name="Xcb579568ef754486ebde8b41ba4528bdf380eec"/>
+    <w:bookmarkEnd w:id="56"/>
+    <w:bookmarkStart w:id="60" w:name="Xcb579568ef754486ebde8b41ba4528bdf380eec"/>
     <w:p>
       <w:pPr>
         <w:pStyle w:val="Heading2"/>
       </w:pPr>
       <w:r>
-        <w:t xml:space="preserve">20 Credit other courses without summarizing them</w:t>
-      </w:r>
-    </w:p>
-    <w:p>
-      <w:pPr>
-        <w:pStyle w:val="Compact"/>
-        <w:numPr>
-          <w:ilvl w:val="0"/>
-          <w:numId w:val="1017"/>
+        <w:t xml:space="preserve">21 Credit other courses without summarizing them</w:t>
+      </w:r>
+    </w:p>
+    <w:p>
+      <w:pPr>
+        <w:pStyle w:val="Compact"/>
+        <w:numPr>
+          <w:ilvl w:val="0"/>
+          <w:numId w:val="1018"/>
         </w:numPr>
       </w:pPr>
       <w:r>
@@ -5223,7 +5464,7 @@
       <w:r>
         <w:t xml:space="preserve"> </w:t>
       </w:r>
-      <w:hyperlink r:id="rId56">
+      <w:hyperlink r:id="rId57">
         <w:r>
           <w:rPr>
             <w:rStyle w:val="Hyperlink"/>
@@ -5264,7 +5505,7 @@
         <w:pStyle w:val="Compact"/>
         <w:numPr>
           <w:ilvl w:val="0"/>
-          <w:numId w:val="1017"/>
+          <w:numId w:val="1018"/>
         </w:numPr>
       </w:pPr>
       <w:r>
@@ -5279,7 +5520,7 @@
       <w:r>
         <w:t xml:space="preserve"> </w:t>
       </w:r>
-      <w:hyperlink r:id="rId57">
+      <w:hyperlink r:id="rId58">
         <w:r>
           <w:rPr>
             <w:rStyle w:val="Hyperlink"/>
@@ -5299,7 +5540,7 @@
         <w:pStyle w:val="Compact"/>
         <w:numPr>
           <w:ilvl w:val="0"/>
-          <w:numId w:val="1017"/>
+          <w:numId w:val="1018"/>
         </w:numPr>
       </w:pPr>
       <w:r>
@@ -5308,7 +5549,7 @@
       <w:r>
         <w:t xml:space="preserve"> </w:t>
       </w:r>
-      <w:hyperlink r:id="rId58">
+      <w:hyperlink r:id="rId59">
         <w:r>
           <w:rPr>
             <w:rStyle w:val="Hyperlink"/>
@@ -5328,7 +5569,7 @@
         <w:pStyle w:val="Compact"/>
         <w:numPr>
           <w:ilvl w:val="0"/>
-          <w:numId w:val="1017"/>
+          <w:numId w:val="1018"/>
         </w:numPr>
       </w:pPr>
       <w:r>
@@ -5341,14 +5582,14 @@
         <w:t xml:space="preserve">because a bare citation key renders as the author list.</w:t>
       </w:r>
     </w:p>
-    <w:bookmarkEnd w:id="59"/>
-    <w:bookmarkStart w:id="68" w:name="rules-that-apply-to-all-writing"/>
+    <w:bookmarkEnd w:id="60"/>
+    <w:bookmarkStart w:id="69" w:name="rules-that-apply-to-all-writing"/>
     <w:p>
       <w:pPr>
         <w:pStyle w:val="Heading2"/>
       </w:pPr>
       <w:r>
-        <w:t xml:space="preserve">21 Rules that apply to all writing</w:t>
+        <w:t xml:space="preserve">22 Rules that apply to all writing</w:t>
       </w:r>
     </w:p>
     <w:p>
@@ -5364,10 +5605,10 @@
         <w:pStyle w:val="Compact"/>
         <w:numPr>
           <w:ilvl w:val="0"/>
-          <w:numId w:val="1018"/>
-        </w:numPr>
-      </w:pPr>
-      <w:hyperlink r:id="rId60">
+          <w:numId w:val="1019"/>
+        </w:numPr>
+      </w:pPr>
+      <w:hyperlink r:id="rId61">
         <w:r>
           <w:rPr>
             <w:rStyle w:val="Hyperlink"/>
@@ -5384,10 +5625,10 @@
         <w:pStyle w:val="Compact"/>
         <w:numPr>
           <w:ilvl w:val="0"/>
-          <w:numId w:val="1018"/>
-        </w:numPr>
-      </w:pPr>
-      <w:hyperlink r:id="rId61">
+          <w:numId w:val="1019"/>
+        </w:numPr>
+      </w:pPr>
+      <w:hyperlink r:id="rId62">
         <w:r>
           <w:rPr>
             <w:rStyle w:val="Hyperlink"/>
@@ -5407,10 +5648,10 @@
         <w:pStyle w:val="Compact"/>
         <w:numPr>
           <w:ilvl w:val="0"/>
-          <w:numId w:val="1018"/>
-        </w:numPr>
-      </w:pPr>
-      <w:hyperlink r:id="rId62">
+          <w:numId w:val="1019"/>
+        </w:numPr>
+      </w:pPr>
+      <w:hyperlink r:id="rId63">
         <w:r>
           <w:rPr>
             <w:rStyle w:val="Hyperlink"/>
@@ -5427,10 +5668,10 @@
         <w:pStyle w:val="Compact"/>
         <w:numPr>
           <w:ilvl w:val="0"/>
-          <w:numId w:val="1018"/>
-        </w:numPr>
-      </w:pPr>
-      <w:hyperlink r:id="rId63">
+          <w:numId w:val="1019"/>
+        </w:numPr>
+      </w:pPr>
+      <w:hyperlink r:id="rId64">
         <w:r>
           <w:rPr>
             <w:rStyle w:val="Hyperlink"/>
@@ -5450,10 +5691,10 @@
         <w:pStyle w:val="Compact"/>
         <w:numPr>
           <w:ilvl w:val="0"/>
-          <w:numId w:val="1018"/>
-        </w:numPr>
-      </w:pPr>
-      <w:hyperlink r:id="rId64">
+          <w:numId w:val="1019"/>
+        </w:numPr>
+      </w:pPr>
+      <w:hyperlink r:id="rId65">
         <w:r>
           <w:rPr>
             <w:rStyle w:val="Hyperlink"/>
@@ -5465,8 +5706,8 @@
         <w:t xml:space="preserve">.</w:t>
       </w:r>
     </w:p>
-    <w:bookmarkStart w:id="67" w:name="refs"/>
-    <w:bookmarkStart w:id="66" w:name="ref-freeman2014active"/>
+    <w:bookmarkStart w:id="68" w:name="refs"/>
+    <w:bookmarkStart w:id="67" w:name="ref-freeman2014active"/>
     <w:p>
       <w:pPr>
         <w:pStyle w:val="Bibliography"/>
@@ -5499,7 +5740,7 @@
       <w:r>
         <w:t xml:space="preserve"> </w:t>
       </w:r>
-      <w:hyperlink r:id="rId65">
+      <w:hyperlink r:id="rId66">
         <w:r>
           <w:rPr>
             <w:rStyle w:val="Hyperlink"/>
@@ -5511,9 +5752,9 @@
         <w:t xml:space="preserve">.</w:t>
       </w:r>
     </w:p>
-    <w:bookmarkEnd w:id="66"/>
     <w:bookmarkEnd w:id="67"/>
     <w:bookmarkEnd w:id="68"/>
+    <w:bookmarkEnd w:id="69"/>
     <w:sectPr>
       <w:footnotePr>
         <w:numRestart w:val="eachSect"/>
@@ -5782,6 +6023,9 @@
     <w:abstractNumId w:val="991"/>
   </w:num>
   <w:num w:numId="1018">
+    <w:abstractNumId w:val="991"/>
+  </w:num>
+  <w:num w:numId="1019">
     <w:abstractNumId w:val="991"/>
   </w:num>
 </w:numbering>

</xml_diff>

<commit_message>
Deploying to gh-pages from @ Morrison-Lab/psw@0dc4359fe9b6d75a62fc868dee55d73176b887ef 🚀
</commit_message>
<xml_diff>
--- a/chapters/teaching.docx
+++ b/chapters/teaching.docx
@@ -15,7 +15,7 @@
         <w:pStyle w:val="Date"/>
       </w:pPr>
       <w:r>
-        <w:t xml:space="preserve">Last modified: 2026-10-19 00:31:38 (PDT)</w:t>
+        <w:t xml:space="preserve">Last modified: 2026-10-19 00:38:42 (PDT)</w:t>
       </w:r>
     </w:p>
     <w:tbl>
@@ -364,6 +364,30 @@
       </w:r>
       <w:r>
         <w:t xml:space="preserve">in order, rather than one exercise with parts (a) through (e).</w:t>
+      </w:r>
+      <w:r>
+        <w:t xml:space="preserve"> </w:t>
+      </w:r>
+      <w:r>
+        <w:t xml:space="preserve">A numbered list of questions inside one exercise is the same thing as parts, so split it too.</w:t>
+      </w:r>
+      <w:r>
+        <w:t xml:space="preserve"> </w:t>
+      </w:r>
+      <w:r>
+        <w:t xml:space="preserve">Put the shared setup in the first exercise,</w:t>
+      </w:r>
+      <w:r>
+        <w:t xml:space="preserve"> </w:t>
+      </w:r>
+      <w:r>
+        <w:t xml:space="preserve">and begin each later exercise by citing it, as in</w:t>
+      </w:r>
+      <w:r>
+        <w:t xml:space="preserve"> </w:t>
+      </w:r>
+      <w:r>
+        <w:t xml:space="preserve">“Make the assumptions of the first exercise.”</w:t>
       </w:r>
       <w:r>
         <w:t xml:space="preserve"> </w:t>

</xml_diff>

<commit_message>
Deploying to gh-pages from @ Morrison-Lab/psw@706e404dd43fb3b98978eb60c5940f62d55b4ada 🚀
</commit_message>
<xml_diff>
--- a/chapters/teaching.docx
+++ b/chapters/teaching.docx
@@ -15,7 +15,7 @@
         <w:pStyle w:val="Date"/>
       </w:pPr>
       <w:r>
-        <w:t xml:space="preserve">Last modified: 2026-10-19 00:38:42 (PDT)</w:t>
+        <w:t xml:space="preserve">Last modified: 2026-10-19 00:51:56 (PDT)</w:t>
       </w:r>
     </w:p>
     <w:tbl>
@@ -369,7 +369,13 @@
         <w:t xml:space="preserve"> </w:t>
       </w:r>
       <w:r>
-        <w:t xml:space="preserve">A numbered list of questions inside one exercise is the same thing as parts, so split it too.</w:t>
+        <w:t xml:space="preserve">Any exercise with several parts is split, however the parts are marked:</w:t>
+      </w:r>
+      <w:r>
+        <w:t xml:space="preserve"> </w:t>
+      </w:r>
+      <w:r>
+        <w:t xml:space="preserve">letters, numbers or bullets.</w:t>
       </w:r>
       <w:r>
         <w:t xml:space="preserve"> </w:t>

</xml_diff>

<commit_message>
Deploying to gh-pages from @ Morrison-Lab/psw@d63c234c5443e920ce583a803de42bf8c1a30c0b 🚀
</commit_message>
<xml_diff>
--- a/chapters/teaching.docx
+++ b/chapters/teaching.docx
@@ -15,7 +15,7 @@
         <w:pStyle w:val="Date"/>
       </w:pPr>
       <w:r>
-        <w:t xml:space="preserve">Last modified: 2026-10-23 11:24:10 (PDT)</w:t>
+        <w:t xml:space="preserve">Last modified: 2026-10-23 13:27:37 (PDT)</w:t>
       </w:r>
     </w:p>
     <w:tbl>
@@ -2086,7 +2086,7 @@
       </w:r>
     </w:p>
     <w:bookmarkEnd w:id="25"/>
-    <w:bookmarkStart w:id="28" w:name="show-each-idea-applied-and-in-a-figure"/>
+    <w:bookmarkStart w:id="30" w:name="show-each-idea-applied-and-in-a-figure"/>
     <w:p>
       <w:pPr>
         <w:pStyle w:val="Heading2"/>
@@ -2253,6 +2253,184 @@
         </w:numPr>
       </w:pPr>
       <w:r>
+        <w:t xml:space="preserve">Give nearly every</w:t>
+      </w:r>
+      <w:r>
+        <w:t xml:space="preserve"> </w:t>
+      </w:r>
+      <w:r>
+        <w:rPr>
+          <w:rStyle w:val="VerbatimChar"/>
+        </w:rPr>
+        <w:t xml:space="preserve">#exm-</w:t>
+      </w:r>
+      <w:r>
+        <w:t xml:space="preserve"> </w:t>
+      </w:r>
+      <w:r>
+        <w:t xml:space="preserve">div a figure of its data, model or results (Ezra, 2026-10-23).</w:t>
+      </w:r>
+      <w:r>
+        <w:t xml:space="preserve"> </w:t>
+      </w:r>
+      <w:r>
+        <w:t xml:space="preserve">When an example has no figure, state the reason in that div.</w:t>
+      </w:r>
+      <w:r>
+        <w:t xml:space="preserve"> </w:t>
+      </w:r>
+      <w:r>
+        <w:t xml:space="preserve">Put the figure inside the div,</w:t>
+      </w:r>
+      <w:r>
+        <w:t xml:space="preserve"> </w:t>
+      </w:r>
+      <w:r>
+        <w:t xml:space="preserve">or include a subfile whose name ends in</w:t>
+      </w:r>
+      <w:r>
+        <w:t xml:space="preserve"> </w:t>
+      </w:r>
+      <w:r>
+        <w:rPr>
+          <w:rStyle w:val="VerbatimChar"/>
+        </w:rPr>
+        <w:t xml:space="preserve">_fig</w:t>
+      </w:r>
+      <w:r>
+        <w:t xml:space="preserve"> </w:t>
+      </w:r>
+      <w:r>
+        <w:t xml:space="preserve">inside the div.</w:t>
+      </w:r>
+      <w:r>
+        <w:t xml:space="preserve"> </w:t>
+      </w:r>
+      <w:r>
+        <w:t xml:space="preserve">When an example has nothing to plot, such as a single number,</w:t>
+      </w:r>
+      <w:r>
+        <w:t xml:space="preserve"> </w:t>
+      </w:r>
+      <w:r>
+        <w:t xml:space="preserve">add</w:t>
+      </w:r>
+      <w:r>
+        <w:t xml:space="preserve"> </w:t>
+      </w:r>
+      <w:r>
+        <w:rPr>
+          <w:rStyle w:val="VerbatimChar"/>
+        </w:rPr>
+        <w:t xml:space="preserve">&lt;!-- no-figure: reason --&gt;</w:t>
+      </w:r>
+      <w:r>
+        <w:t xml:space="preserve"> </w:t>
+      </w:r>
+      <w:r>
+        <w:t xml:space="preserve">inside the div,</w:t>
+      </w:r>
+      <w:r>
+        <w:t xml:space="preserve"> </w:t>
+      </w:r>
+      <w:r>
+        <w:t xml:space="preserve">replacing</w:t>
+      </w:r>
+      <w:r>
+        <w:t xml:space="preserve"> </w:t>
+      </w:r>
+      <w:r>
+        <w:rPr>
+          <w:rStyle w:val="VerbatimChar"/>
+        </w:rPr>
+        <w:t xml:space="preserve">reason</w:t>
+      </w:r>
+      <w:r>
+        <w:t xml:space="preserve"> </w:t>
+      </w:r>
+      <w:r>
+        <w:t xml:space="preserve">with why there is nothing to plot.</w:t>
+      </w:r>
+      <w:r>
+        <w:t xml:space="preserve"> </w:t>
+      </w:r>
+      <w:r>
+        <w:t xml:space="preserve">The</w:t>
+      </w:r>
+      <w:r>
+        <w:t xml:space="preserve"> </w:t>
+      </w:r>
+      <w:r>
+        <w:rPr>
+          <w:rStyle w:val="VerbatimChar"/>
+        </w:rPr>
+        <w:t xml:space="preserve">check-exm-figures</w:t>
+      </w:r>
+      <w:r>
+        <w:t xml:space="preserve"> </w:t>
+      </w:r>
+      <w:r>
+        <w:t xml:space="preserve">workflow in</w:t>
+      </w:r>
+      <w:r>
+        <w:t xml:space="preserve"> </w:t>
+      </w:r>
+      <w:hyperlink r:id="rId27">
+        <w:r>
+          <w:rPr>
+            <w:rStyle w:val="VerbatimChar"/>
+          </w:rPr>
+          <w:t xml:space="preserve">gha</w:t>
+        </w:r>
+      </w:hyperlink>
+      <w:r>
+        <w:t xml:space="preserve"> </w:t>
+      </w:r>
+      <w:r>
+        <w:t xml:space="preserve">reports, in a pull request, each example that has no figure and no</w:t>
+      </w:r>
+      <w:r>
+        <w:t xml:space="preserve"> </w:t>
+      </w:r>
+      <w:r>
+        <w:rPr>
+          <w:rStyle w:val="VerbatimChar"/>
+        </w:rPr>
+        <w:t xml:space="preserve">no-figure</w:t>
+      </w:r>
+      <w:r>
+        <w:t xml:space="preserve"> </w:t>
+      </w:r>
+      <w:r>
+        <w:t xml:space="preserve">comment</w:t>
+      </w:r>
+      <w:r>
+        <w:t xml:space="preserve"> </w:t>
+      </w:r>
+      <w:r>
+        <w:t xml:space="preserve">(</w:t>
+      </w:r>
+      <w:hyperlink r:id="rId28">
+        <w:r>
+          <w:rPr>
+            <w:rStyle w:val="Hyperlink"/>
+          </w:rPr>
+          <w:t xml:space="preserve">gha#1193</w:t>
+        </w:r>
+      </w:hyperlink>
+      <w:r>
+        <w:t xml:space="preserve">).</w:t>
+      </w:r>
+    </w:p>
+    <w:p>
+      <w:pPr>
+        <w:pStyle w:val="Compact"/>
+        <w:numPr>
+          <w:ilvl w:val="0"/>
+          <w:numId w:val="1006"/>
+        </w:numPr>
+      </w:pPr>
+      <w:r>
         <w:t xml:space="preserve">Give every topic at least one figure that shows the idea,</w:t>
       </w:r>
       <w:r>
@@ -2330,7 +2508,7 @@
       <w:r>
         <w:t xml:space="preserve"> </w:t>
       </w:r>
-      <w:hyperlink r:id="rId27">
+      <w:hyperlink r:id="rId29">
         <w:r>
           <w:rPr>
             <w:rStyle w:val="Hyperlink"/>
@@ -2357,8 +2535,8 @@
         <w:t xml:space="preserve">Make each figure follow the accessibility rules below.</w:t>
       </w:r>
     </w:p>
-    <w:bookmarkEnd w:id="28"/>
-    <w:bookmarkStart w:id="30" w:name="X7f95f8ec3b796fc99108c37bb45d62741b824c4"/>
+    <w:bookmarkEnd w:id="30"/>
+    <w:bookmarkStart w:id="32" w:name="X7f95f8ec3b796fc99108c37bb45d62741b824c4"/>
     <w:p>
       <w:pPr>
         <w:pStyle w:val="Heading2"/>
@@ -2593,7 +2771,7 @@
         <w:t xml:space="preserve">Give the practice exercise its own slug and follow the numbering and slide-break rules above.</w:t>
       </w:r>
     </w:p>
-    <w:bookmarkStart w:id="29" w:name="exm-practice-after-example"/>
+    <w:bookmarkStart w:id="31" w:name="exm-practice-after-example"/>
     <w:p>
       <w:pPr>
         <w:pStyle w:val="FirstParagraph"/>
@@ -2749,9 +2927,9 @@
         <w:t xml:space="preserve">).</w:t>
       </w:r>
     </w:p>
-    <w:bookmarkEnd w:id="29"/>
-    <w:bookmarkEnd w:id="30"/>
-    <w:bookmarkStart w:id="34" w:name="Xf27331f4c36c8d578e5fa29a37312484cc3343a"/>
+    <w:bookmarkEnd w:id="31"/>
+    <w:bookmarkEnd w:id="32"/>
+    <w:bookmarkStart w:id="36" w:name="Xf27331f4c36c8d578e5fa29a37312484cc3343a"/>
     <w:p>
       <w:pPr>
         <w:pStyle w:val="Heading2"/>
@@ -2869,7 +3047,7 @@
       <w:r>
         <w:t xml:space="preserve"> </w:t>
       </w:r>
-      <w:hyperlink r:id="rId31">
+      <w:hyperlink r:id="rId33">
         <w:r>
           <w:rPr>
             <w:rStyle w:val="Hyperlink"/>
@@ -2895,7 +3073,7 @@
       <w:r>
         <w:t xml:space="preserve"> </w:t>
       </w:r>
-      <w:hyperlink r:id="rId32">
+      <w:hyperlink r:id="rId34">
         <w:r>
           <w:rPr>
             <w:rStyle w:val="Hyperlink"/>
@@ -2960,7 +3138,7 @@
       <w:r>
         <w:t xml:space="preserve"> </w:t>
       </w:r>
-      <w:hyperlink r:id="rId33">
+      <w:hyperlink r:id="rId35">
         <w:r>
           <w:rPr>
             <w:rStyle w:val="Hyperlink"/>
@@ -3131,8 +3309,8 @@
         <w:t xml:space="preserve">so setup steps must work on a shared or hosted machine.</w:t>
       </w:r>
     </w:p>
-    <w:bookmarkEnd w:id="34"/>
-    <w:bookmarkStart w:id="43" w:name="present-r-results-with-modern-packages"/>
+    <w:bookmarkEnd w:id="36"/>
+    <w:bookmarkStart w:id="45" w:name="present-r-results-with-modern-packages"/>
     <w:p>
       <w:pPr>
         <w:pStyle w:val="Heading2"/>
@@ -3214,7 +3392,7 @@
       <w:r>
         <w:t xml:space="preserve"> </w:t>
       </w:r>
-      <w:hyperlink r:id="rId35">
+      <w:hyperlink r:id="rId37">
         <w:r>
           <w:rPr>
             <w:rStyle w:val="Hyperlink"/>
@@ -3246,7 +3424,7 @@
       <w:r>
         <w:t xml:space="preserve"> </w:t>
       </w:r>
-      <w:hyperlink r:id="rId36">
+      <w:hyperlink r:id="rId38">
         <w:r>
           <w:rPr>
             <w:rStyle w:val="Hyperlink"/>
@@ -3320,7 +3498,7 @@
       <w:r>
         <w:t xml:space="preserve"> </w:t>
       </w:r>
-      <w:hyperlink r:id="rId37">
+      <w:hyperlink r:id="rId39">
         <w:r>
           <w:rPr>
             <w:rStyle w:val="Hyperlink"/>
@@ -3391,7 +3569,7 @@
       <w:r>
         <w:t xml:space="preserve"> </w:t>
       </w:r>
-      <w:hyperlink r:id="rId38">
+      <w:hyperlink r:id="rId40">
         <w:r>
           <w:rPr>
             <w:rStyle w:val="Hyperlink"/>
@@ -3408,7 +3586,7 @@
       <w:r>
         <w:t xml:space="preserve"> </w:t>
       </w:r>
-      <w:hyperlink r:id="rId39">
+      <w:hyperlink r:id="rId41">
         <w:r>
           <w:rPr>
             <w:rStyle w:val="Hyperlink"/>
@@ -3431,7 +3609,7 @@
       <w:r>
         <w:t xml:space="preserve"> </w:t>
       </w:r>
-      <w:hyperlink r:id="rId40">
+      <w:hyperlink r:id="rId42">
         <w:r>
           <w:rPr>
             <w:rStyle w:val="Hyperlink"/>
@@ -3487,7 +3665,7 @@
       <w:r>
         <w:t xml:space="preserve"> </w:t>
       </w:r>
-      <w:hyperlink r:id="rId41">
+      <w:hyperlink r:id="rId43">
         <w:r>
           <w:rPr>
             <w:rStyle w:val="Hyperlink"/>
@@ -3525,7 +3703,7 @@
       <w:r>
         <w:t xml:space="preserve"> </w:t>
       </w:r>
-      <w:hyperlink r:id="rId42">
+      <w:hyperlink r:id="rId44">
         <w:r>
           <w:rPr>
             <w:rStyle w:val="Hyperlink"/>
@@ -3540,8 +3718,8 @@
         <w:t xml:space="preserve">notes show the style.</w:t>
       </w:r>
     </w:p>
-    <w:bookmarkEnd w:id="43"/>
-    <w:bookmarkStart w:id="47" w:name="manipulate-data-with-dplyr-not-base-r"/>
+    <w:bookmarkEnd w:id="45"/>
+    <w:bookmarkStart w:id="49" w:name="manipulate-data-with-dplyr-not-base-r"/>
     <w:p>
       <w:pPr>
         <w:pStyle w:val="Heading2"/>
@@ -3578,7 +3756,7 @@
       <w:r>
         <w:t xml:space="preserve"> </w:t>
       </w:r>
-      <w:hyperlink r:id="rId44">
+      <w:hyperlink r:id="rId46">
         <w:r>
           <w:rPr>
             <w:rStyle w:val="Hyperlink"/>
@@ -3736,7 +3914,7 @@
       <w:r>
         <w:t xml:space="preserve"> </w:t>
       </w:r>
-      <w:hyperlink r:id="rId45">
+      <w:hyperlink r:id="rId47">
         <w:r>
           <w:rPr>
             <w:rStyle w:val="Hyperlink"/>
@@ -3828,7 +4006,7 @@
       <w:r>
         <w:t xml:space="preserve"> </w:t>
       </w:r>
-      <w:hyperlink r:id="rId46">
+      <w:hyperlink r:id="rId48">
         <w:r>
           <w:rPr>
             <w:rStyle w:val="Hyperlink"/>
@@ -4017,8 +4195,8 @@
         <w:t xml:space="preserve">The rule is about selecting, filtering and building data frames.</w:t>
       </w:r>
     </w:p>
-    <w:bookmarkEnd w:id="47"/>
-    <w:bookmarkStart w:id="49" w:name="X2bc6121e3a2f39a37d8a6591d77df16bd22bd0b"/>
+    <w:bookmarkEnd w:id="49"/>
+    <w:bookmarkStart w:id="51" w:name="X2bc6121e3a2f39a37d8a6591d77df16bd22bd0b"/>
     <w:p>
       <w:pPr>
         <w:pStyle w:val="Heading2"/>
@@ -4111,7 +4289,7 @@
       <w:r>
         <w:t xml:space="preserve"> </w:t>
       </w:r>
-      <w:hyperlink r:id="rId48">
+      <w:hyperlink r:id="rId50">
         <w:r>
           <w:rPr>
             <w:rStyle w:val="Hyperlink"/>
@@ -4288,8 +4466,8 @@
         <w:t xml:space="preserve">directory it creates.</w:t>
       </w:r>
     </w:p>
-    <w:bookmarkEnd w:id="49"/>
-    <w:bookmarkStart w:id="50" w:name="X7c0de8eaf50a5b2644eabf66f1f9b734b8a4a71"/>
+    <w:bookmarkEnd w:id="51"/>
+    <w:bookmarkStart w:id="52" w:name="X7c0de8eaf50a5b2644eabf66f1f9b734b8a4a71"/>
     <w:p>
       <w:pPr>
         <w:pStyle w:val="Heading2"/>
@@ -4464,8 +4642,8 @@
         <w:t xml:space="preserve">such as a transformation, a modeling choice, a tuning value or a random seed.</w:t>
       </w:r>
     </w:p>
-    <w:bookmarkEnd w:id="50"/>
-    <w:bookmarkStart w:id="51" w:name="X94063c6448bea82c8f1e8d367c642bbe2eda89b"/>
+    <w:bookmarkEnd w:id="52"/>
+    <w:bookmarkStart w:id="53" w:name="X94063c6448bea82c8f1e8d367c642bbe2eda89b"/>
     <w:p>
       <w:pPr>
         <w:pStyle w:val="Heading2"/>
@@ -4705,8 +4883,8 @@
         <w:t xml:space="preserve">.</w:t>
       </w:r>
     </w:p>
-    <w:bookmarkEnd w:id="51"/>
-    <w:bookmarkStart w:id="52" w:name="Xffa5a3357c8672d830c88e1e58a0ef107550647"/>
+    <w:bookmarkEnd w:id="53"/>
+    <w:bookmarkStart w:id="54" w:name="Xffa5a3357c8672d830c88e1e58a0ef107550647"/>
     <w:p>
       <w:pPr>
         <w:pStyle w:val="Heading2"/>
@@ -4825,8 +5003,8 @@
         <w:t xml:space="preserve">A chapter introduces those where it defines them.</w:t>
       </w:r>
     </w:p>
-    <w:bookmarkEnd w:id="52"/>
-    <w:bookmarkStart w:id="53" w:name="make-figures-accessible"/>
+    <w:bookmarkEnd w:id="54"/>
+    <w:bookmarkStart w:id="55" w:name="make-figures-accessible"/>
     <w:p>
       <w:pPr>
         <w:pStyle w:val="Heading2"/>
@@ -4961,8 +5139,8 @@
         <w:t xml:space="preserve">(observed when rendering lecture notes to PDF).</w:t>
       </w:r>
     </w:p>
-    <w:bookmarkEnd w:id="53"/>
-    <w:bookmarkStart w:id="55" w:name="structure-slides-for-the-reader"/>
+    <w:bookmarkEnd w:id="55"/>
+    <w:bookmarkStart w:id="57" w:name="structure-slides-for-the-reader"/>
     <w:p>
       <w:pPr>
         <w:pStyle w:val="Heading2"/>
@@ -5021,7 +5199,7 @@
       <w:r>
         <w:t xml:space="preserve"> </w:t>
       </w:r>
-      <w:hyperlink r:id="rId54">
+      <w:hyperlink r:id="rId56">
         <w:r>
           <w:rPr>
             <w:rStyle w:val="Hyperlink"/>
@@ -5261,8 +5439,8 @@
         <w:t xml:space="preserve">Put a slide break after the heading and move the text onto content slides.</w:t>
       </w:r>
     </w:p>
-    <w:bookmarkEnd w:id="55"/>
-    <w:bookmarkStart w:id="56" w:name="talk-about-the-ideas-not-the-notes"/>
+    <w:bookmarkEnd w:id="57"/>
+    <w:bookmarkStart w:id="58" w:name="talk-about-the-ideas-not-the-notes"/>
     <w:p>
       <w:pPr>
         <w:pStyle w:val="Heading2"/>
@@ -5434,8 +5612,8 @@
         <w:t xml:space="preserve">and it goes stale when the definition moves.</w:t>
       </w:r>
     </w:p>
-    <w:bookmarkEnd w:id="56"/>
-    <w:bookmarkStart w:id="60" w:name="Xcb579568ef754486ebde8b41ba4528bdf380eec"/>
+    <w:bookmarkEnd w:id="58"/>
+    <w:bookmarkStart w:id="62" w:name="Xcb579568ef754486ebde8b41ba4528bdf380eec"/>
     <w:p>
       <w:pPr>
         <w:pStyle w:val="Heading2"/>
@@ -5494,7 +5672,7 @@
       <w:r>
         <w:t xml:space="preserve"> </w:t>
       </w:r>
-      <w:hyperlink r:id="rId57">
+      <w:hyperlink r:id="rId59">
         <w:r>
           <w:rPr>
             <w:rStyle w:val="Hyperlink"/>
@@ -5550,7 +5728,7 @@
       <w:r>
         <w:t xml:space="preserve"> </w:t>
       </w:r>
-      <w:hyperlink r:id="rId58">
+      <w:hyperlink r:id="rId60">
         <w:r>
           <w:rPr>
             <w:rStyle w:val="Hyperlink"/>
@@ -5579,7 +5757,7 @@
       <w:r>
         <w:t xml:space="preserve"> </w:t>
       </w:r>
-      <w:hyperlink r:id="rId59">
+      <w:hyperlink r:id="rId61">
         <w:r>
           <w:rPr>
             <w:rStyle w:val="Hyperlink"/>
@@ -5612,8 +5790,8 @@
         <w:t xml:space="preserve">because a bare citation key renders as the author list.</w:t>
       </w:r>
     </w:p>
-    <w:bookmarkEnd w:id="60"/>
-    <w:bookmarkStart w:id="69" w:name="rules-that-apply-to-all-writing"/>
+    <w:bookmarkEnd w:id="62"/>
+    <w:bookmarkStart w:id="71" w:name="rules-that-apply-to-all-writing"/>
     <w:p>
       <w:pPr>
         <w:pStyle w:val="Heading2"/>
@@ -5638,7 +5816,7 @@
           <w:numId w:val="1019"/>
         </w:numPr>
       </w:pPr>
-      <w:hyperlink r:id="rId61">
+      <w:hyperlink r:id="rId63">
         <w:r>
           <w:rPr>
             <w:rStyle w:val="Hyperlink"/>
@@ -5658,7 +5836,7 @@
           <w:numId w:val="1019"/>
         </w:numPr>
       </w:pPr>
-      <w:hyperlink r:id="rId62">
+      <w:hyperlink r:id="rId64">
         <w:r>
           <w:rPr>
             <w:rStyle w:val="Hyperlink"/>
@@ -5681,7 +5859,7 @@
           <w:numId w:val="1019"/>
         </w:numPr>
       </w:pPr>
-      <w:hyperlink r:id="rId63">
+      <w:hyperlink r:id="rId65">
         <w:r>
           <w:rPr>
             <w:rStyle w:val="Hyperlink"/>
@@ -5701,7 +5879,7 @@
           <w:numId w:val="1019"/>
         </w:numPr>
       </w:pPr>
-      <w:hyperlink r:id="rId64">
+      <w:hyperlink r:id="rId66">
         <w:r>
           <w:rPr>
             <w:rStyle w:val="Hyperlink"/>
@@ -5724,7 +5902,7 @@
           <w:numId w:val="1019"/>
         </w:numPr>
       </w:pPr>
-      <w:hyperlink r:id="rId65">
+      <w:hyperlink r:id="rId67">
         <w:r>
           <w:rPr>
             <w:rStyle w:val="Hyperlink"/>
@@ -5736,8 +5914,8 @@
         <w:t xml:space="preserve">.</w:t>
       </w:r>
     </w:p>
-    <w:bookmarkStart w:id="68" w:name="refs"/>
-    <w:bookmarkStart w:id="67" w:name="ref-freeman2014active"/>
+    <w:bookmarkStart w:id="70" w:name="refs"/>
+    <w:bookmarkStart w:id="69" w:name="ref-freeman2014active"/>
     <w:p>
       <w:pPr>
         <w:pStyle w:val="Bibliography"/>
@@ -5770,7 +5948,7 @@
       <w:r>
         <w:t xml:space="preserve"> </w:t>
       </w:r>
-      <w:hyperlink r:id="rId66">
+      <w:hyperlink r:id="rId68">
         <w:r>
           <w:rPr>
             <w:rStyle w:val="Hyperlink"/>
@@ -5782,9 +5960,9 @@
         <w:t xml:space="preserve">.</w:t>
       </w:r>
     </w:p>
-    <w:bookmarkEnd w:id="67"/>
-    <w:bookmarkEnd w:id="68"/>
     <w:bookmarkEnd w:id="69"/>
+    <w:bookmarkEnd w:id="70"/>
+    <w:bookmarkEnd w:id="71"/>
     <w:sectPr>
       <w:footnotePr>
         <w:numRestart w:val="eachSect"/>

</xml_diff>

<commit_message>
Deploying to gh-pages from @ Morrison-Lab/psw@e8426f7dff286981a831e6c492992508e47d7c3b 🚀
</commit_message>
<xml_diff>
--- a/chapters/teaching.docx
+++ b/chapters/teaching.docx
@@ -15,7 +15,7 @@
         <w:pStyle w:val="Date"/>
       </w:pPr>
       <w:r>
-        <w:t xml:space="preserve">Last modified: 2026-10-26 13:08:28 (PDT)</w:t>
+        <w:t xml:space="preserve">Last modified: 2026-10-26 13:43:45 (PDT)</w:t>
       </w:r>
     </w:p>
     <w:tbl>
@@ -2086,7 +2086,7 @@
       </w:r>
     </w:p>
     <w:bookmarkEnd w:id="25"/>
-    <w:bookmarkStart w:id="30" w:name="show-each-idea-applied-and-in-a-figure"/>
+    <w:bookmarkStart w:id="31" w:name="show-each-idea-applied-and-in-a-figure"/>
     <w:p>
       <w:pPr>
         <w:pStyle w:val="Heading2"/>
@@ -2431,6 +2431,263 @@
         </w:numPr>
       </w:pPr>
       <w:r>
+        <w:t xml:space="preserve">Give every div whose title mentions visualization</w:t>
+      </w:r>
+      <w:r>
+        <w:t xml:space="preserve"> </w:t>
+      </w:r>
+      <w:r>
+        <w:t xml:space="preserve">(</w:t>
+      </w:r>
+      <w:r>
+        <w:rPr>
+          <w:i/>
+          <w:iCs/>
+        </w:rPr>
+        <w:t xml:space="preserve">visualize</w:t>
+      </w:r>
+      <w:r>
+        <w:t xml:space="preserve">,</w:t>
+      </w:r>
+      <w:r>
+        <w:t xml:space="preserve"> </w:t>
+      </w:r>
+      <w:r>
+        <w:rPr>
+          <w:i/>
+          <w:iCs/>
+        </w:rPr>
+        <w:t xml:space="preserve">visualizing</w:t>
+      </w:r>
+      <w:r>
+        <w:t xml:space="preserve">,</w:t>
+      </w:r>
+      <w:r>
+        <w:t xml:space="preserve"> </w:t>
+      </w:r>
+      <w:r>
+        <w:rPr>
+          <w:i/>
+          <w:iCs/>
+        </w:rPr>
+        <w:t xml:space="preserve">visualization</w:t>
+      </w:r>
+      <w:r>
+        <w:t xml:space="preserve">) a corresponding figure (Ezra, 2026-10-26).</w:t>
+      </w:r>
+      <w:r>
+        <w:t xml:space="preserve"> </w:t>
+      </w:r>
+      <w:r>
+        <w:t xml:space="preserve">For an exercise, the figure may sit in the exercise or in its solution.</w:t>
+      </w:r>
+      <w:r>
+        <w:t xml:space="preserve"> </w:t>
+      </w:r>
+      <w:r>
+        <w:t xml:space="preserve">The rule also covers any div that asks for a picture:</w:t>
+      </w:r>
+      <w:r>
+        <w:t xml:space="preserve"> </w:t>
+      </w:r>
+      <w:r>
+        <w:t xml:space="preserve">a title or an exercise prompt that says</w:t>
+      </w:r>
+      <w:r>
+        <w:t xml:space="preserve"> </w:t>
+      </w:r>
+      <w:r>
+        <w:rPr>
+          <w:i/>
+          <w:iCs/>
+        </w:rPr>
+        <w:t xml:space="preserve">plot</w:t>
+      </w:r>
+      <w:r>
+        <w:t xml:space="preserve">,</w:t>
+      </w:r>
+      <w:r>
+        <w:t xml:space="preserve"> </w:t>
+      </w:r>
+      <w:r>
+        <w:rPr>
+          <w:i/>
+          <w:iCs/>
+        </w:rPr>
+        <w:t xml:space="preserve">sketch</w:t>
+      </w:r>
+      <w:r>
+        <w:t xml:space="preserve">,</w:t>
+      </w:r>
+      <w:r>
+        <w:t xml:space="preserve"> </w:t>
+      </w:r>
+      <w:r>
+        <w:rPr>
+          <w:i/>
+          <w:iCs/>
+        </w:rPr>
+        <w:t xml:space="preserve">draw</w:t>
+      </w:r>
+      <w:r>
+        <w:t xml:space="preserve">,</w:t>
+      </w:r>
+      <w:r>
+        <w:t xml:space="preserve"> </w:t>
+      </w:r>
+      <w:r>
+        <w:rPr>
+          <w:i/>
+          <w:iCs/>
+        </w:rPr>
+        <w:t xml:space="preserve">diagram</w:t>
+      </w:r>
+      <w:r>
+        <w:t xml:space="preserve">, or</w:t>
+      </w:r>
+      <w:r>
+        <w:t xml:space="preserve"> </w:t>
+      </w:r>
+      <w:r>
+        <w:rPr>
+          <w:i/>
+          <w:iCs/>
+        </w:rPr>
+        <w:t xml:space="preserve">contour</w:t>
+      </w:r>
+      <w:r>
+        <w:t xml:space="preserve"> </w:t>
+      </w:r>
+      <w:r>
+        <w:t xml:space="preserve">(in any inflection, such as</w:t>
+      </w:r>
+      <w:r>
+        <w:t xml:space="preserve"> </w:t>
+      </w:r>
+      <w:r>
+        <w:rPr>
+          <w:i/>
+          <w:iCs/>
+        </w:rPr>
+        <w:t xml:space="preserve">plotting</w:t>
+      </w:r>
+      <w:r>
+        <w:t xml:space="preserve"> </w:t>
+      </w:r>
+      <w:r>
+        <w:t xml:space="preserve">or</w:t>
+      </w:r>
+      <w:r>
+        <w:t xml:space="preserve"> </w:t>
+      </w:r>
+      <w:r>
+        <w:rPr>
+          <w:i/>
+          <w:iCs/>
+        </w:rPr>
+        <w:t xml:space="preserve">sketching</w:t>
+      </w:r>
+      <w:r>
+        <w:t xml:space="preserve">),</w:t>
+      </w:r>
+      <w:r>
+        <w:t xml:space="preserve"> </w:t>
+      </w:r>
+      <w:r>
+        <w:t xml:space="preserve">or that asks the reader to mark points on a surface.</w:t>
+      </w:r>
+      <w:r>
+        <w:t xml:space="preserve"> </w:t>
+      </w:r>
+      <w:r>
+        <w:t xml:space="preserve">The</w:t>
+      </w:r>
+      <w:r>
+        <w:t xml:space="preserve"> </w:t>
+      </w:r>
+      <w:r>
+        <w:rPr>
+          <w:rStyle w:val="VerbatimChar"/>
+        </w:rPr>
+        <w:t xml:space="preserve">check-visualization-figures</w:t>
+      </w:r>
+      <w:r>
+        <w:t xml:space="preserve"> </w:t>
+      </w:r>
+      <w:r>
+        <w:t xml:space="preserve">workflow in</w:t>
+      </w:r>
+      <w:r>
+        <w:t xml:space="preserve"> </w:t>
+      </w:r>
+      <w:hyperlink r:id="rId27">
+        <w:r>
+          <w:rPr>
+            <w:rStyle w:val="VerbatimChar"/>
+          </w:rPr>
+          <w:t xml:space="preserve">gha</w:t>
+        </w:r>
+      </w:hyperlink>
+      <w:r>
+        <w:t xml:space="preserve"> </w:t>
+      </w:r>
+      <w:r>
+        <w:t xml:space="preserve">reports, in a pull request, each such div that has no figure in it or in its solution,</w:t>
+      </w:r>
+      <w:r>
+        <w:t xml:space="preserve"> </w:t>
+      </w:r>
+      <w:r>
+        <w:t xml:space="preserve">and a</w:t>
+      </w:r>
+      <w:r>
+        <w:t xml:space="preserve"> </w:t>
+      </w:r>
+      <w:r>
+        <w:rPr>
+          <w:rStyle w:val="VerbatimChar"/>
+        </w:rPr>
+        <w:t xml:space="preserve">&lt;!-- no-figure: reason --&gt;</w:t>
+      </w:r>
+      <w:r>
+        <w:t xml:space="preserve"> </w:t>
+      </w:r>
+      <w:r>
+        <w:t xml:space="preserve">comment inside the div suppresses that report,</w:t>
+      </w:r>
+      <w:r>
+        <w:t xml:space="preserve"> </w:t>
+      </w:r>
+      <w:r>
+        <w:t xml:space="preserve">as it does for an example</w:t>
+      </w:r>
+      <w:r>
+        <w:t xml:space="preserve"> </w:t>
+      </w:r>
+      <w:r>
+        <w:t xml:space="preserve">(</w:t>
+      </w:r>
+      <w:hyperlink r:id="rId29">
+        <w:r>
+          <w:rPr>
+            <w:rStyle w:val="Hyperlink"/>
+          </w:rPr>
+          <w:t xml:space="preserve">gha#1262</w:t>
+        </w:r>
+      </w:hyperlink>
+      <w:r>
+        <w:t xml:space="preserve">).</w:t>
+      </w:r>
+    </w:p>
+    <w:p>
+      <w:pPr>
+        <w:pStyle w:val="Compact"/>
+        <w:numPr>
+          <w:ilvl w:val="0"/>
+          <w:numId w:val="1006"/>
+        </w:numPr>
+      </w:pPr>
+      <w:r>
         <w:t xml:space="preserve">Give every topic at least one figure that shows the idea,</w:t>
       </w:r>
       <w:r>
@@ -2508,7 +2765,7 @@
       <w:r>
         <w:t xml:space="preserve"> </w:t>
       </w:r>
-      <w:hyperlink r:id="rId29">
+      <w:hyperlink r:id="rId30">
         <w:r>
           <w:rPr>
             <w:rStyle w:val="Hyperlink"/>
@@ -2535,8 +2792,8 @@
         <w:t xml:space="preserve">Make each figure follow the accessibility rules below.</w:t>
       </w:r>
     </w:p>
-    <w:bookmarkEnd w:id="30"/>
-    <w:bookmarkStart w:id="32" w:name="X7f95f8ec3b796fc99108c37bb45d62741b824c4"/>
+    <w:bookmarkEnd w:id="31"/>
+    <w:bookmarkStart w:id="33" w:name="X7f95f8ec3b796fc99108c37bb45d62741b824c4"/>
     <w:p>
       <w:pPr>
         <w:pStyle w:val="Heading2"/>
@@ -2771,7 +3028,7 @@
         <w:t xml:space="preserve">Give the practice exercise its own slug and follow the numbering and slide-break rules above.</w:t>
       </w:r>
     </w:p>
-    <w:bookmarkStart w:id="31" w:name="exm-practice-after-example"/>
+    <w:bookmarkStart w:id="32" w:name="exm-practice-after-example"/>
     <w:p>
       <w:pPr>
         <w:pStyle w:val="FirstParagraph"/>
@@ -2927,9 +3184,9 @@
         <w:t xml:space="preserve">).</w:t>
       </w:r>
     </w:p>
-    <w:bookmarkEnd w:id="31"/>
     <w:bookmarkEnd w:id="32"/>
-    <w:bookmarkStart w:id="36" w:name="Xf27331f4c36c8d578e5fa29a37312484cc3343a"/>
+    <w:bookmarkEnd w:id="33"/>
+    <w:bookmarkStart w:id="37" w:name="Xf27331f4c36c8d578e5fa29a37312484cc3343a"/>
     <w:p>
       <w:pPr>
         <w:pStyle w:val="Heading2"/>
@@ -3047,7 +3304,7 @@
       <w:r>
         <w:t xml:space="preserve"> </w:t>
       </w:r>
-      <w:hyperlink r:id="rId33">
+      <w:hyperlink r:id="rId34">
         <w:r>
           <w:rPr>
             <w:rStyle w:val="Hyperlink"/>
@@ -3073,7 +3330,7 @@
       <w:r>
         <w:t xml:space="preserve"> </w:t>
       </w:r>
-      <w:hyperlink r:id="rId34">
+      <w:hyperlink r:id="rId35">
         <w:r>
           <w:rPr>
             <w:rStyle w:val="Hyperlink"/>
@@ -3138,7 +3395,7 @@
       <w:r>
         <w:t xml:space="preserve"> </w:t>
       </w:r>
-      <w:hyperlink r:id="rId35">
+      <w:hyperlink r:id="rId36">
         <w:r>
           <w:rPr>
             <w:rStyle w:val="Hyperlink"/>
@@ -3309,8 +3566,8 @@
         <w:t xml:space="preserve">so setup steps must work on a shared or hosted machine.</w:t>
       </w:r>
     </w:p>
-    <w:bookmarkEnd w:id="36"/>
-    <w:bookmarkStart w:id="45" w:name="present-r-results-with-modern-packages"/>
+    <w:bookmarkEnd w:id="37"/>
+    <w:bookmarkStart w:id="46" w:name="present-r-results-with-modern-packages"/>
     <w:p>
       <w:pPr>
         <w:pStyle w:val="Heading2"/>
@@ -3392,7 +3649,7 @@
       <w:r>
         <w:t xml:space="preserve"> </w:t>
       </w:r>
-      <w:hyperlink r:id="rId37">
+      <w:hyperlink r:id="rId38">
         <w:r>
           <w:rPr>
             <w:rStyle w:val="Hyperlink"/>
@@ -3424,7 +3681,7 @@
       <w:r>
         <w:t xml:space="preserve"> </w:t>
       </w:r>
-      <w:hyperlink r:id="rId38">
+      <w:hyperlink r:id="rId39">
         <w:r>
           <w:rPr>
             <w:rStyle w:val="Hyperlink"/>
@@ -3498,7 +3755,7 @@
       <w:r>
         <w:t xml:space="preserve"> </w:t>
       </w:r>
-      <w:hyperlink r:id="rId39">
+      <w:hyperlink r:id="rId40">
         <w:r>
           <w:rPr>
             <w:rStyle w:val="Hyperlink"/>
@@ -3569,7 +3826,7 @@
       <w:r>
         <w:t xml:space="preserve"> </w:t>
       </w:r>
-      <w:hyperlink r:id="rId40">
+      <w:hyperlink r:id="rId41">
         <w:r>
           <w:rPr>
             <w:rStyle w:val="Hyperlink"/>
@@ -3586,7 +3843,7 @@
       <w:r>
         <w:t xml:space="preserve"> </w:t>
       </w:r>
-      <w:hyperlink r:id="rId41">
+      <w:hyperlink r:id="rId42">
         <w:r>
           <w:rPr>
             <w:rStyle w:val="Hyperlink"/>
@@ -3609,7 +3866,7 @@
       <w:r>
         <w:t xml:space="preserve"> </w:t>
       </w:r>
-      <w:hyperlink r:id="rId42">
+      <w:hyperlink r:id="rId43">
         <w:r>
           <w:rPr>
             <w:rStyle w:val="Hyperlink"/>
@@ -3665,7 +3922,7 @@
       <w:r>
         <w:t xml:space="preserve"> </w:t>
       </w:r>
-      <w:hyperlink r:id="rId43">
+      <w:hyperlink r:id="rId44">
         <w:r>
           <w:rPr>
             <w:rStyle w:val="Hyperlink"/>
@@ -3703,7 +3960,7 @@
       <w:r>
         <w:t xml:space="preserve"> </w:t>
       </w:r>
-      <w:hyperlink r:id="rId44">
+      <w:hyperlink r:id="rId45">
         <w:r>
           <w:rPr>
             <w:rStyle w:val="Hyperlink"/>
@@ -3718,8 +3975,8 @@
         <w:t xml:space="preserve">notes show the style.</w:t>
       </w:r>
     </w:p>
-    <w:bookmarkEnd w:id="45"/>
-    <w:bookmarkStart w:id="49" w:name="manipulate-data-with-dplyr-not-base-r"/>
+    <w:bookmarkEnd w:id="46"/>
+    <w:bookmarkStart w:id="50" w:name="manipulate-data-with-dplyr-not-base-r"/>
     <w:p>
       <w:pPr>
         <w:pStyle w:val="Heading2"/>
@@ -3756,7 +4013,7 @@
       <w:r>
         <w:t xml:space="preserve"> </w:t>
       </w:r>
-      <w:hyperlink r:id="rId46">
+      <w:hyperlink r:id="rId47">
         <w:r>
           <w:rPr>
             <w:rStyle w:val="Hyperlink"/>
@@ -3914,7 +4171,7 @@
       <w:r>
         <w:t xml:space="preserve"> </w:t>
       </w:r>
-      <w:hyperlink r:id="rId47">
+      <w:hyperlink r:id="rId48">
         <w:r>
           <w:rPr>
             <w:rStyle w:val="Hyperlink"/>
@@ -4006,7 +4263,7 @@
       <w:r>
         <w:t xml:space="preserve"> </w:t>
       </w:r>
-      <w:hyperlink r:id="rId48">
+      <w:hyperlink r:id="rId49">
         <w:r>
           <w:rPr>
             <w:rStyle w:val="Hyperlink"/>
@@ -4195,8 +4452,8 @@
         <w:t xml:space="preserve">The rule is about selecting, filtering and building data frames.</w:t>
       </w:r>
     </w:p>
-    <w:bookmarkEnd w:id="49"/>
-    <w:bookmarkStart w:id="51" w:name="X2bc6121e3a2f39a37d8a6591d77df16bd22bd0b"/>
+    <w:bookmarkEnd w:id="50"/>
+    <w:bookmarkStart w:id="52" w:name="X2bc6121e3a2f39a37d8a6591d77df16bd22bd0b"/>
     <w:p>
       <w:pPr>
         <w:pStyle w:val="Heading2"/>
@@ -4289,7 +4546,7 @@
       <w:r>
         <w:t xml:space="preserve"> </w:t>
       </w:r>
-      <w:hyperlink r:id="rId50">
+      <w:hyperlink r:id="rId51">
         <w:r>
           <w:rPr>
             <w:rStyle w:val="Hyperlink"/>
@@ -4466,8 +4723,8 @@
         <w:t xml:space="preserve">directory it creates.</w:t>
       </w:r>
     </w:p>
-    <w:bookmarkEnd w:id="51"/>
-    <w:bookmarkStart w:id="52" w:name="X7c0de8eaf50a5b2644eabf66f1f9b734b8a4a71"/>
+    <w:bookmarkEnd w:id="52"/>
+    <w:bookmarkStart w:id="53" w:name="X7c0de8eaf50a5b2644eabf66f1f9b734b8a4a71"/>
     <w:p>
       <w:pPr>
         <w:pStyle w:val="Heading2"/>
@@ -4642,8 +4899,8 @@
         <w:t xml:space="preserve">such as a transformation, a modeling choice, a tuning value or a random seed.</w:t>
       </w:r>
     </w:p>
-    <w:bookmarkEnd w:id="52"/>
-    <w:bookmarkStart w:id="53" w:name="X94063c6448bea82c8f1e8d367c642bbe2eda89b"/>
+    <w:bookmarkEnd w:id="53"/>
+    <w:bookmarkStart w:id="54" w:name="X94063c6448bea82c8f1e8d367c642bbe2eda89b"/>
     <w:p>
       <w:pPr>
         <w:pStyle w:val="Heading2"/>
@@ -4883,8 +5140,8 @@
         <w:t xml:space="preserve">.</w:t>
       </w:r>
     </w:p>
-    <w:bookmarkEnd w:id="53"/>
-    <w:bookmarkStart w:id="54" w:name="Xffa5a3357c8672d830c88e1e58a0ef107550647"/>
+    <w:bookmarkEnd w:id="54"/>
+    <w:bookmarkStart w:id="55" w:name="Xffa5a3357c8672d830c88e1e58a0ef107550647"/>
     <w:p>
       <w:pPr>
         <w:pStyle w:val="Heading2"/>
@@ -5003,8 +5260,8 @@
         <w:t xml:space="preserve">A chapter introduces those where it defines them.</w:t>
       </w:r>
     </w:p>
-    <w:bookmarkEnd w:id="54"/>
-    <w:bookmarkStart w:id="55" w:name="make-figures-accessible"/>
+    <w:bookmarkEnd w:id="55"/>
+    <w:bookmarkStart w:id="56" w:name="make-figures-accessible"/>
     <w:p>
       <w:pPr>
         <w:pStyle w:val="Heading2"/>
@@ -5139,8 +5396,8 @@
         <w:t xml:space="preserve">(observed when rendering lecture notes to PDF).</w:t>
       </w:r>
     </w:p>
-    <w:bookmarkEnd w:id="55"/>
-    <w:bookmarkStart w:id="57" w:name="structure-slides-for-the-reader"/>
+    <w:bookmarkEnd w:id="56"/>
+    <w:bookmarkStart w:id="58" w:name="structure-slides-for-the-reader"/>
     <w:p>
       <w:pPr>
         <w:pStyle w:val="Heading2"/>
@@ -5199,7 +5456,7 @@
       <w:r>
         <w:t xml:space="preserve"> </w:t>
       </w:r>
-      <w:hyperlink r:id="rId56">
+      <w:hyperlink r:id="rId57">
         <w:r>
           <w:rPr>
             <w:rStyle w:val="Hyperlink"/>
@@ -5439,8 +5696,8 @@
         <w:t xml:space="preserve">Put a slide break after the heading and move the text onto content slides.</w:t>
       </w:r>
     </w:p>
-    <w:bookmarkEnd w:id="57"/>
-    <w:bookmarkStart w:id="59" w:name="X5f21f12cbfc4e3df5e838110af4e52db506fec1"/>
+    <w:bookmarkEnd w:id="58"/>
+    <w:bookmarkStart w:id="60" w:name="X5f21f12cbfc4e3df5e838110af4e52db506fec1"/>
     <w:p>
       <w:pPr>
         <w:pStyle w:val="Heading2"/>
@@ -5583,7 +5840,7 @@
         <w:t xml:space="preserve">The same rule applies to every other reference table, such as a table of notation.</w:t>
       </w:r>
     </w:p>
-    <w:bookmarkStart w:id="58" w:name="exm-note-sheet-rows"/>
+    <w:bookmarkStart w:id="59" w:name="exm-note-sheet-rows"/>
     <w:p>
       <w:pPr>
         <w:pStyle w:val="BodyText"/>
@@ -5674,9 +5931,9 @@
         <w:t xml:space="preserve">The ✅ rows let the reader find one formula by one label.</w:t>
       </w:r>
     </w:p>
-    <w:bookmarkEnd w:id="58"/>
     <w:bookmarkEnd w:id="59"/>
-    <w:bookmarkStart w:id="60" w:name="talk-about-the-ideas-not-the-notes"/>
+    <w:bookmarkEnd w:id="60"/>
+    <w:bookmarkStart w:id="61" w:name="talk-about-the-ideas-not-the-notes"/>
     <w:p>
       <w:pPr>
         <w:pStyle w:val="Heading2"/>
@@ -5848,8 +6105,8 @@
         <w:t xml:space="preserve">and it goes stale when the definition moves.</w:t>
       </w:r>
     </w:p>
-    <w:bookmarkEnd w:id="60"/>
-    <w:bookmarkStart w:id="64" w:name="Xcb579568ef754486ebde8b41ba4528bdf380eec"/>
+    <w:bookmarkEnd w:id="61"/>
+    <w:bookmarkStart w:id="65" w:name="Xcb579568ef754486ebde8b41ba4528bdf380eec"/>
     <w:p>
       <w:pPr>
         <w:pStyle w:val="Heading2"/>
@@ -5908,7 +6165,7 @@
       <w:r>
         <w:t xml:space="preserve"> </w:t>
       </w:r>
-      <w:hyperlink r:id="rId61">
+      <w:hyperlink r:id="rId62">
         <w:r>
           <w:rPr>
             <w:rStyle w:val="Hyperlink"/>
@@ -5964,7 +6221,7 @@
       <w:r>
         <w:t xml:space="preserve"> </w:t>
       </w:r>
-      <w:hyperlink r:id="rId62">
+      <w:hyperlink r:id="rId63">
         <w:r>
           <w:rPr>
             <w:rStyle w:val="Hyperlink"/>
@@ -5993,7 +6250,7 @@
       <w:r>
         <w:t xml:space="preserve"> </w:t>
       </w:r>
-      <w:hyperlink r:id="rId63">
+      <w:hyperlink r:id="rId64">
         <w:r>
           <w:rPr>
             <w:rStyle w:val="Hyperlink"/>
@@ -6026,8 +6283,8 @@
         <w:t xml:space="preserve">because a bare citation key renders as the author list.</w:t>
       </w:r>
     </w:p>
-    <w:bookmarkEnd w:id="64"/>
-    <w:bookmarkStart w:id="73" w:name="rules-that-apply-to-all-writing"/>
+    <w:bookmarkEnd w:id="65"/>
+    <w:bookmarkStart w:id="74" w:name="rules-that-apply-to-all-writing"/>
     <w:p>
       <w:pPr>
         <w:pStyle w:val="Heading2"/>
@@ -6052,7 +6309,7 @@
           <w:numId w:val="1020"/>
         </w:numPr>
       </w:pPr>
-      <w:hyperlink r:id="rId65">
+      <w:hyperlink r:id="rId66">
         <w:r>
           <w:rPr>
             <w:rStyle w:val="Hyperlink"/>
@@ -6072,7 +6329,7 @@
           <w:numId w:val="1020"/>
         </w:numPr>
       </w:pPr>
-      <w:hyperlink r:id="rId66">
+      <w:hyperlink r:id="rId67">
         <w:r>
           <w:rPr>
             <w:rStyle w:val="Hyperlink"/>
@@ -6095,7 +6352,7 @@
           <w:numId w:val="1020"/>
         </w:numPr>
       </w:pPr>
-      <w:hyperlink r:id="rId67">
+      <w:hyperlink r:id="rId68">
         <w:r>
           <w:rPr>
             <w:rStyle w:val="Hyperlink"/>
@@ -6115,7 +6372,7 @@
           <w:numId w:val="1020"/>
         </w:numPr>
       </w:pPr>
-      <w:hyperlink r:id="rId68">
+      <w:hyperlink r:id="rId69">
         <w:r>
           <w:rPr>
             <w:rStyle w:val="Hyperlink"/>
@@ -6138,7 +6395,7 @@
           <w:numId w:val="1020"/>
         </w:numPr>
       </w:pPr>
-      <w:hyperlink r:id="rId69">
+      <w:hyperlink r:id="rId70">
         <w:r>
           <w:rPr>
             <w:rStyle w:val="Hyperlink"/>
@@ -6150,8 +6407,8 @@
         <w:t xml:space="preserve">.</w:t>
       </w:r>
     </w:p>
-    <w:bookmarkStart w:id="72" w:name="refs"/>
-    <w:bookmarkStart w:id="71" w:name="ref-freeman2014active"/>
+    <w:bookmarkStart w:id="73" w:name="refs"/>
+    <w:bookmarkStart w:id="72" w:name="ref-freeman2014active"/>
     <w:p>
       <w:pPr>
         <w:pStyle w:val="Bibliography"/>
@@ -6184,7 +6441,7 @@
       <w:r>
         <w:t xml:space="preserve"> </w:t>
       </w:r>
-      <w:hyperlink r:id="rId70">
+      <w:hyperlink r:id="rId71">
         <w:r>
           <w:rPr>
             <w:rStyle w:val="Hyperlink"/>
@@ -6196,9 +6453,9 @@
         <w:t xml:space="preserve">.</w:t>
       </w:r>
     </w:p>
-    <w:bookmarkEnd w:id="71"/>
     <w:bookmarkEnd w:id="72"/>
     <w:bookmarkEnd w:id="73"/>
+    <w:bookmarkEnd w:id="74"/>
     <w:sectPr>
       <w:footnotePr>
         <w:numRestart w:val="eachSect"/>

</xml_diff>

<commit_message>
Deploying to gh-pages from @ Morrison-Lab/psw@0d8e915bd9b8c46dd7d39a3da3f59af356e35ac2 🚀
</commit_message>
<xml_diff>
--- a/chapters/teaching.docx
+++ b/chapters/teaching.docx
@@ -15,7 +15,7 @@
         <w:pStyle w:val="Date"/>
       </w:pPr>
       <w:r>
-        <w:t xml:space="preserve">Last modified: 2026-10-26 19:27:28 (PDT)</w:t>
+        <w:t xml:space="preserve">Last modified: 2026-10-26 23:59:30 (PDT)</w:t>
       </w:r>
     </w:p>
     <w:tbl>
@@ -6106,13 +6106,51 @@
       </w:r>
     </w:p>
     <w:bookmarkEnd w:id="61"/>
-    <w:bookmarkStart w:id="65" w:name="Xcb579568ef754486ebde8b41ba4528bdf380eec"/>
+    <w:bookmarkStart w:id="63" w:name="write-grading-rubrics-as-checklists"/>
     <w:p>
       <w:pPr>
         <w:pStyle w:val="Heading2"/>
       </w:pPr>
       <w:r>
-        <w:t xml:space="preserve">22 Credit other courses without summarizing them</w:t>
+        <w:t xml:space="preserve">22 Write grading rubrics as checklists</w:t>
+      </w:r>
+    </w:p>
+    <w:p>
+      <w:pPr>
+        <w:pStyle w:val="FirstParagraph"/>
+      </w:pPr>
+      <w:r>
+        <w:t xml:space="preserve">Structure the rubric for most STEM questions as a checklist</w:t>
+      </w:r>
+      <w:r>
+        <w:t xml:space="preserve"> </w:t>
+      </w:r>
+      <w:r>
+        <w:t xml:space="preserve">(Ezra, 2026-10-26).</w:t>
+      </w:r>
+      <w:r>
+        <w:t xml:space="preserve"> </w:t>
+      </w:r>
+      <w:r>
+        <w:t xml:space="preserve">A grader then marks each item as earned or not,</w:t>
+      </w:r>
+      <w:r>
+        <w:t xml:space="preserve"> </w:t>
+      </w:r>
+      <w:r>
+        <w:t xml:space="preserve">and the points are the sum of the earned items.</w:t>
+      </w:r>
+      <w:r>
+        <w:t xml:space="preserve"> </w:t>
+      </w:r>
+      <w:r>
+        <w:t xml:space="preserve">A rubric written as a paragraph makes the grader reconstruct the items,</w:t>
+      </w:r>
+      <w:r>
+        <w:t xml:space="preserve"> </w:t>
+      </w:r>
+      <w:r>
+        <w:t xml:space="preserve">and two graders reconstruct different items.</w:t>
       </w:r>
     </w:p>
     <w:p>
@@ -6124,6 +6162,350 @@
         </w:numPr>
       </w:pPr>
       <w:r>
+        <w:t xml:space="preserve">Write one checklist item per observable criterion,</w:t>
+      </w:r>
+      <w:r>
+        <w:t xml:space="preserve"> </w:t>
+      </w:r>
+      <w:r>
+        <w:t xml:space="preserve">and put its points first.</w:t>
+      </w:r>
+    </w:p>
+    <w:p>
+      <w:pPr>
+        <w:pStyle w:val="Compact"/>
+        <w:numPr>
+          <w:ilvl w:val="0"/>
+          <w:numId w:val="1019"/>
+        </w:numPr>
+      </w:pPr>
+      <w:r>
+        <w:t xml:space="preserve">Make the points of the items sum to the question’s points,</w:t>
+      </w:r>
+      <w:r>
+        <w:t xml:space="preserve"> </w:t>
+      </w:r>
+      <w:r>
+        <w:t xml:space="preserve">and state that total in the line that introduces the checklist.</w:t>
+      </w:r>
+    </w:p>
+    <w:p>
+      <w:pPr>
+        <w:pStyle w:val="Compact"/>
+        <w:numPr>
+          <w:ilvl w:val="0"/>
+          <w:numId w:val="1019"/>
+        </w:numPr>
+      </w:pPr>
+      <w:r>
+        <w:t xml:space="preserve">Write each item so that it is either met or not met.</w:t>
+      </w:r>
+      <w:r>
+        <w:t xml:space="preserve"> </w:t>
+      </w:r>
+      <w:r>
+        <w:t xml:space="preserve">Name the answer or the evidence that meets the criterion, as in</w:t>
+      </w:r>
+      <w:r>
+        <w:t xml:space="preserve"> </w:t>
+      </w:r>
+      <w:r>
+        <w:t xml:space="preserve">“cites the gap between training and CV MSE”</w:t>
+      </w:r>
+      <w:r>
+        <w:t xml:space="preserve">.</w:t>
+      </w:r>
+    </w:p>
+    <w:p>
+      <w:pPr>
+        <w:pStyle w:val="Compact"/>
+        <w:numPr>
+          <w:ilvl w:val="0"/>
+          <w:numId w:val="1019"/>
+        </w:numPr>
+      </w:pPr>
+      <w:r>
+        <w:t xml:space="preserve">List an acceptable alternative answer as a sub-bullet without points</w:t>
+      </w:r>
+      <w:r>
+        <w:t xml:space="preserve"> </w:t>
+      </w:r>
+      <w:r>
+        <w:t xml:space="preserve">under the item it also satisfies,</w:t>
+      </w:r>
+      <w:r>
+        <w:t xml:space="preserve"> </w:t>
+      </w:r>
+      <w:r>
+        <w:t xml:space="preserve">so the items still sum to the question’s points.</w:t>
+      </w:r>
+      <w:r>
+        <w:t xml:space="preserve"> </w:t>
+      </w:r>
+      <w:r>
+        <w:t xml:space="preserve">Do not put the alternative in a separate paragraph.</w:t>
+      </w:r>
+    </w:p>
+    <w:p>
+      <w:pPr>
+        <w:pStyle w:val="Compact"/>
+        <w:numPr>
+          <w:ilvl w:val="0"/>
+          <w:numId w:val="1019"/>
+        </w:numPr>
+      </w:pPr>
+      <w:r>
+        <w:t xml:space="preserve">Keep the rubric in the solution, after the answer,</w:t>
+      </w:r>
+      <w:r>
+        <w:t xml:space="preserve"> </w:t>
+      </w:r>
+      <w:r>
+        <w:t xml:space="preserve">so a course that withholds solutions from students withholds the rubric too.</w:t>
+      </w:r>
+    </w:p>
+    <w:p>
+      <w:pPr>
+        <w:pStyle w:val="Compact"/>
+        <w:numPr>
+          <w:ilvl w:val="0"/>
+          <w:numId w:val="1019"/>
+        </w:numPr>
+      </w:pPr>
+      <w:r>
+        <w:t xml:space="preserve">Use another structure when a question has no separable criteria,</w:t>
+      </w:r>
+      <w:r>
+        <w:t xml:space="preserve"> </w:t>
+      </w:r>
+      <w:r>
+        <w:t xml:space="preserve">such as a single holistic judgment of a proof’s rigor.</w:t>
+      </w:r>
+    </w:p>
+    <w:bookmarkStart w:id="62" w:name="exm-rubric-checklist"/>
+    <w:p>
+      <w:pPr>
+        <w:pStyle w:val="FirstParagraph"/>
+      </w:pPr>
+      <w:r>
+        <w:rPr>
+          <w:b/>
+          <w:bCs/>
+        </w:rPr>
+        <w:t xml:space="preserve">Example 6 (A rubric as a checklist)</w:t>
+      </w:r>
+      <w:r>
+        <w:t xml:space="preserve"> </w:t>
+      </w:r>
+      <w:r>
+        <w:t xml:space="preserve"> </w:t>
+      </w:r>
+    </w:p>
+    <w:p>
+      <w:pPr>
+        <w:pStyle w:val="BlockText"/>
+      </w:pPr>
+      <w:r>
+        <w:t xml:space="preserve">❌ Grading (6 points): two for</w:t>
+      </w:r>
+      <w:r>
+        <w:t xml:space="preserve"> </w:t>
+      </w:r>
+      <m:oMath>
+        <m:acc>
+          <m:accPr>
+            <m:chr m:val="⃗"/>
+          </m:accPr>
+          <m:e>
+            <m:r>
+              <m:t>r</m:t>
+            </m:r>
+          </m:e>
+        </m:acc>
+      </m:oMath>
+      <w:r>
+        <w:t xml:space="preserve">, one for</w:t>
+      </w:r>
+      <w:r>
+        <w:t xml:space="preserve"> </w:t>
+      </w:r>
+      <w:r>
+        <w:t xml:space="preserve">$\dprod{\vx}{\vec r} = 0$</w:t>
+      </w:r>
+      <w:r>
+        <w:t xml:space="preserve">,</w:t>
+      </w:r>
+      <w:r>
+        <w:t xml:space="preserve"> </w:t>
+      </w:r>
+      <w:r>
+        <w:t xml:space="preserve">three for</w:t>
+      </w:r>
+      <w:r>
+        <w:t xml:space="preserve"> </w:t>
+      </w:r>
+      <w:r>
+        <w:t xml:space="preserve">“orthogonal”</w:t>
+      </w:r>
+      <w:r>
+        <w:t xml:space="preserve"> </w:t>
+      </w:r>
+      <w:r>
+        <w:t xml:space="preserve">with its link to the normal equation.</w:t>
+      </w:r>
+    </w:p>
+    <w:p>
+      <w:pPr>
+        <w:pStyle w:val="BlockText"/>
+      </w:pPr>
+      <w:r>
+        <w:t xml:space="preserve">✅</w:t>
+      </w:r>
+    </w:p>
+    <w:p>
+      <w:pPr>
+        <w:pStyle w:val="SourceCode"/>
+      </w:pPr>
+      <w:r>
+        <w:rPr>
+          <w:rStyle w:val="NormalTok"/>
+        </w:rPr>
+        <w:t xml:space="preserve">Grading (6 points):</w:t>
+      </w:r>
+      <w:r>
+        <w:br/>
+      </w:r>
+      <w:r>
+        <w:br/>
+      </w:r>
+      <w:r>
+        <w:rPr>
+          <w:rStyle w:val="SpecialStringTok"/>
+        </w:rPr>
+        <w:t xml:space="preserve">- </w:t>
+      </w:r>
+      <w:r>
+        <w:rPr>
+          <w:rStyle w:val="VariableTok"/>
+        </w:rPr>
+        <w:t xml:space="preserve">[ ]</w:t>
+      </w:r>
+      <w:r>
+        <w:rPr>
+          <w:rStyle w:val="NormalTok"/>
+        </w:rPr>
+        <w:t xml:space="preserve"> 2 points: gives $\vresid = \tp{</w:t>
+      </w:r>
+      <w:r>
+        <w:rPr>
+          <w:rStyle w:val="CommentTok"/>
+        </w:rPr>
+        <w:t xml:space="preserve">[</w:t>
+      </w:r>
+      <w:r>
+        <w:rPr>
+          <w:rStyle w:val="OtherTok"/>
+        </w:rPr>
+        <w:t xml:space="preserve">-1, -1, 1</w:t>
+      </w:r>
+      <w:r>
+        <w:rPr>
+          <w:rStyle w:val="CommentTok"/>
+        </w:rPr>
+        <w:t xml:space="preserve">]</w:t>
+      </w:r>
+      <w:r>
+        <w:rPr>
+          <w:rStyle w:val="NormalTok"/>
+        </w:rPr>
+        <w:t xml:space="preserve">}$.</w:t>
+      </w:r>
+      <w:r>
+        <w:br/>
+      </w:r>
+      <w:r>
+        <w:rPr>
+          <w:rStyle w:val="SpecialStringTok"/>
+        </w:rPr>
+        <w:t xml:space="preserve">- </w:t>
+      </w:r>
+      <w:r>
+        <w:rPr>
+          <w:rStyle w:val="VariableTok"/>
+        </w:rPr>
+        <w:t xml:space="preserve">[ ]</w:t>
+      </w:r>
+      <w:r>
+        <w:rPr>
+          <w:rStyle w:val="NormalTok"/>
+        </w:rPr>
+        <w:t xml:space="preserve"> 1 point: computes $\dprod{\vx}{\vresid} = 0$.</w:t>
+      </w:r>
+      <w:r>
+        <w:br/>
+      </w:r>
+      <w:r>
+        <w:rPr>
+          <w:rStyle w:val="SpecialStringTok"/>
+        </w:rPr>
+        <w:t xml:space="preserve">- </w:t>
+      </w:r>
+      <w:r>
+        <w:rPr>
+          <w:rStyle w:val="VariableTok"/>
+        </w:rPr>
+        <w:t xml:space="preserve">[ ]</w:t>
+      </w:r>
+      <w:r>
+        <w:rPr>
+          <w:rStyle w:val="NormalTok"/>
+        </w:rPr>
+        <w:t xml:space="preserve"> 3 points: says $\vresid$ is orthogonal to $\vx$</w:t>
+      </w:r>
+      <w:r>
+        <w:br/>
+      </w:r>
+      <w:r>
+        <w:rPr>
+          <w:rStyle w:val="NormalTok"/>
+        </w:rPr>
+        <w:t xml:space="preserve">  and links this orthogonality to the normal equation.</w:t>
+      </w:r>
+    </w:p>
+    <w:p>
+      <w:pPr>
+        <w:pStyle w:val="FirstParagraph"/>
+      </w:pPr>
+      <w:r>
+        <w:t xml:space="preserve">The checklist shows the grader each item to mark</w:t>
+      </w:r>
+      <w:r>
+        <w:t xml:space="preserve"> </w:t>
+      </w:r>
+      <w:r>
+        <w:t xml:space="preserve">and lets a script check that the points sum to the total.</w:t>
+      </w:r>
+    </w:p>
+    <w:bookmarkEnd w:id="62"/>
+    <w:bookmarkEnd w:id="63"/>
+    <w:bookmarkStart w:id="67" w:name="Xcb579568ef754486ebde8b41ba4528bdf380eec"/>
+    <w:p>
+      <w:pPr>
+        <w:pStyle w:val="Heading2"/>
+      </w:pPr>
+      <w:r>
+        <w:t xml:space="preserve">23 Credit other courses without summarizing them</w:t>
+      </w:r>
+    </w:p>
+    <w:p>
+      <w:pPr>
+        <w:pStyle w:val="Compact"/>
+        <w:numPr>
+          <w:ilvl w:val="0"/>
+          <w:numId w:val="1020"/>
+        </w:numPr>
+      </w:pPr>
+      <w:r>
         <w:t xml:space="preserve">Write your own version of another course’s material,</w:t>
       </w:r>
       <w:r>
@@ -6165,7 +6547,7 @@
       <w:r>
         <w:t xml:space="preserve"> </w:t>
       </w:r>
-      <w:hyperlink r:id="rId62">
+      <w:hyperlink r:id="rId64">
         <w:r>
           <w:rPr>
             <w:rStyle w:val="Hyperlink"/>
@@ -6206,7 +6588,7 @@
         <w:pStyle w:val="Compact"/>
         <w:numPr>
           <w:ilvl w:val="0"/>
-          <w:numId w:val="1019"/>
+          <w:numId w:val="1020"/>
         </w:numPr>
       </w:pPr>
       <w:r>
@@ -6221,7 +6603,7 @@
       <w:r>
         <w:t xml:space="preserve"> </w:t>
       </w:r>
-      <w:hyperlink r:id="rId63">
+      <w:hyperlink r:id="rId65">
         <w:r>
           <w:rPr>
             <w:rStyle w:val="Hyperlink"/>
@@ -6241,7 +6623,7 @@
         <w:pStyle w:val="Compact"/>
         <w:numPr>
           <w:ilvl w:val="0"/>
-          <w:numId w:val="1019"/>
+          <w:numId w:val="1020"/>
         </w:numPr>
       </w:pPr>
       <w:r>
@@ -6250,7 +6632,7 @@
       <w:r>
         <w:t xml:space="preserve"> </w:t>
       </w:r>
-      <w:hyperlink r:id="rId64">
+      <w:hyperlink r:id="rId66">
         <w:r>
           <w:rPr>
             <w:rStyle w:val="Hyperlink"/>
@@ -6270,7 +6652,7 @@
         <w:pStyle w:val="Compact"/>
         <w:numPr>
           <w:ilvl w:val="0"/>
-          <w:numId w:val="1019"/>
+          <w:numId w:val="1020"/>
         </w:numPr>
       </w:pPr>
       <w:r>
@@ -6283,14 +6665,14 @@
         <w:t xml:space="preserve">because a bare citation key renders as the author list.</w:t>
       </w:r>
     </w:p>
-    <w:bookmarkEnd w:id="65"/>
-    <w:bookmarkStart w:id="74" w:name="rules-that-apply-to-all-writing"/>
+    <w:bookmarkEnd w:id="67"/>
+    <w:bookmarkStart w:id="76" w:name="rules-that-apply-to-all-writing"/>
     <w:p>
       <w:pPr>
         <w:pStyle w:val="Heading2"/>
       </w:pPr>
       <w:r>
-        <w:t xml:space="preserve">23 Rules that apply to all writing</w:t>
+        <w:t xml:space="preserve">24 Rules that apply to all writing</w:t>
       </w:r>
     </w:p>
     <w:p>
@@ -6306,10 +6688,10 @@
         <w:pStyle w:val="Compact"/>
         <w:numPr>
           <w:ilvl w:val="0"/>
-          <w:numId w:val="1020"/>
-        </w:numPr>
-      </w:pPr>
-      <w:hyperlink r:id="rId66">
+          <w:numId w:val="1021"/>
+        </w:numPr>
+      </w:pPr>
+      <w:hyperlink r:id="rId68">
         <w:r>
           <w:rPr>
             <w:rStyle w:val="Hyperlink"/>
@@ -6326,10 +6708,10 @@
         <w:pStyle w:val="Compact"/>
         <w:numPr>
           <w:ilvl w:val="0"/>
-          <w:numId w:val="1020"/>
-        </w:numPr>
-      </w:pPr>
-      <w:hyperlink r:id="rId67">
+          <w:numId w:val="1021"/>
+        </w:numPr>
+      </w:pPr>
+      <w:hyperlink r:id="rId69">
         <w:r>
           <w:rPr>
             <w:rStyle w:val="Hyperlink"/>
@@ -6349,10 +6731,10 @@
         <w:pStyle w:val="Compact"/>
         <w:numPr>
           <w:ilvl w:val="0"/>
-          <w:numId w:val="1020"/>
-        </w:numPr>
-      </w:pPr>
-      <w:hyperlink r:id="rId68">
+          <w:numId w:val="1021"/>
+        </w:numPr>
+      </w:pPr>
+      <w:hyperlink r:id="rId70">
         <w:r>
           <w:rPr>
             <w:rStyle w:val="Hyperlink"/>
@@ -6369,10 +6751,10 @@
         <w:pStyle w:val="Compact"/>
         <w:numPr>
           <w:ilvl w:val="0"/>
-          <w:numId w:val="1020"/>
-        </w:numPr>
-      </w:pPr>
-      <w:hyperlink r:id="rId69">
+          <w:numId w:val="1021"/>
+        </w:numPr>
+      </w:pPr>
+      <w:hyperlink r:id="rId71">
         <w:r>
           <w:rPr>
             <w:rStyle w:val="Hyperlink"/>
@@ -6392,10 +6774,10 @@
         <w:pStyle w:val="Compact"/>
         <w:numPr>
           <w:ilvl w:val="0"/>
-          <w:numId w:val="1020"/>
-        </w:numPr>
-      </w:pPr>
-      <w:hyperlink r:id="rId70">
+          <w:numId w:val="1021"/>
+        </w:numPr>
+      </w:pPr>
+      <w:hyperlink r:id="rId72">
         <w:r>
           <w:rPr>
             <w:rStyle w:val="Hyperlink"/>
@@ -6407,8 +6789,8 @@
         <w:t xml:space="preserve">.</w:t>
       </w:r>
     </w:p>
-    <w:bookmarkStart w:id="73" w:name="refs"/>
-    <w:bookmarkStart w:id="72" w:name="ref-freeman2014active"/>
+    <w:bookmarkStart w:id="75" w:name="refs"/>
+    <w:bookmarkStart w:id="74" w:name="ref-freeman2014active"/>
     <w:p>
       <w:pPr>
         <w:pStyle w:val="Bibliography"/>
@@ -6441,7 +6823,7 @@
       <w:r>
         <w:t xml:space="preserve"> </w:t>
       </w:r>
-      <w:hyperlink r:id="rId71">
+      <w:hyperlink r:id="rId73">
         <w:r>
           <w:rPr>
             <w:rStyle w:val="Hyperlink"/>
@@ -6453,9 +6835,9 @@
         <w:t xml:space="preserve">.</w:t>
       </w:r>
     </w:p>
-    <w:bookmarkEnd w:id="72"/>
-    <w:bookmarkEnd w:id="73"/>
     <w:bookmarkEnd w:id="74"/>
+    <w:bookmarkEnd w:id="75"/>
+    <w:bookmarkEnd w:id="76"/>
     <w:sectPr>
       <w:footnotePr>
         <w:numRestart w:val="eachSect"/>
@@ -6730,6 +7112,9 @@
     <w:abstractNumId w:val="991"/>
   </w:num>
   <w:num w:numId="1020">
+    <w:abstractNumId w:val="991"/>
+  </w:num>
+  <w:num w:numId="1021">
     <w:abstractNumId w:val="991"/>
   </w:num>
 </w:numbering>

</xml_diff>

<commit_message>
Deploying to gh-pages from @ Morrison-Lab/psw@fe8d1dbf6890d6db09712de1a3e1846fac118905 🚀
</commit_message>
<xml_diff>
--- a/chapters/teaching.docx
+++ b/chapters/teaching.docx
@@ -15,7 +15,7 @@
         <w:pStyle w:val="Date"/>
       </w:pPr>
       <w:r>
-        <w:t xml:space="preserve">Last modified: 2026-10-26 23:59:30 (PDT)</w:t>
+        <w:t xml:space="preserve">Last modified: 2026-10-27 01:39:34 (PDT)</w:t>
       </w:r>
     </w:p>
     <w:tbl>
@@ -3567,13 +3567,13 @@
       </w:r>
     </w:p>
     <w:bookmarkEnd w:id="37"/>
-    <w:bookmarkStart w:id="46" w:name="present-r-results-with-modern-packages"/>
+    <w:bookmarkStart w:id="38" w:name="Xf53ecb3398b87b82ffd1a126dd02e87a65bb694"/>
     <w:p>
       <w:pPr>
         <w:pStyle w:val="Heading2"/>
       </w:pPr>
       <w:r>
-        <w:t xml:space="preserve">12 Present R results with modern packages</w:t>
+        <w:t xml:space="preserve">12 Keep each step’s code in one chunk, and put parallel chunks in a language tabset</w:t>
       </w:r>
     </w:p>
     <w:p>
@@ -3581,6 +3581,275 @@
         <w:pStyle w:val="FirstParagraph"/>
       </w:pPr>
       <w:r>
+        <w:t xml:space="preserve">This rule applies to every executed code chunk in teaching materials,</w:t>
+      </w:r>
+      <w:r>
+        <w:t xml:space="preserve"> </w:t>
+      </w:r>
+      <w:r>
+        <w:t xml:space="preserve">in every course and every teaching repository, in every language.</w:t>
+      </w:r>
+    </w:p>
+    <w:p>
+      <w:pPr>
+        <w:pStyle w:val="Compact"/>
+        <w:numPr>
+          <w:ilvl w:val="0"/>
+          <w:numId w:val="1009"/>
+        </w:numPr>
+      </w:pPr>
+      <w:r>
+        <w:t xml:space="preserve">Put parallel versions of one computation in one language tabset, never one chunk after another.</w:t>
+      </w:r>
+      <w:r>
+        <w:t xml:space="preserve"> </w:t>
+      </w:r>
+      <w:r>
+        <w:t xml:space="preserve">A reader should see one language at a time.</w:t>
+      </w:r>
+    </w:p>
+    <w:p>
+      <w:pPr>
+        <w:pStyle w:val="Compact"/>
+        <w:numPr>
+          <w:ilvl w:val="0"/>
+          <w:numId w:val="1009"/>
+        </w:numPr>
+      </w:pPr>
+      <w:r>
+        <w:t xml:space="preserve">Write one chunk for each step of the computation.</w:t>
+      </w:r>
+      <w:r>
+        <w:t xml:space="preserve"> </w:t>
+      </w:r>
+      <w:r>
+        <w:t xml:space="preserve">A figure’s code is one chunk, even when it takes ten lines.</w:t>
+      </w:r>
+    </w:p>
+    <w:p>
+      <w:pPr>
+        <w:pStyle w:val="Compact"/>
+        <w:numPr>
+          <w:ilvl w:val="0"/>
+          <w:numId w:val="1009"/>
+        </w:numPr>
+      </w:pPr>
+      <w:r>
+        <w:t xml:space="preserve">Split a chunk only for a reason that the reader can see:</w:t>
+      </w:r>
+    </w:p>
+    <w:p>
+      <w:pPr>
+        <w:pStyle w:val="Compact"/>
+        <w:numPr>
+          <w:ilvl w:val="1"/>
+          <w:numId w:val="1010"/>
+        </w:numPr>
+      </w:pPr>
+      <w:r>
+        <w:rPr>
+          <w:b/>
+          <w:bCs/>
+        </w:rPr>
+        <w:t xml:space="preserve">Own label or options</w:t>
+      </w:r>
+      <w:r>
+        <w:t xml:space="preserve">: the second part needs its own label, caption or chunk options.</w:t>
+      </w:r>
+    </w:p>
+    <w:p>
+      <w:pPr>
+        <w:pStyle w:val="Compact"/>
+        <w:numPr>
+          <w:ilvl w:val="1"/>
+          <w:numId w:val="1010"/>
+        </w:numPr>
+      </w:pPr>
+      <w:r>
+        <w:rPr>
+          <w:b/>
+          <w:bCs/>
+        </w:rPr>
+        <w:t xml:space="preserve">Separate output</w:t>
+      </w:r>
+      <w:r>
+        <w:t xml:space="preserve">: the second part shows output that the first part should not.</w:t>
+      </w:r>
+    </w:p>
+    <w:p>
+      <w:pPr>
+        <w:pStyle w:val="Compact"/>
+        <w:numPr>
+          <w:ilvl w:val="1"/>
+          <w:numId w:val="1010"/>
+        </w:numPr>
+      </w:pPr>
+      <w:r>
+        <w:rPr>
+          <w:b/>
+          <w:bCs/>
+        </w:rPr>
+        <w:t xml:space="preserve">Dependent prose</w:t>
+      </w:r>
+      <w:r>
+        <w:t xml:space="preserve">: prose between the parts needs the first part’s output.</w:t>
+      </w:r>
+    </w:p>
+    <w:p>
+      <w:pPr>
+        <w:pStyle w:val="Compact"/>
+        <w:numPr>
+          <w:ilvl w:val="0"/>
+          <w:numId w:val="1009"/>
+        </w:numPr>
+      </w:pPr>
+      <w:r>
+        <w:t xml:space="preserve">Do not split a chunk to name its parts, or to keep it short.</w:t>
+      </w:r>
+      <w:r>
+        <w:t xml:space="preserve"> </w:t>
+      </w:r>
+      <w:r>
+        <w:t xml:space="preserve">Comments name the parts</w:t>
+      </w:r>
+      <w:r>
+        <w:t xml:space="preserve"> </w:t>
+      </w:r>
+      <w:r>
+        <w:t xml:space="preserve">(see</w:t>
+      </w:r>
+      <w:r>
+        <w:t xml:space="preserve"> </w:t>
+      </w:r>
+      <w:hyperlink w:anchor="X7c0de8eaf50a5b2644eabf66f1f9b734b8a4a71">
+        <w:r>
+          <w:rPr>
+            <w:rStyle w:val="Hyperlink"/>
+          </w:rPr>
+          <w:t xml:space="preserve">Comment every code chunk to say what and why</w:t>
+        </w:r>
+      </w:hyperlink>
+      <w:r>
+        <w:t xml:space="preserve">).</w:t>
+      </w:r>
+    </w:p>
+    <w:p>
+      <w:pPr>
+        <w:pStyle w:val="Compact"/>
+        <w:numPr>
+          <w:ilvl w:val="0"/>
+          <w:numId w:val="1009"/>
+        </w:numPr>
+      </w:pPr>
+      <w:r>
+        <w:t xml:space="preserve">Give a chunk that only stores values for later code or inline code</w:t>
+      </w:r>
+      <w:r>
+        <w:t xml:space="preserve"> </w:t>
+      </w:r>
+      <w:r>
+        <w:rPr>
+          <w:rStyle w:val="VerbatimChar"/>
+        </w:rPr>
+        <w:t xml:space="preserve">#| include: false</w:t>
+      </w:r>
+      <w:r>
+        <w:t xml:space="preserve">.</w:t>
+      </w:r>
+      <w:r>
+        <w:t xml:space="preserve"> </w:t>
+      </w:r>
+      <w:r>
+        <w:t xml:space="preserve">When the chunk that computes those values is already hidden, merge the storing code into that chunk.</w:t>
+      </w:r>
+    </w:p>
+    <w:p>
+      <w:pPr>
+        <w:pStyle w:val="Compact"/>
+        <w:numPr>
+          <w:ilvl w:val="0"/>
+          <w:numId w:val="1009"/>
+        </w:numPr>
+      </w:pPr>
+      <w:r>
+        <w:t xml:space="preserve">Check for output that splits a chunk without a reason.</w:t>
+      </w:r>
+      <w:r>
+        <w:t xml:space="preserve"> </w:t>
+      </w:r>
+      <w:r>
+        <w:t xml:space="preserve">In Python, reticulate prints the value of each top-level call that returns something other than</w:t>
+      </w:r>
+      <w:r>
+        <w:t xml:space="preserve"> </w:t>
+      </w:r>
+      <w:r>
+        <w:rPr>
+          <w:rStyle w:val="VerbatimChar"/>
+        </w:rPr>
+        <w:t xml:space="preserve">None</w:t>
+      </w:r>
+      <w:r>
+        <w:t xml:space="preserve"> </w:t>
+      </w:r>
+      <w:r>
+        <w:t xml:space="preserve">and shows the chunk as one code block per printed value,</w:t>
+      </w:r>
+      <w:r>
+        <w:t xml:space="preserve"> </w:t>
+      </w:r>
+      <w:r>
+        <w:t xml:space="preserve">such as a</w:t>
+      </w:r>
+      <w:r>
+        <w:t xml:space="preserve"> </w:t>
+      </w:r>
+      <w:r>
+        <w:rPr>
+          <w:rStyle w:val="VerbatimChar"/>
+        </w:rPr>
+        <w:t xml:space="preserve">&lt;matplotlib.lines.Line2D object at 0x...&gt;</w:t>
+      </w:r>
+      <w:r>
+        <w:t xml:space="preserve"> </w:t>
+      </w:r>
+      <w:r>
+        <w:t xml:space="preserve">line after every</w:t>
+      </w:r>
+      <w:r>
+        <w:t xml:space="preserve"> </w:t>
+      </w:r>
+      <w:r>
+        <w:rPr>
+          <w:rStyle w:val="VerbatimChar"/>
+        </w:rPr>
+        <w:t xml:space="preserve">ax.plot(...)</w:t>
+      </w:r>
+      <w:r>
+        <w:t xml:space="preserve">.</w:t>
+      </w:r>
+      <w:r>
+        <w:t xml:space="preserve"> </w:t>
+      </w:r>
+      <w:r>
+        <w:t xml:space="preserve">End each such call with a semicolon, or assign its value.</w:t>
+      </w:r>
+    </w:p>
+    <w:bookmarkEnd w:id="38"/>
+    <w:bookmarkStart w:id="47" w:name="present-r-results-with-modern-packages"/>
+    <w:p>
+      <w:pPr>
+        <w:pStyle w:val="Heading2"/>
+      </w:pPr>
+      <w:r>
+        <w:t xml:space="preserve">13 Present R results with modern packages</w:t>
+      </w:r>
+    </w:p>
+    <w:p>
+      <w:pPr>
+        <w:pStyle w:val="FirstParagraph"/>
+      </w:pPr>
+      <w:r>
         <w:t xml:space="preserve">This rule applies to all R code in teaching materials,</w:t>
       </w:r>
       <w:r>
@@ -3595,7 +3864,7 @@
         <w:pStyle w:val="Compact"/>
         <w:numPr>
           <w:ilvl w:val="0"/>
-          <w:numId w:val="1009"/>
+          <w:numId w:val="1011"/>
         </w:numPr>
       </w:pPr>
       <w:r>
@@ -3640,7 +3909,7 @@
         <w:pStyle w:val="Compact"/>
         <w:numPr>
           <w:ilvl w:val="0"/>
-          <w:numId w:val="1009"/>
+          <w:numId w:val="1011"/>
         </w:numPr>
       </w:pPr>
       <w:r>
@@ -3649,7 +3918,7 @@
       <w:r>
         <w:t xml:space="preserve"> </w:t>
       </w:r>
-      <w:hyperlink r:id="rId38">
+      <w:hyperlink r:id="rId39">
         <w:r>
           <w:rPr>
             <w:rStyle w:val="Hyperlink"/>
@@ -3681,7 +3950,7 @@
       <w:r>
         <w:t xml:space="preserve"> </w:t>
       </w:r>
-      <w:hyperlink r:id="rId39">
+      <w:hyperlink r:id="rId40">
         <w:r>
           <w:rPr>
             <w:rStyle w:val="Hyperlink"/>
@@ -3746,7 +4015,7 @@
         <w:pStyle w:val="Compact"/>
         <w:numPr>
           <w:ilvl w:val="0"/>
-          <w:numId w:val="1009"/>
+          <w:numId w:val="1011"/>
         </w:numPr>
       </w:pPr>
       <w:r>
@@ -3755,7 +4024,7 @@
       <w:r>
         <w:t xml:space="preserve"> </w:t>
       </w:r>
-      <w:hyperlink r:id="rId40">
+      <w:hyperlink r:id="rId41">
         <w:r>
           <w:rPr>
             <w:rStyle w:val="Hyperlink"/>
@@ -3817,7 +4086,7 @@
         <w:pStyle w:val="Compact"/>
         <w:numPr>
           <w:ilvl w:val="0"/>
-          <w:numId w:val="1009"/>
+          <w:numId w:val="1011"/>
         </w:numPr>
       </w:pPr>
       <w:r>
@@ -3826,7 +4095,7 @@
       <w:r>
         <w:t xml:space="preserve"> </w:t>
       </w:r>
-      <w:hyperlink r:id="rId41">
+      <w:hyperlink r:id="rId42">
         <w:r>
           <w:rPr>
             <w:rStyle w:val="Hyperlink"/>
@@ -3843,7 +4112,7 @@
       <w:r>
         <w:t xml:space="preserve"> </w:t>
       </w:r>
-      <w:hyperlink r:id="rId42">
+      <w:hyperlink r:id="rId43">
         <w:r>
           <w:rPr>
             <w:rStyle w:val="Hyperlink"/>
@@ -3866,7 +4135,7 @@
       <w:r>
         <w:t xml:space="preserve"> </w:t>
       </w:r>
-      <w:hyperlink r:id="rId43">
+      <w:hyperlink r:id="rId44">
         <w:r>
           <w:rPr>
             <w:rStyle w:val="Hyperlink"/>
@@ -3898,7 +4167,7 @@
         <w:pStyle w:val="Compact"/>
         <w:numPr>
           <w:ilvl w:val="0"/>
-          <w:numId w:val="1009"/>
+          <w:numId w:val="1011"/>
         </w:numPr>
       </w:pPr>
       <w:r>
@@ -3922,7 +4191,7 @@
       <w:r>
         <w:t xml:space="preserve"> </w:t>
       </w:r>
-      <w:hyperlink r:id="rId44">
+      <w:hyperlink r:id="rId45">
         <w:r>
           <w:rPr>
             <w:rStyle w:val="Hyperlink"/>
@@ -3951,7 +4220,7 @@
         <w:pStyle w:val="Compact"/>
         <w:numPr>
           <w:ilvl w:val="0"/>
-          <w:numId w:val="1009"/>
+          <w:numId w:val="1011"/>
         </w:numPr>
       </w:pPr>
       <w:r>
@@ -3960,7 +4229,7 @@
       <w:r>
         <w:t xml:space="preserve"> </w:t>
       </w:r>
-      <w:hyperlink r:id="rId45">
+      <w:hyperlink r:id="rId46">
         <w:r>
           <w:rPr>
             <w:rStyle w:val="Hyperlink"/>
@@ -3975,14 +4244,14 @@
         <w:t xml:space="preserve">notes show the style.</w:t>
       </w:r>
     </w:p>
-    <w:bookmarkEnd w:id="46"/>
-    <w:bookmarkStart w:id="50" w:name="manipulate-data-with-dplyr-not-base-r"/>
+    <w:bookmarkEnd w:id="47"/>
+    <w:bookmarkStart w:id="51" w:name="manipulate-data-with-dplyr-not-base-r"/>
     <w:p>
       <w:pPr>
         <w:pStyle w:val="Heading2"/>
       </w:pPr>
       <w:r>
-        <w:t xml:space="preserve">13 Manipulate data with dplyr, not base R</w:t>
+        <w:t xml:space="preserve">14 Manipulate data with dplyr, not base R</w:t>
       </w:r>
     </w:p>
     <w:p>
@@ -4004,7 +4273,7 @@
         <w:pStyle w:val="Compact"/>
         <w:numPr>
           <w:ilvl w:val="0"/>
-          <w:numId w:val="1010"/>
+          <w:numId w:val="1012"/>
         </w:numPr>
       </w:pPr>
       <w:r>
@@ -4013,7 +4282,7 @@
       <w:r>
         <w:t xml:space="preserve"> </w:t>
       </w:r>
-      <w:hyperlink r:id="rId47">
+      <w:hyperlink r:id="rId48">
         <w:r>
           <w:rPr>
             <w:rStyle w:val="Hyperlink"/>
@@ -4075,7 +4344,7 @@
         <w:pStyle w:val="Compact"/>
         <w:numPr>
           <w:ilvl w:val="0"/>
-          <w:numId w:val="1010"/>
+          <w:numId w:val="1012"/>
         </w:numPr>
       </w:pPr>
       <w:r>
@@ -4126,7 +4395,7 @@
         <w:pStyle w:val="Compact"/>
         <w:numPr>
           <w:ilvl w:val="0"/>
-          <w:numId w:val="1010"/>
+          <w:numId w:val="1012"/>
         </w:numPr>
       </w:pPr>
       <w:r>
@@ -4162,7 +4431,7 @@
         <w:pStyle w:val="Compact"/>
         <w:numPr>
           <w:ilvl w:val="0"/>
-          <w:numId w:val="1010"/>
+          <w:numId w:val="1012"/>
         </w:numPr>
       </w:pPr>
       <w:r>
@@ -4171,7 +4440,7 @@
       <w:r>
         <w:t xml:space="preserve"> </w:t>
       </w:r>
-      <w:hyperlink r:id="rId48">
+      <w:hyperlink r:id="rId49">
         <w:r>
           <w:rPr>
             <w:rStyle w:val="Hyperlink"/>
@@ -4218,7 +4487,7 @@
         <w:pStyle w:val="Compact"/>
         <w:numPr>
           <w:ilvl w:val="0"/>
-          <w:numId w:val="1010"/>
+          <w:numId w:val="1012"/>
         </w:numPr>
       </w:pPr>
       <w:r>
@@ -4254,7 +4523,7 @@
         <w:pStyle w:val="Compact"/>
         <w:numPr>
           <w:ilvl w:val="0"/>
-          <w:numId w:val="1010"/>
+          <w:numId w:val="1012"/>
         </w:numPr>
       </w:pPr>
       <w:r>
@@ -4263,7 +4532,7 @@
       <w:r>
         <w:t xml:space="preserve"> </w:t>
       </w:r>
-      <w:hyperlink r:id="rId49">
+      <w:hyperlink r:id="rId50">
         <w:r>
           <w:rPr>
             <w:rStyle w:val="Hyperlink"/>
@@ -4310,7 +4579,7 @@
         <w:pStyle w:val="Compact"/>
         <w:numPr>
           <w:ilvl w:val="0"/>
-          <w:numId w:val="1010"/>
+          <w:numId w:val="1012"/>
         </w:numPr>
       </w:pPr>
       <w:r>
@@ -4334,7 +4603,7 @@
         <w:pStyle w:val="Compact"/>
         <w:numPr>
           <w:ilvl w:val="0"/>
-          <w:numId w:val="1010"/>
+          <w:numId w:val="1012"/>
         </w:numPr>
       </w:pPr>
       <w:r>
@@ -4433,7 +4702,7 @@
         <w:pStyle w:val="Compact"/>
         <w:numPr>
           <w:ilvl w:val="0"/>
-          <w:numId w:val="1010"/>
+          <w:numId w:val="1012"/>
         </w:numPr>
       </w:pPr>
       <w:r>
@@ -4452,14 +4721,14 @@
         <w:t xml:space="preserve">The rule is about selecting, filtering and building data frames.</w:t>
       </w:r>
     </w:p>
-    <w:bookmarkEnd w:id="50"/>
-    <w:bookmarkStart w:id="52" w:name="X2bc6121e3a2f39a37d8a6591d77df16bd22bd0b"/>
+    <w:bookmarkEnd w:id="51"/>
+    <w:bookmarkStart w:id="53" w:name="X2bc6121e3a2f39a37d8a6591d77df16bd22bd0b"/>
     <w:p>
       <w:pPr>
         <w:pStyle w:val="Heading2"/>
       </w:pPr>
       <w:r>
-        <w:t xml:space="preserve">14 Include code from files instead of copying it</w:t>
+        <w:t xml:space="preserve">15 Include code from files instead of copying it</w:t>
       </w:r>
     </w:p>
     <w:p>
@@ -4475,7 +4744,7 @@
         <w:pStyle w:val="Compact"/>
         <w:numPr>
           <w:ilvl w:val="0"/>
-          <w:numId w:val="1011"/>
+          <w:numId w:val="1013"/>
         </w:numPr>
       </w:pPr>
       <w:r>
@@ -4519,7 +4788,7 @@
         <w:pStyle w:val="Compact"/>
         <w:numPr>
           <w:ilvl w:val="0"/>
-          <w:numId w:val="1011"/>
+          <w:numId w:val="1013"/>
         </w:numPr>
       </w:pPr>
       <w:r>
@@ -4546,7 +4815,7 @@
       <w:r>
         <w:t xml:space="preserve"> </w:t>
       </w:r>
-      <w:hyperlink r:id="rId51">
+      <w:hyperlink r:id="rId52">
         <w:r>
           <w:rPr>
             <w:rStyle w:val="Hyperlink"/>
@@ -4632,7 +4901,7 @@
         <w:pStyle w:val="Compact"/>
         <w:numPr>
           <w:ilvl w:val="0"/>
-          <w:numId w:val="1011"/>
+          <w:numId w:val="1013"/>
         </w:numPr>
       </w:pPr>
       <w:r>
@@ -4677,7 +4946,7 @@
         <w:pStyle w:val="Compact"/>
         <w:numPr>
           <w:ilvl w:val="0"/>
-          <w:numId w:val="1011"/>
+          <w:numId w:val="1013"/>
         </w:numPr>
       </w:pPr>
       <w:r>
@@ -4723,14 +4992,14 @@
         <w:t xml:space="preserve">directory it creates.</w:t>
       </w:r>
     </w:p>
-    <w:bookmarkEnd w:id="52"/>
-    <w:bookmarkStart w:id="53" w:name="X7c0de8eaf50a5b2644eabf66f1f9b734b8a4a71"/>
+    <w:bookmarkEnd w:id="53"/>
+    <w:bookmarkStart w:id="54" w:name="X7c0de8eaf50a5b2644eabf66f1f9b734b8a4a71"/>
     <w:p>
       <w:pPr>
         <w:pStyle w:val="Heading2"/>
       </w:pPr>
       <w:r>
-        <w:t xml:space="preserve">15 Comment every code chunk to say what and why</w:t>
+        <w:t xml:space="preserve">16 Comment every code chunk to say what and why</w:t>
       </w:r>
     </w:p>
     <w:p>
@@ -4752,7 +5021,7 @@
         <w:pStyle w:val="Compact"/>
         <w:numPr>
           <w:ilvl w:val="0"/>
-          <w:numId w:val="1012"/>
+          <w:numId w:val="1014"/>
         </w:numPr>
       </w:pPr>
       <w:r>
@@ -4770,7 +5039,7 @@
         <w:pStyle w:val="Compact"/>
         <w:numPr>
           <w:ilvl w:val="0"/>
-          <w:numId w:val="1012"/>
+          <w:numId w:val="1014"/>
         </w:numPr>
       </w:pPr>
       <w:r>
@@ -4788,7 +5057,7 @@
         <w:pStyle w:val="Compact"/>
         <w:numPr>
           <w:ilvl w:val="0"/>
-          <w:numId w:val="1012"/>
+          <w:numId w:val="1014"/>
         </w:numPr>
       </w:pPr>
       <w:r>
@@ -4886,7 +5155,7 @@
         <w:pStyle w:val="Compact"/>
         <w:numPr>
           <w:ilvl w:val="0"/>
-          <w:numId w:val="1012"/>
+          <w:numId w:val="1014"/>
         </w:numPr>
       </w:pPr>
       <w:r>
@@ -4899,14 +5168,14 @@
         <w:t xml:space="preserve">such as a transformation, a modeling choice, a tuning value or a random seed.</w:t>
       </w:r>
     </w:p>
-    <w:bookmarkEnd w:id="53"/>
-    <w:bookmarkStart w:id="54" w:name="X94063c6448bea82c8f1e8d367c642bbe2eda89b"/>
+    <w:bookmarkEnd w:id="54"/>
+    <w:bookmarkStart w:id="55" w:name="X94063c6448bea82c8f1e8d367c642bbe2eda89b"/>
     <w:p>
       <w:pPr>
         <w:pStyle w:val="Heading2"/>
       </w:pPr>
       <w:r>
-        <w:t xml:space="preserve">16 Set</w:t>
+        <w:t xml:space="preserve">17 Set</w:t>
       </w:r>
       <w:r>
         <w:t xml:space="preserve"> </w:t>
@@ -4984,7 +5253,7 @@
         <w:pStyle w:val="Compact"/>
         <w:numPr>
           <w:ilvl w:val="0"/>
-          <w:numId w:val="1013"/>
+          <w:numId w:val="1015"/>
         </w:numPr>
       </w:pPr>
       <w:r>
@@ -5017,7 +5286,7 @@
         <w:pStyle w:val="Compact"/>
         <w:numPr>
           <w:ilvl w:val="0"/>
-          <w:numId w:val="1013"/>
+          <w:numId w:val="1015"/>
         </w:numPr>
       </w:pPr>
       <w:r>
@@ -5050,7 +5319,7 @@
         <w:pStyle w:val="Compact"/>
         <w:numPr>
           <w:ilvl w:val="0"/>
-          <w:numId w:val="1013"/>
+          <w:numId w:val="1015"/>
         </w:numPr>
       </w:pPr>
       <w:r>
@@ -5140,14 +5409,14 @@
         <w:t xml:space="preserve">.</w:t>
       </w:r>
     </w:p>
-    <w:bookmarkEnd w:id="54"/>
-    <w:bookmarkStart w:id="55" w:name="Xffa5a3357c8672d830c88e1e58a0ef107550647"/>
+    <w:bookmarkEnd w:id="55"/>
+    <w:bookmarkStart w:id="56" w:name="Xffa5a3357c8672d830c88e1e58a0ef107550647"/>
     <w:p>
       <w:pPr>
         <w:pStyle w:val="Heading2"/>
       </w:pPr>
       <w:r>
-        <w:t xml:space="preserve">17 Introduce every function in a programming primer</w:t>
+        <w:t xml:space="preserve">18 Introduce every function in a programming primer</w:t>
       </w:r>
     </w:p>
     <w:p>
@@ -5169,7 +5438,7 @@
         <w:pStyle w:val="Compact"/>
         <w:numPr>
           <w:ilvl w:val="0"/>
-          <w:numId w:val="1014"/>
+          <w:numId w:val="1016"/>
         </w:numPr>
       </w:pPr>
       <w:r>
@@ -5193,7 +5462,7 @@
         <w:pStyle w:val="Compact"/>
         <w:numPr>
           <w:ilvl w:val="0"/>
-          <w:numId w:val="1014"/>
+          <w:numId w:val="1016"/>
         </w:numPr>
       </w:pPr>
       <w:r>
@@ -5223,7 +5492,7 @@
         <w:pStyle w:val="Compact"/>
         <w:numPr>
           <w:ilvl w:val="0"/>
-          <w:numId w:val="1014"/>
+          <w:numId w:val="1016"/>
         </w:numPr>
       </w:pPr>
       <w:r>
@@ -5247,7 +5516,7 @@
         <w:pStyle w:val="Compact"/>
         <w:numPr>
           <w:ilvl w:val="0"/>
-          <w:numId w:val="1014"/>
+          <w:numId w:val="1016"/>
         </w:numPr>
       </w:pPr>
       <w:r>
@@ -5260,22 +5529,22 @@
         <w:t xml:space="preserve">A chapter introduces those where it defines them.</w:t>
       </w:r>
     </w:p>
-    <w:bookmarkEnd w:id="55"/>
-    <w:bookmarkStart w:id="56" w:name="make-figures-accessible"/>
+    <w:bookmarkEnd w:id="56"/>
+    <w:bookmarkStart w:id="57" w:name="make-figures-accessible"/>
     <w:p>
       <w:pPr>
         <w:pStyle w:val="Heading2"/>
       </w:pPr>
       <w:r>
-        <w:t xml:space="preserve">18 Make figures accessible</w:t>
-      </w:r>
-    </w:p>
-    <w:p>
-      <w:pPr>
-        <w:pStyle w:val="Compact"/>
-        <w:numPr>
-          <w:ilvl w:val="0"/>
-          <w:numId w:val="1015"/>
+        <w:t xml:space="preserve">19 Make figures accessible</w:t>
+      </w:r>
+    </w:p>
+    <w:p>
+      <w:pPr>
+        <w:pStyle w:val="Compact"/>
+        <w:numPr>
+          <w:ilvl w:val="0"/>
+          <w:numId w:val="1017"/>
         </w:numPr>
       </w:pPr>
       <w:r>
@@ -5302,7 +5571,7 @@
         <w:pStyle w:val="Compact"/>
         <w:numPr>
           <w:ilvl w:val="0"/>
-          <w:numId w:val="1015"/>
+          <w:numId w:val="1017"/>
         </w:numPr>
       </w:pPr>
       <w:r>
@@ -5332,7 +5601,7 @@
         <w:pStyle w:val="Compact"/>
         <w:numPr>
           <w:ilvl w:val="0"/>
-          <w:numId w:val="1015"/>
+          <w:numId w:val="1017"/>
         </w:numPr>
       </w:pPr>
       <w:r>
@@ -5371,7 +5640,7 @@
         <w:pStyle w:val="Compact"/>
         <w:numPr>
           <w:ilvl w:val="0"/>
-          <w:numId w:val="1015"/>
+          <w:numId w:val="1017"/>
         </w:numPr>
       </w:pPr>
       <w:r>
@@ -5396,22 +5665,22 @@
         <w:t xml:space="preserve">(observed when rendering lecture notes to PDF).</w:t>
       </w:r>
     </w:p>
-    <w:bookmarkEnd w:id="56"/>
-    <w:bookmarkStart w:id="58" w:name="structure-slides-for-the-reader"/>
+    <w:bookmarkEnd w:id="57"/>
+    <w:bookmarkStart w:id="59" w:name="structure-slides-for-the-reader"/>
     <w:p>
       <w:pPr>
         <w:pStyle w:val="Heading2"/>
       </w:pPr>
       <w:r>
-        <w:t xml:space="preserve">19 Structure slides for the reader</w:t>
-      </w:r>
-    </w:p>
-    <w:p>
-      <w:pPr>
-        <w:pStyle w:val="Compact"/>
-        <w:numPr>
-          <w:ilvl w:val="0"/>
-          <w:numId w:val="1016"/>
+        <w:t xml:space="preserve">20 Structure slides for the reader</w:t>
+      </w:r>
+    </w:p>
+    <w:p>
+      <w:pPr>
+        <w:pStyle w:val="Compact"/>
+        <w:numPr>
+          <w:ilvl w:val="0"/>
+          <w:numId w:val="1018"/>
         </w:numPr>
       </w:pPr>
       <w:r>
@@ -5441,7 +5710,7 @@
         <w:pStyle w:val="Compact"/>
         <w:numPr>
           <w:ilvl w:val="0"/>
-          <w:numId w:val="1016"/>
+          <w:numId w:val="1018"/>
         </w:numPr>
       </w:pPr>
       <w:r>
@@ -5456,7 +5725,7 @@
       <w:r>
         <w:t xml:space="preserve"> </w:t>
       </w:r>
-      <w:hyperlink r:id="rId57">
+      <w:hyperlink r:id="rId58">
         <w:r>
           <w:rPr>
             <w:rStyle w:val="Hyperlink"/>
@@ -5476,7 +5745,7 @@
         <w:pStyle w:val="Compact"/>
         <w:numPr>
           <w:ilvl w:val="0"/>
-          <w:numId w:val="1016"/>
+          <w:numId w:val="1018"/>
         </w:numPr>
       </w:pPr>
       <w:r>
@@ -5503,7 +5772,7 @@
         <w:pStyle w:val="Compact"/>
         <w:numPr>
           <w:ilvl w:val="0"/>
-          <w:numId w:val="1016"/>
+          <w:numId w:val="1018"/>
         </w:numPr>
       </w:pPr>
       <w:r>
@@ -5572,7 +5841,7 @@
         <w:pStyle w:val="Compact"/>
         <w:numPr>
           <w:ilvl w:val="0"/>
-          <w:numId w:val="1016"/>
+          <w:numId w:val="1018"/>
         </w:numPr>
       </w:pPr>
       <w:r>
@@ -5641,7 +5910,7 @@
         <w:pStyle w:val="Compact"/>
         <w:numPr>
           <w:ilvl w:val="0"/>
-          <w:numId w:val="1016"/>
+          <w:numId w:val="1018"/>
         </w:numPr>
       </w:pPr>
       <w:r>
@@ -5665,7 +5934,7 @@
         <w:pStyle w:val="Compact"/>
         <w:numPr>
           <w:ilvl w:val="0"/>
-          <w:numId w:val="1016"/>
+          <w:numId w:val="1018"/>
         </w:numPr>
       </w:pPr>
       <w:r>
@@ -5696,14 +5965,14 @@
         <w:t xml:space="preserve">Put a slide break after the heading and move the text onto content slides.</w:t>
       </w:r>
     </w:p>
-    <w:bookmarkEnd w:id="58"/>
-    <w:bookmarkStart w:id="60" w:name="X5f21f12cbfc4e3df5e838110af4e52db506fec1"/>
+    <w:bookmarkEnd w:id="59"/>
+    <w:bookmarkStart w:id="61" w:name="X5f21f12cbfc4e3df5e838110af4e52db506fec1"/>
     <w:p>
       <w:pPr>
         <w:pStyle w:val="Heading2"/>
       </w:pPr>
       <w:r>
-        <w:t xml:space="preserve">20 Give each concept in a note sheet its own row</w:t>
+        <w:t xml:space="preserve">21 Give each concept in a note sheet its own row</w:t>
       </w:r>
     </w:p>
     <w:p>
@@ -5751,7 +6020,7 @@
         <w:pStyle w:val="Compact"/>
         <w:numPr>
           <w:ilvl w:val="0"/>
-          <w:numId w:val="1017"/>
+          <w:numId w:val="1019"/>
         </w:numPr>
       </w:pPr>
       <w:r>
@@ -5763,7 +6032,7 @@
         <w:pStyle w:val="Compact"/>
         <w:numPr>
           <w:ilvl w:val="0"/>
-          <w:numId w:val="1017"/>
+          <w:numId w:val="1019"/>
         </w:numPr>
       </w:pPr>
       <w:r>
@@ -5781,7 +6050,7 @@
         <w:pStyle w:val="Compact"/>
         <w:numPr>
           <w:ilvl w:val="0"/>
-          <w:numId w:val="1017"/>
+          <w:numId w:val="1019"/>
         </w:numPr>
       </w:pPr>
       <w:r>
@@ -5799,7 +6068,7 @@
         <w:pStyle w:val="Compact"/>
         <w:numPr>
           <w:ilvl w:val="0"/>
-          <w:numId w:val="1017"/>
+          <w:numId w:val="1019"/>
         </w:numPr>
       </w:pPr>
       <w:r>
@@ -5840,7 +6109,7 @@
         <w:t xml:space="preserve">The same rule applies to every other reference table, such as a table of notation.</w:t>
       </w:r>
     </w:p>
-    <w:bookmarkStart w:id="59" w:name="exm-note-sheet-rows"/>
+    <w:bookmarkStart w:id="60" w:name="exm-note-sheet-rows"/>
     <w:p>
       <w:pPr>
         <w:pStyle w:val="BodyText"/>
@@ -5931,15 +6200,15 @@
         <w:t xml:space="preserve">The ✅ rows let the reader find one formula by one label.</w:t>
       </w:r>
     </w:p>
-    <w:bookmarkEnd w:id="59"/>
     <w:bookmarkEnd w:id="60"/>
-    <w:bookmarkStart w:id="61" w:name="talk-about-the-ideas-not-the-notes"/>
+    <w:bookmarkEnd w:id="61"/>
+    <w:bookmarkStart w:id="62" w:name="talk-about-the-ideas-not-the-notes"/>
     <w:p>
       <w:pPr>
         <w:pStyle w:val="Heading2"/>
       </w:pPr>
       <w:r>
-        <w:t xml:space="preserve">21 Talk about the ideas, not the notes</w:t>
+        <w:t xml:space="preserve">22 Talk about the ideas, not the notes</w:t>
       </w:r>
     </w:p>
     <w:p>
@@ -5967,7 +6236,7 @@
         <w:pStyle w:val="Compact"/>
         <w:numPr>
           <w:ilvl w:val="0"/>
-          <w:numId w:val="1018"/>
+          <w:numId w:val="1020"/>
         </w:numPr>
       </w:pPr>
       <w:r>
@@ -6009,7 +6278,7 @@
         <w:pStyle w:val="Compact"/>
         <w:numPr>
           <w:ilvl w:val="0"/>
-          <w:numId w:val="1018"/>
+          <w:numId w:val="1020"/>
         </w:numPr>
       </w:pPr>
       <w:r>
@@ -6048,7 +6317,7 @@
         <w:pStyle w:val="Compact"/>
         <w:numPr>
           <w:ilvl w:val="0"/>
-          <w:numId w:val="1018"/>
+          <w:numId w:val="1020"/>
         </w:numPr>
       </w:pPr>
       <w:r>
@@ -6105,14 +6374,14 @@
         <w:t xml:space="preserve">and it goes stale when the definition moves.</w:t>
       </w:r>
     </w:p>
-    <w:bookmarkEnd w:id="61"/>
-    <w:bookmarkStart w:id="63" w:name="write-grading-rubrics-as-checklists"/>
+    <w:bookmarkEnd w:id="62"/>
+    <w:bookmarkStart w:id="64" w:name="write-grading-rubrics-as-checklists"/>
     <w:p>
       <w:pPr>
         <w:pStyle w:val="Heading2"/>
       </w:pPr>
       <w:r>
-        <w:t xml:space="preserve">22 Write grading rubrics as checklists</w:t>
+        <w:t xml:space="preserve">23 Write grading rubrics as checklists</w:t>
       </w:r>
     </w:p>
     <w:p>
@@ -6158,7 +6427,7 @@
         <w:pStyle w:val="Compact"/>
         <w:numPr>
           <w:ilvl w:val="0"/>
-          <w:numId w:val="1019"/>
+          <w:numId w:val="1021"/>
         </w:numPr>
       </w:pPr>
       <w:r>
@@ -6176,7 +6445,7 @@
         <w:pStyle w:val="Compact"/>
         <w:numPr>
           <w:ilvl w:val="0"/>
-          <w:numId w:val="1019"/>
+          <w:numId w:val="1021"/>
         </w:numPr>
       </w:pPr>
       <w:r>
@@ -6194,7 +6463,7 @@
         <w:pStyle w:val="Compact"/>
         <w:numPr>
           <w:ilvl w:val="0"/>
-          <w:numId w:val="1019"/>
+          <w:numId w:val="1021"/>
         </w:numPr>
       </w:pPr>
       <w:r>
@@ -6221,7 +6490,7 @@
         <w:pStyle w:val="Compact"/>
         <w:numPr>
           <w:ilvl w:val="0"/>
-          <w:numId w:val="1019"/>
+          <w:numId w:val="1021"/>
         </w:numPr>
       </w:pPr>
       <w:r>
@@ -6251,7 +6520,7 @@
         <w:pStyle w:val="Compact"/>
         <w:numPr>
           <w:ilvl w:val="0"/>
-          <w:numId w:val="1019"/>
+          <w:numId w:val="1021"/>
         </w:numPr>
       </w:pPr>
       <w:r>
@@ -6269,7 +6538,7 @@
         <w:pStyle w:val="Compact"/>
         <w:numPr>
           <w:ilvl w:val="0"/>
-          <w:numId w:val="1019"/>
+          <w:numId w:val="1021"/>
         </w:numPr>
       </w:pPr>
       <w:r>
@@ -6282,7 +6551,7 @@
         <w:t xml:space="preserve">such as a single holistic judgment of a proof’s rigor.</w:t>
       </w:r>
     </w:p>
-    <w:bookmarkStart w:id="62" w:name="exm-rubric-checklist"/>
+    <w:bookmarkStart w:id="63" w:name="exm-rubric-checklist"/>
     <w:p>
       <w:pPr>
         <w:pStyle w:val="FirstParagraph"/>
@@ -6486,23 +6755,23 @@
         <w:t xml:space="preserve">and lets a script check that the points sum to the total.</w:t>
       </w:r>
     </w:p>
-    <w:bookmarkEnd w:id="62"/>
     <w:bookmarkEnd w:id="63"/>
-    <w:bookmarkStart w:id="67" w:name="Xcb579568ef754486ebde8b41ba4528bdf380eec"/>
+    <w:bookmarkEnd w:id="64"/>
+    <w:bookmarkStart w:id="68" w:name="Xcb579568ef754486ebde8b41ba4528bdf380eec"/>
     <w:p>
       <w:pPr>
         <w:pStyle w:val="Heading2"/>
       </w:pPr>
       <w:r>
-        <w:t xml:space="preserve">23 Credit other courses without summarizing them</w:t>
-      </w:r>
-    </w:p>
-    <w:p>
-      <w:pPr>
-        <w:pStyle w:val="Compact"/>
-        <w:numPr>
-          <w:ilvl w:val="0"/>
-          <w:numId w:val="1020"/>
+        <w:t xml:space="preserve">24 Credit other courses without summarizing them</w:t>
+      </w:r>
+    </w:p>
+    <w:p>
+      <w:pPr>
+        <w:pStyle w:val="Compact"/>
+        <w:numPr>
+          <w:ilvl w:val="0"/>
+          <w:numId w:val="1022"/>
         </w:numPr>
       </w:pPr>
       <w:r>
@@ -6547,7 +6816,7 @@
       <w:r>
         <w:t xml:space="preserve"> </w:t>
       </w:r>
-      <w:hyperlink r:id="rId64">
+      <w:hyperlink r:id="rId65">
         <w:r>
           <w:rPr>
             <w:rStyle w:val="Hyperlink"/>
@@ -6588,7 +6857,7 @@
         <w:pStyle w:val="Compact"/>
         <w:numPr>
           <w:ilvl w:val="0"/>
-          <w:numId w:val="1020"/>
+          <w:numId w:val="1022"/>
         </w:numPr>
       </w:pPr>
       <w:r>
@@ -6603,7 +6872,7 @@
       <w:r>
         <w:t xml:space="preserve"> </w:t>
       </w:r>
-      <w:hyperlink r:id="rId65">
+      <w:hyperlink r:id="rId66">
         <w:r>
           <w:rPr>
             <w:rStyle w:val="Hyperlink"/>
@@ -6623,7 +6892,7 @@
         <w:pStyle w:val="Compact"/>
         <w:numPr>
           <w:ilvl w:val="0"/>
-          <w:numId w:val="1020"/>
+          <w:numId w:val="1022"/>
         </w:numPr>
       </w:pPr>
       <w:r>
@@ -6632,7 +6901,7 @@
       <w:r>
         <w:t xml:space="preserve"> </w:t>
       </w:r>
-      <w:hyperlink r:id="rId66">
+      <w:hyperlink r:id="rId67">
         <w:r>
           <w:rPr>
             <w:rStyle w:val="Hyperlink"/>
@@ -6652,7 +6921,7 @@
         <w:pStyle w:val="Compact"/>
         <w:numPr>
           <w:ilvl w:val="0"/>
-          <w:numId w:val="1020"/>
+          <w:numId w:val="1022"/>
         </w:numPr>
       </w:pPr>
       <w:r>
@@ -6665,14 +6934,14 @@
         <w:t xml:space="preserve">because a bare citation key renders as the author list.</w:t>
       </w:r>
     </w:p>
-    <w:bookmarkEnd w:id="67"/>
-    <w:bookmarkStart w:id="76" w:name="rules-that-apply-to-all-writing"/>
+    <w:bookmarkEnd w:id="68"/>
+    <w:bookmarkStart w:id="77" w:name="rules-that-apply-to-all-writing"/>
     <w:p>
       <w:pPr>
         <w:pStyle w:val="Heading2"/>
       </w:pPr>
       <w:r>
-        <w:t xml:space="preserve">24 Rules that apply to all writing</w:t>
+        <w:t xml:space="preserve">25 Rules that apply to all writing</w:t>
       </w:r>
     </w:p>
     <w:p>
@@ -6688,10 +6957,10 @@
         <w:pStyle w:val="Compact"/>
         <w:numPr>
           <w:ilvl w:val="0"/>
-          <w:numId w:val="1021"/>
-        </w:numPr>
-      </w:pPr>
-      <w:hyperlink r:id="rId68">
+          <w:numId w:val="1023"/>
+        </w:numPr>
+      </w:pPr>
+      <w:hyperlink r:id="rId69">
         <w:r>
           <w:rPr>
             <w:rStyle w:val="Hyperlink"/>
@@ -6708,10 +6977,10 @@
         <w:pStyle w:val="Compact"/>
         <w:numPr>
           <w:ilvl w:val="0"/>
-          <w:numId w:val="1021"/>
-        </w:numPr>
-      </w:pPr>
-      <w:hyperlink r:id="rId69">
+          <w:numId w:val="1023"/>
+        </w:numPr>
+      </w:pPr>
+      <w:hyperlink r:id="rId70">
         <w:r>
           <w:rPr>
             <w:rStyle w:val="Hyperlink"/>
@@ -6731,10 +7000,10 @@
         <w:pStyle w:val="Compact"/>
         <w:numPr>
           <w:ilvl w:val="0"/>
-          <w:numId w:val="1021"/>
-        </w:numPr>
-      </w:pPr>
-      <w:hyperlink r:id="rId70">
+          <w:numId w:val="1023"/>
+        </w:numPr>
+      </w:pPr>
+      <w:hyperlink r:id="rId71">
         <w:r>
           <w:rPr>
             <w:rStyle w:val="Hyperlink"/>
@@ -6751,10 +7020,10 @@
         <w:pStyle w:val="Compact"/>
         <w:numPr>
           <w:ilvl w:val="0"/>
-          <w:numId w:val="1021"/>
-        </w:numPr>
-      </w:pPr>
-      <w:hyperlink r:id="rId71">
+          <w:numId w:val="1023"/>
+        </w:numPr>
+      </w:pPr>
+      <w:hyperlink r:id="rId72">
         <w:r>
           <w:rPr>
             <w:rStyle w:val="Hyperlink"/>
@@ -6774,10 +7043,10 @@
         <w:pStyle w:val="Compact"/>
         <w:numPr>
           <w:ilvl w:val="0"/>
-          <w:numId w:val="1021"/>
-        </w:numPr>
-      </w:pPr>
-      <w:hyperlink r:id="rId72">
+          <w:numId w:val="1023"/>
+        </w:numPr>
+      </w:pPr>
+      <w:hyperlink r:id="rId73">
         <w:r>
           <w:rPr>
             <w:rStyle w:val="Hyperlink"/>
@@ -6789,8 +7058,8 @@
         <w:t xml:space="preserve">.</w:t>
       </w:r>
     </w:p>
-    <w:bookmarkStart w:id="75" w:name="refs"/>
-    <w:bookmarkStart w:id="74" w:name="ref-freeman2014active"/>
+    <w:bookmarkStart w:id="76" w:name="refs"/>
+    <w:bookmarkStart w:id="75" w:name="ref-freeman2014active"/>
     <w:p>
       <w:pPr>
         <w:pStyle w:val="Bibliography"/>
@@ -6823,7 +7092,7 @@
       <w:r>
         <w:t xml:space="preserve"> </w:t>
       </w:r>
-      <w:hyperlink r:id="rId73">
+      <w:hyperlink r:id="rId74">
         <w:r>
           <w:rPr>
             <w:rStyle w:val="Hyperlink"/>
@@ -6835,9 +7104,9 @@
         <w:t xml:space="preserve">.</w:t>
       </w:r>
     </w:p>
-    <w:bookmarkEnd w:id="74"/>
     <w:bookmarkEnd w:id="75"/>
     <w:bookmarkEnd w:id="76"/>
+    <w:bookmarkEnd w:id="77"/>
     <w:sectPr>
       <w:footnotePr>
         <w:numRestart w:val="eachSect"/>
@@ -7115,6 +7384,12 @@
     <w:abstractNumId w:val="991"/>
   </w:num>
   <w:num w:numId="1021">
+    <w:abstractNumId w:val="991"/>
+  </w:num>
+  <w:num w:numId="1022">
+    <w:abstractNumId w:val="991"/>
+  </w:num>
+  <w:num w:numId="1023">
     <w:abstractNumId w:val="991"/>
   </w:num>
 </w:numbering>

</xml_diff>

<commit_message>
Deploying to gh-pages from @ Morrison-Lab/psw@757615531b752a0db47af3cd17e6ca383452846d 🚀
</commit_message>
<xml_diff>
--- a/chapters/teaching.docx
+++ b/chapters/teaching.docx
@@ -15,7 +15,7 @@
         <w:pStyle w:val="Date"/>
       </w:pPr>
       <w:r>
-        <w:t xml:space="preserve">Last modified: 2026-10-27 20:13:11 (PDT)</w:t>
+        <w:t xml:space="preserve">Last modified: 2026-10-27 20:19:40 (PDT)</w:t>
       </w:r>
     </w:p>
     <w:tbl>
@@ -400,6 +400,90 @@
       </w:r>
       <w:r>
         <w:t xml:space="preserve">Later exercises can use earlier results through cross-references.</w:t>
+      </w:r>
+    </w:p>
+    <w:p>
+      <w:pPr>
+        <w:pStyle w:val="Compact"/>
+        <w:numPr>
+          <w:ilvl w:val="0"/>
+          <w:numId w:val="1001"/>
+        </w:numPr>
+      </w:pPr>
+      <w:r>
+        <w:t xml:space="preserve">Make each exercise ask for one thing (Ezra, 2026-10-27).</w:t>
+      </w:r>
+      <w:r>
+        <w:t xml:space="preserve"> </w:t>
+      </w:r>
+      <w:r>
+        <w:t xml:space="preserve">A prompt that says</w:t>
+      </w:r>
+      <w:r>
+        <w:t xml:space="preserve"> </w:t>
+      </w:r>
+      <w:r>
+        <w:t xml:space="preserve">“compute the slope, and compare it with the fitted value”</w:t>
+      </w:r>
+      <w:r>
+        <w:t xml:space="preserve"> </w:t>
+      </w:r>
+      <w:r>
+        <w:t xml:space="preserve">asks for two things, so split it into two exercises,</w:t>
+      </w:r>
+      <w:r>
+        <w:t xml:space="preserve"> </w:t>
+      </w:r>
+      <w:r>
+        <w:t xml:space="preserve">each with its own solution.</w:t>
+      </w:r>
+      <w:r>
+        <w:t xml:space="preserve"> </w:t>
+      </w:r>
+      <w:r>
+        <w:t xml:space="preserve">Split a list item or step inside an exercise the same way,</w:t>
+      </w:r>
+      <w:r>
+        <w:t xml:space="preserve"> </w:t>
+      </w:r>
+      <w:r>
+        <w:t xml:space="preserve">into separate exercises.</w:t>
+      </w:r>
+      <w:r>
+        <w:t xml:space="preserve"> </w:t>
+      </w:r>
+      <w:r>
+        <w:t xml:space="preserve">Phrases such as</w:t>
+      </w:r>
+      <w:r>
+        <w:t xml:space="preserve"> </w:t>
+      </w:r>
+      <w:r>
+        <w:t xml:space="preserve">“and then”</w:t>
+      </w:r>
+      <w:r>
+        <w:t xml:space="preserve">,</w:t>
+      </w:r>
+      <w:r>
+        <w:t xml:space="preserve"> </w:t>
+      </w:r>
+      <w:r>
+        <w:t xml:space="preserve">“and also”</w:t>
+      </w:r>
+      <w:r>
+        <w:t xml:space="preserve">, and</w:t>
+      </w:r>
+      <w:r>
+        <w:t xml:space="preserve"> </w:t>
+      </w:r>
+      <w:r>
+        <w:t xml:space="preserve">“and compare”</w:t>
+      </w:r>
+      <w:r>
+        <w:t xml:space="preserve"> </w:t>
+      </w:r>
+      <w:r>
+        <w:t xml:space="preserve">mark a second ask.</w:t>
       </w:r>
     </w:p>
     <w:p>

</xml_diff>

<commit_message>
Deploying to gh-pages from @ Morrison-Lab/psw@05ffb4eda7f8b89589fe19b8f31dd00552f6f796 🚀
</commit_message>
<xml_diff>
--- a/chapters/teaching.docx
+++ b/chapters/teaching.docx
@@ -15,7 +15,7 @@
         <w:pStyle w:val="Date"/>
       </w:pPr>
       <w:r>
-        <w:t xml:space="preserve">Last modified: 2026-10-28 01:12:24 (PDT)</w:t>
+        <w:t xml:space="preserve">Last modified: 2026-10-28 14:23:41 (PDT)</w:t>
       </w:r>
     </w:p>
     <w:tbl>
@@ -1046,20 +1046,74 @@
     </w:p>
     <w:bookmarkEnd w:id="17"/>
     <w:bookmarkEnd w:id="18"/>
-    <w:bookmarkStart w:id="21" w:name="give-each-defined-term-its-own-div"/>
+    <w:bookmarkStart w:id="19" w:name="Xcb2ea076bd2bdcde187ea355befd37150b69b89"/>
     <w:p>
       <w:pPr>
         <w:pStyle w:val="Heading2"/>
       </w:pPr>
       <w:r>
-        <w:t xml:space="preserve">3 Give each defined term its own div</w:t>
+        <w:t xml:space="preserve">3 Give each question’s answer its own paragraph</w:t>
       </w:r>
     </w:p>
     <w:p>
       <w:pPr>
         <w:pStyle w:val="FirstParagraph"/>
       </w:pPr>
-      <w:hyperlink r:id="rId19">
+      <w:r>
+        <w:t xml:space="preserve">When a prompt asks several questions, answer each one in its own paragraph, or in several paragraphs if it needs them</w:t>
+      </w:r>
+      <w:r>
+        <w:t xml:space="preserve"> </w:t>
+      </w:r>
+      <w:r>
+        <w:t xml:space="preserve">(Ezra, 2026-10-28).</w:t>
+      </w:r>
+      <w:r>
+        <w:t xml:space="preserve"> </w:t>
+      </w:r>
+      <w:r>
+        <w:t xml:space="preserve">A solution to</w:t>
+      </w:r>
+      <w:r>
+        <w:t xml:space="preserve"> </w:t>
+      </w:r>
+      <w:r>
+        <w:t xml:space="preserve">“Which model underfits, which overfits most, and which would you choose?”</w:t>
+      </w:r>
+      <w:r>
+        <w:t xml:space="preserve"> </w:t>
+      </w:r>
+      <w:r>
+        <w:t xml:space="preserve">has one paragraph for the underfitting model, one for the overfitting model and one for the choice.</w:t>
+      </w:r>
+      <w:r>
+        <w:t xml:space="preserve"> </w:t>
+      </w:r>
+      <w:r>
+        <w:t xml:space="preserve">A reader looking for one answer then finds it without reading the others.</w:t>
+      </w:r>
+      <w:r>
+        <w:t xml:space="preserve"> </w:t>
+      </w:r>
+      <w:r>
+        <w:t xml:space="preserve">No automated check enforces this rule, because a script cannot tell how many questions a prompt asks.</w:t>
+      </w:r>
+    </w:p>
+    <w:bookmarkEnd w:id="19"/>
+    <w:bookmarkStart w:id="22" w:name="give-each-defined-term-its-own-div"/>
+    <w:p>
+      <w:pPr>
+        <w:pStyle w:val="Heading2"/>
+      </w:pPr>
+      <w:r>
+        <w:t xml:space="preserve">4 Give each defined term its own div</w:t>
+      </w:r>
+    </w:p>
+    <w:p>
+      <w:pPr>
+        <w:pStyle w:val="FirstParagraph"/>
+      </w:pPr>
+      <w:hyperlink r:id="rId20">
         <w:r>
           <w:rPr>
             <w:rStyle w:val="Hyperlink"/>
@@ -1310,7 +1364,7 @@
       <w:r>
         <w:t xml:space="preserve"> </w:t>
       </w:r>
-      <w:hyperlink r:id="rId20">
+      <w:hyperlink r:id="rId21">
         <w:r>
           <w:rPr>
             <w:rStyle w:val="Hyperlink"/>
@@ -1477,14 +1531,14 @@
         <w:t xml:space="preserve">and also the points where the derivative does not exist.</w:t>
       </w:r>
     </w:p>
-    <w:bookmarkEnd w:id="21"/>
-    <w:bookmarkStart w:id="22" w:name="state-the-notation-and-its-alternatives"/>
+    <w:bookmarkEnd w:id="22"/>
+    <w:bookmarkStart w:id="23" w:name="state-the-notation-and-its-alternatives"/>
     <w:p>
       <w:pPr>
         <w:pStyle w:val="Heading2"/>
       </w:pPr>
       <w:r>
-        <w:t xml:space="preserve">4 State the notation and its alternatives</w:t>
+        <w:t xml:space="preserve">5 State the notation and its alternatives</w:t>
       </w:r>
     </w:p>
     <w:p>
@@ -1576,14 +1630,14 @@
         <w:t xml:space="preserve">to make the choice explicit.</w:t>
       </w:r>
     </w:p>
-    <w:bookmarkEnd w:id="22"/>
-    <w:bookmarkStart w:id="24" w:name="Xac7e4ead54b12ccf6544491699a177b7d16fa22"/>
+    <w:bookmarkEnd w:id="23"/>
+    <w:bookmarkStart w:id="25" w:name="Xac7e4ead54b12ccf6544491699a177b7d16fa22"/>
     <w:p>
       <w:pPr>
         <w:pStyle w:val="Heading2"/>
       </w:pPr>
       <w:r>
-        <w:t xml:space="preserve">5 Lead with the simplest correct form of a definition</w:t>
+        <w:t xml:space="preserve">6 Lead with the simplest correct form of a definition</w:t>
       </w:r>
     </w:p>
     <w:p>
@@ -1608,7 +1662,7 @@
       <w:r>
         <w:t xml:space="preserve"> </w:t>
       </w:r>
-      <w:hyperlink r:id="rId23">
+      <w:hyperlink r:id="rId24">
         <w:r>
           <w:rPr>
             <w:rStyle w:val="Hyperlink"/>
@@ -1854,14 +1908,14 @@
         <w:t xml:space="preserve">The conventional form still appears in the notes, as a named result.</w:t>
       </w:r>
     </w:p>
-    <w:bookmarkEnd w:id="24"/>
-    <w:bookmarkStart w:id="25" w:name="reuse-one-written-version-of-each-result"/>
+    <w:bookmarkEnd w:id="25"/>
+    <w:bookmarkStart w:id="26" w:name="reuse-one-written-version-of-each-result"/>
     <w:p>
       <w:pPr>
         <w:pStyle w:val="Heading2"/>
       </w:pPr>
       <w:r>
-        <w:t xml:space="preserve">6 Reuse one written version of each result</w:t>
+        <w:t xml:space="preserve">7 Reuse one written version of each result</w:t>
       </w:r>
     </w:p>
     <w:p>
@@ -1896,14 +1950,14 @@
         <w:t xml:space="preserve">instead of keeping a second wording that can drift.</w:t>
       </w:r>
     </w:p>
-    <w:bookmarkEnd w:id="25"/>
-    <w:bookmarkStart w:id="27" w:name="use-real-data-and-compute-every-number"/>
+    <w:bookmarkEnd w:id="26"/>
+    <w:bookmarkStart w:id="28" w:name="use-real-data-and-compute-every-number"/>
     <w:p>
       <w:pPr>
         <w:pStyle w:val="Heading2"/>
       </w:pPr>
       <w:r>
-        <w:t xml:space="preserve">7 Use real data and compute every number</w:t>
+        <w:t xml:space="preserve">8 Use real data and compute every number</w:t>
       </w:r>
     </w:p>
     <w:p>
@@ -2026,7 +2080,7 @@
         <w:t xml:space="preserve">A number typed into prose goes stale when the data or the code changes.</w:t>
       </w:r>
     </w:p>
-    <w:bookmarkStart w:id="26" w:name="exm-show-data-first"/>
+    <w:bookmarkStart w:id="27" w:name="exm-show-data-first"/>
     <w:p>
       <w:pPr>
         <w:pStyle w:val="FirstParagraph"/>
@@ -2099,15 +2153,15 @@
         <w:t xml:space="preserve">The ✅ version lets every later slide refer to something the reader has already seen.</w:t>
       </w:r>
     </w:p>
-    <w:bookmarkEnd w:id="26"/>
     <w:bookmarkEnd w:id="27"/>
-    <w:bookmarkStart w:id="28" w:name="Xa214254a94aa6db868b5b9577007bf4e27699b1"/>
+    <w:bookmarkEnd w:id="28"/>
+    <w:bookmarkStart w:id="29" w:name="Xa214254a94aa6db868b5b9577007bf4e27699b1"/>
     <w:p>
       <w:pPr>
         <w:pStyle w:val="Heading2"/>
       </w:pPr>
       <w:r>
-        <w:t xml:space="preserve">8 Store structured data in structured formats</w:t>
+        <w:t xml:space="preserve">9 Store structured data in structured formats</w:t>
       </w:r>
     </w:p>
     <w:p>
@@ -2240,14 +2294,14 @@
         <w:t xml:space="preserve">A short list that no other page reads can stay as prose.</w:t>
       </w:r>
     </w:p>
-    <w:bookmarkEnd w:id="28"/>
-    <w:bookmarkStart w:id="34" w:name="show-each-idea-applied-and-in-a-figure"/>
+    <w:bookmarkEnd w:id="29"/>
+    <w:bookmarkStart w:id="35" w:name="show-each-idea-applied-and-in-a-figure"/>
     <w:p>
       <w:pPr>
         <w:pStyle w:val="Heading2"/>
       </w:pPr>
       <w:r>
-        <w:t xml:space="preserve">9 Show each idea applied and in a figure</w:t>
+        <w:t xml:space="preserve">10 Show each idea applied and in a figure</w:t>
       </w:r>
     </w:p>
     <w:p>
@@ -2384,7 +2438,7 @@
       <w:r>
         <w:t xml:space="preserve"> </w:t>
       </w:r>
-      <w:hyperlink r:id="rId29">
+      <w:hyperlink r:id="rId30">
         <w:r>
           <w:rPr>
             <w:rStyle w:val="Hyperlink"/>
@@ -2530,7 +2584,7 @@
       <w:r>
         <w:t xml:space="preserve"> </w:t>
       </w:r>
-      <w:hyperlink r:id="rId30">
+      <w:hyperlink r:id="rId31">
         <w:r>
           <w:rPr>
             <w:rStyle w:val="VerbatimChar"/>
@@ -2565,7 +2619,7 @@
       <w:r>
         <w:t xml:space="preserve">(</w:t>
       </w:r>
-      <w:hyperlink r:id="rId31">
+      <w:hyperlink r:id="rId32">
         <w:r>
           <w:rPr>
             <w:rStyle w:val="Hyperlink"/>
@@ -2775,7 +2829,7 @@
       <w:r>
         <w:t xml:space="preserve"> </w:t>
       </w:r>
-      <w:hyperlink r:id="rId30">
+      <w:hyperlink r:id="rId31">
         <w:r>
           <w:rPr>
             <w:rStyle w:val="VerbatimChar"/>
@@ -2822,7 +2876,7 @@
       <w:r>
         <w:t xml:space="preserve">(</w:t>
       </w:r>
-      <w:hyperlink r:id="rId32">
+      <w:hyperlink r:id="rId33">
         <w:r>
           <w:rPr>
             <w:rStyle w:val="Hyperlink"/>
@@ -2920,7 +2974,7 @@
       <w:r>
         <w:t xml:space="preserve"> </w:t>
       </w:r>
-      <w:hyperlink r:id="rId33">
+      <w:hyperlink r:id="rId34">
         <w:r>
           <w:rPr>
             <w:rStyle w:val="Hyperlink"/>
@@ -2947,14 +3001,14 @@
         <w:t xml:space="preserve">Make each figure follow the accessibility rules below.</w:t>
       </w:r>
     </w:p>
-    <w:bookmarkEnd w:id="34"/>
-    <w:bookmarkStart w:id="36" w:name="X7f95f8ec3b796fc99108c37bb45d62741b824c4"/>
+    <w:bookmarkEnd w:id="35"/>
+    <w:bookmarkStart w:id="37" w:name="X7f95f8ec3b796fc99108c37bb45d62741b824c4"/>
     <w:p>
       <w:pPr>
         <w:pStyle w:val="Heading2"/>
       </w:pPr>
       <w:r>
-        <w:t xml:space="preserve">10 Follow every example with an exercise and solution</w:t>
+        <w:t xml:space="preserve">11 Follow every example with an exercise and solution</w:t>
       </w:r>
     </w:p>
     <w:p>
@@ -3141,7 +3195,7 @@
       <w:r>
         <w:t xml:space="preserve"> </w:t>
       </w:r>
-      <w:hyperlink r:id="rId19">
+      <w:hyperlink r:id="rId20">
         <w:r>
           <w:rPr>
             <w:rStyle w:val="Hyperlink"/>
@@ -3186,7 +3240,7 @@
         <w:t xml:space="preserve">Give the practice exercise its own slug and follow the numbering and slide-break rules above.</w:t>
       </w:r>
     </w:p>
-    <w:bookmarkStart w:id="35" w:name="exm-practice-after-example"/>
+    <w:bookmarkStart w:id="36" w:name="exm-practice-after-example"/>
     <w:p>
       <w:pPr>
         <w:pStyle w:val="FirstParagraph"/>
@@ -3342,15 +3396,15 @@
         <w:t xml:space="preserve">).</w:t>
       </w:r>
     </w:p>
-    <w:bookmarkEnd w:id="35"/>
     <w:bookmarkEnd w:id="36"/>
-    <w:bookmarkStart w:id="40" w:name="Xf27331f4c36c8d578e5fa29a37312484cc3343a"/>
+    <w:bookmarkEnd w:id="37"/>
+    <w:bookmarkStart w:id="41" w:name="Xf27331f4c36c8d578e5fa29a37312484cc3343a"/>
     <w:p>
       <w:pPr>
         <w:pStyle w:val="Heading2"/>
       </w:pPr>
       <w:r>
-        <w:t xml:space="preserve">11 Write labs for both languages and any computer</w:t>
+        <w:t xml:space="preserve">12 Write labs for both languages and any computer</w:t>
       </w:r>
     </w:p>
     <w:p>
@@ -3462,7 +3516,7 @@
       <w:r>
         <w:t xml:space="preserve"> </w:t>
       </w:r>
-      <w:hyperlink r:id="rId37">
+      <w:hyperlink r:id="rId38">
         <w:r>
           <w:rPr>
             <w:rStyle w:val="Hyperlink"/>
@@ -3488,7 +3542,7 @@
       <w:r>
         <w:t xml:space="preserve"> </w:t>
       </w:r>
-      <w:hyperlink r:id="rId38">
+      <w:hyperlink r:id="rId39">
         <w:r>
           <w:rPr>
             <w:rStyle w:val="Hyperlink"/>
@@ -3556,7 +3610,7 @@
       <w:r>
         <w:t xml:space="preserve"> </w:t>
       </w:r>
-      <w:hyperlink r:id="rId39">
+      <w:hyperlink r:id="rId40">
         <w:r>
           <w:rPr>
             <w:rStyle w:val="Hyperlink"/>
@@ -3727,14 +3781,14 @@
         <w:t xml:space="preserve">so setup steps must work on a shared or hosted machine.</w:t>
       </w:r>
     </w:p>
-    <w:bookmarkEnd w:id="40"/>
-    <w:bookmarkStart w:id="41" w:name="Xf53ecb3398b87b82ffd1a126dd02e87a65bb694"/>
+    <w:bookmarkEnd w:id="41"/>
+    <w:bookmarkStart w:id="42" w:name="Xf53ecb3398b87b82ffd1a126dd02e87a65bb694"/>
     <w:p>
       <w:pPr>
         <w:pStyle w:val="Heading2"/>
       </w:pPr>
       <w:r>
-        <w:t xml:space="preserve">12 Keep each step’s code in one chunk, and put parallel chunks in a language tabset</w:t>
+        <w:t xml:space="preserve">13 Keep each step’s code in one chunk, and put parallel chunks in a language tabset</w:t>
       </w:r>
     </w:p>
     <w:p>
@@ -3996,14 +4050,14 @@
         <w:t xml:space="preserve">End each such call with a semicolon, or assign its value.</w:t>
       </w:r>
     </w:p>
-    <w:bookmarkEnd w:id="41"/>
-    <w:bookmarkStart w:id="50" w:name="present-r-results-with-modern-packages"/>
+    <w:bookmarkEnd w:id="42"/>
+    <w:bookmarkStart w:id="51" w:name="present-r-results-with-modern-packages"/>
     <w:p>
       <w:pPr>
         <w:pStyle w:val="Heading2"/>
       </w:pPr>
       <w:r>
-        <w:t xml:space="preserve">13 Present R results with modern packages</w:t>
+        <w:t xml:space="preserve">14 Present R results with modern packages</w:t>
       </w:r>
     </w:p>
     <w:p>
@@ -4082,7 +4136,7 @@
       <w:r>
         <w:t xml:space="preserve"> </w:t>
       </w:r>
-      <w:hyperlink r:id="rId42">
+      <w:hyperlink r:id="rId43">
         <w:r>
           <w:rPr>
             <w:rStyle w:val="Hyperlink"/>
@@ -4114,7 +4168,7 @@
       <w:r>
         <w:t xml:space="preserve"> </w:t>
       </w:r>
-      <w:hyperlink r:id="rId43">
+      <w:hyperlink r:id="rId44">
         <w:r>
           <w:rPr>
             <w:rStyle w:val="Hyperlink"/>
@@ -4188,7 +4242,7 @@
       <w:r>
         <w:t xml:space="preserve"> </w:t>
       </w:r>
-      <w:hyperlink r:id="rId44">
+      <w:hyperlink r:id="rId45">
         <w:r>
           <w:rPr>
             <w:rStyle w:val="Hyperlink"/>
@@ -4259,7 +4313,7 @@
       <w:r>
         <w:t xml:space="preserve"> </w:t>
       </w:r>
-      <w:hyperlink r:id="rId45">
+      <w:hyperlink r:id="rId46">
         <w:r>
           <w:rPr>
             <w:rStyle w:val="Hyperlink"/>
@@ -4276,7 +4330,7 @@
       <w:r>
         <w:t xml:space="preserve"> </w:t>
       </w:r>
-      <w:hyperlink r:id="rId46">
+      <w:hyperlink r:id="rId47">
         <w:r>
           <w:rPr>
             <w:rStyle w:val="Hyperlink"/>
@@ -4299,7 +4353,7 @@
       <w:r>
         <w:t xml:space="preserve"> </w:t>
       </w:r>
-      <w:hyperlink r:id="rId47">
+      <w:hyperlink r:id="rId48">
         <w:r>
           <w:rPr>
             <w:rStyle w:val="Hyperlink"/>
@@ -4355,7 +4409,7 @@
       <w:r>
         <w:t xml:space="preserve"> </w:t>
       </w:r>
-      <w:hyperlink r:id="rId48">
+      <w:hyperlink r:id="rId49">
         <w:r>
           <w:rPr>
             <w:rStyle w:val="Hyperlink"/>
@@ -4393,7 +4447,7 @@
       <w:r>
         <w:t xml:space="preserve"> </w:t>
       </w:r>
-      <w:hyperlink r:id="rId49">
+      <w:hyperlink r:id="rId50">
         <w:r>
           <w:rPr>
             <w:rStyle w:val="Hyperlink"/>
@@ -4408,14 +4462,14 @@
         <w:t xml:space="preserve">notes show the style.</w:t>
       </w:r>
     </w:p>
-    <w:bookmarkEnd w:id="50"/>
-    <w:bookmarkStart w:id="54" w:name="manipulate-data-with-dplyr-not-base-r"/>
+    <w:bookmarkEnd w:id="51"/>
+    <w:bookmarkStart w:id="55" w:name="manipulate-data-with-dplyr-not-base-r"/>
     <w:p>
       <w:pPr>
         <w:pStyle w:val="Heading2"/>
       </w:pPr>
       <w:r>
-        <w:t xml:space="preserve">14 Manipulate data with dplyr, not base R</w:t>
+        <w:t xml:space="preserve">15 Manipulate data with dplyr, not base R</w:t>
       </w:r>
     </w:p>
     <w:p>
@@ -4446,7 +4500,7 @@
       <w:r>
         <w:t xml:space="preserve"> </w:t>
       </w:r>
-      <w:hyperlink r:id="rId51">
+      <w:hyperlink r:id="rId52">
         <w:r>
           <w:rPr>
             <w:rStyle w:val="Hyperlink"/>
@@ -4604,7 +4658,7 @@
       <w:r>
         <w:t xml:space="preserve"> </w:t>
       </w:r>
-      <w:hyperlink r:id="rId52">
+      <w:hyperlink r:id="rId53">
         <w:r>
           <w:rPr>
             <w:rStyle w:val="Hyperlink"/>
@@ -4696,7 +4750,7 @@
       <w:r>
         <w:t xml:space="preserve"> </w:t>
       </w:r>
-      <w:hyperlink r:id="rId53">
+      <w:hyperlink r:id="rId54">
         <w:r>
           <w:rPr>
             <w:rStyle w:val="Hyperlink"/>
@@ -4888,14 +4942,14 @@
         <w:t xml:space="preserve">The rule is about selecting, filtering and building data frames.</w:t>
       </w:r>
     </w:p>
-    <w:bookmarkEnd w:id="54"/>
-    <w:bookmarkStart w:id="56" w:name="X2bc6121e3a2f39a37d8a6591d77df16bd22bd0b"/>
+    <w:bookmarkEnd w:id="55"/>
+    <w:bookmarkStart w:id="57" w:name="X2bc6121e3a2f39a37d8a6591d77df16bd22bd0b"/>
     <w:p>
       <w:pPr>
         <w:pStyle w:val="Heading2"/>
       </w:pPr>
       <w:r>
-        <w:t xml:space="preserve">15 Include code from files instead of copying it</w:t>
+        <w:t xml:space="preserve">16 Include code from files instead of copying it</w:t>
       </w:r>
     </w:p>
     <w:p>
@@ -4982,7 +5036,7 @@
       <w:r>
         <w:t xml:space="preserve"> </w:t>
       </w:r>
-      <w:hyperlink r:id="rId55">
+      <w:hyperlink r:id="rId56">
         <w:r>
           <w:rPr>
             <w:rStyle w:val="Hyperlink"/>
@@ -5159,14 +5213,14 @@
         <w:t xml:space="preserve">directory it creates.</w:t>
       </w:r>
     </w:p>
-    <w:bookmarkEnd w:id="56"/>
-    <w:bookmarkStart w:id="57" w:name="X7c0de8eaf50a5b2644eabf66f1f9b734b8a4a71"/>
+    <w:bookmarkEnd w:id="57"/>
+    <w:bookmarkStart w:id="58" w:name="X7c0de8eaf50a5b2644eabf66f1f9b734b8a4a71"/>
     <w:p>
       <w:pPr>
         <w:pStyle w:val="Heading2"/>
       </w:pPr>
       <w:r>
-        <w:t xml:space="preserve">16 Comment every code chunk to say what and why</w:t>
+        <w:t xml:space="preserve">17 Comment every code chunk to say what and why</w:t>
       </w:r>
     </w:p>
     <w:p>
@@ -5335,14 +5389,14 @@
         <w:t xml:space="preserve">such as a transformation, a modeling choice, a tuning value or a random seed.</w:t>
       </w:r>
     </w:p>
-    <w:bookmarkEnd w:id="57"/>
-    <w:bookmarkStart w:id="58" w:name="X94063c6448bea82c8f1e8d367c642bbe2eda89b"/>
+    <w:bookmarkEnd w:id="58"/>
+    <w:bookmarkStart w:id="59" w:name="X94063c6448bea82c8f1e8d367c642bbe2eda89b"/>
     <w:p>
       <w:pPr>
         <w:pStyle w:val="Heading2"/>
       </w:pPr>
       <w:r>
-        <w:t xml:space="preserve">17 Set</w:t>
+        <w:t xml:space="preserve">18 Set</w:t>
       </w:r>
       <w:r>
         <w:t xml:space="preserve"> </w:t>
@@ -5576,14 +5630,14 @@
         <w:t xml:space="preserve">.</w:t>
       </w:r>
     </w:p>
-    <w:bookmarkEnd w:id="58"/>
-    <w:bookmarkStart w:id="59" w:name="Xffa5a3357c8672d830c88e1e58a0ef107550647"/>
+    <w:bookmarkEnd w:id="59"/>
+    <w:bookmarkStart w:id="60" w:name="Xffa5a3357c8672d830c88e1e58a0ef107550647"/>
     <w:p>
       <w:pPr>
         <w:pStyle w:val="Heading2"/>
       </w:pPr>
       <w:r>
-        <w:t xml:space="preserve">18 Introduce every function in a programming primer</w:t>
+        <w:t xml:space="preserve">19 Introduce every function in a programming primer</w:t>
       </w:r>
     </w:p>
     <w:p>
@@ -5702,14 +5756,14 @@
         <w:t xml:space="preserve">A chapter introduces those where it defines them.</w:t>
       </w:r>
     </w:p>
-    <w:bookmarkEnd w:id="59"/>
-    <w:bookmarkStart w:id="60" w:name="make-figures-accessible"/>
+    <w:bookmarkEnd w:id="60"/>
+    <w:bookmarkStart w:id="61" w:name="make-figures-accessible"/>
     <w:p>
       <w:pPr>
         <w:pStyle w:val="Heading2"/>
       </w:pPr>
       <w:r>
-        <w:t xml:space="preserve">19 Make figures accessible</w:t>
+        <w:t xml:space="preserve">20 Make figures accessible</w:t>
       </w:r>
     </w:p>
     <w:p>
@@ -5838,14 +5892,14 @@
         <w:t xml:space="preserve">(observed when rendering lecture notes to PDF).</w:t>
       </w:r>
     </w:p>
-    <w:bookmarkEnd w:id="60"/>
-    <w:bookmarkStart w:id="62" w:name="structure-slides-for-the-reader"/>
+    <w:bookmarkEnd w:id="61"/>
+    <w:bookmarkStart w:id="63" w:name="structure-slides-for-the-reader"/>
     <w:p>
       <w:pPr>
         <w:pStyle w:val="Heading2"/>
       </w:pPr>
       <w:r>
-        <w:t xml:space="preserve">20 Structure slides for the reader</w:t>
+        <w:t xml:space="preserve">21 Structure slides for the reader</w:t>
       </w:r>
     </w:p>
     <w:p>
@@ -5898,7 +5952,7 @@
       <w:r>
         <w:t xml:space="preserve"> </w:t>
       </w:r>
-      <w:hyperlink r:id="rId61">
+      <w:hyperlink r:id="rId62">
         <w:r>
           <w:rPr>
             <w:rStyle w:val="Hyperlink"/>
@@ -6138,14 +6192,14 @@
         <w:t xml:space="preserve">Put a slide break after the heading and move the text onto content slides.</w:t>
       </w:r>
     </w:p>
-    <w:bookmarkEnd w:id="62"/>
-    <w:bookmarkStart w:id="64" w:name="X5f21f12cbfc4e3df5e838110af4e52db506fec1"/>
+    <w:bookmarkEnd w:id="63"/>
+    <w:bookmarkStart w:id="65" w:name="X5f21f12cbfc4e3df5e838110af4e52db506fec1"/>
     <w:p>
       <w:pPr>
         <w:pStyle w:val="Heading2"/>
       </w:pPr>
       <w:r>
-        <w:t xml:space="preserve">21 Give each concept in a note sheet its own row</w:t>
+        <w:t xml:space="preserve">22 Give each concept in a note sheet its own row</w:t>
       </w:r>
     </w:p>
     <w:p>
@@ -6282,7 +6336,7 @@
         <w:t xml:space="preserve">The same rule applies to every other reference table, such as a table of notation.</w:t>
       </w:r>
     </w:p>
-    <w:bookmarkStart w:id="63" w:name="exm-note-sheet-rows"/>
+    <w:bookmarkStart w:id="64" w:name="exm-note-sheet-rows"/>
     <w:p>
       <w:pPr>
         <w:pStyle w:val="BodyText"/>
@@ -6373,15 +6427,15 @@
         <w:t xml:space="preserve">The ✅ rows let the reader find one formula by one label.</w:t>
       </w:r>
     </w:p>
-    <w:bookmarkEnd w:id="63"/>
     <w:bookmarkEnd w:id="64"/>
-    <w:bookmarkStart w:id="65" w:name="talk-about-the-ideas-not-the-notes"/>
+    <w:bookmarkEnd w:id="65"/>
+    <w:bookmarkStart w:id="66" w:name="talk-about-the-ideas-not-the-notes"/>
     <w:p>
       <w:pPr>
         <w:pStyle w:val="Heading2"/>
       </w:pPr>
       <w:r>
-        <w:t xml:space="preserve">22 Talk about the ideas, not the notes</w:t>
+        <w:t xml:space="preserve">23 Talk about the ideas, not the notes</w:t>
       </w:r>
     </w:p>
     <w:p>
@@ -6564,14 +6618,14 @@
         <w:t xml:space="preserve">and it goes stale when the definition moves.</w:t>
       </w:r>
     </w:p>
-    <w:bookmarkEnd w:id="65"/>
-    <w:bookmarkStart w:id="67" w:name="write-grading-rubrics-as-checklists"/>
+    <w:bookmarkEnd w:id="66"/>
+    <w:bookmarkStart w:id="68" w:name="write-grading-rubrics-as-checklists"/>
     <w:p>
       <w:pPr>
         <w:pStyle w:val="Heading2"/>
       </w:pPr>
       <w:r>
-        <w:t xml:space="preserve">23 Write grading rubrics as checklists</w:t>
+        <w:t xml:space="preserve">24 Write grading rubrics as checklists</w:t>
       </w:r>
     </w:p>
     <w:p>
@@ -6741,7 +6795,7 @@
         <w:t xml:space="preserve">such as a single holistic judgment of a proof’s rigor.</w:t>
       </w:r>
     </w:p>
-    <w:bookmarkStart w:id="66" w:name="exm-rubric-checklist"/>
+    <w:bookmarkStart w:id="67" w:name="exm-rubric-checklist"/>
     <w:p>
       <w:pPr>
         <w:pStyle w:val="FirstParagraph"/>
@@ -6994,15 +7048,15 @@
         <w:t xml:space="preserve">and lets a script check that the points sum to the total.</w:t>
       </w:r>
     </w:p>
-    <w:bookmarkEnd w:id="66"/>
     <w:bookmarkEnd w:id="67"/>
-    <w:bookmarkStart w:id="71" w:name="Xcb579568ef754486ebde8b41ba4528bdf380eec"/>
+    <w:bookmarkEnd w:id="68"/>
+    <w:bookmarkStart w:id="72" w:name="Xcb579568ef754486ebde8b41ba4528bdf380eec"/>
     <w:p>
       <w:pPr>
         <w:pStyle w:val="Heading2"/>
       </w:pPr>
       <w:r>
-        <w:t xml:space="preserve">24 Credit other courses without summarizing them</w:t>
+        <w:t xml:space="preserve">25 Credit other courses without summarizing them</w:t>
       </w:r>
     </w:p>
     <w:p>
@@ -7055,7 +7109,7 @@
       <w:r>
         <w:t xml:space="preserve"> </w:t>
       </w:r>
-      <w:hyperlink r:id="rId68">
+      <w:hyperlink r:id="rId69">
         <w:r>
           <w:rPr>
             <w:rStyle w:val="Hyperlink"/>
@@ -7111,7 +7165,7 @@
       <w:r>
         <w:t xml:space="preserve"> </w:t>
       </w:r>
-      <w:hyperlink r:id="rId69">
+      <w:hyperlink r:id="rId70">
         <w:r>
           <w:rPr>
             <w:rStyle w:val="Hyperlink"/>
@@ -7140,7 +7194,7 @@
       <w:r>
         <w:t xml:space="preserve"> </w:t>
       </w:r>
-      <w:hyperlink r:id="rId70">
+      <w:hyperlink r:id="rId71">
         <w:r>
           <w:rPr>
             <w:rStyle w:val="Hyperlink"/>
@@ -7173,14 +7227,14 @@
         <w:t xml:space="preserve">because a bare citation key renders as the author list.</w:t>
       </w:r>
     </w:p>
-    <w:bookmarkEnd w:id="71"/>
-    <w:bookmarkStart w:id="80" w:name="rules-that-apply-to-all-writing"/>
+    <w:bookmarkEnd w:id="72"/>
+    <w:bookmarkStart w:id="81" w:name="rules-that-apply-to-all-writing"/>
     <w:p>
       <w:pPr>
         <w:pStyle w:val="Heading2"/>
       </w:pPr>
       <w:r>
-        <w:t xml:space="preserve">25 Rules that apply to all writing</w:t>
+        <w:t xml:space="preserve">26 Rules that apply to all writing</w:t>
       </w:r>
     </w:p>
     <w:p>
@@ -7199,7 +7253,7 @@
           <w:numId w:val="1023"/>
         </w:numPr>
       </w:pPr>
-      <w:hyperlink r:id="rId72">
+      <w:hyperlink r:id="rId73">
         <w:r>
           <w:rPr>
             <w:rStyle w:val="Hyperlink"/>
@@ -7219,7 +7273,7 @@
           <w:numId w:val="1023"/>
         </w:numPr>
       </w:pPr>
-      <w:hyperlink r:id="rId73">
+      <w:hyperlink r:id="rId74">
         <w:r>
           <w:rPr>
             <w:rStyle w:val="Hyperlink"/>
@@ -7242,7 +7296,7 @@
           <w:numId w:val="1023"/>
         </w:numPr>
       </w:pPr>
-      <w:hyperlink r:id="rId74">
+      <w:hyperlink r:id="rId75">
         <w:r>
           <w:rPr>
             <w:rStyle w:val="Hyperlink"/>
@@ -7262,7 +7316,7 @@
           <w:numId w:val="1023"/>
         </w:numPr>
       </w:pPr>
-      <w:hyperlink r:id="rId75">
+      <w:hyperlink r:id="rId76">
         <w:r>
           <w:rPr>
             <w:rStyle w:val="Hyperlink"/>
@@ -7285,7 +7339,7 @@
           <w:numId w:val="1023"/>
         </w:numPr>
       </w:pPr>
-      <w:hyperlink r:id="rId76">
+      <w:hyperlink r:id="rId77">
         <w:r>
           <w:rPr>
             <w:rStyle w:val="Hyperlink"/>
@@ -7297,8 +7351,8 @@
         <w:t xml:space="preserve">.</w:t>
       </w:r>
     </w:p>
-    <w:bookmarkStart w:id="79" w:name="refs"/>
-    <w:bookmarkStart w:id="78" w:name="ref-freeman2014active"/>
+    <w:bookmarkStart w:id="80" w:name="refs"/>
+    <w:bookmarkStart w:id="79" w:name="ref-freeman2014active"/>
     <w:p>
       <w:pPr>
         <w:pStyle w:val="Bibliography"/>
@@ -7331,7 +7385,7 @@
       <w:r>
         <w:t xml:space="preserve"> </w:t>
       </w:r>
-      <w:hyperlink r:id="rId77">
+      <w:hyperlink r:id="rId78">
         <w:r>
           <w:rPr>
             <w:rStyle w:val="Hyperlink"/>
@@ -7343,9 +7397,9 @@
         <w:t xml:space="preserve">.</w:t>
       </w:r>
     </w:p>
-    <w:bookmarkEnd w:id="78"/>
     <w:bookmarkEnd w:id="79"/>
     <w:bookmarkEnd w:id="80"/>
+    <w:bookmarkEnd w:id="81"/>
     <w:sectPr>
       <w:footnotePr>
         <w:numRestart w:val="eachSect"/>

</xml_diff>

<commit_message>
Deploying to gh-pages from @ Morrison-Lab/psw@49f0f62b565ca803a7a7cf055f97bc5a428f9eb1 🚀
</commit_message>
<xml_diff>
--- a/chapters/teaching.docx
+++ b/chapters/teaching.docx
@@ -15,7 +15,7 @@
         <w:pStyle w:val="Date"/>
       </w:pPr>
       <w:r>
-        <w:t xml:space="preserve">Last modified: 2026-10-28 14:23:41 (PDT)</w:t>
+        <w:t xml:space="preserve">Last modified: 2026-10-28 14:35:19 (PDT)</w:t>
       </w:r>
     </w:p>
     <w:tbl>
@@ -1046,13 +1046,13 @@
     </w:p>
     <w:bookmarkEnd w:id="17"/>
     <w:bookmarkEnd w:id="18"/>
-    <w:bookmarkStart w:id="19" w:name="Xcb2ea076bd2bdcde187ea355befd37150b69b89"/>
+    <w:bookmarkStart w:id="20" w:name="say-what-a-yes-or-no-answer-means"/>
     <w:p>
       <w:pPr>
         <w:pStyle w:val="Heading2"/>
       </w:pPr>
       <w:r>
-        <w:t xml:space="preserve">3 Give each question’s answer its own paragraph</w:t>
+        <w:t xml:space="preserve">3 Say what a yes-or-no answer means</w:t>
       </w:r>
     </w:p>
     <w:p>
@@ -1060,6 +1060,192 @@
         <w:pStyle w:val="FirstParagraph"/>
       </w:pPr>
       <w:r>
+        <w:t xml:space="preserve">Follow a</w:t>
+      </w:r>
+      <w:r>
+        <w:t xml:space="preserve"> </w:t>
+      </w:r>
+      <w:r>
+        <w:t xml:space="preserve">“Yes”</w:t>
+      </w:r>
+      <w:r>
+        <w:t xml:space="preserve"> </w:t>
+      </w:r>
+      <w:r>
+        <w:t xml:space="preserve">or</w:t>
+      </w:r>
+      <w:r>
+        <w:t xml:space="preserve"> </w:t>
+      </w:r>
+      <w:r>
+        <w:t xml:space="preserve">“No”</w:t>
+      </w:r>
+      <w:r>
+        <w:t xml:space="preserve"> </w:t>
+      </w:r>
+      <w:r>
+        <w:t xml:space="preserve">with what the answer means in the words of the question,</w:t>
+      </w:r>
+      <w:r>
+        <w:t xml:space="preserve"> </w:t>
+      </w:r>
+      <w:r>
+        <w:t xml:space="preserve">as in</w:t>
+      </w:r>
+      <w:r>
+        <w:t xml:space="preserve"> </w:t>
+      </w:r>
+      <w:r>
+        <w:t xml:space="preserve">“No: it’s not possible that the advanced network has a test error of 0.25,”</w:t>
+      </w:r>
+      <w:r>
+        <w:t xml:space="preserve"> </w:t>
+      </w:r>
+      <w:r>
+        <w:t xml:space="preserve">not a bare</w:t>
+      </w:r>
+      <w:r>
+        <w:t xml:space="preserve"> </w:t>
+      </w:r>
+      <w:r>
+        <w:t xml:space="preserve">“No.”</w:t>
+      </w:r>
+      <w:r>
+        <w:t xml:space="preserve"> </w:t>
+      </w:r>
+      <w:r>
+        <w:t xml:space="preserve">(Ezra, 2026-10-28).</w:t>
+      </w:r>
+      <w:r>
+        <w:t xml:space="preserve"> </w:t>
+      </w:r>
+      <w:r>
+        <w:t xml:space="preserve">A reader who sees only the first line then still knows what the answer claims,</w:t>
+      </w:r>
+      <w:r>
+        <w:t xml:space="preserve"> </w:t>
+      </w:r>
+      <w:r>
+        <w:t xml:space="preserve">and a bare</w:t>
+      </w:r>
+      <w:r>
+        <w:t xml:space="preserve"> </w:t>
+      </w:r>
+      <w:r>
+        <w:t xml:space="preserve">“No.”</w:t>
+      </w:r>
+      <w:r>
+        <w:t xml:space="preserve"> </w:t>
+      </w:r>
+      <w:r>
+        <w:t xml:space="preserve">leaves open what is being denied.</w:t>
+      </w:r>
+      <w:r>
+        <w:t xml:space="preserve"> </w:t>
+      </w:r>
+      <w:r>
+        <w:t xml:space="preserve">The rule covers solutions, worked examples and any other answer to a question.</w:t>
+      </w:r>
+    </w:p>
+    <w:bookmarkStart w:id="19" w:name="exm-yes-no-conclusion"/>
+    <w:p>
+      <w:pPr>
+        <w:pStyle w:val="BodyText"/>
+      </w:pPr>
+      <w:r>
+        <w:rPr>
+          <w:b/>
+          <w:bCs/>
+        </w:rPr>
+        <w:t xml:space="preserve">Example 3 (Saying what a</w:t>
+      </w:r>
+      <w:r>
+        <w:rPr>
+          <w:b/>
+          <w:bCs/>
+        </w:rPr>
+        <w:t xml:space="preserve"> </w:t>
+      </w:r>
+      <w:r>
+        <w:rPr>
+          <w:b/>
+          <w:bCs/>
+        </w:rPr>
+        <w:t xml:space="preserve">“No”</w:t>
+      </w:r>
+      <w:r>
+        <w:rPr>
+          <w:b/>
+          <w:bCs/>
+        </w:rPr>
+        <w:t xml:space="preserve"> </w:t>
+      </w:r>
+      <w:r>
+        <w:rPr>
+          <w:b/>
+          <w:bCs/>
+        </w:rPr>
+        <w:t xml:space="preserve">means)</w:t>
+      </w:r>
+      <w:r>
+        <w:t xml:space="preserve"> </w:t>
+      </w:r>
+      <w:r>
+        <w:t xml:space="preserve"> </w:t>
+      </w:r>
+    </w:p>
+    <w:p>
+      <w:pPr>
+        <w:pStyle w:val="BlockText"/>
+      </w:pPr>
+      <w:r>
+        <w:t xml:space="preserve">❌ No. The irreducible error is a lower bound on the expected squared prediction error.</w:t>
+      </w:r>
+    </w:p>
+    <w:p>
+      <w:pPr>
+        <w:pStyle w:val="BlockText"/>
+      </w:pPr>
+      <w:r>
+        <w:t xml:space="preserve">✅ No: it’s not possible that the advanced network has a test error of 0.25.</w:t>
+      </w:r>
+      <w:r>
+        <w:t xml:space="preserve"> </w:t>
+      </w:r>
+      <w:r>
+        <w:t xml:space="preserve">The irreducible error is a lower bound on the expected squared prediction error.</w:t>
+      </w:r>
+    </w:p>
+    <w:p>
+      <w:pPr>
+        <w:pStyle w:val="FirstParagraph"/>
+      </w:pPr>
+      <w:r>
+        <w:t xml:space="preserve">The ✅ version states the conclusion in the question’s own words,</w:t>
+      </w:r>
+      <w:r>
+        <w:t xml:space="preserve"> </w:t>
+      </w:r>
+      <w:r>
+        <w:t xml:space="preserve">so the reasons that follow support a claim the reader has already seen.</w:t>
+      </w:r>
+    </w:p>
+    <w:bookmarkEnd w:id="19"/>
+    <w:bookmarkEnd w:id="20"/>
+    <w:bookmarkStart w:id="21" w:name="Xcb2ea076bd2bdcde187ea355befd37150b69b89"/>
+    <w:p>
+      <w:pPr>
+        <w:pStyle w:val="Heading2"/>
+      </w:pPr>
+      <w:r>
+        <w:t xml:space="preserve">4 Give each question’s answer its own paragraph</w:t>
+      </w:r>
+    </w:p>
+    <w:p>
+      <w:pPr>
+        <w:pStyle w:val="FirstParagraph"/>
+      </w:pPr>
+      <w:r>
         <w:t xml:space="preserve">When a prompt asks several questions, answer each one in its own paragraph, or in several paragraphs if it needs them</w:t>
       </w:r>
       <w:r>
@@ -1099,21 +1285,21 @@
         <w:t xml:space="preserve">No automated check enforces this rule, because a script cannot tell how many questions a prompt asks.</w:t>
       </w:r>
     </w:p>
-    <w:bookmarkEnd w:id="19"/>
-    <w:bookmarkStart w:id="22" w:name="give-each-defined-term-its-own-div"/>
+    <w:bookmarkEnd w:id="21"/>
+    <w:bookmarkStart w:id="24" w:name="give-each-defined-term-its-own-div"/>
     <w:p>
       <w:pPr>
         <w:pStyle w:val="Heading2"/>
       </w:pPr>
       <w:r>
-        <w:t xml:space="preserve">4 Give each defined term its own div</w:t>
+        <w:t xml:space="preserve">5 Give each defined term its own div</w:t>
       </w:r>
     </w:p>
     <w:p>
       <w:pPr>
         <w:pStyle w:val="FirstParagraph"/>
       </w:pPr>
-      <w:hyperlink r:id="rId20">
+      <w:hyperlink r:id="rId22">
         <w:r>
           <w:rPr>
             <w:rStyle w:val="Hyperlink"/>
@@ -1364,7 +1550,7 @@
       <w:r>
         <w:t xml:space="preserve"> </w:t>
       </w:r>
-      <w:hyperlink r:id="rId21">
+      <w:hyperlink r:id="rId23">
         <w:r>
           <w:rPr>
             <w:rStyle w:val="Hyperlink"/>
@@ -1531,14 +1717,14 @@
         <w:t xml:space="preserve">and also the points where the derivative does not exist.</w:t>
       </w:r>
     </w:p>
-    <w:bookmarkEnd w:id="22"/>
-    <w:bookmarkStart w:id="23" w:name="state-the-notation-and-its-alternatives"/>
+    <w:bookmarkEnd w:id="24"/>
+    <w:bookmarkStart w:id="25" w:name="state-the-notation-and-its-alternatives"/>
     <w:p>
       <w:pPr>
         <w:pStyle w:val="Heading2"/>
       </w:pPr>
       <w:r>
-        <w:t xml:space="preserve">5 State the notation and its alternatives</w:t>
+        <w:t xml:space="preserve">6 State the notation and its alternatives</w:t>
       </w:r>
     </w:p>
     <w:p>
@@ -1630,14 +1816,14 @@
         <w:t xml:space="preserve">to make the choice explicit.</w:t>
       </w:r>
     </w:p>
-    <w:bookmarkEnd w:id="23"/>
-    <w:bookmarkStart w:id="25" w:name="Xac7e4ead54b12ccf6544491699a177b7d16fa22"/>
+    <w:bookmarkEnd w:id="25"/>
+    <w:bookmarkStart w:id="27" w:name="Xac7e4ead54b12ccf6544491699a177b7d16fa22"/>
     <w:p>
       <w:pPr>
         <w:pStyle w:val="Heading2"/>
       </w:pPr>
       <w:r>
-        <w:t xml:space="preserve">6 Lead with the simplest correct form of a definition</w:t>
+        <w:t xml:space="preserve">7 Lead with the simplest correct form of a definition</w:t>
       </w:r>
     </w:p>
     <w:p>
@@ -1662,7 +1848,7 @@
       <w:r>
         <w:t xml:space="preserve"> </w:t>
       </w:r>
-      <w:hyperlink r:id="rId24">
+      <w:hyperlink r:id="rId26">
         <w:r>
           <w:rPr>
             <w:rStyle w:val="Hyperlink"/>
@@ -1908,14 +2094,14 @@
         <w:t xml:space="preserve">The conventional form still appears in the notes, as a named result.</w:t>
       </w:r>
     </w:p>
-    <w:bookmarkEnd w:id="25"/>
-    <w:bookmarkStart w:id="26" w:name="reuse-one-written-version-of-each-result"/>
+    <w:bookmarkEnd w:id="27"/>
+    <w:bookmarkStart w:id="28" w:name="reuse-one-written-version-of-each-result"/>
     <w:p>
       <w:pPr>
         <w:pStyle w:val="Heading2"/>
       </w:pPr>
       <w:r>
-        <w:t xml:space="preserve">7 Reuse one written version of each result</w:t>
+        <w:t xml:space="preserve">8 Reuse one written version of each result</w:t>
       </w:r>
     </w:p>
     <w:p>
@@ -1950,14 +2136,14 @@
         <w:t xml:space="preserve">instead of keeping a second wording that can drift.</w:t>
       </w:r>
     </w:p>
-    <w:bookmarkEnd w:id="26"/>
-    <w:bookmarkStart w:id="28" w:name="use-real-data-and-compute-every-number"/>
+    <w:bookmarkEnd w:id="28"/>
+    <w:bookmarkStart w:id="30" w:name="use-real-data-and-compute-every-number"/>
     <w:p>
       <w:pPr>
         <w:pStyle w:val="Heading2"/>
       </w:pPr>
       <w:r>
-        <w:t xml:space="preserve">8 Use real data and compute every number</w:t>
+        <w:t xml:space="preserve">9 Use real data and compute every number</w:t>
       </w:r>
     </w:p>
     <w:p>
@@ -2080,7 +2266,7 @@
         <w:t xml:space="preserve">A number typed into prose goes stale when the data or the code changes.</w:t>
       </w:r>
     </w:p>
-    <w:bookmarkStart w:id="27" w:name="exm-show-data-first"/>
+    <w:bookmarkStart w:id="29" w:name="exm-show-data-first"/>
     <w:p>
       <w:pPr>
         <w:pStyle w:val="FirstParagraph"/>
@@ -2090,7 +2276,7 @@
           <w:b/>
           <w:bCs/>
         </w:rPr>
-        <w:t xml:space="preserve">Example 3 (Showing the data at first mention)</w:t>
+        <w:t xml:space="preserve">Example 4 (Showing the data at first mention)</w:t>
       </w:r>
       <w:r>
         <w:t xml:space="preserve"> </w:t>
@@ -2153,15 +2339,15 @@
         <w:t xml:space="preserve">The ✅ version lets every later slide refer to something the reader has already seen.</w:t>
       </w:r>
     </w:p>
-    <w:bookmarkEnd w:id="27"/>
-    <w:bookmarkEnd w:id="28"/>
-    <w:bookmarkStart w:id="29" w:name="Xa214254a94aa6db868b5b9577007bf4e27699b1"/>
+    <w:bookmarkEnd w:id="29"/>
+    <w:bookmarkEnd w:id="30"/>
+    <w:bookmarkStart w:id="31" w:name="Xa214254a94aa6db868b5b9577007bf4e27699b1"/>
     <w:p>
       <w:pPr>
         <w:pStyle w:val="Heading2"/>
       </w:pPr>
       <w:r>
-        <w:t xml:space="preserve">9 Store structured data in structured formats</w:t>
+        <w:t xml:space="preserve">10 Store structured data in structured formats</w:t>
       </w:r>
     </w:p>
     <w:p>
@@ -2294,14 +2480,14 @@
         <w:t xml:space="preserve">A short list that no other page reads can stay as prose.</w:t>
       </w:r>
     </w:p>
-    <w:bookmarkEnd w:id="29"/>
-    <w:bookmarkStart w:id="35" w:name="show-each-idea-applied-and-in-a-figure"/>
+    <w:bookmarkEnd w:id="31"/>
+    <w:bookmarkStart w:id="37" w:name="show-each-idea-applied-and-in-a-figure"/>
     <w:p>
       <w:pPr>
         <w:pStyle w:val="Heading2"/>
       </w:pPr>
       <w:r>
-        <w:t xml:space="preserve">10 Show each idea applied and in a figure</w:t>
+        <w:t xml:space="preserve">11 Show each idea applied and in a figure</w:t>
       </w:r>
     </w:p>
     <w:p>
@@ -2438,7 +2624,7 @@
       <w:r>
         <w:t xml:space="preserve"> </w:t>
       </w:r>
-      <w:hyperlink r:id="rId30">
+      <w:hyperlink r:id="rId32">
         <w:r>
           <w:rPr>
             <w:rStyle w:val="Hyperlink"/>
@@ -2584,7 +2770,7 @@
       <w:r>
         <w:t xml:space="preserve"> </w:t>
       </w:r>
-      <w:hyperlink r:id="rId31">
+      <w:hyperlink r:id="rId33">
         <w:r>
           <w:rPr>
             <w:rStyle w:val="VerbatimChar"/>
@@ -2619,7 +2805,7 @@
       <w:r>
         <w:t xml:space="preserve">(</w:t>
       </w:r>
-      <w:hyperlink r:id="rId32">
+      <w:hyperlink r:id="rId34">
         <w:r>
           <w:rPr>
             <w:rStyle w:val="Hyperlink"/>
@@ -2829,7 +3015,7 @@
       <w:r>
         <w:t xml:space="preserve"> </w:t>
       </w:r>
-      <w:hyperlink r:id="rId31">
+      <w:hyperlink r:id="rId33">
         <w:r>
           <w:rPr>
             <w:rStyle w:val="VerbatimChar"/>
@@ -2876,7 +3062,7 @@
       <w:r>
         <w:t xml:space="preserve">(</w:t>
       </w:r>
-      <w:hyperlink r:id="rId33">
+      <w:hyperlink r:id="rId35">
         <w:r>
           <w:rPr>
             <w:rStyle w:val="Hyperlink"/>
@@ -2974,7 +3160,7 @@
       <w:r>
         <w:t xml:space="preserve"> </w:t>
       </w:r>
-      <w:hyperlink r:id="rId34">
+      <w:hyperlink r:id="rId36">
         <w:r>
           <w:rPr>
             <w:rStyle w:val="Hyperlink"/>
@@ -3001,14 +3187,14 @@
         <w:t xml:space="preserve">Make each figure follow the accessibility rules below.</w:t>
       </w:r>
     </w:p>
-    <w:bookmarkEnd w:id="35"/>
-    <w:bookmarkStart w:id="37" w:name="X7f95f8ec3b796fc99108c37bb45d62741b824c4"/>
+    <w:bookmarkEnd w:id="37"/>
+    <w:bookmarkStart w:id="39" w:name="X7f95f8ec3b796fc99108c37bb45d62741b824c4"/>
     <w:p>
       <w:pPr>
         <w:pStyle w:val="Heading2"/>
       </w:pPr>
       <w:r>
-        <w:t xml:space="preserve">11 Follow every example with an exercise and solution</w:t>
+        <w:t xml:space="preserve">12 Follow every example with an exercise and solution</w:t>
       </w:r>
     </w:p>
     <w:p>
@@ -3195,7 +3381,7 @@
       <w:r>
         <w:t xml:space="preserve"> </w:t>
       </w:r>
-      <w:hyperlink r:id="rId20">
+      <w:hyperlink r:id="rId22">
         <w:r>
           <w:rPr>
             <w:rStyle w:val="Hyperlink"/>
@@ -3240,7 +3426,7 @@
         <w:t xml:space="preserve">Give the practice exercise its own slug and follow the numbering and slide-break rules above.</w:t>
       </w:r>
     </w:p>
-    <w:bookmarkStart w:id="36" w:name="exm-practice-after-example"/>
+    <w:bookmarkStart w:id="38" w:name="exm-practice-after-example"/>
     <w:p>
       <w:pPr>
         <w:pStyle w:val="FirstParagraph"/>
@@ -3250,7 +3436,7 @@
           <w:b/>
           <w:bCs/>
         </w:rPr>
-        <w:t xml:space="preserve">Example 4 (An example followed by a practice exercise)</w:t>
+        <w:t xml:space="preserve">Example 5 (An example followed by a practice exercise)</w:t>
       </w:r>
       <w:r>
         <w:t xml:space="preserve"> </w:t>
@@ -3396,15 +3582,15 @@
         <w:t xml:space="preserve">).</w:t>
       </w:r>
     </w:p>
-    <w:bookmarkEnd w:id="36"/>
-    <w:bookmarkEnd w:id="37"/>
-    <w:bookmarkStart w:id="41" w:name="Xf27331f4c36c8d578e5fa29a37312484cc3343a"/>
+    <w:bookmarkEnd w:id="38"/>
+    <w:bookmarkEnd w:id="39"/>
+    <w:bookmarkStart w:id="43" w:name="Xf27331f4c36c8d578e5fa29a37312484cc3343a"/>
     <w:p>
       <w:pPr>
         <w:pStyle w:val="Heading2"/>
       </w:pPr>
       <w:r>
-        <w:t xml:space="preserve">12 Write labs for both languages and any computer</w:t>
+        <w:t xml:space="preserve">13 Write labs for both languages and any computer</w:t>
       </w:r>
     </w:p>
     <w:p>
@@ -3516,7 +3702,7 @@
       <w:r>
         <w:t xml:space="preserve"> </w:t>
       </w:r>
-      <w:hyperlink r:id="rId38">
+      <w:hyperlink r:id="rId40">
         <w:r>
           <w:rPr>
             <w:rStyle w:val="Hyperlink"/>
@@ -3542,7 +3728,7 @@
       <w:r>
         <w:t xml:space="preserve"> </w:t>
       </w:r>
-      <w:hyperlink r:id="rId39">
+      <w:hyperlink r:id="rId41">
         <w:r>
           <w:rPr>
             <w:rStyle w:val="Hyperlink"/>
@@ -3610,7 +3796,7 @@
       <w:r>
         <w:t xml:space="preserve"> </w:t>
       </w:r>
-      <w:hyperlink r:id="rId40">
+      <w:hyperlink r:id="rId42">
         <w:r>
           <w:rPr>
             <w:rStyle w:val="Hyperlink"/>
@@ -3781,14 +3967,14 @@
         <w:t xml:space="preserve">so setup steps must work on a shared or hosted machine.</w:t>
       </w:r>
     </w:p>
-    <w:bookmarkEnd w:id="41"/>
-    <w:bookmarkStart w:id="42" w:name="Xf53ecb3398b87b82ffd1a126dd02e87a65bb694"/>
+    <w:bookmarkEnd w:id="43"/>
+    <w:bookmarkStart w:id="44" w:name="Xf53ecb3398b87b82ffd1a126dd02e87a65bb694"/>
     <w:p>
       <w:pPr>
         <w:pStyle w:val="Heading2"/>
       </w:pPr>
       <w:r>
-        <w:t xml:space="preserve">13 Keep each step’s code in one chunk, and put parallel chunks in a language tabset</w:t>
+        <w:t xml:space="preserve">14 Keep each step’s code in one chunk, and put parallel chunks in a language tabset</w:t>
       </w:r>
     </w:p>
     <w:p>
@@ -4050,14 +4236,14 @@
         <w:t xml:space="preserve">End each such call with a semicolon, or assign its value.</w:t>
       </w:r>
     </w:p>
-    <w:bookmarkEnd w:id="42"/>
-    <w:bookmarkStart w:id="51" w:name="present-r-results-with-modern-packages"/>
+    <w:bookmarkEnd w:id="44"/>
+    <w:bookmarkStart w:id="53" w:name="present-r-results-with-modern-packages"/>
     <w:p>
       <w:pPr>
         <w:pStyle w:val="Heading2"/>
       </w:pPr>
       <w:r>
-        <w:t xml:space="preserve">14 Present R results with modern packages</w:t>
+        <w:t xml:space="preserve">15 Present R results with modern packages</w:t>
       </w:r>
     </w:p>
     <w:p>
@@ -4136,7 +4322,7 @@
       <w:r>
         <w:t xml:space="preserve"> </w:t>
       </w:r>
-      <w:hyperlink r:id="rId43">
+      <w:hyperlink r:id="rId45">
         <w:r>
           <w:rPr>
             <w:rStyle w:val="Hyperlink"/>
@@ -4168,7 +4354,7 @@
       <w:r>
         <w:t xml:space="preserve"> </w:t>
       </w:r>
-      <w:hyperlink r:id="rId44">
+      <w:hyperlink r:id="rId46">
         <w:r>
           <w:rPr>
             <w:rStyle w:val="Hyperlink"/>
@@ -4242,7 +4428,7 @@
       <w:r>
         <w:t xml:space="preserve"> </w:t>
       </w:r>
-      <w:hyperlink r:id="rId45">
+      <w:hyperlink r:id="rId47">
         <w:r>
           <w:rPr>
             <w:rStyle w:val="Hyperlink"/>
@@ -4313,7 +4499,7 @@
       <w:r>
         <w:t xml:space="preserve"> </w:t>
       </w:r>
-      <w:hyperlink r:id="rId46">
+      <w:hyperlink r:id="rId48">
         <w:r>
           <w:rPr>
             <w:rStyle w:val="Hyperlink"/>
@@ -4330,7 +4516,7 @@
       <w:r>
         <w:t xml:space="preserve"> </w:t>
       </w:r>
-      <w:hyperlink r:id="rId47">
+      <w:hyperlink r:id="rId49">
         <w:r>
           <w:rPr>
             <w:rStyle w:val="Hyperlink"/>
@@ -4353,7 +4539,7 @@
       <w:r>
         <w:t xml:space="preserve"> </w:t>
       </w:r>
-      <w:hyperlink r:id="rId48">
+      <w:hyperlink r:id="rId50">
         <w:r>
           <w:rPr>
             <w:rStyle w:val="Hyperlink"/>
@@ -4409,7 +4595,7 @@
       <w:r>
         <w:t xml:space="preserve"> </w:t>
       </w:r>
-      <w:hyperlink r:id="rId49">
+      <w:hyperlink r:id="rId51">
         <w:r>
           <w:rPr>
             <w:rStyle w:val="Hyperlink"/>
@@ -4447,7 +4633,7 @@
       <w:r>
         <w:t xml:space="preserve"> </w:t>
       </w:r>
-      <w:hyperlink r:id="rId50">
+      <w:hyperlink r:id="rId52">
         <w:r>
           <w:rPr>
             <w:rStyle w:val="Hyperlink"/>
@@ -4462,14 +4648,14 @@
         <w:t xml:space="preserve">notes show the style.</w:t>
       </w:r>
     </w:p>
-    <w:bookmarkEnd w:id="51"/>
-    <w:bookmarkStart w:id="55" w:name="manipulate-data-with-dplyr-not-base-r"/>
+    <w:bookmarkEnd w:id="53"/>
+    <w:bookmarkStart w:id="57" w:name="manipulate-data-with-dplyr-not-base-r"/>
     <w:p>
       <w:pPr>
         <w:pStyle w:val="Heading2"/>
       </w:pPr>
       <w:r>
-        <w:t xml:space="preserve">15 Manipulate data with dplyr, not base R</w:t>
+        <w:t xml:space="preserve">16 Manipulate data with dplyr, not base R</w:t>
       </w:r>
     </w:p>
     <w:p>
@@ -4500,7 +4686,7 @@
       <w:r>
         <w:t xml:space="preserve"> </w:t>
       </w:r>
-      <w:hyperlink r:id="rId52">
+      <w:hyperlink r:id="rId54">
         <w:r>
           <w:rPr>
             <w:rStyle w:val="Hyperlink"/>
@@ -4658,7 +4844,7 @@
       <w:r>
         <w:t xml:space="preserve"> </w:t>
       </w:r>
-      <w:hyperlink r:id="rId53">
+      <w:hyperlink r:id="rId55">
         <w:r>
           <w:rPr>
             <w:rStyle w:val="Hyperlink"/>
@@ -4750,7 +4936,7 @@
       <w:r>
         <w:t xml:space="preserve"> </w:t>
       </w:r>
-      <w:hyperlink r:id="rId54">
+      <w:hyperlink r:id="rId56">
         <w:r>
           <w:rPr>
             <w:rStyle w:val="Hyperlink"/>
@@ -4942,14 +5128,14 @@
         <w:t xml:space="preserve">The rule is about selecting, filtering and building data frames.</w:t>
       </w:r>
     </w:p>
-    <w:bookmarkEnd w:id="55"/>
-    <w:bookmarkStart w:id="57" w:name="X2bc6121e3a2f39a37d8a6591d77df16bd22bd0b"/>
+    <w:bookmarkEnd w:id="57"/>
+    <w:bookmarkStart w:id="59" w:name="X2bc6121e3a2f39a37d8a6591d77df16bd22bd0b"/>
     <w:p>
       <w:pPr>
         <w:pStyle w:val="Heading2"/>
       </w:pPr>
       <w:r>
-        <w:t xml:space="preserve">16 Include code from files instead of copying it</w:t>
+        <w:t xml:space="preserve">17 Include code from files instead of copying it</w:t>
       </w:r>
     </w:p>
     <w:p>
@@ -5036,7 +5222,7 @@
       <w:r>
         <w:t xml:space="preserve"> </w:t>
       </w:r>
-      <w:hyperlink r:id="rId56">
+      <w:hyperlink r:id="rId58">
         <w:r>
           <w:rPr>
             <w:rStyle w:val="Hyperlink"/>
@@ -5213,14 +5399,14 @@
         <w:t xml:space="preserve">directory it creates.</w:t>
       </w:r>
     </w:p>
-    <w:bookmarkEnd w:id="57"/>
-    <w:bookmarkStart w:id="58" w:name="X7c0de8eaf50a5b2644eabf66f1f9b734b8a4a71"/>
+    <w:bookmarkEnd w:id="59"/>
+    <w:bookmarkStart w:id="60" w:name="X7c0de8eaf50a5b2644eabf66f1f9b734b8a4a71"/>
     <w:p>
       <w:pPr>
         <w:pStyle w:val="Heading2"/>
       </w:pPr>
       <w:r>
-        <w:t xml:space="preserve">17 Comment every code chunk to say what and why</w:t>
+        <w:t xml:space="preserve">18 Comment every code chunk to say what and why</w:t>
       </w:r>
     </w:p>
     <w:p>
@@ -5389,14 +5575,14 @@
         <w:t xml:space="preserve">such as a transformation, a modeling choice, a tuning value or a random seed.</w:t>
       </w:r>
     </w:p>
-    <w:bookmarkEnd w:id="58"/>
-    <w:bookmarkStart w:id="59" w:name="X94063c6448bea82c8f1e8d367c642bbe2eda89b"/>
+    <w:bookmarkEnd w:id="60"/>
+    <w:bookmarkStart w:id="61" w:name="X94063c6448bea82c8f1e8d367c642bbe2eda89b"/>
     <w:p>
       <w:pPr>
         <w:pStyle w:val="Heading2"/>
       </w:pPr>
       <w:r>
-        <w:t xml:space="preserve">18 Set</w:t>
+        <w:t xml:space="preserve">19 Set</w:t>
       </w:r>
       <w:r>
         <w:t xml:space="preserve"> </w:t>
@@ -5630,14 +5816,14 @@
         <w:t xml:space="preserve">.</w:t>
       </w:r>
     </w:p>
-    <w:bookmarkEnd w:id="59"/>
-    <w:bookmarkStart w:id="60" w:name="Xffa5a3357c8672d830c88e1e58a0ef107550647"/>
+    <w:bookmarkEnd w:id="61"/>
+    <w:bookmarkStart w:id="62" w:name="Xffa5a3357c8672d830c88e1e58a0ef107550647"/>
     <w:p>
       <w:pPr>
         <w:pStyle w:val="Heading2"/>
       </w:pPr>
       <w:r>
-        <w:t xml:space="preserve">19 Introduce every function in a programming primer</w:t>
+        <w:t xml:space="preserve">20 Introduce every function in a programming primer</w:t>
       </w:r>
     </w:p>
     <w:p>
@@ -5756,14 +5942,14 @@
         <w:t xml:space="preserve">A chapter introduces those where it defines them.</w:t>
       </w:r>
     </w:p>
-    <w:bookmarkEnd w:id="60"/>
-    <w:bookmarkStart w:id="61" w:name="make-figures-accessible"/>
+    <w:bookmarkEnd w:id="62"/>
+    <w:bookmarkStart w:id="63" w:name="make-figures-accessible"/>
     <w:p>
       <w:pPr>
         <w:pStyle w:val="Heading2"/>
       </w:pPr>
       <w:r>
-        <w:t xml:space="preserve">20 Make figures accessible</w:t>
+        <w:t xml:space="preserve">21 Make figures accessible</w:t>
       </w:r>
     </w:p>
     <w:p>
@@ -5892,14 +6078,14 @@
         <w:t xml:space="preserve">(observed when rendering lecture notes to PDF).</w:t>
       </w:r>
     </w:p>
-    <w:bookmarkEnd w:id="61"/>
-    <w:bookmarkStart w:id="63" w:name="structure-slides-for-the-reader"/>
+    <w:bookmarkEnd w:id="63"/>
+    <w:bookmarkStart w:id="65" w:name="structure-slides-for-the-reader"/>
     <w:p>
       <w:pPr>
         <w:pStyle w:val="Heading2"/>
       </w:pPr>
       <w:r>
-        <w:t xml:space="preserve">21 Structure slides for the reader</w:t>
+        <w:t xml:space="preserve">22 Structure slides for the reader</w:t>
       </w:r>
     </w:p>
     <w:p>
@@ -5952,7 +6138,7 @@
       <w:r>
         <w:t xml:space="preserve"> </w:t>
       </w:r>
-      <w:hyperlink r:id="rId62">
+      <w:hyperlink r:id="rId64">
         <w:r>
           <w:rPr>
             <w:rStyle w:val="Hyperlink"/>
@@ -6192,14 +6378,14 @@
         <w:t xml:space="preserve">Put a slide break after the heading and move the text onto content slides.</w:t>
       </w:r>
     </w:p>
-    <w:bookmarkEnd w:id="63"/>
-    <w:bookmarkStart w:id="65" w:name="X5f21f12cbfc4e3df5e838110af4e52db506fec1"/>
+    <w:bookmarkEnd w:id="65"/>
+    <w:bookmarkStart w:id="67" w:name="X5f21f12cbfc4e3df5e838110af4e52db506fec1"/>
     <w:p>
       <w:pPr>
         <w:pStyle w:val="Heading2"/>
       </w:pPr>
       <w:r>
-        <w:t xml:space="preserve">22 Give each concept in a note sheet its own row</w:t>
+        <w:t xml:space="preserve">23 Give each concept in a note sheet its own row</w:t>
       </w:r>
     </w:p>
     <w:p>
@@ -6336,7 +6522,7 @@
         <w:t xml:space="preserve">The same rule applies to every other reference table, such as a table of notation.</w:t>
       </w:r>
     </w:p>
-    <w:bookmarkStart w:id="64" w:name="exm-note-sheet-rows"/>
+    <w:bookmarkStart w:id="66" w:name="exm-note-sheet-rows"/>
     <w:p>
       <w:pPr>
         <w:pStyle w:val="BodyText"/>
@@ -6346,7 +6532,7 @@
           <w:b/>
           <w:bCs/>
         </w:rPr>
-        <w:t xml:space="preserve">Example 5 (Splitting a merged row)</w:t>
+        <w:t xml:space="preserve">Example 6 (Splitting a merged row)</w:t>
       </w:r>
       <w:r>
         <w:t xml:space="preserve"> </w:t>
@@ -6427,15 +6613,15 @@
         <w:t xml:space="preserve">The ✅ rows let the reader find one formula by one label.</w:t>
       </w:r>
     </w:p>
-    <w:bookmarkEnd w:id="64"/>
-    <w:bookmarkEnd w:id="65"/>
-    <w:bookmarkStart w:id="66" w:name="talk-about-the-ideas-not-the-notes"/>
+    <w:bookmarkEnd w:id="66"/>
+    <w:bookmarkEnd w:id="67"/>
+    <w:bookmarkStart w:id="68" w:name="talk-about-the-ideas-not-the-notes"/>
     <w:p>
       <w:pPr>
         <w:pStyle w:val="Heading2"/>
       </w:pPr>
       <w:r>
-        <w:t xml:space="preserve">23 Talk about the ideas, not the notes</w:t>
+        <w:t xml:space="preserve">24 Talk about the ideas, not the notes</w:t>
       </w:r>
     </w:p>
     <w:p>
@@ -6618,14 +6804,14 @@
         <w:t xml:space="preserve">and it goes stale when the definition moves.</w:t>
       </w:r>
     </w:p>
-    <w:bookmarkEnd w:id="66"/>
-    <w:bookmarkStart w:id="68" w:name="write-grading-rubrics-as-checklists"/>
+    <w:bookmarkEnd w:id="68"/>
+    <w:bookmarkStart w:id="70" w:name="write-grading-rubrics-as-checklists"/>
     <w:p>
       <w:pPr>
         <w:pStyle w:val="Heading2"/>
       </w:pPr>
       <w:r>
-        <w:t xml:space="preserve">24 Write grading rubrics as checklists</w:t>
+        <w:t xml:space="preserve">25 Write grading rubrics as checklists</w:t>
       </w:r>
     </w:p>
     <w:p>
@@ -6795,7 +6981,7 @@
         <w:t xml:space="preserve">such as a single holistic judgment of a proof’s rigor.</w:t>
       </w:r>
     </w:p>
-    <w:bookmarkStart w:id="67" w:name="exm-rubric-checklist"/>
+    <w:bookmarkStart w:id="69" w:name="exm-rubric-checklist"/>
     <w:p>
       <w:pPr>
         <w:pStyle w:val="FirstParagraph"/>
@@ -6805,7 +6991,7 @@
           <w:b/>
           <w:bCs/>
         </w:rPr>
-        <w:t xml:space="preserve">Example 6 (A rubric as a checklist)</w:t>
+        <w:t xml:space="preserve">Example 7 (A rubric as a checklist)</w:t>
       </w:r>
       <w:r>
         <w:t xml:space="preserve"> </w:t>
@@ -7048,15 +7234,15 @@
         <w:t xml:space="preserve">and lets a script check that the points sum to the total.</w:t>
       </w:r>
     </w:p>
-    <w:bookmarkEnd w:id="67"/>
-    <w:bookmarkEnd w:id="68"/>
-    <w:bookmarkStart w:id="72" w:name="Xcb579568ef754486ebde8b41ba4528bdf380eec"/>
+    <w:bookmarkEnd w:id="69"/>
+    <w:bookmarkEnd w:id="70"/>
+    <w:bookmarkStart w:id="74" w:name="Xcb579568ef754486ebde8b41ba4528bdf380eec"/>
     <w:p>
       <w:pPr>
         <w:pStyle w:val="Heading2"/>
       </w:pPr>
       <w:r>
-        <w:t xml:space="preserve">25 Credit other courses without summarizing them</w:t>
+        <w:t xml:space="preserve">26 Credit other courses without summarizing them</w:t>
       </w:r>
     </w:p>
     <w:p>
@@ -7109,7 +7295,7 @@
       <w:r>
         <w:t xml:space="preserve"> </w:t>
       </w:r>
-      <w:hyperlink r:id="rId69">
+      <w:hyperlink r:id="rId71">
         <w:r>
           <w:rPr>
             <w:rStyle w:val="Hyperlink"/>
@@ -7165,7 +7351,7 @@
       <w:r>
         <w:t xml:space="preserve"> </w:t>
       </w:r>
-      <w:hyperlink r:id="rId70">
+      <w:hyperlink r:id="rId72">
         <w:r>
           <w:rPr>
             <w:rStyle w:val="Hyperlink"/>
@@ -7194,7 +7380,7 @@
       <w:r>
         <w:t xml:space="preserve"> </w:t>
       </w:r>
-      <w:hyperlink r:id="rId71">
+      <w:hyperlink r:id="rId73">
         <w:r>
           <w:rPr>
             <w:rStyle w:val="Hyperlink"/>
@@ -7227,14 +7413,14 @@
         <w:t xml:space="preserve">because a bare citation key renders as the author list.</w:t>
       </w:r>
     </w:p>
-    <w:bookmarkEnd w:id="72"/>
-    <w:bookmarkStart w:id="81" w:name="rules-that-apply-to-all-writing"/>
+    <w:bookmarkEnd w:id="74"/>
+    <w:bookmarkStart w:id="83" w:name="rules-that-apply-to-all-writing"/>
     <w:p>
       <w:pPr>
         <w:pStyle w:val="Heading2"/>
       </w:pPr>
       <w:r>
-        <w:t xml:space="preserve">26 Rules that apply to all writing</w:t>
+        <w:t xml:space="preserve">27 Rules that apply to all writing</w:t>
       </w:r>
     </w:p>
     <w:p>
@@ -7253,7 +7439,7 @@
           <w:numId w:val="1023"/>
         </w:numPr>
       </w:pPr>
-      <w:hyperlink r:id="rId73">
+      <w:hyperlink r:id="rId75">
         <w:r>
           <w:rPr>
             <w:rStyle w:val="Hyperlink"/>
@@ -7273,7 +7459,7 @@
           <w:numId w:val="1023"/>
         </w:numPr>
       </w:pPr>
-      <w:hyperlink r:id="rId74">
+      <w:hyperlink r:id="rId76">
         <w:r>
           <w:rPr>
             <w:rStyle w:val="Hyperlink"/>
@@ -7296,7 +7482,7 @@
           <w:numId w:val="1023"/>
         </w:numPr>
       </w:pPr>
-      <w:hyperlink r:id="rId75">
+      <w:hyperlink r:id="rId77">
         <w:r>
           <w:rPr>
             <w:rStyle w:val="Hyperlink"/>
@@ -7316,7 +7502,7 @@
           <w:numId w:val="1023"/>
         </w:numPr>
       </w:pPr>
-      <w:hyperlink r:id="rId76">
+      <w:hyperlink r:id="rId78">
         <w:r>
           <w:rPr>
             <w:rStyle w:val="Hyperlink"/>
@@ -7339,7 +7525,7 @@
           <w:numId w:val="1023"/>
         </w:numPr>
       </w:pPr>
-      <w:hyperlink r:id="rId77">
+      <w:hyperlink r:id="rId79">
         <w:r>
           <w:rPr>
             <w:rStyle w:val="Hyperlink"/>
@@ -7351,8 +7537,8 @@
         <w:t xml:space="preserve">.</w:t>
       </w:r>
     </w:p>
-    <w:bookmarkStart w:id="80" w:name="refs"/>
-    <w:bookmarkStart w:id="79" w:name="ref-freeman2014active"/>
+    <w:bookmarkStart w:id="82" w:name="refs"/>
+    <w:bookmarkStart w:id="81" w:name="ref-freeman2014active"/>
     <w:p>
       <w:pPr>
         <w:pStyle w:val="Bibliography"/>
@@ -7385,7 +7571,7 @@
       <w:r>
         <w:t xml:space="preserve"> </w:t>
       </w:r>
-      <w:hyperlink r:id="rId78">
+      <w:hyperlink r:id="rId80">
         <w:r>
           <w:rPr>
             <w:rStyle w:val="Hyperlink"/>
@@ -7397,9 +7583,9 @@
         <w:t xml:space="preserve">.</w:t>
       </w:r>
     </w:p>
-    <w:bookmarkEnd w:id="79"/>
-    <w:bookmarkEnd w:id="80"/>
     <w:bookmarkEnd w:id="81"/>
+    <w:bookmarkEnd w:id="82"/>
+    <w:bookmarkEnd w:id="83"/>
     <w:sectPr>
       <w:footnotePr>
         <w:numRestart w:val="eachSect"/>

</xml_diff>

<commit_message>
Deploying to gh-pages from @ Morrison-Lab/psw@82c3139c27b52f179dd9c9806989aa12a4cde0b5 🚀
</commit_message>
<xml_diff>
--- a/chapters/teaching.docx
+++ b/chapters/teaching.docx
@@ -15,7 +15,7 @@
         <w:pStyle w:val="Date"/>
       </w:pPr>
       <w:r>
-        <w:t xml:space="preserve">Last modified: 2026-10-28 16:35:15 (PDT)</w:t>
+        <w:t xml:space="preserve">Last modified: 2026-10-28 18:26:29 (PDT)</w:t>
       </w:r>
     </w:p>
     <w:tbl>
@@ -172,7 +172,7 @@
         <w:t xml:space="preserve">This chapter adds the rules that apply to teaching materials in particular.</w:t>
       </w:r>
     </w:p>
-    <w:bookmarkStart w:id="13" w:name="X54d80540a68b433948113395869433e0fc9698c"/>
+    <w:bookmarkStart w:id="15" w:name="X54d80540a68b433948113395869433e0fc9698c"/>
     <w:p>
       <w:pPr>
         <w:pStyle w:val="Heading2"/>
@@ -411,6 +411,175 @@
         </w:numPr>
       </w:pPr>
       <w:r>
+        <w:t xml:space="preserve">Split the solution the same way as its exercise (Ezra, 2026-10-28).</w:t>
+      </w:r>
+      <w:r>
+        <w:t xml:space="preserve"> </w:t>
+      </w:r>
+      <w:r>
+        <w:t xml:space="preserve">Each</w:t>
+      </w:r>
+      <w:r>
+        <w:t xml:space="preserve"> </w:t>
+      </w:r>
+      <w:r>
+        <w:rPr>
+          <w:rStyle w:val="VerbatimChar"/>
+        </w:rPr>
+        <w:t xml:space="preserve">#sol-</w:t>
+      </w:r>
+      <w:r>
+        <w:t xml:space="preserve"> </w:t>
+      </w:r>
+      <w:r>
+        <w:t xml:space="preserve">of a split exercise answers only its own</w:t>
+      </w:r>
+      <w:r>
+        <w:t xml:space="preserve"> </w:t>
+      </w:r>
+      <w:r>
+        <w:rPr>
+          <w:rStyle w:val="VerbatimChar"/>
+        </w:rPr>
+        <w:t xml:space="preserve">#exr-</w:t>
+      </w:r>
+      <w:r>
+        <w:t xml:space="preserve">,</w:t>
+      </w:r>
+      <w:r>
+        <w:t xml:space="preserve"> </w:t>
+      </w:r>
+      <w:r>
+        <w:t xml:space="preserve">takes its slug from that exercise (see the slug rule below),</w:t>
+      </w:r>
+      <w:r>
+        <w:t xml:space="preserve"> </w:t>
+      </w:r>
+      <w:r>
+        <w:t xml:space="preserve">and sits in its own subfile after its exercise.</w:t>
+      </w:r>
+      <w:r>
+        <w:t xml:space="preserve"> </w:t>
+      </w:r>
+      <w:r>
+        <w:t xml:space="preserve">This covers code: a lab solution puts each step’s code, output and figure in the solution of the exercise that asks for it,</w:t>
+      </w:r>
+      <w:r>
+        <w:t xml:space="preserve"> </w:t>
+      </w:r>
+      <w:r>
+        <w:t xml:space="preserve">not all in the first solution.</w:t>
+      </w:r>
+      <w:r>
+        <w:t xml:space="preserve"> </w:t>
+      </w:r>
+      <w:r>
+        <w:t xml:space="preserve">A solution does not label parts such as</w:t>
+      </w:r>
+      <w:r>
+        <w:t xml:space="preserve"> </w:t>
+      </w:r>
+      <w:r>
+        <w:t xml:space="preserve">“(b)”</w:t>
+      </w:r>
+      <w:r>
+        <w:t xml:space="preserve"> </w:t>
+      </w:r>
+      <w:r>
+        <w:t xml:space="preserve">or</w:t>
+      </w:r>
+      <w:r>
+        <w:t xml:space="preserve"> </w:t>
+      </w:r>
+      <w:r>
+        <w:t xml:space="preserve">“Part 2”</w:t>
+      </w:r>
+      <w:r>
+        <w:t xml:space="preserve">,</w:t>
+      </w:r>
+      <w:r>
+        <w:t xml:space="preserve"> </w:t>
+      </w:r>
+      <w:r>
+        <w:t xml:space="preserve">and does not draw a figure that a later exercise asks for.</w:t>
+      </w:r>
+      <w:r>
+        <w:t xml:space="preserve"> </w:t>
+      </w:r>
+      <w:r>
+        <w:t xml:space="preserve">Code that a later part needs stays in the earliest solution that needs it,</w:t>
+      </w:r>
+      <w:r>
+        <w:t xml:space="preserve"> </w:t>
+      </w:r>
+      <w:r>
+        <w:t xml:space="preserve">because the page shares one session per language.</w:t>
+      </w:r>
+      <w:r>
+        <w:t xml:space="preserve"> </w:t>
+      </w:r>
+      <w:r>
+        <w:t xml:space="preserve">The</w:t>
+      </w:r>
+      <w:r>
+        <w:t xml:space="preserve"> </w:t>
+      </w:r>
+      <w:r>
+        <w:rPr>
+          <w:rStyle w:val="VerbatimChar"/>
+        </w:rPr>
+        <w:t xml:space="preserve">check-split-solutions</w:t>
+      </w:r>
+      <w:r>
+        <w:t xml:space="preserve"> </w:t>
+      </w:r>
+      <w:r>
+        <w:t xml:space="preserve">workflow in</w:t>
+      </w:r>
+      <w:r>
+        <w:t xml:space="preserve"> </w:t>
+      </w:r>
+      <w:hyperlink r:id="rId12">
+        <w:r>
+          <w:rPr>
+            <w:rStyle w:val="VerbatimChar"/>
+          </w:rPr>
+          <w:t xml:space="preserve">gha</w:t>
+        </w:r>
+      </w:hyperlink>
+      <w:r>
+        <w:t xml:space="preserve"> </w:t>
+      </w:r>
+      <w:r>
+        <w:t xml:space="preserve">enforces this</w:t>
+      </w:r>
+      <w:r>
+        <w:t xml:space="preserve"> </w:t>
+      </w:r>
+      <w:r>
+        <w:t xml:space="preserve">(</w:t>
+      </w:r>
+      <w:hyperlink r:id="rId13">
+        <w:r>
+          <w:rPr>
+            <w:rStyle w:val="Hyperlink"/>
+          </w:rPr>
+          <w:t xml:space="preserve">gha#1290</w:t>
+        </w:r>
+      </w:hyperlink>
+      <w:r>
+        <w:t xml:space="preserve">).</w:t>
+      </w:r>
+    </w:p>
+    <w:p>
+      <w:pPr>
+        <w:pStyle w:val="Compact"/>
+        <w:numPr>
+          <w:ilvl w:val="0"/>
+          <w:numId w:val="1001"/>
+        </w:numPr>
+      </w:pPr>
+      <w:r>
         <w:t xml:space="preserve">Make each exercise ask for one thing (Ezra, 2026-10-27).</w:t>
       </w:r>
       <w:r>
@@ -576,7 +745,7 @@
         <w:t xml:space="preserve">not in italic text.</w:t>
       </w:r>
     </w:p>
-    <w:bookmarkStart w:id="12" w:name="exm-exercise-before-definition"/>
+    <w:bookmarkStart w:id="14" w:name="exm-exercise-before-definition"/>
     <w:p>
       <w:pPr>
         <w:pStyle w:val="FirstParagraph"/>
@@ -733,9 +902,9 @@
         <w:t xml:space="preserve">before they see the formal definition.</w:t>
       </w:r>
     </w:p>
-    <w:bookmarkEnd w:id="12"/>
-    <w:bookmarkEnd w:id="13"/>
-    <w:bookmarkStart w:id="18" w:name="Xb68f5757ebba706c680e7c5ed557ac14973d7af"/>
+    <w:bookmarkEnd w:id="14"/>
+    <w:bookmarkEnd w:id="15"/>
+    <w:bookmarkStart w:id="20" w:name="Xb68f5757ebba706c680e7c5ed557ac14973d7af"/>
     <w:p>
       <w:pPr>
         <w:pStyle w:val="Heading2"/>
@@ -798,7 +967,7 @@
       <w:r>
         <w:t xml:space="preserve"> </w:t>
       </w:r>
-      <w:hyperlink r:id="rId14">
+      <w:hyperlink r:id="rId16">
         <w:r>
           <w:rPr>
             <w:rStyle w:val="Hyperlink"/>
@@ -878,7 +1047,7 @@
       <w:r>
         <w:t xml:space="preserve"> </w:t>
       </w:r>
-      <w:hyperlink r:id="rId15">
+      <w:hyperlink r:id="rId17">
         <w:r>
           <w:rPr>
             <w:rStyle w:val="Hyperlink"/>
@@ -904,7 +1073,7 @@
       <w:r>
         <w:t xml:space="preserve"> </w:t>
       </w:r>
-      <w:hyperlink r:id="rId16">
+      <w:hyperlink r:id="rId18">
         <w:r>
           <w:rPr>
             <w:rStyle w:val="Hyperlink"/>
@@ -995,7 +1164,7 @@
         <w:t xml:space="preserve">When a unit still looks long, ask what could be named and moved out.</w:t>
       </w:r>
     </w:p>
-    <w:bookmarkStart w:id="17" w:name="exm-atomic-units"/>
+    <w:bookmarkStart w:id="19" w:name="exm-atomic-units"/>
     <w:p>
       <w:pPr>
         <w:pStyle w:val="BodyText"/>
@@ -1044,9 +1213,9 @@
         <w:t xml:space="preserve">and each piece fits on a slide.</w:t>
       </w:r>
     </w:p>
-    <w:bookmarkEnd w:id="17"/>
-    <w:bookmarkEnd w:id="18"/>
-    <w:bookmarkStart w:id="20" w:name="say-what-a-yes-or-no-answer-means"/>
+    <w:bookmarkEnd w:id="19"/>
+    <w:bookmarkEnd w:id="20"/>
+    <w:bookmarkStart w:id="22" w:name="say-what-a-yes-or-no-answer-means"/>
     <w:p>
       <w:pPr>
         <w:pStyle w:val="Heading2"/>
@@ -1147,7 +1316,7 @@
         <w:t xml:space="preserve">The rule covers solutions, worked examples and any other answer to a question.</w:t>
       </w:r>
     </w:p>
-    <w:bookmarkStart w:id="19" w:name="exm-yes-no-conclusion"/>
+    <w:bookmarkStart w:id="21" w:name="exm-yes-no-conclusion"/>
     <w:p>
       <w:pPr>
         <w:pStyle w:val="BodyText"/>
@@ -1230,9 +1399,9 @@
         <w:t xml:space="preserve">so the reasons that follow support a claim the reader has already seen.</w:t>
       </w:r>
     </w:p>
-    <w:bookmarkEnd w:id="19"/>
-    <w:bookmarkEnd w:id="20"/>
-    <w:bookmarkStart w:id="21" w:name="Xcb2ea076bd2bdcde187ea355befd37150b69b89"/>
+    <w:bookmarkEnd w:id="21"/>
+    <w:bookmarkEnd w:id="22"/>
+    <w:bookmarkStart w:id="23" w:name="Xcb2ea076bd2bdcde187ea355befd37150b69b89"/>
     <w:p>
       <w:pPr>
         <w:pStyle w:val="Heading2"/>
@@ -1285,8 +1454,8 @@
         <w:t xml:space="preserve">No automated check enforces this rule, because a script cannot tell how many questions a prompt asks.</w:t>
       </w:r>
     </w:p>
-    <w:bookmarkEnd w:id="21"/>
-    <w:bookmarkStart w:id="24" w:name="give-each-defined-term-its-own-div"/>
+    <w:bookmarkEnd w:id="23"/>
+    <w:bookmarkStart w:id="26" w:name="give-each-defined-term-its-own-div"/>
     <w:p>
       <w:pPr>
         <w:pStyle w:val="Heading2"/>
@@ -1299,7 +1468,7 @@
       <w:pPr>
         <w:pStyle w:val="FirstParagraph"/>
       </w:pPr>
-      <w:hyperlink r:id="rId22">
+      <w:hyperlink r:id="rId24">
         <w:r>
           <w:rPr>
             <w:rStyle w:val="Hyperlink"/>
@@ -1550,7 +1719,7 @@
       <w:r>
         <w:t xml:space="preserve"> </w:t>
       </w:r>
-      <w:hyperlink r:id="rId23">
+      <w:hyperlink r:id="rId25">
         <w:r>
           <w:rPr>
             <w:rStyle w:val="Hyperlink"/>
@@ -1717,8 +1886,8 @@
         <w:t xml:space="preserve">and also the points where the derivative does not exist.</w:t>
       </w:r>
     </w:p>
-    <w:bookmarkEnd w:id="24"/>
-    <w:bookmarkStart w:id="25" w:name="state-the-notation-and-its-alternatives"/>
+    <w:bookmarkEnd w:id="26"/>
+    <w:bookmarkStart w:id="27" w:name="state-the-notation-and-its-alternatives"/>
     <w:p>
       <w:pPr>
         <w:pStyle w:val="Heading2"/>
@@ -1816,8 +1985,8 @@
         <w:t xml:space="preserve">to make the choice explicit.</w:t>
       </w:r>
     </w:p>
-    <w:bookmarkEnd w:id="25"/>
-    <w:bookmarkStart w:id="27" w:name="Xac7e4ead54b12ccf6544491699a177b7d16fa22"/>
+    <w:bookmarkEnd w:id="27"/>
+    <w:bookmarkStart w:id="29" w:name="Xac7e4ead54b12ccf6544491699a177b7d16fa22"/>
     <w:p>
       <w:pPr>
         <w:pStyle w:val="Heading2"/>
@@ -1848,7 +2017,7 @@
       <w:r>
         <w:t xml:space="preserve"> </w:t>
       </w:r>
-      <w:hyperlink r:id="rId26">
+      <w:hyperlink r:id="rId28">
         <w:r>
           <w:rPr>
             <w:rStyle w:val="Hyperlink"/>
@@ -2094,8 +2263,8 @@
         <w:t xml:space="preserve">The conventional form still appears in the notes, as a named result.</w:t>
       </w:r>
     </w:p>
-    <w:bookmarkEnd w:id="27"/>
-    <w:bookmarkStart w:id="28" w:name="reuse-one-written-version-of-each-result"/>
+    <w:bookmarkEnd w:id="29"/>
+    <w:bookmarkStart w:id="30" w:name="reuse-one-written-version-of-each-result"/>
     <w:p>
       <w:pPr>
         <w:pStyle w:val="Heading2"/>
@@ -2136,8 +2305,8 @@
         <w:t xml:space="preserve">instead of keeping a second wording that can drift.</w:t>
       </w:r>
     </w:p>
-    <w:bookmarkEnd w:id="28"/>
-    <w:bookmarkStart w:id="30" w:name="use-real-data-and-compute-every-number"/>
+    <w:bookmarkEnd w:id="30"/>
+    <w:bookmarkStart w:id="32" w:name="use-real-data-and-compute-every-number"/>
     <w:p>
       <w:pPr>
         <w:pStyle w:val="Heading2"/>
@@ -2266,7 +2435,7 @@
         <w:t xml:space="preserve">A number typed into prose goes stale when the data or the code changes.</w:t>
       </w:r>
     </w:p>
-    <w:bookmarkStart w:id="29" w:name="exm-show-data-first"/>
+    <w:bookmarkStart w:id="31" w:name="exm-show-data-first"/>
     <w:p>
       <w:pPr>
         <w:pStyle w:val="FirstParagraph"/>
@@ -2339,9 +2508,9 @@
         <w:t xml:space="preserve">The ✅ version lets every later slide refer to something the reader has already seen.</w:t>
       </w:r>
     </w:p>
-    <w:bookmarkEnd w:id="29"/>
-    <w:bookmarkEnd w:id="30"/>
-    <w:bookmarkStart w:id="31" w:name="Xa214254a94aa6db868b5b9577007bf4e27699b1"/>
+    <w:bookmarkEnd w:id="31"/>
+    <w:bookmarkEnd w:id="32"/>
+    <w:bookmarkStart w:id="33" w:name="Xa214254a94aa6db868b5b9577007bf4e27699b1"/>
     <w:p>
       <w:pPr>
         <w:pStyle w:val="Heading2"/>
@@ -2372,7 +2541,7 @@
       <w:r>
         <w:t xml:space="preserve"> </w:t>
       </w:r>
-      <w:hyperlink r:id="rId16">
+      <w:hyperlink r:id="rId18">
         <w:r>
           <w:rPr>
             <w:rStyle w:val="Hyperlink"/>
@@ -2480,8 +2649,8 @@
         <w:t xml:space="preserve">A short list that no other page reads can stay as prose.</w:t>
       </w:r>
     </w:p>
-    <w:bookmarkEnd w:id="31"/>
-    <w:bookmarkStart w:id="37" w:name="show-each-idea-applied-and-in-a-figure"/>
+    <w:bookmarkEnd w:id="33"/>
+    <w:bookmarkStart w:id="38" w:name="show-each-idea-applied-and-in-a-figure"/>
     <w:p>
       <w:pPr>
         <w:pStyle w:val="Heading2"/>
@@ -2624,7 +2793,7 @@
       <w:r>
         <w:t xml:space="preserve"> </w:t>
       </w:r>
-      <w:hyperlink r:id="rId32">
+      <w:hyperlink r:id="rId34">
         <w:r>
           <w:rPr>
             <w:rStyle w:val="Hyperlink"/>
@@ -2770,7 +2939,7 @@
       <w:r>
         <w:t xml:space="preserve"> </w:t>
       </w:r>
-      <w:hyperlink r:id="rId33">
+      <w:hyperlink r:id="rId12">
         <w:r>
           <w:rPr>
             <w:rStyle w:val="VerbatimChar"/>
@@ -2805,7 +2974,7 @@
       <w:r>
         <w:t xml:space="preserve">(</w:t>
       </w:r>
-      <w:hyperlink r:id="rId34">
+      <w:hyperlink r:id="rId35">
         <w:r>
           <w:rPr>
             <w:rStyle w:val="Hyperlink"/>
@@ -3015,7 +3184,7 @@
       <w:r>
         <w:t xml:space="preserve"> </w:t>
       </w:r>
-      <w:hyperlink r:id="rId33">
+      <w:hyperlink r:id="rId12">
         <w:r>
           <w:rPr>
             <w:rStyle w:val="VerbatimChar"/>
@@ -3062,7 +3231,7 @@
       <w:r>
         <w:t xml:space="preserve">(</w:t>
       </w:r>
-      <w:hyperlink r:id="rId35">
+      <w:hyperlink r:id="rId36">
         <w:r>
           <w:rPr>
             <w:rStyle w:val="Hyperlink"/>
@@ -3160,7 +3329,7 @@
       <w:r>
         <w:t xml:space="preserve"> </w:t>
       </w:r>
-      <w:hyperlink r:id="rId36">
+      <w:hyperlink r:id="rId37">
         <w:r>
           <w:rPr>
             <w:rStyle w:val="Hyperlink"/>
@@ -3187,8 +3356,8 @@
         <w:t xml:space="preserve">Make each figure follow the accessibility rules below.</w:t>
       </w:r>
     </w:p>
-    <w:bookmarkEnd w:id="37"/>
-    <w:bookmarkStart w:id="39" w:name="X7f95f8ec3b796fc99108c37bb45d62741b824c4"/>
+    <w:bookmarkEnd w:id="38"/>
+    <w:bookmarkStart w:id="40" w:name="X7f95f8ec3b796fc99108c37bb45d62741b824c4"/>
     <w:p>
       <w:pPr>
         <w:pStyle w:val="Heading2"/>
@@ -3381,7 +3550,7 @@
       <w:r>
         <w:t xml:space="preserve"> </w:t>
       </w:r>
-      <w:hyperlink r:id="rId22">
+      <w:hyperlink r:id="rId24">
         <w:r>
           <w:rPr>
             <w:rStyle w:val="Hyperlink"/>
@@ -3426,7 +3595,7 @@
         <w:t xml:space="preserve">Give the practice exercise its own slug and follow the numbering and slide-break rules above.</w:t>
       </w:r>
     </w:p>
-    <w:bookmarkStart w:id="38" w:name="exm-practice-after-example"/>
+    <w:bookmarkStart w:id="39" w:name="exm-practice-after-example"/>
     <w:p>
       <w:pPr>
         <w:pStyle w:val="FirstParagraph"/>
@@ -3582,9 +3751,9 @@
         <w:t xml:space="preserve">).</w:t>
       </w:r>
     </w:p>
-    <w:bookmarkEnd w:id="38"/>
     <w:bookmarkEnd w:id="39"/>
-    <w:bookmarkStart w:id="43" w:name="Xf27331f4c36c8d578e5fa29a37312484cc3343a"/>
+    <w:bookmarkEnd w:id="40"/>
+    <w:bookmarkStart w:id="44" w:name="Xf27331f4c36c8d578e5fa29a37312484cc3343a"/>
     <w:p>
       <w:pPr>
         <w:pStyle w:val="Heading2"/>
@@ -3702,7 +3871,7 @@
       <w:r>
         <w:t xml:space="preserve"> </w:t>
       </w:r>
-      <w:hyperlink r:id="rId40">
+      <w:hyperlink r:id="rId41">
         <w:r>
           <w:rPr>
             <w:rStyle w:val="Hyperlink"/>
@@ -3728,7 +3897,7 @@
       <w:r>
         <w:t xml:space="preserve"> </w:t>
       </w:r>
-      <w:hyperlink r:id="rId41">
+      <w:hyperlink r:id="rId42">
         <w:r>
           <w:rPr>
             <w:rStyle w:val="Hyperlink"/>
@@ -3796,7 +3965,7 @@
       <w:r>
         <w:t xml:space="preserve"> </w:t>
       </w:r>
-      <w:hyperlink r:id="rId42">
+      <w:hyperlink r:id="rId43">
         <w:r>
           <w:rPr>
             <w:rStyle w:val="Hyperlink"/>
@@ -3967,8 +4136,8 @@
         <w:t xml:space="preserve">so setup steps must work on a shared or hosted machine.</w:t>
       </w:r>
     </w:p>
-    <w:bookmarkEnd w:id="43"/>
-    <w:bookmarkStart w:id="44" w:name="Xf53ecb3398b87b82ffd1a126dd02e87a65bb694"/>
+    <w:bookmarkEnd w:id="44"/>
+    <w:bookmarkStart w:id="45" w:name="Xf53ecb3398b87b82ffd1a126dd02e87a65bb694"/>
     <w:p>
       <w:pPr>
         <w:pStyle w:val="Heading2"/>
@@ -4236,8 +4405,8 @@
         <w:t xml:space="preserve">End each such call with a semicolon, or assign its value.</w:t>
       </w:r>
     </w:p>
-    <w:bookmarkEnd w:id="44"/>
-    <w:bookmarkStart w:id="53" w:name="present-r-results-with-modern-packages"/>
+    <w:bookmarkEnd w:id="45"/>
+    <w:bookmarkStart w:id="54" w:name="present-r-results-with-modern-packages"/>
     <w:p>
       <w:pPr>
         <w:pStyle w:val="Heading2"/>
@@ -4322,7 +4491,7 @@
       <w:r>
         <w:t xml:space="preserve"> </w:t>
       </w:r>
-      <w:hyperlink r:id="rId45">
+      <w:hyperlink r:id="rId46">
         <w:r>
           <w:rPr>
             <w:rStyle w:val="Hyperlink"/>
@@ -4354,7 +4523,7 @@
       <w:r>
         <w:t xml:space="preserve"> </w:t>
       </w:r>
-      <w:hyperlink r:id="rId46">
+      <w:hyperlink r:id="rId47">
         <w:r>
           <w:rPr>
             <w:rStyle w:val="Hyperlink"/>
@@ -4428,7 +4597,7 @@
       <w:r>
         <w:t xml:space="preserve"> </w:t>
       </w:r>
-      <w:hyperlink r:id="rId47">
+      <w:hyperlink r:id="rId48">
         <w:r>
           <w:rPr>
             <w:rStyle w:val="Hyperlink"/>
@@ -4499,7 +4668,7 @@
       <w:r>
         <w:t xml:space="preserve"> </w:t>
       </w:r>
-      <w:hyperlink r:id="rId48">
+      <w:hyperlink r:id="rId49">
         <w:r>
           <w:rPr>
             <w:rStyle w:val="Hyperlink"/>
@@ -4516,7 +4685,7 @@
       <w:r>
         <w:t xml:space="preserve"> </w:t>
       </w:r>
-      <w:hyperlink r:id="rId49">
+      <w:hyperlink r:id="rId50">
         <w:r>
           <w:rPr>
             <w:rStyle w:val="Hyperlink"/>
@@ -4539,7 +4708,7 @@
       <w:r>
         <w:t xml:space="preserve"> </w:t>
       </w:r>
-      <w:hyperlink r:id="rId50">
+      <w:hyperlink r:id="rId51">
         <w:r>
           <w:rPr>
             <w:rStyle w:val="Hyperlink"/>
@@ -4595,7 +4764,7 @@
       <w:r>
         <w:t xml:space="preserve"> </w:t>
       </w:r>
-      <w:hyperlink r:id="rId51">
+      <w:hyperlink r:id="rId52">
         <w:r>
           <w:rPr>
             <w:rStyle w:val="Hyperlink"/>
@@ -4633,7 +4802,7 @@
       <w:r>
         <w:t xml:space="preserve"> </w:t>
       </w:r>
-      <w:hyperlink r:id="rId52">
+      <w:hyperlink r:id="rId53">
         <w:r>
           <w:rPr>
             <w:rStyle w:val="Hyperlink"/>
@@ -4648,8 +4817,8 @@
         <w:t xml:space="preserve">notes show the style.</w:t>
       </w:r>
     </w:p>
-    <w:bookmarkEnd w:id="53"/>
-    <w:bookmarkStart w:id="57" w:name="manipulate-data-with-dplyr-not-base-r"/>
+    <w:bookmarkEnd w:id="54"/>
+    <w:bookmarkStart w:id="58" w:name="manipulate-data-with-dplyr-not-base-r"/>
     <w:p>
       <w:pPr>
         <w:pStyle w:val="Heading2"/>
@@ -4686,7 +4855,7 @@
       <w:r>
         <w:t xml:space="preserve"> </w:t>
       </w:r>
-      <w:hyperlink r:id="rId54">
+      <w:hyperlink r:id="rId55">
         <w:r>
           <w:rPr>
             <w:rStyle w:val="Hyperlink"/>
@@ -4844,7 +5013,7 @@
       <w:r>
         <w:t xml:space="preserve"> </w:t>
       </w:r>
-      <w:hyperlink r:id="rId55">
+      <w:hyperlink r:id="rId56">
         <w:r>
           <w:rPr>
             <w:rStyle w:val="Hyperlink"/>
@@ -4936,7 +5105,7 @@
       <w:r>
         <w:t xml:space="preserve"> </w:t>
       </w:r>
-      <w:hyperlink r:id="rId56">
+      <w:hyperlink r:id="rId57">
         <w:r>
           <w:rPr>
             <w:rStyle w:val="Hyperlink"/>
@@ -5128,8 +5297,8 @@
         <w:t xml:space="preserve">The rule is about selecting, filtering and building data frames.</w:t>
       </w:r>
     </w:p>
-    <w:bookmarkEnd w:id="57"/>
-    <w:bookmarkStart w:id="59" w:name="X2bc6121e3a2f39a37d8a6591d77df16bd22bd0b"/>
+    <w:bookmarkEnd w:id="58"/>
+    <w:bookmarkStart w:id="60" w:name="X2bc6121e3a2f39a37d8a6591d77df16bd22bd0b"/>
     <w:p>
       <w:pPr>
         <w:pStyle w:val="Heading2"/>
@@ -5222,7 +5391,7 @@
       <w:r>
         <w:t xml:space="preserve"> </w:t>
       </w:r>
-      <w:hyperlink r:id="rId58">
+      <w:hyperlink r:id="rId59">
         <w:r>
           <w:rPr>
             <w:rStyle w:val="Hyperlink"/>
@@ -5399,8 +5568,8 @@
         <w:t xml:space="preserve">directory it creates.</w:t>
       </w:r>
     </w:p>
-    <w:bookmarkEnd w:id="59"/>
-    <w:bookmarkStart w:id="60" w:name="X7c0de8eaf50a5b2644eabf66f1f9b734b8a4a71"/>
+    <w:bookmarkEnd w:id="60"/>
+    <w:bookmarkStart w:id="61" w:name="X7c0de8eaf50a5b2644eabf66f1f9b734b8a4a71"/>
     <w:p>
       <w:pPr>
         <w:pStyle w:val="Heading2"/>
@@ -5575,8 +5744,8 @@
         <w:t xml:space="preserve">such as a transformation, a modeling choice, a tuning value or a random seed.</w:t>
       </w:r>
     </w:p>
-    <w:bookmarkEnd w:id="60"/>
-    <w:bookmarkStart w:id="61" w:name="X94063c6448bea82c8f1e8d367c642bbe2eda89b"/>
+    <w:bookmarkEnd w:id="61"/>
+    <w:bookmarkStart w:id="62" w:name="X94063c6448bea82c8f1e8d367c642bbe2eda89b"/>
     <w:p>
       <w:pPr>
         <w:pStyle w:val="Heading2"/>
@@ -5816,8 +5985,8 @@
         <w:t xml:space="preserve">.</w:t>
       </w:r>
     </w:p>
-    <w:bookmarkEnd w:id="61"/>
-    <w:bookmarkStart w:id="62" w:name="Xffa5a3357c8672d830c88e1e58a0ef107550647"/>
+    <w:bookmarkEnd w:id="62"/>
+    <w:bookmarkStart w:id="63" w:name="Xffa5a3357c8672d830c88e1e58a0ef107550647"/>
     <w:p>
       <w:pPr>
         <w:pStyle w:val="Heading2"/>
@@ -5942,8 +6111,8 @@
         <w:t xml:space="preserve">A chapter introduces those where it defines them.</w:t>
       </w:r>
     </w:p>
-    <w:bookmarkEnd w:id="62"/>
-    <w:bookmarkStart w:id="63" w:name="make-figures-accessible"/>
+    <w:bookmarkEnd w:id="63"/>
+    <w:bookmarkStart w:id="64" w:name="make-figures-accessible"/>
     <w:p>
       <w:pPr>
         <w:pStyle w:val="Heading2"/>
@@ -6078,8 +6247,8 @@
         <w:t xml:space="preserve">(observed when rendering lecture notes to PDF).</w:t>
       </w:r>
     </w:p>
-    <w:bookmarkEnd w:id="63"/>
-    <w:bookmarkStart w:id="65" w:name="structure-slides-for-the-reader"/>
+    <w:bookmarkEnd w:id="64"/>
+    <w:bookmarkStart w:id="66" w:name="structure-slides-for-the-reader"/>
     <w:p>
       <w:pPr>
         <w:pStyle w:val="Heading2"/>
@@ -6138,7 +6307,7 @@
       <w:r>
         <w:t xml:space="preserve"> </w:t>
       </w:r>
-      <w:hyperlink r:id="rId64">
+      <w:hyperlink r:id="rId65">
         <w:r>
           <w:rPr>
             <w:rStyle w:val="Hyperlink"/>
@@ -6378,8 +6547,8 @@
         <w:t xml:space="preserve">Put a slide break after the heading and move the text onto content slides.</w:t>
       </w:r>
     </w:p>
-    <w:bookmarkEnd w:id="65"/>
-    <w:bookmarkStart w:id="67" w:name="X5f21f12cbfc4e3df5e838110af4e52db506fec1"/>
+    <w:bookmarkEnd w:id="66"/>
+    <w:bookmarkStart w:id="68" w:name="X5f21f12cbfc4e3df5e838110af4e52db506fec1"/>
     <w:p>
       <w:pPr>
         <w:pStyle w:val="Heading2"/>
@@ -6502,7 +6671,7 @@
       <w:r>
         <w:t xml:space="preserve"> </w:t>
       </w:r>
-      <w:hyperlink r:id="rId15">
+      <w:hyperlink r:id="rId17">
         <w:r>
           <w:rPr>
             <w:rStyle w:val="Hyperlink"/>
@@ -6522,7 +6691,7 @@
         <w:t xml:space="preserve">The same rule applies to every other reference table, such as a table of notation.</w:t>
       </w:r>
     </w:p>
-    <w:bookmarkStart w:id="66" w:name="exm-note-sheet-rows"/>
+    <w:bookmarkStart w:id="67" w:name="exm-note-sheet-rows"/>
     <w:p>
       <w:pPr>
         <w:pStyle w:val="BodyText"/>
@@ -6613,9 +6782,9 @@
         <w:t xml:space="preserve">The ✅ rows let the reader find one formula by one label.</w:t>
       </w:r>
     </w:p>
-    <w:bookmarkEnd w:id="66"/>
     <w:bookmarkEnd w:id="67"/>
-    <w:bookmarkStart w:id="68" w:name="talk-about-the-ideas-not-the-notes"/>
+    <w:bookmarkEnd w:id="68"/>
+    <w:bookmarkStart w:id="69" w:name="talk-about-the-ideas-not-the-notes"/>
     <w:p>
       <w:pPr>
         <w:pStyle w:val="Heading2"/>
@@ -6634,7 +6803,7 @@
       <w:r>
         <w:t xml:space="preserve"> </w:t>
       </w:r>
-      <w:hyperlink r:id="rId16">
+      <w:hyperlink r:id="rId18">
         <w:r>
           <w:rPr>
             <w:rStyle w:val="Hyperlink"/>
@@ -6804,8 +6973,8 @@
         <w:t xml:space="preserve">and it goes stale when the definition moves.</w:t>
       </w:r>
     </w:p>
-    <w:bookmarkEnd w:id="68"/>
-    <w:bookmarkStart w:id="70" w:name="write-grading-rubrics-as-checklists"/>
+    <w:bookmarkEnd w:id="69"/>
+    <w:bookmarkStart w:id="71" w:name="write-grading-rubrics-as-checklists"/>
     <w:p>
       <w:pPr>
         <w:pStyle w:val="Heading2"/>
@@ -6981,7 +7150,7 @@
         <w:t xml:space="preserve">such as a single holistic judgment of a proof’s rigor.</w:t>
       </w:r>
     </w:p>
-    <w:bookmarkStart w:id="69" w:name="exm-rubric-checklist"/>
+    <w:bookmarkStart w:id="70" w:name="exm-rubric-checklist"/>
     <w:p>
       <w:pPr>
         <w:pStyle w:val="FirstParagraph"/>
@@ -7234,9 +7403,9 @@
         <w:t xml:space="preserve">and lets a script check that the points sum to the total.</w:t>
       </w:r>
     </w:p>
-    <w:bookmarkEnd w:id="69"/>
     <w:bookmarkEnd w:id="70"/>
-    <w:bookmarkStart w:id="74" w:name="Xcb579568ef754486ebde8b41ba4528bdf380eec"/>
+    <w:bookmarkEnd w:id="71"/>
+    <w:bookmarkStart w:id="75" w:name="Xcb579568ef754486ebde8b41ba4528bdf380eec"/>
     <w:p>
       <w:pPr>
         <w:pStyle w:val="Heading2"/>
@@ -7295,7 +7464,7 @@
       <w:r>
         <w:t xml:space="preserve"> </w:t>
       </w:r>
-      <w:hyperlink r:id="rId71">
+      <w:hyperlink r:id="rId72">
         <w:r>
           <w:rPr>
             <w:rStyle w:val="Hyperlink"/>
@@ -7351,7 +7520,7 @@
       <w:r>
         <w:t xml:space="preserve"> </w:t>
       </w:r>
-      <w:hyperlink r:id="rId72">
+      <w:hyperlink r:id="rId73">
         <w:r>
           <w:rPr>
             <w:rStyle w:val="Hyperlink"/>
@@ -7380,7 +7549,7 @@
       <w:r>
         <w:t xml:space="preserve"> </w:t>
       </w:r>
-      <w:hyperlink r:id="rId73">
+      <w:hyperlink r:id="rId74">
         <w:r>
           <w:rPr>
             <w:rStyle w:val="Hyperlink"/>
@@ -7413,8 +7582,8 @@
         <w:t xml:space="preserve">because a bare citation key renders as the author list.</w:t>
       </w:r>
     </w:p>
-    <w:bookmarkEnd w:id="74"/>
-    <w:bookmarkStart w:id="83" w:name="rules-that-apply-to-all-writing"/>
+    <w:bookmarkEnd w:id="75"/>
+    <w:bookmarkStart w:id="84" w:name="rules-that-apply-to-all-writing"/>
     <w:p>
       <w:pPr>
         <w:pStyle w:val="Heading2"/>
@@ -7439,7 +7608,7 @@
           <w:numId w:val="1023"/>
         </w:numPr>
       </w:pPr>
-      <w:hyperlink r:id="rId75">
+      <w:hyperlink r:id="rId76">
         <w:r>
           <w:rPr>
             <w:rStyle w:val="Hyperlink"/>
@@ -7459,7 +7628,7 @@
           <w:numId w:val="1023"/>
         </w:numPr>
       </w:pPr>
-      <w:hyperlink r:id="rId76">
+      <w:hyperlink r:id="rId77">
         <w:r>
           <w:rPr>
             <w:rStyle w:val="Hyperlink"/>
@@ -7482,7 +7651,7 @@
           <w:numId w:val="1023"/>
         </w:numPr>
       </w:pPr>
-      <w:hyperlink r:id="rId77">
+      <w:hyperlink r:id="rId78">
         <w:r>
           <w:rPr>
             <w:rStyle w:val="Hyperlink"/>
@@ -7502,7 +7671,7 @@
           <w:numId w:val="1023"/>
         </w:numPr>
       </w:pPr>
-      <w:hyperlink r:id="rId78">
+      <w:hyperlink r:id="rId79">
         <w:r>
           <w:rPr>
             <w:rStyle w:val="Hyperlink"/>
@@ -7525,7 +7694,7 @@
           <w:numId w:val="1023"/>
         </w:numPr>
       </w:pPr>
-      <w:hyperlink r:id="rId79">
+      <w:hyperlink r:id="rId80">
         <w:r>
           <w:rPr>
             <w:rStyle w:val="Hyperlink"/>
@@ -7537,8 +7706,8 @@
         <w:t xml:space="preserve">.</w:t>
       </w:r>
     </w:p>
-    <w:bookmarkStart w:id="82" w:name="refs"/>
-    <w:bookmarkStart w:id="81" w:name="ref-freeman2014active"/>
+    <w:bookmarkStart w:id="83" w:name="refs"/>
+    <w:bookmarkStart w:id="82" w:name="ref-freeman2014active"/>
     <w:p>
       <w:pPr>
         <w:pStyle w:val="Bibliography"/>
@@ -7571,7 +7740,7 @@
       <w:r>
         <w:t xml:space="preserve"> </w:t>
       </w:r>
-      <w:hyperlink r:id="rId80">
+      <w:hyperlink r:id="rId81">
         <w:r>
           <w:rPr>
             <w:rStyle w:val="Hyperlink"/>
@@ -7583,9 +7752,9 @@
         <w:t xml:space="preserve">.</w:t>
       </w:r>
     </w:p>
-    <w:bookmarkEnd w:id="81"/>
     <w:bookmarkEnd w:id="82"/>
     <w:bookmarkEnd w:id="83"/>
+    <w:bookmarkEnd w:id="84"/>
     <w:sectPr>
       <w:footnotePr>
         <w:numRestart w:val="eachSect"/>

</xml_diff>

<commit_message>
Deploying to gh-pages from @ Morrison-Lab/psw@8227e35cbfbf0600dcebad2cc2fdfa2455129e49 🚀
</commit_message>
<xml_diff>
--- a/chapters/teaching.docx
+++ b/chapters/teaching.docx
@@ -15,7 +15,7 @@
         <w:pStyle w:val="Date"/>
       </w:pPr>
       <w:r>
-        <w:t xml:space="preserve">Last modified: 2026-10-29 00:12:59 (PDT)</w:t>
+        <w:t xml:space="preserve">Last modified: 2026-10-29 00:21:17 (PDT)</w:t>
       </w:r>
     </w:p>
     <w:tbl>
@@ -172,7 +172,7 @@
         <w:t xml:space="preserve">This chapter adds the rules that apply to teaching materials in particular.</w:t>
       </w:r>
     </w:p>
-    <w:bookmarkStart w:id="15" w:name="X54d80540a68b433948113395869433e0fc9698c"/>
+    <w:bookmarkStart w:id="16" w:name="X54d80540a68b433948113395869433e0fc9698c"/>
     <w:p>
       <w:pPr>
         <w:pStyle w:val="Heading2"/>
@@ -327,121 +327,19 @@
         </w:numPr>
       </w:pPr>
       <w:r>
-        <w:t xml:space="preserve">Give each bottom-level prompt its own</w:t>
-      </w:r>
-      <w:r>
-        <w:t xml:space="preserve"> </w:t>
-      </w:r>
-      <w:r>
-        <w:rPr>
-          <w:rStyle w:val="VerbatimChar"/>
-        </w:rPr>
-        <w:t xml:space="preserve">#exr-</w:t>
-      </w:r>
-      <w:r>
-        <w:t xml:space="preserve"> </w:t>
-      </w:r>
-      <w:r>
-        <w:t xml:space="preserve">div and its own</w:t>
-      </w:r>
-      <w:r>
-        <w:t xml:space="preserve"> </w:t>
-      </w:r>
-      <w:r>
-        <w:rPr>
-          <w:rStyle w:val="VerbatimChar"/>
-        </w:rPr>
-        <w:t xml:space="preserve">#sol-</w:t>
-      </w:r>
-      <w:r>
-        <w:t xml:space="preserve"> </w:t>
-      </w:r>
-      <w:r>
-        <w:t xml:space="preserve">div,</w:t>
-      </w:r>
-      <w:r>
-        <w:t xml:space="preserve"> </w:t>
-      </w:r>
-      <w:r>
-        <w:t xml:space="preserve">in order, rather than one exercise with parts (a) through (e).</w:t>
-      </w:r>
-      <w:r>
-        <w:t xml:space="preserve"> </w:t>
-      </w:r>
-      <w:r>
-        <w:t xml:space="preserve">Any exercise with several parts is split, however the parts are marked:</w:t>
-      </w:r>
-      <w:r>
-        <w:t xml:space="preserve"> </w:t>
-      </w:r>
-      <w:r>
-        <w:t xml:space="preserve">letters, numbers or bullets.</w:t>
-      </w:r>
-      <w:r>
-        <w:t xml:space="preserve"> </w:t>
-      </w:r>
-      <w:r>
-        <w:t xml:space="preserve">Put the shared setup in the first exercise,</w:t>
-      </w:r>
-      <w:r>
-        <w:t xml:space="preserve"> </w:t>
-      </w:r>
-      <w:r>
-        <w:t xml:space="preserve">and begin each later exercise by citing it, as in</w:t>
-      </w:r>
-      <w:r>
-        <w:t xml:space="preserve"> </w:t>
-      </w:r>
-      <w:r>
-        <w:t xml:space="preserve">“Make the assumptions of the first exercise.”</w:t>
-      </w:r>
-      <w:r>
-        <w:t xml:space="preserve"> </w:t>
-      </w:r>
-      <w:r>
-        <w:t xml:space="preserve">Later exercises can use earlier results through cross-references.</w:t>
-      </w:r>
-    </w:p>
-    <w:p>
-      <w:pPr>
-        <w:pStyle w:val="Compact"/>
-        <w:numPr>
-          <w:ilvl w:val="0"/>
-          <w:numId w:val="1001"/>
-        </w:numPr>
-      </w:pPr>
-      <w:r>
-        <w:t xml:space="preserve">Split the solution the same way as its exercise (Ezra, 2026-10-28).</w:t>
-      </w:r>
-      <w:r>
-        <w:t xml:space="preserve"> </w:t>
-      </w:r>
-      <w:r>
-        <w:t xml:space="preserve">Each</w:t>
-      </w:r>
-      <w:r>
-        <w:t xml:space="preserve"> </w:t>
-      </w:r>
-      <w:r>
-        <w:rPr>
-          <w:rStyle w:val="VerbatimChar"/>
-        </w:rPr>
-        <w:t xml:space="preserve">#sol-</w:t>
-      </w:r>
-      <w:r>
-        <w:t xml:space="preserve"> </w:t>
-      </w:r>
-      <w:r>
-        <w:t xml:space="preserve">of a split exercise answers only its own</w:t>
-      </w:r>
-      <w:r>
-        <w:t xml:space="preserve"> </w:t>
-      </w:r>
-      <w:r>
-        <w:rPr>
-          <w:rStyle w:val="VerbatimChar"/>
-        </w:rPr>
-        <w:t xml:space="preserve">#exr-</w:t>
+        <w:t xml:space="preserve">Restate every result that a solution first derives in its own theorem-type div</w:t>
+      </w:r>
+      <w:r>
+        <w:t xml:space="preserve"> </w:t>
+      </w:r>
+      <w:r>
+        <w:t xml:space="preserve">(</w:t>
+      </w:r>
+      <w:r>
+        <w:rPr>
+          <w:rStyle w:val="VerbatimChar"/>
+        </w:rPr>
+        <w:t xml:space="preserve">#thm-</w:t>
       </w:r>
       <w:r>
         <w:t xml:space="preserve">,</w:t>
@@ -450,37 +348,22 @@
         <w:t xml:space="preserve"> </w:t>
       </w:r>
       <w:r>
-        <w:t xml:space="preserve">takes its slug from that exercise (see the slug rule below),</w:t>
-      </w:r>
-      <w:r>
-        <w:t xml:space="preserve"> </w:t>
-      </w:r>
-      <w:r>
-        <w:t xml:space="preserve">and sits in its own subfile after its exercise.</w:t>
-      </w:r>
-      <w:r>
-        <w:t xml:space="preserve"> </w:t>
-      </w:r>
-      <w:r>
-        <w:t xml:space="preserve">This covers code: a lab solution puts each step’s code, output and figure in the solution of the exercise that asks for it,</w:t>
-      </w:r>
-      <w:r>
-        <w:t xml:space="preserve"> </w:t>
-      </w:r>
-      <w:r>
-        <w:t xml:space="preserve">not all in the first solution.</w:t>
-      </w:r>
-      <w:r>
-        <w:t xml:space="preserve"> </w:t>
-      </w:r>
-      <w:r>
-        <w:t xml:space="preserve">A solution does not label parts such as</w:t>
-      </w:r>
-      <w:r>
-        <w:t xml:space="preserve"> </w:t>
-      </w:r>
-      <w:r>
-        <w:t xml:space="preserve">“(b)”</w:t>
+        <w:rPr>
+          <w:rStyle w:val="VerbatimChar"/>
+        </w:rPr>
+        <w:t xml:space="preserve">#lem-</w:t>
+      </w:r>
+      <w:r>
+        <w:t xml:space="preserve">,</w:t>
+      </w:r>
+      <w:r>
+        <w:t xml:space="preserve"> </w:t>
+      </w:r>
+      <w:r>
+        <w:rPr>
+          <w:rStyle w:val="VerbatimChar"/>
+        </w:rPr>
+        <w:t xml:space="preserve">#cor-</w:t>
       </w:r>
       <w:r>
         <w:t xml:space="preserve"> </w:t>
@@ -492,28 +375,25 @@
         <w:t xml:space="preserve"> </w:t>
       </w:r>
       <w:r>
-        <w:t xml:space="preserve">“Part 2”</w:t>
-      </w:r>
-      <w:r>
-        <w:t xml:space="preserve">,</w:t>
-      </w:r>
-      <w:r>
-        <w:t xml:space="preserve"> </w:t>
-      </w:r>
-      <w:r>
-        <w:t xml:space="preserve">and does not draw a figure that a later exercise asks for.</w:t>
-      </w:r>
-      <w:r>
-        <w:t xml:space="preserve"> </w:t>
-      </w:r>
-      <w:r>
-        <w:t xml:space="preserve">Code that a later part needs stays in the earliest solution that needs it,</w:t>
-      </w:r>
-      <w:r>
-        <w:t xml:space="preserve"> </w:t>
-      </w:r>
-      <w:r>
-        <w:t xml:space="preserve">because the page shares one session per language.</w:t>
+        <w:rPr>
+          <w:rStyle w:val="VerbatimChar"/>
+        </w:rPr>
+        <w:t xml:space="preserve">#prp-</w:t>
+      </w:r>
+      <w:r>
+        <w:t xml:space="preserve">) after the exercise (Ezra, 2026-10-29).</w:t>
+      </w:r>
+      <w:r>
+        <w:t xml:space="preserve"> </w:t>
+      </w:r>
+      <w:r>
+        <w:t xml:space="preserve">The solution shows the working,</w:t>
+      </w:r>
+      <w:r>
+        <w:t xml:space="preserve"> </w:t>
+      </w:r>
+      <w:r>
+        <w:t xml:space="preserve">and the theorem div states the result by itself, so a reader can find and cite it.</w:t>
       </w:r>
       <w:r>
         <w:t xml:space="preserve"> </w:t>
@@ -528,7 +408,7 @@
         <w:rPr>
           <w:rStyle w:val="VerbatimChar"/>
         </w:rPr>
-        <w:t xml:space="preserve">check-split-solutions</w:t>
+        <w:t xml:space="preserve">check-restated-results</w:t>
       </w:r>
       <w:r>
         <w:t xml:space="preserve"> </w:t>
@@ -551,6 +431,292 @@
         <w:t xml:space="preserve"> </w:t>
       </w:r>
       <w:r>
+        <w:t xml:space="preserve">warns about a derivation solution that a pull request edits</w:t>
+      </w:r>
+      <w:r>
+        <w:t xml:space="preserve"> </w:t>
+      </w:r>
+      <w:r>
+        <w:t xml:space="preserve">and that no theorem-type div follows</w:t>
+      </w:r>
+      <w:r>
+        <w:t xml:space="preserve"> </w:t>
+      </w:r>
+      <w:r>
+        <w:t xml:space="preserve">(</w:t>
+      </w:r>
+      <w:hyperlink r:id="rId13">
+        <w:r>
+          <w:rPr>
+            <w:rStyle w:val="Hyperlink"/>
+          </w:rPr>
+          <w:t xml:space="preserve">gha#1309</w:t>
+        </w:r>
+      </w:hyperlink>
+      <w:r>
+        <w:t xml:space="preserve">).</w:t>
+      </w:r>
+      <w:r>
+        <w:t xml:space="preserve"> </w:t>
+      </w:r>
+      <w:r>
+        <w:t xml:space="preserve">The check never sweeps existing content:</w:t>
+      </w:r>
+      <w:r>
+        <w:t xml:space="preserve"> </w:t>
+      </w:r>
+      <w:r>
+        <w:t xml:space="preserve">restate the result when you edit the passage anyway.</w:t>
+      </w:r>
+      <w:r>
+        <w:t xml:space="preserve"> </w:t>
+      </w:r>
+      <w:r>
+        <w:rPr>
+          <w:rStyle w:val="VerbatimChar"/>
+        </w:rPr>
+        <w:t xml:space="preserve">&lt;!-- restated-ok: reason --&gt;</w:t>
+      </w:r>
+      <w:r>
+        <w:t xml:space="preserve"> </w:t>
+      </w:r>
+      <w:r>
+        <w:t xml:space="preserve">in the solution exempts a result that is stated elsewhere.</w:t>
+      </w:r>
+    </w:p>
+    <w:p>
+      <w:pPr>
+        <w:pStyle w:val="Compact"/>
+        <w:numPr>
+          <w:ilvl w:val="0"/>
+          <w:numId w:val="1001"/>
+        </w:numPr>
+      </w:pPr>
+      <w:r>
+        <w:t xml:space="preserve">Give each bottom-level prompt its own</w:t>
+      </w:r>
+      <w:r>
+        <w:t xml:space="preserve"> </w:t>
+      </w:r>
+      <w:r>
+        <w:rPr>
+          <w:rStyle w:val="VerbatimChar"/>
+        </w:rPr>
+        <w:t xml:space="preserve">#exr-</w:t>
+      </w:r>
+      <w:r>
+        <w:t xml:space="preserve"> </w:t>
+      </w:r>
+      <w:r>
+        <w:t xml:space="preserve">div and its own</w:t>
+      </w:r>
+      <w:r>
+        <w:t xml:space="preserve"> </w:t>
+      </w:r>
+      <w:r>
+        <w:rPr>
+          <w:rStyle w:val="VerbatimChar"/>
+        </w:rPr>
+        <w:t xml:space="preserve">#sol-</w:t>
+      </w:r>
+      <w:r>
+        <w:t xml:space="preserve"> </w:t>
+      </w:r>
+      <w:r>
+        <w:t xml:space="preserve">div,</w:t>
+      </w:r>
+      <w:r>
+        <w:t xml:space="preserve"> </w:t>
+      </w:r>
+      <w:r>
+        <w:t xml:space="preserve">in order, rather than one exercise with parts (a) through (e).</w:t>
+      </w:r>
+      <w:r>
+        <w:t xml:space="preserve"> </w:t>
+      </w:r>
+      <w:r>
+        <w:t xml:space="preserve">Any exercise with several parts is split, however the parts are marked:</w:t>
+      </w:r>
+      <w:r>
+        <w:t xml:space="preserve"> </w:t>
+      </w:r>
+      <w:r>
+        <w:t xml:space="preserve">letters, numbers or bullets.</w:t>
+      </w:r>
+      <w:r>
+        <w:t xml:space="preserve"> </w:t>
+      </w:r>
+      <w:r>
+        <w:t xml:space="preserve">Put the shared setup in the first exercise,</w:t>
+      </w:r>
+      <w:r>
+        <w:t xml:space="preserve"> </w:t>
+      </w:r>
+      <w:r>
+        <w:t xml:space="preserve">and begin each later exercise by citing it, as in</w:t>
+      </w:r>
+      <w:r>
+        <w:t xml:space="preserve"> </w:t>
+      </w:r>
+      <w:r>
+        <w:t xml:space="preserve">“Make the assumptions of the first exercise.”</w:t>
+      </w:r>
+      <w:r>
+        <w:t xml:space="preserve"> </w:t>
+      </w:r>
+      <w:r>
+        <w:t xml:space="preserve">Later exercises can use earlier results through cross-references.</w:t>
+      </w:r>
+    </w:p>
+    <w:p>
+      <w:pPr>
+        <w:pStyle w:val="Compact"/>
+        <w:numPr>
+          <w:ilvl w:val="0"/>
+          <w:numId w:val="1001"/>
+        </w:numPr>
+      </w:pPr>
+      <w:r>
+        <w:t xml:space="preserve">Split the solution the same way as its exercise (Ezra, 2026-10-28).</w:t>
+      </w:r>
+      <w:r>
+        <w:t xml:space="preserve"> </w:t>
+      </w:r>
+      <w:r>
+        <w:t xml:space="preserve">Each</w:t>
+      </w:r>
+      <w:r>
+        <w:t xml:space="preserve"> </w:t>
+      </w:r>
+      <w:r>
+        <w:rPr>
+          <w:rStyle w:val="VerbatimChar"/>
+        </w:rPr>
+        <w:t xml:space="preserve">#sol-</w:t>
+      </w:r>
+      <w:r>
+        <w:t xml:space="preserve"> </w:t>
+      </w:r>
+      <w:r>
+        <w:t xml:space="preserve">of a split exercise answers only its own</w:t>
+      </w:r>
+      <w:r>
+        <w:t xml:space="preserve"> </w:t>
+      </w:r>
+      <w:r>
+        <w:rPr>
+          <w:rStyle w:val="VerbatimChar"/>
+        </w:rPr>
+        <w:t xml:space="preserve">#exr-</w:t>
+      </w:r>
+      <w:r>
+        <w:t xml:space="preserve">,</w:t>
+      </w:r>
+      <w:r>
+        <w:t xml:space="preserve"> </w:t>
+      </w:r>
+      <w:r>
+        <w:t xml:space="preserve">takes its slug from that exercise (see the slug rule below),</w:t>
+      </w:r>
+      <w:r>
+        <w:t xml:space="preserve"> </w:t>
+      </w:r>
+      <w:r>
+        <w:t xml:space="preserve">and sits in its own subfile after its exercise.</w:t>
+      </w:r>
+      <w:r>
+        <w:t xml:space="preserve"> </w:t>
+      </w:r>
+      <w:r>
+        <w:t xml:space="preserve">This covers code: a lab solution puts each step’s code, output and figure in the solution of the exercise that asks for it,</w:t>
+      </w:r>
+      <w:r>
+        <w:t xml:space="preserve"> </w:t>
+      </w:r>
+      <w:r>
+        <w:t xml:space="preserve">not all in the first solution.</w:t>
+      </w:r>
+      <w:r>
+        <w:t xml:space="preserve"> </w:t>
+      </w:r>
+      <w:r>
+        <w:t xml:space="preserve">A solution does not label parts such as</w:t>
+      </w:r>
+      <w:r>
+        <w:t xml:space="preserve"> </w:t>
+      </w:r>
+      <w:r>
+        <w:t xml:space="preserve">“(b)”</w:t>
+      </w:r>
+      <w:r>
+        <w:t xml:space="preserve"> </w:t>
+      </w:r>
+      <w:r>
+        <w:t xml:space="preserve">or</w:t>
+      </w:r>
+      <w:r>
+        <w:t xml:space="preserve"> </w:t>
+      </w:r>
+      <w:r>
+        <w:t xml:space="preserve">“Part 2”</w:t>
+      </w:r>
+      <w:r>
+        <w:t xml:space="preserve">,</w:t>
+      </w:r>
+      <w:r>
+        <w:t xml:space="preserve"> </w:t>
+      </w:r>
+      <w:r>
+        <w:t xml:space="preserve">and does not draw a figure that a later exercise asks for.</w:t>
+      </w:r>
+      <w:r>
+        <w:t xml:space="preserve"> </w:t>
+      </w:r>
+      <w:r>
+        <w:t xml:space="preserve">Code that a later part needs stays in the earliest solution that needs it,</w:t>
+      </w:r>
+      <w:r>
+        <w:t xml:space="preserve"> </w:t>
+      </w:r>
+      <w:r>
+        <w:t xml:space="preserve">because the page shares one session per language.</w:t>
+      </w:r>
+      <w:r>
+        <w:t xml:space="preserve"> </w:t>
+      </w:r>
+      <w:r>
+        <w:t xml:space="preserve">The</w:t>
+      </w:r>
+      <w:r>
+        <w:t xml:space="preserve"> </w:t>
+      </w:r>
+      <w:r>
+        <w:rPr>
+          <w:rStyle w:val="VerbatimChar"/>
+        </w:rPr>
+        <w:t xml:space="preserve">check-split-solutions</w:t>
+      </w:r>
+      <w:r>
+        <w:t xml:space="preserve"> </w:t>
+      </w:r>
+      <w:r>
+        <w:t xml:space="preserve">workflow in</w:t>
+      </w:r>
+      <w:r>
+        <w:t xml:space="preserve"> </w:t>
+      </w:r>
+      <w:hyperlink r:id="rId12">
+        <w:r>
+          <w:rPr>
+            <w:rStyle w:val="VerbatimChar"/>
+          </w:rPr>
+          <w:t xml:space="preserve">gha</w:t>
+        </w:r>
+      </w:hyperlink>
+      <w:r>
+        <w:t xml:space="preserve"> </w:t>
+      </w:r>
+      <w:r>
         <w:t xml:space="preserve">enforces this</w:t>
       </w:r>
       <w:r>
@@ -559,7 +725,7 @@
       <w:r>
         <w:t xml:space="preserve">(</w:t>
       </w:r>
-      <w:hyperlink r:id="rId13">
+      <w:hyperlink r:id="rId14">
         <w:r>
           <w:rPr>
             <w:rStyle w:val="Hyperlink"/>
@@ -745,7 +911,7 @@
         <w:t xml:space="preserve">not in italic text.</w:t>
       </w:r>
     </w:p>
-    <w:bookmarkStart w:id="14" w:name="exm-exercise-before-definition"/>
+    <w:bookmarkStart w:id="15" w:name="exm-exercise-before-definition"/>
     <w:p>
       <w:pPr>
         <w:pStyle w:val="FirstParagraph"/>
@@ -902,9 +1068,9 @@
         <w:t xml:space="preserve">before they see the formal definition.</w:t>
       </w:r>
     </w:p>
-    <w:bookmarkEnd w:id="14"/>
     <w:bookmarkEnd w:id="15"/>
-    <w:bookmarkStart w:id="20" w:name="Xb68f5757ebba706c680e7c5ed557ac14973d7af"/>
+    <w:bookmarkEnd w:id="16"/>
+    <w:bookmarkStart w:id="21" w:name="Xb68f5757ebba706c680e7c5ed557ac14973d7af"/>
     <w:p>
       <w:pPr>
         <w:pStyle w:val="Heading2"/>
@@ -967,7 +1133,7 @@
       <w:r>
         <w:t xml:space="preserve"> </w:t>
       </w:r>
-      <w:hyperlink r:id="rId16">
+      <w:hyperlink r:id="rId17">
         <w:r>
           <w:rPr>
             <w:rStyle w:val="Hyperlink"/>
@@ -1047,7 +1213,7 @@
       <w:r>
         <w:t xml:space="preserve"> </w:t>
       </w:r>
-      <w:hyperlink r:id="rId17">
+      <w:hyperlink r:id="rId18">
         <w:r>
           <w:rPr>
             <w:rStyle w:val="Hyperlink"/>
@@ -1073,7 +1239,7 @@
       <w:r>
         <w:t xml:space="preserve"> </w:t>
       </w:r>
-      <w:hyperlink r:id="rId18">
+      <w:hyperlink r:id="rId19">
         <w:r>
           <w:rPr>
             <w:rStyle w:val="Hyperlink"/>
@@ -1164,7 +1330,7 @@
         <w:t xml:space="preserve">When a unit still looks long, ask what could be named and moved out.</w:t>
       </w:r>
     </w:p>
-    <w:bookmarkStart w:id="19" w:name="exm-atomic-units"/>
+    <w:bookmarkStart w:id="20" w:name="exm-atomic-units"/>
     <w:p>
       <w:pPr>
         <w:pStyle w:val="BodyText"/>
@@ -1213,9 +1379,9 @@
         <w:t xml:space="preserve">and each piece fits on a slide.</w:t>
       </w:r>
     </w:p>
-    <w:bookmarkEnd w:id="19"/>
     <w:bookmarkEnd w:id="20"/>
-    <w:bookmarkStart w:id="22" w:name="say-what-a-yes-or-no-answer-means"/>
+    <w:bookmarkEnd w:id="21"/>
+    <w:bookmarkStart w:id="23" w:name="say-what-a-yes-or-no-answer-means"/>
     <w:p>
       <w:pPr>
         <w:pStyle w:val="Heading2"/>
@@ -1316,7 +1482,7 @@
         <w:t xml:space="preserve">The rule covers solutions, worked examples and any other answer to a question.</w:t>
       </w:r>
     </w:p>
-    <w:bookmarkStart w:id="21" w:name="exm-yes-no-conclusion"/>
+    <w:bookmarkStart w:id="22" w:name="exm-yes-no-conclusion"/>
     <w:p>
       <w:pPr>
         <w:pStyle w:val="BodyText"/>
@@ -1399,9 +1565,9 @@
         <w:t xml:space="preserve">so the reasons that follow support a claim the reader has already seen.</w:t>
       </w:r>
     </w:p>
-    <w:bookmarkEnd w:id="21"/>
     <w:bookmarkEnd w:id="22"/>
-    <w:bookmarkStart w:id="23" w:name="Xcb2ea076bd2bdcde187ea355befd37150b69b89"/>
+    <w:bookmarkEnd w:id="23"/>
+    <w:bookmarkStart w:id="24" w:name="Xcb2ea076bd2bdcde187ea355befd37150b69b89"/>
     <w:p>
       <w:pPr>
         <w:pStyle w:val="Heading2"/>
@@ -1454,8 +1620,8 @@
         <w:t xml:space="preserve">No automated check enforces this rule, because a script cannot tell how many questions a prompt asks.</w:t>
       </w:r>
     </w:p>
-    <w:bookmarkEnd w:id="23"/>
-    <w:bookmarkStart w:id="26" w:name="give-each-defined-term-its-own-div"/>
+    <w:bookmarkEnd w:id="24"/>
+    <w:bookmarkStart w:id="27" w:name="give-each-defined-term-its-own-div"/>
     <w:p>
       <w:pPr>
         <w:pStyle w:val="Heading2"/>
@@ -1468,7 +1634,7 @@
       <w:pPr>
         <w:pStyle w:val="FirstParagraph"/>
       </w:pPr>
-      <w:hyperlink r:id="rId24">
+      <w:hyperlink r:id="rId25">
         <w:r>
           <w:rPr>
             <w:rStyle w:val="Hyperlink"/>
@@ -1719,7 +1885,7 @@
       <w:r>
         <w:t xml:space="preserve"> </w:t>
       </w:r>
-      <w:hyperlink r:id="rId25">
+      <w:hyperlink r:id="rId26">
         <w:r>
           <w:rPr>
             <w:rStyle w:val="Hyperlink"/>
@@ -1886,8 +2052,8 @@
         <w:t xml:space="preserve">and also the points where the derivative does not exist.</w:t>
       </w:r>
     </w:p>
-    <w:bookmarkEnd w:id="26"/>
-    <w:bookmarkStart w:id="27" w:name="state-the-notation-and-its-alternatives"/>
+    <w:bookmarkEnd w:id="27"/>
+    <w:bookmarkStart w:id="28" w:name="state-the-notation-and-its-alternatives"/>
     <w:p>
       <w:pPr>
         <w:pStyle w:val="Heading2"/>
@@ -1985,8 +2151,8 @@
         <w:t xml:space="preserve">to make the choice explicit.</w:t>
       </w:r>
     </w:p>
-    <w:bookmarkEnd w:id="27"/>
-    <w:bookmarkStart w:id="29" w:name="Xac7e4ead54b12ccf6544491699a177b7d16fa22"/>
+    <w:bookmarkEnd w:id="28"/>
+    <w:bookmarkStart w:id="30" w:name="Xac7e4ead54b12ccf6544491699a177b7d16fa22"/>
     <w:p>
       <w:pPr>
         <w:pStyle w:val="Heading2"/>
@@ -2017,7 +2183,7 @@
       <w:r>
         <w:t xml:space="preserve"> </w:t>
       </w:r>
-      <w:hyperlink r:id="rId28">
+      <w:hyperlink r:id="rId29">
         <w:r>
           <w:rPr>
             <w:rStyle w:val="Hyperlink"/>
@@ -2263,8 +2429,8 @@
         <w:t xml:space="preserve">The conventional form still appears in the notes, as a named result.</w:t>
       </w:r>
     </w:p>
-    <w:bookmarkEnd w:id="29"/>
-    <w:bookmarkStart w:id="30" w:name="reuse-one-written-version-of-each-result"/>
+    <w:bookmarkEnd w:id="30"/>
+    <w:bookmarkStart w:id="31" w:name="reuse-one-written-version-of-each-result"/>
     <w:p>
       <w:pPr>
         <w:pStyle w:val="Heading2"/>
@@ -2305,8 +2471,8 @@
         <w:t xml:space="preserve">instead of keeping a second wording that can drift.</w:t>
       </w:r>
     </w:p>
-    <w:bookmarkEnd w:id="30"/>
-    <w:bookmarkStart w:id="32" w:name="use-real-data-and-compute-every-number"/>
+    <w:bookmarkEnd w:id="31"/>
+    <w:bookmarkStart w:id="33" w:name="use-real-data-and-compute-every-number"/>
     <w:p>
       <w:pPr>
         <w:pStyle w:val="Heading2"/>
@@ -2435,7 +2601,7 @@
         <w:t xml:space="preserve">A number typed into prose goes stale when the data or the code changes.</w:t>
       </w:r>
     </w:p>
-    <w:bookmarkStart w:id="31" w:name="exm-show-data-first"/>
+    <w:bookmarkStart w:id="32" w:name="exm-show-data-first"/>
     <w:p>
       <w:pPr>
         <w:pStyle w:val="FirstParagraph"/>
@@ -2508,9 +2674,9 @@
         <w:t xml:space="preserve">The ✅ version lets every later slide refer to something the reader has already seen.</w:t>
       </w:r>
     </w:p>
-    <w:bookmarkEnd w:id="31"/>
     <w:bookmarkEnd w:id="32"/>
-    <w:bookmarkStart w:id="33" w:name="Xa214254a94aa6db868b5b9577007bf4e27699b1"/>
+    <w:bookmarkEnd w:id="33"/>
+    <w:bookmarkStart w:id="34" w:name="Xa214254a94aa6db868b5b9577007bf4e27699b1"/>
     <w:p>
       <w:pPr>
         <w:pStyle w:val="Heading2"/>
@@ -2541,7 +2707,7 @@
       <w:r>
         <w:t xml:space="preserve"> </w:t>
       </w:r>
-      <w:hyperlink r:id="rId18">
+      <w:hyperlink r:id="rId19">
         <w:r>
           <w:rPr>
             <w:rStyle w:val="Hyperlink"/>
@@ -2649,8 +2815,8 @@
         <w:t xml:space="preserve">A short list that no other page reads can stay as prose.</w:t>
       </w:r>
     </w:p>
-    <w:bookmarkEnd w:id="33"/>
-    <w:bookmarkStart w:id="38" w:name="show-each-idea-applied-and-in-a-figure"/>
+    <w:bookmarkEnd w:id="34"/>
+    <w:bookmarkStart w:id="39" w:name="show-each-idea-applied-and-in-a-figure"/>
     <w:p>
       <w:pPr>
         <w:pStyle w:val="Heading2"/>
@@ -2793,7 +2959,7 @@
       <w:r>
         <w:t xml:space="preserve"> </w:t>
       </w:r>
-      <w:hyperlink r:id="rId34">
+      <w:hyperlink r:id="rId35">
         <w:r>
           <w:rPr>
             <w:rStyle w:val="Hyperlink"/>
@@ -2974,7 +3140,7 @@
       <w:r>
         <w:t xml:space="preserve">(</w:t>
       </w:r>
-      <w:hyperlink r:id="rId35">
+      <w:hyperlink r:id="rId36">
         <w:r>
           <w:rPr>
             <w:rStyle w:val="Hyperlink"/>
@@ -3231,7 +3397,7 @@
       <w:r>
         <w:t xml:space="preserve">(</w:t>
       </w:r>
-      <w:hyperlink r:id="rId36">
+      <w:hyperlink r:id="rId37">
         <w:r>
           <w:rPr>
             <w:rStyle w:val="Hyperlink"/>
@@ -3329,7 +3495,7 @@
       <w:r>
         <w:t xml:space="preserve"> </w:t>
       </w:r>
-      <w:hyperlink r:id="rId37">
+      <w:hyperlink r:id="rId38">
         <w:r>
           <w:rPr>
             <w:rStyle w:val="Hyperlink"/>
@@ -3356,8 +3522,8 @@
         <w:t xml:space="preserve">Make each figure follow the accessibility rules below.</w:t>
       </w:r>
     </w:p>
-    <w:bookmarkEnd w:id="38"/>
-    <w:bookmarkStart w:id="40" w:name="X7f95f8ec3b796fc99108c37bb45d62741b824c4"/>
+    <w:bookmarkEnd w:id="39"/>
+    <w:bookmarkStart w:id="41" w:name="X7f95f8ec3b796fc99108c37bb45d62741b824c4"/>
     <w:p>
       <w:pPr>
         <w:pStyle w:val="Heading2"/>
@@ -3550,7 +3716,7 @@
       <w:r>
         <w:t xml:space="preserve"> </w:t>
       </w:r>
-      <w:hyperlink r:id="rId24">
+      <w:hyperlink r:id="rId25">
         <w:r>
           <w:rPr>
             <w:rStyle w:val="Hyperlink"/>
@@ -3595,7 +3761,7 @@
         <w:t xml:space="preserve">Give the practice exercise its own slug and follow the numbering and slide-break rules above.</w:t>
       </w:r>
     </w:p>
-    <w:bookmarkStart w:id="39" w:name="exm-practice-after-example"/>
+    <w:bookmarkStart w:id="40" w:name="exm-practice-after-example"/>
     <w:p>
       <w:pPr>
         <w:pStyle w:val="FirstParagraph"/>
@@ -3751,9 +3917,9 @@
         <w:t xml:space="preserve">).</w:t>
       </w:r>
     </w:p>
-    <w:bookmarkEnd w:id="39"/>
     <w:bookmarkEnd w:id="40"/>
-    <w:bookmarkStart w:id="44" w:name="Xf27331f4c36c8d578e5fa29a37312484cc3343a"/>
+    <w:bookmarkEnd w:id="41"/>
+    <w:bookmarkStart w:id="45" w:name="Xf27331f4c36c8d578e5fa29a37312484cc3343a"/>
     <w:p>
       <w:pPr>
         <w:pStyle w:val="Heading2"/>
@@ -3871,7 +4037,7 @@
       <w:r>
         <w:t xml:space="preserve"> </w:t>
       </w:r>
-      <w:hyperlink r:id="rId41">
+      <w:hyperlink r:id="rId42">
         <w:r>
           <w:rPr>
             <w:rStyle w:val="Hyperlink"/>
@@ -3897,7 +4063,7 @@
       <w:r>
         <w:t xml:space="preserve"> </w:t>
       </w:r>
-      <w:hyperlink r:id="rId42">
+      <w:hyperlink r:id="rId43">
         <w:r>
           <w:rPr>
             <w:rStyle w:val="Hyperlink"/>
@@ -3965,7 +4131,7 @@
       <w:r>
         <w:t xml:space="preserve"> </w:t>
       </w:r>
-      <w:hyperlink r:id="rId43">
+      <w:hyperlink r:id="rId44">
         <w:r>
           <w:rPr>
             <w:rStyle w:val="Hyperlink"/>
@@ -4136,8 +4302,8 @@
         <w:t xml:space="preserve">so setup steps must work on a shared or hosted machine.</w:t>
       </w:r>
     </w:p>
-    <w:bookmarkEnd w:id="44"/>
-    <w:bookmarkStart w:id="45" w:name="Xf53ecb3398b87b82ffd1a126dd02e87a65bb694"/>
+    <w:bookmarkEnd w:id="45"/>
+    <w:bookmarkStart w:id="46" w:name="Xf53ecb3398b87b82ffd1a126dd02e87a65bb694"/>
     <w:p>
       <w:pPr>
         <w:pStyle w:val="Heading2"/>
@@ -4405,8 +4571,8 @@
         <w:t xml:space="preserve">End each such call with a semicolon, or assign its value.</w:t>
       </w:r>
     </w:p>
-    <w:bookmarkEnd w:id="45"/>
-    <w:bookmarkStart w:id="54" w:name="present-r-results-with-modern-packages"/>
+    <w:bookmarkEnd w:id="46"/>
+    <w:bookmarkStart w:id="55" w:name="present-r-results-with-modern-packages"/>
     <w:p>
       <w:pPr>
         <w:pStyle w:val="Heading2"/>
@@ -4491,7 +4657,7 @@
       <w:r>
         <w:t xml:space="preserve"> </w:t>
       </w:r>
-      <w:hyperlink r:id="rId46">
+      <w:hyperlink r:id="rId47">
         <w:r>
           <w:rPr>
             <w:rStyle w:val="Hyperlink"/>
@@ -4523,7 +4689,7 @@
       <w:r>
         <w:t xml:space="preserve"> </w:t>
       </w:r>
-      <w:hyperlink r:id="rId47">
+      <w:hyperlink r:id="rId48">
         <w:r>
           <w:rPr>
             <w:rStyle w:val="Hyperlink"/>
@@ -4597,7 +4763,7 @@
       <w:r>
         <w:t xml:space="preserve"> </w:t>
       </w:r>
-      <w:hyperlink r:id="rId48">
+      <w:hyperlink r:id="rId49">
         <w:r>
           <w:rPr>
             <w:rStyle w:val="Hyperlink"/>
@@ -4668,7 +4834,7 @@
       <w:r>
         <w:t xml:space="preserve"> </w:t>
       </w:r>
-      <w:hyperlink r:id="rId49">
+      <w:hyperlink r:id="rId50">
         <w:r>
           <w:rPr>
             <w:rStyle w:val="Hyperlink"/>
@@ -4685,7 +4851,7 @@
       <w:r>
         <w:t xml:space="preserve"> </w:t>
       </w:r>
-      <w:hyperlink r:id="rId50">
+      <w:hyperlink r:id="rId51">
         <w:r>
           <w:rPr>
             <w:rStyle w:val="Hyperlink"/>
@@ -4708,7 +4874,7 @@
       <w:r>
         <w:t xml:space="preserve"> </w:t>
       </w:r>
-      <w:hyperlink r:id="rId51">
+      <w:hyperlink r:id="rId52">
         <w:r>
           <w:rPr>
             <w:rStyle w:val="Hyperlink"/>
@@ -4764,7 +4930,7 @@
       <w:r>
         <w:t xml:space="preserve"> </w:t>
       </w:r>
-      <w:hyperlink r:id="rId52">
+      <w:hyperlink r:id="rId53">
         <w:r>
           <w:rPr>
             <w:rStyle w:val="Hyperlink"/>
@@ -4802,7 +4968,7 @@
       <w:r>
         <w:t xml:space="preserve"> </w:t>
       </w:r>
-      <w:hyperlink r:id="rId53">
+      <w:hyperlink r:id="rId54">
         <w:r>
           <w:rPr>
             <w:rStyle w:val="Hyperlink"/>
@@ -4817,8 +4983,8 @@
         <w:t xml:space="preserve">notes show the style.</w:t>
       </w:r>
     </w:p>
-    <w:bookmarkEnd w:id="54"/>
-    <w:bookmarkStart w:id="58" w:name="manipulate-data-with-dplyr-not-base-r"/>
+    <w:bookmarkEnd w:id="55"/>
+    <w:bookmarkStart w:id="59" w:name="manipulate-data-with-dplyr-not-base-r"/>
     <w:p>
       <w:pPr>
         <w:pStyle w:val="Heading2"/>
@@ -4855,7 +5021,7 @@
       <w:r>
         <w:t xml:space="preserve"> </w:t>
       </w:r>
-      <w:hyperlink r:id="rId55">
+      <w:hyperlink r:id="rId56">
         <w:r>
           <w:rPr>
             <w:rStyle w:val="Hyperlink"/>
@@ -5013,7 +5179,7 @@
       <w:r>
         <w:t xml:space="preserve"> </w:t>
       </w:r>
-      <w:hyperlink r:id="rId56">
+      <w:hyperlink r:id="rId57">
         <w:r>
           <w:rPr>
             <w:rStyle w:val="Hyperlink"/>
@@ -5105,7 +5271,7 @@
       <w:r>
         <w:t xml:space="preserve"> </w:t>
       </w:r>
-      <w:hyperlink r:id="rId57">
+      <w:hyperlink r:id="rId58">
         <w:r>
           <w:rPr>
             <w:rStyle w:val="Hyperlink"/>
@@ -5297,8 +5463,8 @@
         <w:t xml:space="preserve">The rule is about selecting, filtering and building data frames.</w:t>
       </w:r>
     </w:p>
-    <w:bookmarkEnd w:id="58"/>
-    <w:bookmarkStart w:id="60" w:name="X2bc6121e3a2f39a37d8a6591d77df16bd22bd0b"/>
+    <w:bookmarkEnd w:id="59"/>
+    <w:bookmarkStart w:id="61" w:name="X2bc6121e3a2f39a37d8a6591d77df16bd22bd0b"/>
     <w:p>
       <w:pPr>
         <w:pStyle w:val="Heading2"/>
@@ -5391,7 +5557,7 @@
       <w:r>
         <w:t xml:space="preserve"> </w:t>
       </w:r>
-      <w:hyperlink r:id="rId59">
+      <w:hyperlink r:id="rId60">
         <w:r>
           <w:rPr>
             <w:rStyle w:val="Hyperlink"/>
@@ -5568,8 +5734,8 @@
         <w:t xml:space="preserve">directory it creates.</w:t>
       </w:r>
     </w:p>
-    <w:bookmarkEnd w:id="60"/>
-    <w:bookmarkStart w:id="61" w:name="X7c0de8eaf50a5b2644eabf66f1f9b734b8a4a71"/>
+    <w:bookmarkEnd w:id="61"/>
+    <w:bookmarkStart w:id="62" w:name="X7c0de8eaf50a5b2644eabf66f1f9b734b8a4a71"/>
     <w:p>
       <w:pPr>
         <w:pStyle w:val="Heading2"/>
@@ -5744,8 +5910,8 @@
         <w:t xml:space="preserve">such as a transformation, a modeling choice, a tuning value or a random seed.</w:t>
       </w:r>
     </w:p>
-    <w:bookmarkEnd w:id="61"/>
-    <w:bookmarkStart w:id="62" w:name="X94063c6448bea82c8f1e8d367c642bbe2eda89b"/>
+    <w:bookmarkEnd w:id="62"/>
+    <w:bookmarkStart w:id="63" w:name="X94063c6448bea82c8f1e8d367c642bbe2eda89b"/>
     <w:p>
       <w:pPr>
         <w:pStyle w:val="Heading2"/>
@@ -5985,8 +6151,8 @@
         <w:t xml:space="preserve">.</w:t>
       </w:r>
     </w:p>
-    <w:bookmarkEnd w:id="62"/>
-    <w:bookmarkStart w:id="63" w:name="Xffa5a3357c8672d830c88e1e58a0ef107550647"/>
+    <w:bookmarkEnd w:id="63"/>
+    <w:bookmarkStart w:id="64" w:name="Xffa5a3357c8672d830c88e1e58a0ef107550647"/>
     <w:p>
       <w:pPr>
         <w:pStyle w:val="Heading2"/>
@@ -6111,8 +6277,8 @@
         <w:t xml:space="preserve">A chapter introduces those where it defines them.</w:t>
       </w:r>
     </w:p>
-    <w:bookmarkEnd w:id="63"/>
-    <w:bookmarkStart w:id="64" w:name="make-figures-accessible"/>
+    <w:bookmarkEnd w:id="64"/>
+    <w:bookmarkStart w:id="65" w:name="make-figures-accessible"/>
     <w:p>
       <w:pPr>
         <w:pStyle w:val="Heading2"/>
@@ -6247,8 +6413,8 @@
         <w:t xml:space="preserve">(observed when rendering lecture notes to PDF).</w:t>
       </w:r>
     </w:p>
-    <w:bookmarkEnd w:id="64"/>
-    <w:bookmarkStart w:id="66" w:name="structure-slides-for-the-reader"/>
+    <w:bookmarkEnd w:id="65"/>
+    <w:bookmarkStart w:id="67" w:name="structure-slides-for-the-reader"/>
     <w:p>
       <w:pPr>
         <w:pStyle w:val="Heading2"/>
@@ -6307,7 +6473,7 @@
       <w:r>
         <w:t xml:space="preserve"> </w:t>
       </w:r>
-      <w:hyperlink r:id="rId65">
+      <w:hyperlink r:id="rId66">
         <w:r>
           <w:rPr>
             <w:rStyle w:val="Hyperlink"/>
@@ -6547,8 +6713,8 @@
         <w:t xml:space="preserve">Put a slide break after the heading and move the text onto content slides.</w:t>
       </w:r>
     </w:p>
-    <w:bookmarkEnd w:id="66"/>
-    <w:bookmarkStart w:id="68" w:name="X5f21f12cbfc4e3df5e838110af4e52db506fec1"/>
+    <w:bookmarkEnd w:id="67"/>
+    <w:bookmarkStart w:id="69" w:name="X5f21f12cbfc4e3df5e838110af4e52db506fec1"/>
     <w:p>
       <w:pPr>
         <w:pStyle w:val="Heading2"/>
@@ -6671,7 +6837,7 @@
       <w:r>
         <w:t xml:space="preserve"> </w:t>
       </w:r>
-      <w:hyperlink r:id="rId17">
+      <w:hyperlink r:id="rId18">
         <w:r>
           <w:rPr>
             <w:rStyle w:val="Hyperlink"/>
@@ -6691,7 +6857,7 @@
         <w:t xml:space="preserve">The same rule applies to every other reference table, such as a table of notation.</w:t>
       </w:r>
     </w:p>
-    <w:bookmarkStart w:id="67" w:name="exm-note-sheet-rows"/>
+    <w:bookmarkStart w:id="68" w:name="exm-note-sheet-rows"/>
     <w:p>
       <w:pPr>
         <w:pStyle w:val="BodyText"/>
@@ -6782,9 +6948,9 @@
         <w:t xml:space="preserve">The ✅ rows let the reader find one formula by one label.</w:t>
       </w:r>
     </w:p>
-    <w:bookmarkEnd w:id="67"/>
     <w:bookmarkEnd w:id="68"/>
-    <w:bookmarkStart w:id="69" w:name="talk-about-the-ideas-not-the-notes"/>
+    <w:bookmarkEnd w:id="69"/>
+    <w:bookmarkStart w:id="70" w:name="talk-about-the-ideas-not-the-notes"/>
     <w:p>
       <w:pPr>
         <w:pStyle w:val="Heading2"/>
@@ -6803,7 +6969,7 @@
       <w:r>
         <w:t xml:space="preserve"> </w:t>
       </w:r>
-      <w:hyperlink r:id="rId18">
+      <w:hyperlink r:id="rId19">
         <w:r>
           <w:rPr>
             <w:rStyle w:val="Hyperlink"/>
@@ -6973,8 +7139,8 @@
         <w:t xml:space="preserve">and it goes stale when the definition moves.</w:t>
       </w:r>
     </w:p>
-    <w:bookmarkEnd w:id="69"/>
-    <w:bookmarkStart w:id="71" w:name="write-grading-rubrics-as-checklists"/>
+    <w:bookmarkEnd w:id="70"/>
+    <w:bookmarkStart w:id="72" w:name="write-grading-rubrics-as-checklists"/>
     <w:p>
       <w:pPr>
         <w:pStyle w:val="Heading2"/>
@@ -7150,7 +7316,7 @@
         <w:t xml:space="preserve">such as a single holistic judgment of a proof’s rigor.</w:t>
       </w:r>
     </w:p>
-    <w:bookmarkStart w:id="70" w:name="exm-rubric-checklist"/>
+    <w:bookmarkStart w:id="71" w:name="exm-rubric-checklist"/>
     <w:p>
       <w:pPr>
         <w:pStyle w:val="FirstParagraph"/>
@@ -7403,9 +7569,9 @@
         <w:t xml:space="preserve">and lets a script check that the points sum to the total.</w:t>
       </w:r>
     </w:p>
-    <w:bookmarkEnd w:id="70"/>
     <w:bookmarkEnd w:id="71"/>
-    <w:bookmarkStart w:id="75" w:name="Xcb579568ef754486ebde8b41ba4528bdf380eec"/>
+    <w:bookmarkEnd w:id="72"/>
+    <w:bookmarkStart w:id="76" w:name="Xcb579568ef754486ebde8b41ba4528bdf380eec"/>
     <w:p>
       <w:pPr>
         <w:pStyle w:val="Heading2"/>
@@ -7464,7 +7630,7 @@
       <w:r>
         <w:t xml:space="preserve"> </w:t>
       </w:r>
-      <w:hyperlink r:id="rId72">
+      <w:hyperlink r:id="rId73">
         <w:r>
           <w:rPr>
             <w:rStyle w:val="Hyperlink"/>
@@ -7520,7 +7686,7 @@
       <w:r>
         <w:t xml:space="preserve"> </w:t>
       </w:r>
-      <w:hyperlink r:id="rId73">
+      <w:hyperlink r:id="rId74">
         <w:r>
           <w:rPr>
             <w:rStyle w:val="Hyperlink"/>
@@ -7549,7 +7715,7 @@
       <w:r>
         <w:t xml:space="preserve"> </w:t>
       </w:r>
-      <w:hyperlink r:id="rId74">
+      <w:hyperlink r:id="rId75">
         <w:r>
           <w:rPr>
             <w:rStyle w:val="Hyperlink"/>
@@ -7582,8 +7748,8 @@
         <w:t xml:space="preserve">because a bare citation key renders as the author list.</w:t>
       </w:r>
     </w:p>
-    <w:bookmarkEnd w:id="75"/>
-    <w:bookmarkStart w:id="84" w:name="rules-that-apply-to-all-writing"/>
+    <w:bookmarkEnd w:id="76"/>
+    <w:bookmarkStart w:id="85" w:name="rules-that-apply-to-all-writing"/>
     <w:p>
       <w:pPr>
         <w:pStyle w:val="Heading2"/>
@@ -7608,7 +7774,7 @@
           <w:numId w:val="1023"/>
         </w:numPr>
       </w:pPr>
-      <w:hyperlink r:id="rId76">
+      <w:hyperlink r:id="rId77">
         <w:r>
           <w:rPr>
             <w:rStyle w:val="Hyperlink"/>
@@ -7628,7 +7794,7 @@
           <w:numId w:val="1023"/>
         </w:numPr>
       </w:pPr>
-      <w:hyperlink r:id="rId77">
+      <w:hyperlink r:id="rId78">
         <w:r>
           <w:rPr>
             <w:rStyle w:val="Hyperlink"/>
@@ -7651,7 +7817,7 @@
           <w:numId w:val="1023"/>
         </w:numPr>
       </w:pPr>
-      <w:hyperlink r:id="rId78">
+      <w:hyperlink r:id="rId79">
         <w:r>
           <w:rPr>
             <w:rStyle w:val="Hyperlink"/>
@@ -7671,7 +7837,7 @@
           <w:numId w:val="1023"/>
         </w:numPr>
       </w:pPr>
-      <w:hyperlink r:id="rId79">
+      <w:hyperlink r:id="rId80">
         <w:r>
           <w:rPr>
             <w:rStyle w:val="Hyperlink"/>
@@ -7694,7 +7860,7 @@
           <w:numId w:val="1023"/>
         </w:numPr>
       </w:pPr>
-      <w:hyperlink r:id="rId80">
+      <w:hyperlink r:id="rId81">
         <w:r>
           <w:rPr>
             <w:rStyle w:val="Hyperlink"/>
@@ -7706,8 +7872,8 @@
         <w:t xml:space="preserve">.</w:t>
       </w:r>
     </w:p>
-    <w:bookmarkStart w:id="83" w:name="refs"/>
-    <w:bookmarkStart w:id="82" w:name="ref-freeman2014active"/>
+    <w:bookmarkStart w:id="84" w:name="refs"/>
+    <w:bookmarkStart w:id="83" w:name="ref-freeman2014active"/>
     <w:p>
       <w:pPr>
         <w:pStyle w:val="Bibliography"/>
@@ -7740,7 +7906,7 @@
       <w:r>
         <w:t xml:space="preserve"> </w:t>
       </w:r>
-      <w:hyperlink r:id="rId81">
+      <w:hyperlink r:id="rId82">
         <w:r>
           <w:rPr>
             <w:rStyle w:val="Hyperlink"/>
@@ -7752,9 +7918,9 @@
         <w:t xml:space="preserve">.</w:t>
       </w:r>
     </w:p>
-    <w:bookmarkEnd w:id="82"/>
     <w:bookmarkEnd w:id="83"/>
     <w:bookmarkEnd w:id="84"/>
+    <w:bookmarkEnd w:id="85"/>
     <w:sectPr>
       <w:footnotePr>
         <w:numRestart w:val="eachSect"/>

</xml_diff>

<commit_message>
Deploying to gh-pages from @ Morrison-Lab/psw@3760d9cca64b59a6a24f3c01f8cd5fdf34f23875 🚀
</commit_message>
<xml_diff>
--- a/chapters/teaching.docx
+++ b/chapters/teaching.docx
@@ -15,7 +15,7 @@
         <w:pStyle w:val="Date"/>
       </w:pPr>
       <w:r>
-        <w:t xml:space="preserve">Last modified: 2026-10-29 00:21:17 (PDT)</w:t>
+        <w:t xml:space="preserve">Last modified: 2026-10-29 08:00:13 (PDT)</w:t>
       </w:r>
     </w:p>
     <w:tbl>
@@ -172,7 +172,7 @@
         <w:t xml:space="preserve">This chapter adds the rules that apply to teaching materials in particular.</w:t>
       </w:r>
     </w:p>
-    <w:bookmarkStart w:id="16" w:name="X54d80540a68b433948113395869433e0fc9698c"/>
+    <w:bookmarkStart w:id="17" w:name="X54d80540a68b433948113395869433e0fc9698c"/>
     <w:p>
       <w:pPr>
         <w:pStyle w:val="Heading2"/>
@@ -224,7 +224,6 @@
     </w:p>
     <w:p>
       <w:pPr>
-        <w:pStyle w:val="Compact"/>
         <w:numPr>
           <w:ilvl w:val="0"/>
           <w:numId w:val="1001"/>
@@ -248,7 +247,6 @@
     </w:p>
     <w:p>
       <w:pPr>
-        <w:pStyle w:val="Compact"/>
         <w:numPr>
           <w:ilvl w:val="0"/>
           <w:numId w:val="1001"/>
@@ -266,7 +264,6 @@
     </w:p>
     <w:p>
       <w:pPr>
-        <w:pStyle w:val="Compact"/>
         <w:numPr>
           <w:ilvl w:val="0"/>
           <w:numId w:val="1001"/>
@@ -320,7 +317,6 @@
     </w:p>
     <w:p>
       <w:pPr>
-        <w:pStyle w:val="Compact"/>
         <w:numPr>
           <w:ilvl w:val="0"/>
           <w:numId w:val="1001"/>
@@ -483,10 +479,143 @@
       <w:r>
         <w:t xml:space="preserve">in the solution exempts a result that is stated elsewhere.</w:t>
       </w:r>
-    </w:p>
-    <w:p>
-      <w:pPr>
-        <w:pStyle w:val="Compact"/>
+      <w:r>
+        <w:t xml:space="preserve"> </w:t>
+      </w:r>
+      <w:r>
+        <w:t xml:space="preserve">A restated theorem passes review only when it meets these four conditions:</w:t>
+      </w:r>
+    </w:p>
+    <w:p>
+      <w:pPr>
+        <w:pStyle w:val="Compact"/>
+        <w:numPr>
+          <w:ilvl w:val="1"/>
+          <w:numId w:val="1002"/>
+        </w:numPr>
+      </w:pPr>
+      <w:r>
+        <w:rPr>
+          <w:b/>
+          <w:bCs/>
+        </w:rPr>
+        <w:t xml:space="preserve">The proof stands alone.</w:t>
+      </w:r>
+      <w:r>
+        <w:t xml:space="preserve"> </w:t>
+      </w:r>
+      <w:r>
+        <w:t xml:space="preserve">It derives the result step by step, or cites earlier results,</w:t>
+      </w:r>
+      <w:r>
+        <w:t xml:space="preserve"> </w:t>
+      </w:r>
+      <w:r>
+        <w:t xml:space="preserve">and does not only point back at the solution that first derived it.</w:t>
+      </w:r>
+    </w:p>
+    <w:p>
+      <w:pPr>
+        <w:pStyle w:val="Compact"/>
+        <w:numPr>
+          <w:ilvl w:val="1"/>
+          <w:numId w:val="1002"/>
+        </w:numPr>
+      </w:pPr>
+      <w:r>
+        <w:rPr>
+          <w:b/>
+          <w:bCs/>
+        </w:rPr>
+        <w:t xml:space="preserve">The statement uses only defined symbols.</w:t>
+      </w:r>
+      <w:r>
+        <w:t xml:space="preserve"> </w:t>
+      </w:r>
+      <w:r>
+        <w:t xml:space="preserve">Every symbol in it is defined in the statement itself or in an earlier div.</w:t>
+      </w:r>
+    </w:p>
+    <w:p>
+      <w:pPr>
+        <w:pStyle w:val="Compact"/>
+        <w:numPr>
+          <w:ilvl w:val="1"/>
+          <w:numId w:val="1002"/>
+        </w:numPr>
+      </w:pPr>
+      <w:r>
+        <w:rPr>
+          <w:b/>
+          <w:bCs/>
+        </w:rPr>
+        <w:t xml:space="preserve">The first use of each</w:t>
+      </w:r>
+      <w:r>
+        <w:rPr>
+          <w:b/>
+          <w:bCs/>
+        </w:rPr>
+        <w:t xml:space="preserve"> </w:t>
+      </w:r>
+      <w:hyperlink r:id="rId14">
+        <w:r>
+          <w:rPr>
+            <w:rStyle w:val="Hyperlink"/>
+            <w:b/>
+            <w:bCs/>
+          </w:rPr>
+          <w:t xml:space="preserve">term</w:t>
+        </w:r>
+      </w:hyperlink>
+      <w:r>
+        <w:rPr>
+          <w:b/>
+          <w:bCs/>
+        </w:rPr>
+        <w:t xml:space="preserve"> </w:t>
+      </w:r>
+      <w:r>
+        <w:rPr>
+          <w:b/>
+          <w:bCs/>
+        </w:rPr>
+        <w:t xml:space="preserve">is linked</w:t>
+      </w:r>
+      <w:r>
+        <w:t xml:space="preserve"> </w:t>
+      </w:r>
+      <w:r>
+        <w:t xml:space="preserve">to the div that defines it.</w:t>
+      </w:r>
+    </w:p>
+    <w:p>
+      <w:pPr>
+        <w:pStyle w:val="Compact"/>
+        <w:numPr>
+          <w:ilvl w:val="1"/>
+          <w:numId w:val="1002"/>
+        </w:numPr>
+      </w:pPr>
+      <w:r>
+        <w:rPr>
+          <w:b/>
+          <w:bCs/>
+        </w:rPr>
+        <w:t xml:space="preserve">Each source line holds one clause</w:t>
+      </w:r>
+      <w:r>
+        <w:t xml:space="preserve">,</w:t>
+      </w:r>
+      <w:r>
+        <w:t xml:space="preserve"> </w:t>
+      </w:r>
+      <w:r>
+        <w:t xml:space="preserve">as the semantic line break rule requires.</w:t>
+      </w:r>
+    </w:p>
+    <w:p>
+      <w:pPr>
         <w:numPr>
           <w:ilvl w:val="0"/>
           <w:numId w:val="1001"/>
@@ -570,7 +699,6 @@
     </w:p>
     <w:p>
       <w:pPr>
-        <w:pStyle w:val="Compact"/>
         <w:numPr>
           <w:ilvl w:val="0"/>
           <w:numId w:val="1001"/>
@@ -725,7 +853,7 @@
       <w:r>
         <w:t xml:space="preserve">(</w:t>
       </w:r>
-      <w:hyperlink r:id="rId14">
+      <w:hyperlink r:id="rId15">
         <w:r>
           <w:rPr>
             <w:rStyle w:val="Hyperlink"/>
@@ -739,7 +867,6 @@
     </w:p>
     <w:p>
       <w:pPr>
-        <w:pStyle w:val="Compact"/>
         <w:numPr>
           <w:ilvl w:val="0"/>
           <w:numId w:val="1001"/>
@@ -826,7 +953,6 @@
     </w:p>
     <w:p>
       <w:pPr>
-        <w:pStyle w:val="Compact"/>
         <w:numPr>
           <w:ilvl w:val="0"/>
           <w:numId w:val="1001"/>
@@ -844,7 +970,6 @@
     </w:p>
     <w:p>
       <w:pPr>
-        <w:pStyle w:val="Compact"/>
         <w:numPr>
           <w:ilvl w:val="0"/>
           <w:numId w:val="1001"/>
@@ -883,7 +1008,6 @@
     </w:p>
     <w:p>
       <w:pPr>
-        <w:pStyle w:val="Compact"/>
         <w:numPr>
           <w:ilvl w:val="0"/>
           <w:numId w:val="1001"/>
@@ -911,7 +1035,7 @@
         <w:t xml:space="preserve">not in italic text.</w:t>
       </w:r>
     </w:p>
-    <w:bookmarkStart w:id="15" w:name="exm-exercise-before-definition"/>
+    <w:bookmarkStart w:id="16" w:name="exm-exercise-before-definition"/>
     <w:p>
       <w:pPr>
         <w:pStyle w:val="FirstParagraph"/>
@@ -1068,8 +1192,8 @@
         <w:t xml:space="preserve">before they see the formal definition.</w:t>
       </w:r>
     </w:p>
-    <w:bookmarkEnd w:id="15"/>
     <w:bookmarkEnd w:id="16"/>
+    <w:bookmarkEnd w:id="17"/>
     <w:bookmarkStart w:id="21" w:name="Xb68f5757ebba706c680e7c5ed557ac14973d7af"/>
     <w:p>
       <w:pPr>
@@ -1133,7 +1257,7 @@
       <w:r>
         <w:t xml:space="preserve"> </w:t>
       </w:r>
-      <w:hyperlink r:id="rId17">
+      <w:hyperlink r:id="rId18">
         <w:r>
           <w:rPr>
             <w:rStyle w:val="Hyperlink"/>
@@ -1186,7 +1310,7 @@
         <w:pStyle w:val="Compact"/>
         <w:numPr>
           <w:ilvl w:val="0"/>
-          <w:numId w:val="1002"/>
+          <w:numId w:val="1003"/>
         </w:numPr>
       </w:pPr>
       <w:r>
@@ -1213,7 +1337,7 @@
       <w:r>
         <w:t xml:space="preserve"> </w:t>
       </w:r>
-      <w:hyperlink r:id="rId18">
+      <w:hyperlink r:id="rId19">
         <w:r>
           <w:rPr>
             <w:rStyle w:val="Hyperlink"/>
@@ -1230,7 +1354,7 @@
         <w:pStyle w:val="Compact"/>
         <w:numPr>
           <w:ilvl w:val="0"/>
-          <w:numId w:val="1002"/>
+          <w:numId w:val="1003"/>
         </w:numPr>
       </w:pPr>
       <w:r>
@@ -1239,7 +1363,7 @@
       <w:r>
         <w:t xml:space="preserve"> </w:t>
       </w:r>
-      <w:hyperlink r:id="rId19">
+      <w:hyperlink r:id="rId14">
         <w:r>
           <w:rPr>
             <w:rStyle w:val="Hyperlink"/>
@@ -1291,7 +1415,7 @@
         <w:pStyle w:val="Compact"/>
         <w:numPr>
           <w:ilvl w:val="0"/>
-          <w:numId w:val="1002"/>
+          <w:numId w:val="1003"/>
         </w:numPr>
       </w:pPr>
       <w:r>
@@ -1309,7 +1433,7 @@
         <w:pStyle w:val="Compact"/>
         <w:numPr>
           <w:ilvl w:val="0"/>
-          <w:numId w:val="1002"/>
+          <w:numId w:val="1003"/>
         </w:numPr>
       </w:pPr>
       <w:r>
@@ -1660,7 +1784,7 @@
         <w:pStyle w:val="Compact"/>
         <w:numPr>
           <w:ilvl w:val="0"/>
-          <w:numId w:val="1003"/>
+          <w:numId w:val="1004"/>
         </w:numPr>
       </w:pPr>
       <w:r>
@@ -1693,7 +1817,7 @@
         <w:pStyle w:val="Compact"/>
         <w:numPr>
           <w:ilvl w:val="0"/>
-          <w:numId w:val="1003"/>
+          <w:numId w:val="1004"/>
         </w:numPr>
       </w:pPr>
       <w:r>
@@ -1744,7 +1868,7 @@
         <w:pStyle w:val="Compact"/>
         <w:numPr>
           <w:ilvl w:val="0"/>
-          <w:numId w:val="1003"/>
+          <w:numId w:val="1004"/>
         </w:numPr>
       </w:pPr>
       <w:r>
@@ -1908,7 +2032,7 @@
         <w:pStyle w:val="Compact"/>
         <w:numPr>
           <w:ilvl w:val="0"/>
-          <w:numId w:val="1003"/>
+          <w:numId w:val="1004"/>
         </w:numPr>
       </w:pPr>
       <w:r>
@@ -2486,7 +2610,7 @@
         <w:pStyle w:val="Compact"/>
         <w:numPr>
           <w:ilvl w:val="0"/>
-          <w:numId w:val="1004"/>
+          <w:numId w:val="1005"/>
         </w:numPr>
       </w:pPr>
       <w:r>
@@ -2510,7 +2634,7 @@
         <w:pStyle w:val="Compact"/>
         <w:numPr>
           <w:ilvl w:val="0"/>
-          <w:numId w:val="1004"/>
+          <w:numId w:val="1005"/>
         </w:numPr>
       </w:pPr>
       <w:r>
@@ -2528,7 +2652,7 @@
         <w:pStyle w:val="Compact"/>
         <w:numPr>
           <w:ilvl w:val="0"/>
-          <w:numId w:val="1004"/>
+          <w:numId w:val="1005"/>
         </w:numPr>
       </w:pPr>
       <w:r>
@@ -2576,7 +2700,7 @@
         <w:pStyle w:val="Compact"/>
         <w:numPr>
           <w:ilvl w:val="0"/>
-          <w:numId w:val="1004"/>
+          <w:numId w:val="1005"/>
         </w:numPr>
       </w:pPr>
       <w:r>
@@ -2698,7 +2822,7 @@
         <w:pStyle w:val="Compact"/>
         <w:numPr>
           <w:ilvl w:val="0"/>
-          <w:numId w:val="1005"/>
+          <w:numId w:val="1006"/>
         </w:numPr>
       </w:pPr>
       <w:r>
@@ -2707,7 +2831,7 @@
       <w:r>
         <w:t xml:space="preserve"> </w:t>
       </w:r>
-      <w:hyperlink r:id="rId19">
+      <w:hyperlink r:id="rId14">
         <w:r>
           <w:rPr>
             <w:rStyle w:val="Hyperlink"/>
@@ -2745,7 +2869,7 @@
         <w:pStyle w:val="Compact"/>
         <w:numPr>
           <w:ilvl w:val="0"/>
-          <w:numId w:val="1005"/>
+          <w:numId w:val="1006"/>
         </w:numPr>
       </w:pPr>
       <w:r>
@@ -2763,7 +2887,7 @@
         <w:pStyle w:val="Compact"/>
         <w:numPr>
           <w:ilvl w:val="0"/>
-          <w:numId w:val="1005"/>
+          <w:numId w:val="1006"/>
         </w:numPr>
       </w:pPr>
       <w:r>
@@ -2790,7 +2914,7 @@
         <w:pStyle w:val="Compact"/>
         <w:numPr>
           <w:ilvl w:val="0"/>
-          <w:numId w:val="1005"/>
+          <w:numId w:val="1006"/>
         </w:numPr>
       </w:pPr>
       <w:r>
@@ -2808,7 +2932,7 @@
         <w:pStyle w:val="Compact"/>
         <w:numPr>
           <w:ilvl w:val="0"/>
-          <w:numId w:val="1005"/>
+          <w:numId w:val="1006"/>
         </w:numPr>
       </w:pPr>
       <w:r>
@@ -2830,7 +2954,7 @@
         <w:pStyle w:val="Compact"/>
         <w:numPr>
           <w:ilvl w:val="0"/>
-          <w:numId w:val="1006"/>
+          <w:numId w:val="1007"/>
         </w:numPr>
       </w:pPr>
       <w:r>
@@ -2854,7 +2978,7 @@
         <w:pStyle w:val="Compact"/>
         <w:numPr>
           <w:ilvl w:val="0"/>
-          <w:numId w:val="1006"/>
+          <w:numId w:val="1007"/>
         </w:numPr>
       </w:pPr>
       <w:r>
@@ -2979,7 +3103,7 @@
         <w:pStyle w:val="Compact"/>
         <w:numPr>
           <w:ilvl w:val="0"/>
-          <w:numId w:val="1006"/>
+          <w:numId w:val="1007"/>
         </w:numPr>
       </w:pPr>
       <w:r>
@@ -3157,7 +3281,7 @@
         <w:pStyle w:val="Compact"/>
         <w:numPr>
           <w:ilvl w:val="0"/>
-          <w:numId w:val="1006"/>
+          <w:numId w:val="1007"/>
         </w:numPr>
       </w:pPr>
       <w:r>
@@ -3414,7 +3538,7 @@
         <w:pStyle w:val="Compact"/>
         <w:numPr>
           <w:ilvl w:val="0"/>
-          <w:numId w:val="1006"/>
+          <w:numId w:val="1007"/>
         </w:numPr>
       </w:pPr>
       <w:r>
@@ -3438,7 +3562,7 @@
         <w:pStyle w:val="Compact"/>
         <w:numPr>
           <w:ilvl w:val="0"/>
-          <w:numId w:val="1006"/>
+          <w:numId w:val="1007"/>
         </w:numPr>
       </w:pPr>
       <w:r>
@@ -3456,7 +3580,7 @@
         <w:pStyle w:val="Compact"/>
         <w:numPr>
           <w:ilvl w:val="0"/>
-          <w:numId w:val="1006"/>
+          <w:numId w:val="1007"/>
         </w:numPr>
       </w:pPr>
       <w:r>
@@ -3515,7 +3639,7 @@
         <w:pStyle w:val="Compact"/>
         <w:numPr>
           <w:ilvl w:val="0"/>
-          <w:numId w:val="1006"/>
+          <w:numId w:val="1007"/>
         </w:numPr>
       </w:pPr>
       <w:r>
@@ -3563,7 +3687,7 @@
         <w:pStyle w:val="Compact"/>
         <w:numPr>
           <w:ilvl w:val="0"/>
-          <w:numId w:val="1007"/>
+          <w:numId w:val="1008"/>
         </w:numPr>
       </w:pPr>
       <w:r>
@@ -3647,7 +3771,7 @@
         <w:pStyle w:val="Compact"/>
         <w:numPr>
           <w:ilvl w:val="0"/>
-          <w:numId w:val="1007"/>
+          <w:numId w:val="1008"/>
         </w:numPr>
       </w:pPr>
       <w:r>
@@ -3683,7 +3807,7 @@
         <w:pStyle w:val="Compact"/>
         <w:numPr>
           <w:ilvl w:val="0"/>
-          <w:numId w:val="1007"/>
+          <w:numId w:val="1008"/>
         </w:numPr>
       </w:pPr>
       <w:r>
@@ -3707,7 +3831,7 @@
         <w:pStyle w:val="Compact"/>
         <w:numPr>
           <w:ilvl w:val="0"/>
-          <w:numId w:val="1007"/>
+          <w:numId w:val="1008"/>
         </w:numPr>
       </w:pPr>
       <w:r>
@@ -3754,7 +3878,7 @@
         <w:pStyle w:val="Compact"/>
         <w:numPr>
           <w:ilvl w:val="0"/>
-          <w:numId w:val="1007"/>
+          <w:numId w:val="1008"/>
         </w:numPr>
       </w:pPr>
       <w:r>
@@ -3947,7 +4071,7 @@
         <w:pStyle w:val="Compact"/>
         <w:numPr>
           <w:ilvl w:val="0"/>
-          <w:numId w:val="1008"/>
+          <w:numId w:val="1009"/>
         </w:numPr>
       </w:pPr>
       <w:r>
@@ -3959,7 +4083,7 @@
         <w:pStyle w:val="Compact"/>
         <w:numPr>
           <w:ilvl w:val="0"/>
-          <w:numId w:val="1008"/>
+          <w:numId w:val="1009"/>
         </w:numPr>
       </w:pPr>
       <w:r>
@@ -4028,7 +4152,7 @@
         <w:pStyle w:val="Compact"/>
         <w:numPr>
           <w:ilvl w:val="0"/>
-          <w:numId w:val="1008"/>
+          <w:numId w:val="1009"/>
         </w:numPr>
       </w:pPr>
       <w:r>
@@ -4083,7 +4207,7 @@
         <w:pStyle w:val="Compact"/>
         <w:numPr>
           <w:ilvl w:val="0"/>
-          <w:numId w:val="1008"/>
+          <w:numId w:val="1009"/>
         </w:numPr>
       </w:pPr>
       <w:r>
@@ -4157,7 +4281,7 @@
         <w:pStyle w:val="Compact"/>
         <w:numPr>
           <w:ilvl w:val="0"/>
-          <w:numId w:val="1008"/>
+          <w:numId w:val="1009"/>
         </w:numPr>
       </w:pPr>
       <w:r>
@@ -4187,7 +4311,7 @@
         <w:pStyle w:val="Compact"/>
         <w:numPr>
           <w:ilvl w:val="0"/>
-          <w:numId w:val="1008"/>
+          <w:numId w:val="1009"/>
         </w:numPr>
       </w:pPr>
       <w:r>
@@ -4199,7 +4323,7 @@
         <w:pStyle w:val="Compact"/>
         <w:numPr>
           <w:ilvl w:val="0"/>
-          <w:numId w:val="1008"/>
+          <w:numId w:val="1009"/>
         </w:numPr>
       </w:pPr>
       <w:r>
@@ -4283,7 +4407,7 @@
         <w:pStyle w:val="Compact"/>
         <w:numPr>
           <w:ilvl w:val="0"/>
-          <w:numId w:val="1008"/>
+          <w:numId w:val="1009"/>
         </w:numPr>
       </w:pPr>
       <w:r>
@@ -4331,7 +4455,7 @@
         <w:pStyle w:val="Compact"/>
         <w:numPr>
           <w:ilvl w:val="0"/>
-          <w:numId w:val="1009"/>
+          <w:numId w:val="1010"/>
         </w:numPr>
       </w:pPr>
       <w:r>
@@ -4349,7 +4473,7 @@
         <w:pStyle w:val="Compact"/>
         <w:numPr>
           <w:ilvl w:val="0"/>
-          <w:numId w:val="1009"/>
+          <w:numId w:val="1010"/>
         </w:numPr>
       </w:pPr>
       <w:r>
@@ -4367,7 +4491,7 @@
         <w:pStyle w:val="Compact"/>
         <w:numPr>
           <w:ilvl w:val="0"/>
-          <w:numId w:val="1009"/>
+          <w:numId w:val="1010"/>
         </w:numPr>
       </w:pPr>
       <w:r>
@@ -4379,7 +4503,7 @@
         <w:pStyle w:val="Compact"/>
         <w:numPr>
           <w:ilvl w:val="1"/>
-          <w:numId w:val="1010"/>
+          <w:numId w:val="1011"/>
         </w:numPr>
       </w:pPr>
       <w:r>
@@ -4398,7 +4522,7 @@
         <w:pStyle w:val="Compact"/>
         <w:numPr>
           <w:ilvl w:val="1"/>
-          <w:numId w:val="1010"/>
+          <w:numId w:val="1011"/>
         </w:numPr>
       </w:pPr>
       <w:r>
@@ -4417,7 +4541,7 @@
         <w:pStyle w:val="Compact"/>
         <w:numPr>
           <w:ilvl w:val="1"/>
-          <w:numId w:val="1010"/>
+          <w:numId w:val="1011"/>
         </w:numPr>
       </w:pPr>
       <w:r>
@@ -4436,7 +4560,7 @@
         <w:pStyle w:val="Compact"/>
         <w:numPr>
           <w:ilvl w:val="0"/>
-          <w:numId w:val="1009"/>
+          <w:numId w:val="1010"/>
         </w:numPr>
       </w:pPr>
       <w:r>
@@ -4474,7 +4598,7 @@
         <w:pStyle w:val="Compact"/>
         <w:numPr>
           <w:ilvl w:val="0"/>
-          <w:numId w:val="1009"/>
+          <w:numId w:val="1010"/>
         </w:numPr>
       </w:pPr>
       <w:r>
@@ -4504,7 +4628,7 @@
         <w:pStyle w:val="Compact"/>
         <w:numPr>
           <w:ilvl w:val="0"/>
-          <w:numId w:val="1009"/>
+          <w:numId w:val="1010"/>
         </w:numPr>
       </w:pPr>
       <w:r>
@@ -4600,7 +4724,7 @@
         <w:pStyle w:val="Compact"/>
         <w:numPr>
           <w:ilvl w:val="0"/>
-          <w:numId w:val="1011"/>
+          <w:numId w:val="1012"/>
         </w:numPr>
       </w:pPr>
       <w:r>
@@ -4648,7 +4772,7 @@
         <w:pStyle w:val="Compact"/>
         <w:numPr>
           <w:ilvl w:val="0"/>
-          <w:numId w:val="1011"/>
+          <w:numId w:val="1012"/>
         </w:numPr>
       </w:pPr>
       <w:r>
@@ -4754,7 +4878,7 @@
         <w:pStyle w:val="Compact"/>
         <w:numPr>
           <w:ilvl w:val="0"/>
-          <w:numId w:val="1011"/>
+          <w:numId w:val="1012"/>
         </w:numPr>
       </w:pPr>
       <w:r>
@@ -4825,7 +4949,7 @@
         <w:pStyle w:val="Compact"/>
         <w:numPr>
           <w:ilvl w:val="0"/>
-          <w:numId w:val="1011"/>
+          <w:numId w:val="1012"/>
         </w:numPr>
       </w:pPr>
       <w:r>
@@ -4906,7 +5030,7 @@
         <w:pStyle w:val="Compact"/>
         <w:numPr>
           <w:ilvl w:val="0"/>
-          <w:numId w:val="1011"/>
+          <w:numId w:val="1012"/>
         </w:numPr>
       </w:pPr>
       <w:r>
@@ -4959,7 +5083,7 @@
         <w:pStyle w:val="Compact"/>
         <w:numPr>
           <w:ilvl w:val="0"/>
-          <w:numId w:val="1011"/>
+          <w:numId w:val="1012"/>
         </w:numPr>
       </w:pPr>
       <w:r>
@@ -5012,7 +5136,7 @@
         <w:pStyle w:val="Compact"/>
         <w:numPr>
           <w:ilvl w:val="0"/>
-          <w:numId w:val="1012"/>
+          <w:numId w:val="1013"/>
         </w:numPr>
       </w:pPr>
       <w:r>
@@ -5083,7 +5207,7 @@
         <w:pStyle w:val="Compact"/>
         <w:numPr>
           <w:ilvl w:val="0"/>
-          <w:numId w:val="1012"/>
+          <w:numId w:val="1013"/>
         </w:numPr>
       </w:pPr>
       <w:r>
@@ -5134,7 +5258,7 @@
         <w:pStyle w:val="Compact"/>
         <w:numPr>
           <w:ilvl w:val="0"/>
-          <w:numId w:val="1012"/>
+          <w:numId w:val="1013"/>
         </w:numPr>
       </w:pPr>
       <w:r>
@@ -5170,7 +5294,7 @@
         <w:pStyle w:val="Compact"/>
         <w:numPr>
           <w:ilvl w:val="0"/>
-          <w:numId w:val="1012"/>
+          <w:numId w:val="1013"/>
         </w:numPr>
       </w:pPr>
       <w:r>
@@ -5226,7 +5350,7 @@
         <w:pStyle w:val="Compact"/>
         <w:numPr>
           <w:ilvl w:val="0"/>
-          <w:numId w:val="1012"/>
+          <w:numId w:val="1013"/>
         </w:numPr>
       </w:pPr>
       <w:r>
@@ -5262,7 +5386,7 @@
         <w:pStyle w:val="Compact"/>
         <w:numPr>
           <w:ilvl w:val="0"/>
-          <w:numId w:val="1012"/>
+          <w:numId w:val="1013"/>
         </w:numPr>
       </w:pPr>
       <w:r>
@@ -5318,7 +5442,7 @@
         <w:pStyle w:val="Compact"/>
         <w:numPr>
           <w:ilvl w:val="0"/>
-          <w:numId w:val="1012"/>
+          <w:numId w:val="1013"/>
         </w:numPr>
       </w:pPr>
       <w:r>
@@ -5342,7 +5466,7 @@
         <w:pStyle w:val="Compact"/>
         <w:numPr>
           <w:ilvl w:val="0"/>
-          <w:numId w:val="1012"/>
+          <w:numId w:val="1013"/>
         </w:numPr>
       </w:pPr>
       <w:r>
@@ -5444,7 +5568,7 @@
         <w:pStyle w:val="Compact"/>
         <w:numPr>
           <w:ilvl w:val="0"/>
-          <w:numId w:val="1012"/>
+          <w:numId w:val="1013"/>
         </w:numPr>
       </w:pPr>
       <w:r>
@@ -5486,7 +5610,7 @@
         <w:pStyle w:val="Compact"/>
         <w:numPr>
           <w:ilvl w:val="0"/>
-          <w:numId w:val="1013"/>
+          <w:numId w:val="1014"/>
         </w:numPr>
       </w:pPr>
       <w:r>
@@ -5530,7 +5654,7 @@
         <w:pStyle w:val="Compact"/>
         <w:numPr>
           <w:ilvl w:val="0"/>
-          <w:numId w:val="1013"/>
+          <w:numId w:val="1014"/>
         </w:numPr>
       </w:pPr>
       <w:r>
@@ -5643,7 +5767,7 @@
         <w:pStyle w:val="Compact"/>
         <w:numPr>
           <w:ilvl w:val="0"/>
-          <w:numId w:val="1013"/>
+          <w:numId w:val="1014"/>
         </w:numPr>
       </w:pPr>
       <w:r>
@@ -5688,7 +5812,7 @@
         <w:pStyle w:val="Compact"/>
         <w:numPr>
           <w:ilvl w:val="0"/>
-          <w:numId w:val="1013"/>
+          <w:numId w:val="1014"/>
         </w:numPr>
       </w:pPr>
       <w:r>
@@ -5763,7 +5887,7 @@
         <w:pStyle w:val="Compact"/>
         <w:numPr>
           <w:ilvl w:val="0"/>
-          <w:numId w:val="1014"/>
+          <w:numId w:val="1015"/>
         </w:numPr>
       </w:pPr>
       <w:r>
@@ -5781,7 +5905,7 @@
         <w:pStyle w:val="Compact"/>
         <w:numPr>
           <w:ilvl w:val="0"/>
-          <w:numId w:val="1014"/>
+          <w:numId w:val="1015"/>
         </w:numPr>
       </w:pPr>
       <w:r>
@@ -5799,7 +5923,7 @@
         <w:pStyle w:val="Compact"/>
         <w:numPr>
           <w:ilvl w:val="0"/>
-          <w:numId w:val="1014"/>
+          <w:numId w:val="1015"/>
         </w:numPr>
       </w:pPr>
       <w:r>
@@ -5897,7 +6021,7 @@
         <w:pStyle w:val="Compact"/>
         <w:numPr>
           <w:ilvl w:val="0"/>
-          <w:numId w:val="1014"/>
+          <w:numId w:val="1015"/>
         </w:numPr>
       </w:pPr>
       <w:r>
@@ -5995,7 +6119,7 @@
         <w:pStyle w:val="Compact"/>
         <w:numPr>
           <w:ilvl w:val="0"/>
-          <w:numId w:val="1015"/>
+          <w:numId w:val="1016"/>
         </w:numPr>
       </w:pPr>
       <w:r>
@@ -6028,7 +6152,7 @@
         <w:pStyle w:val="Compact"/>
         <w:numPr>
           <w:ilvl w:val="0"/>
-          <w:numId w:val="1015"/>
+          <w:numId w:val="1016"/>
         </w:numPr>
       </w:pPr>
       <w:r>
@@ -6061,7 +6185,7 @@
         <w:pStyle w:val="Compact"/>
         <w:numPr>
           <w:ilvl w:val="0"/>
-          <w:numId w:val="1015"/>
+          <w:numId w:val="1016"/>
         </w:numPr>
       </w:pPr>
       <w:r>
@@ -6180,7 +6304,7 @@
         <w:pStyle w:val="Compact"/>
         <w:numPr>
           <w:ilvl w:val="0"/>
-          <w:numId w:val="1016"/>
+          <w:numId w:val="1017"/>
         </w:numPr>
       </w:pPr>
       <w:r>
@@ -6207,7 +6331,7 @@
         <w:pStyle w:val="Compact"/>
         <w:numPr>
           <w:ilvl w:val="0"/>
-          <w:numId w:val="1016"/>
+          <w:numId w:val="1017"/>
         </w:numPr>
       </w:pPr>
       <w:r>
@@ -6240,7 +6364,7 @@
         <w:pStyle w:val="Compact"/>
         <w:numPr>
           <w:ilvl w:val="0"/>
-          <w:numId w:val="1016"/>
+          <w:numId w:val="1017"/>
         </w:numPr>
       </w:pPr>
       <w:r>
@@ -6264,7 +6388,7 @@
         <w:pStyle w:val="Compact"/>
         <w:numPr>
           <w:ilvl w:val="0"/>
-          <w:numId w:val="1016"/>
+          <w:numId w:val="1017"/>
         </w:numPr>
       </w:pPr>
       <w:r>
@@ -6292,7 +6416,7 @@
         <w:pStyle w:val="Compact"/>
         <w:numPr>
           <w:ilvl w:val="0"/>
-          <w:numId w:val="1017"/>
+          <w:numId w:val="1018"/>
         </w:numPr>
       </w:pPr>
       <w:r>
@@ -6319,7 +6443,7 @@
         <w:pStyle w:val="Compact"/>
         <w:numPr>
           <w:ilvl w:val="0"/>
-          <w:numId w:val="1017"/>
+          <w:numId w:val="1018"/>
         </w:numPr>
       </w:pPr>
       <w:r>
@@ -6349,7 +6473,7 @@
         <w:pStyle w:val="Compact"/>
         <w:numPr>
           <w:ilvl w:val="0"/>
-          <w:numId w:val="1017"/>
+          <w:numId w:val="1018"/>
         </w:numPr>
       </w:pPr>
       <w:r>
@@ -6388,7 +6512,7 @@
         <w:pStyle w:val="Compact"/>
         <w:numPr>
           <w:ilvl w:val="0"/>
-          <w:numId w:val="1017"/>
+          <w:numId w:val="1018"/>
         </w:numPr>
       </w:pPr>
       <w:r>
@@ -6428,7 +6552,7 @@
         <w:pStyle w:val="Compact"/>
         <w:numPr>
           <w:ilvl w:val="0"/>
-          <w:numId w:val="1018"/>
+          <w:numId w:val="1019"/>
         </w:numPr>
       </w:pPr>
       <w:r>
@@ -6458,7 +6582,7 @@
         <w:pStyle w:val="Compact"/>
         <w:numPr>
           <w:ilvl w:val="0"/>
-          <w:numId w:val="1018"/>
+          <w:numId w:val="1019"/>
         </w:numPr>
       </w:pPr>
       <w:r>
@@ -6493,7 +6617,7 @@
         <w:pStyle w:val="Compact"/>
         <w:numPr>
           <w:ilvl w:val="0"/>
-          <w:numId w:val="1018"/>
+          <w:numId w:val="1019"/>
         </w:numPr>
       </w:pPr>
       <w:r>
@@ -6520,7 +6644,7 @@
         <w:pStyle w:val="Compact"/>
         <w:numPr>
           <w:ilvl w:val="0"/>
-          <w:numId w:val="1018"/>
+          <w:numId w:val="1019"/>
         </w:numPr>
       </w:pPr>
       <w:r>
@@ -6589,7 +6713,7 @@
         <w:pStyle w:val="Compact"/>
         <w:numPr>
           <w:ilvl w:val="0"/>
-          <w:numId w:val="1018"/>
+          <w:numId w:val="1019"/>
         </w:numPr>
       </w:pPr>
       <w:r>
@@ -6658,7 +6782,7 @@
         <w:pStyle w:val="Compact"/>
         <w:numPr>
           <w:ilvl w:val="0"/>
-          <w:numId w:val="1018"/>
+          <w:numId w:val="1019"/>
         </w:numPr>
       </w:pPr>
       <w:r>
@@ -6682,7 +6806,7 @@
         <w:pStyle w:val="Compact"/>
         <w:numPr>
           <w:ilvl w:val="0"/>
-          <w:numId w:val="1018"/>
+          <w:numId w:val="1019"/>
         </w:numPr>
       </w:pPr>
       <w:r>
@@ -6768,7 +6892,7 @@
         <w:pStyle w:val="Compact"/>
         <w:numPr>
           <w:ilvl w:val="0"/>
-          <w:numId w:val="1019"/>
+          <w:numId w:val="1020"/>
         </w:numPr>
       </w:pPr>
       <w:r>
@@ -6780,7 +6904,7 @@
         <w:pStyle w:val="Compact"/>
         <w:numPr>
           <w:ilvl w:val="0"/>
-          <w:numId w:val="1019"/>
+          <w:numId w:val="1020"/>
         </w:numPr>
       </w:pPr>
       <w:r>
@@ -6798,7 +6922,7 @@
         <w:pStyle w:val="Compact"/>
         <w:numPr>
           <w:ilvl w:val="0"/>
-          <w:numId w:val="1019"/>
+          <w:numId w:val="1020"/>
         </w:numPr>
       </w:pPr>
       <w:r>
@@ -6816,7 +6940,7 @@
         <w:pStyle w:val="Compact"/>
         <w:numPr>
           <w:ilvl w:val="0"/>
-          <w:numId w:val="1019"/>
+          <w:numId w:val="1020"/>
         </w:numPr>
       </w:pPr>
       <w:r>
@@ -6837,7 +6961,7 @@
       <w:r>
         <w:t xml:space="preserve"> </w:t>
       </w:r>
-      <w:hyperlink r:id="rId18">
+      <w:hyperlink r:id="rId19">
         <w:r>
           <w:rPr>
             <w:rStyle w:val="Hyperlink"/>
@@ -6969,7 +7093,7 @@
       <w:r>
         <w:t xml:space="preserve"> </w:t>
       </w:r>
-      <w:hyperlink r:id="rId19">
+      <w:hyperlink r:id="rId14">
         <w:r>
           <w:rPr>
             <w:rStyle w:val="Hyperlink"/>
@@ -7001,7 +7125,7 @@
         <w:pStyle w:val="Compact"/>
         <w:numPr>
           <w:ilvl w:val="0"/>
-          <w:numId w:val="1020"/>
+          <w:numId w:val="1021"/>
         </w:numPr>
       </w:pPr>
       <w:r>
@@ -7043,7 +7167,7 @@
         <w:pStyle w:val="Compact"/>
         <w:numPr>
           <w:ilvl w:val="0"/>
-          <w:numId w:val="1020"/>
+          <w:numId w:val="1021"/>
         </w:numPr>
       </w:pPr>
       <w:r>
@@ -7082,7 +7206,7 @@
         <w:pStyle w:val="Compact"/>
         <w:numPr>
           <w:ilvl w:val="0"/>
-          <w:numId w:val="1020"/>
+          <w:numId w:val="1021"/>
         </w:numPr>
       </w:pPr>
       <w:r>
@@ -7192,7 +7316,7 @@
         <w:pStyle w:val="Compact"/>
         <w:numPr>
           <w:ilvl w:val="0"/>
-          <w:numId w:val="1021"/>
+          <w:numId w:val="1022"/>
         </w:numPr>
       </w:pPr>
       <w:r>
@@ -7210,7 +7334,7 @@
         <w:pStyle w:val="Compact"/>
         <w:numPr>
           <w:ilvl w:val="0"/>
-          <w:numId w:val="1021"/>
+          <w:numId w:val="1022"/>
         </w:numPr>
       </w:pPr>
       <w:r>
@@ -7228,7 +7352,7 @@
         <w:pStyle w:val="Compact"/>
         <w:numPr>
           <w:ilvl w:val="0"/>
-          <w:numId w:val="1021"/>
+          <w:numId w:val="1022"/>
         </w:numPr>
       </w:pPr>
       <w:r>
@@ -7255,7 +7379,7 @@
         <w:pStyle w:val="Compact"/>
         <w:numPr>
           <w:ilvl w:val="0"/>
-          <w:numId w:val="1021"/>
+          <w:numId w:val="1022"/>
         </w:numPr>
       </w:pPr>
       <w:r>
@@ -7285,7 +7409,7 @@
         <w:pStyle w:val="Compact"/>
         <w:numPr>
           <w:ilvl w:val="0"/>
-          <w:numId w:val="1021"/>
+          <w:numId w:val="1022"/>
         </w:numPr>
       </w:pPr>
       <w:r>
@@ -7303,7 +7427,7 @@
         <w:pStyle w:val="Compact"/>
         <w:numPr>
           <w:ilvl w:val="0"/>
-          <w:numId w:val="1021"/>
+          <w:numId w:val="1022"/>
         </w:numPr>
       </w:pPr>
       <w:r>
@@ -7585,7 +7709,7 @@
         <w:pStyle w:val="Compact"/>
         <w:numPr>
           <w:ilvl w:val="0"/>
-          <w:numId w:val="1022"/>
+          <w:numId w:val="1023"/>
         </w:numPr>
       </w:pPr>
       <w:r>
@@ -7671,7 +7795,7 @@
         <w:pStyle w:val="Compact"/>
         <w:numPr>
           <w:ilvl w:val="0"/>
-          <w:numId w:val="1022"/>
+          <w:numId w:val="1023"/>
         </w:numPr>
       </w:pPr>
       <w:r>
@@ -7706,7 +7830,7 @@
         <w:pStyle w:val="Compact"/>
         <w:numPr>
           <w:ilvl w:val="0"/>
-          <w:numId w:val="1022"/>
+          <w:numId w:val="1023"/>
         </w:numPr>
       </w:pPr>
       <w:r>
@@ -7735,7 +7859,7 @@
         <w:pStyle w:val="Compact"/>
         <w:numPr>
           <w:ilvl w:val="0"/>
-          <w:numId w:val="1022"/>
+          <w:numId w:val="1023"/>
         </w:numPr>
       </w:pPr>
       <w:r>
@@ -7771,7 +7895,7 @@
         <w:pStyle w:val="Compact"/>
         <w:numPr>
           <w:ilvl w:val="0"/>
-          <w:numId w:val="1023"/>
+          <w:numId w:val="1024"/>
         </w:numPr>
       </w:pPr>
       <w:hyperlink r:id="rId77">
@@ -7791,7 +7915,7 @@
         <w:pStyle w:val="Compact"/>
         <w:numPr>
           <w:ilvl w:val="0"/>
-          <w:numId w:val="1023"/>
+          <w:numId w:val="1024"/>
         </w:numPr>
       </w:pPr>
       <w:hyperlink r:id="rId78">
@@ -7814,7 +7938,7 @@
         <w:pStyle w:val="Compact"/>
         <w:numPr>
           <w:ilvl w:val="0"/>
-          <w:numId w:val="1023"/>
+          <w:numId w:val="1024"/>
         </w:numPr>
       </w:pPr>
       <w:hyperlink r:id="rId79">
@@ -7834,7 +7958,7 @@
         <w:pStyle w:val="Compact"/>
         <w:numPr>
           <w:ilvl w:val="0"/>
-          <w:numId w:val="1023"/>
+          <w:numId w:val="1024"/>
         </w:numPr>
       </w:pPr>
       <w:hyperlink r:id="rId80">
@@ -7857,7 +7981,7 @@
         <w:pStyle w:val="Compact"/>
         <w:numPr>
           <w:ilvl w:val="0"/>
-          <w:numId w:val="1023"/>
+          <w:numId w:val="1024"/>
         </w:numPr>
       </w:pPr>
       <w:hyperlink r:id="rId81">
@@ -8204,6 +8328,9 @@
     <w:abstractNumId w:val="991"/>
   </w:num>
   <w:num w:numId="1023">
+    <w:abstractNumId w:val="991"/>
+  </w:num>
+  <w:num w:numId="1024">
     <w:abstractNumId w:val="991"/>
   </w:num>
 </w:numbering>

</xml_diff>

<commit_message>
Deploying to gh-pages from @ Morrison-Lab/psw@7ea5059845c2676d91e6f32dae619f11cb5ee945 🚀
</commit_message>
<xml_diff>
--- a/chapters/teaching.docx
+++ b/chapters/teaching.docx
@@ -15,7 +15,7 @@
         <w:pStyle w:val="Date"/>
       </w:pPr>
       <w:r>
-        <w:t xml:space="preserve">Last modified: 2026-10-29 12:57:04 (PDT)</w:t>
+        <w:t xml:space="preserve">Last modified: 2026-10-29 13:51:16 (PDT)</w:t>
       </w:r>
     </w:p>
     <w:tbl>
@@ -1033,6 +1033,74 @@
       </w:r>
       <w:r>
         <w:t xml:space="preserve">not in italic text.</w:t>
+      </w:r>
+    </w:p>
+    <w:p>
+      <w:pPr>
+        <w:numPr>
+          <w:ilvl w:val="0"/>
+          <w:numId w:val="1001"/>
+        </w:numPr>
+      </w:pPr>
+      <w:r>
+        <w:t xml:space="preserve">Give each exercise the background that its title implies, and say why the reader should care (Ezra, 2026-10-29).</w:t>
+      </w:r>
+      <w:r>
+        <w:t xml:space="preserve"> </w:t>
+      </w:r>
+      <w:r>
+        <w:t xml:space="preserve">Whatever the title tells the reader about the object, the body also says:</w:t>
+      </w:r>
+      <w:r>
+        <w:t xml:space="preserve"> </w:t>
+      </w:r>
+      <w:r>
+        <w:t xml:space="preserve">name the object, link its definition, and say where it arises and what it is used for.</w:t>
+      </w:r>
+      <w:r>
+        <w:t xml:space="preserve"> </w:t>
+      </w:r>
+      <w:r>
+        <w:t xml:space="preserve">For a title such as</w:t>
+      </w:r>
+      <w:r>
+        <w:t xml:space="preserve"> </w:t>
+      </w:r>
+      <w:r>
+        <w:t xml:space="preserve">“Maximizing a gamma-family kernel”</w:t>
+      </w:r>
+      <w:r>
+        <w:t xml:space="preserve">,</w:t>
+      </w:r>
+      <w:r>
+        <w:t xml:space="preserve"> </w:t>
+      </w:r>
+      <w:r>
+        <w:t xml:space="preserve">the body says what a gamma distribution and its kernel are,</w:t>
+      </w:r>
+      <w:r>
+        <w:t xml:space="preserve"> </w:t>
+      </w:r>
+      <w:r>
+        <w:t xml:space="preserve">and that maximizing the kernel finds the mode without computing the normalizing constant.</w:t>
+      </w:r>
+      <w:r>
+        <w:t xml:space="preserve"> </w:t>
+      </w:r>
+      <w:r>
+        <w:t xml:space="preserve">A body that only restates the formula leaves a reader who skipped the title with a formula and no reason to care.</w:t>
+      </w:r>
+      <w:r>
+        <w:t xml:space="preserve"> </w:t>
+      </w:r>
+      <w:r>
+        <w:t xml:space="preserve">The first exercise of a split series carries the background,</w:t>
+      </w:r>
+      <w:r>
+        <w:t xml:space="preserve"> </w:t>
+      </w:r>
+      <w:r>
+        <w:t xml:space="preserve">and each later exercise begins by citing it, as the splitting rule above says.</w:t>
       </w:r>
     </w:p>
     <w:bookmarkStart w:id="16" w:name="exm-exercise-before-definition"/>

</xml_diff>

<commit_message>
Deploying to gh-pages from @ Morrison-Lab/psw@7f36e04229f5db90c0575659502f492cc0fe0cc0 🚀
</commit_message>
<xml_diff>
--- a/chapters/teaching.docx
+++ b/chapters/teaching.docx
@@ -15,7 +15,7 @@
         <w:pStyle w:val="Date"/>
       </w:pPr>
       <w:r>
-        <w:t xml:space="preserve">Last modified: 2026-10-29 14:29:08 (PDT)</w:t>
+        <w:t xml:space="preserve">Last modified: 2026-10-29 14:35:32 (PDT)</w:t>
       </w:r>
     </w:p>
     <w:tbl>
@@ -1262,7 +1262,7 @@
     </w:p>
     <w:bookmarkEnd w:id="16"/>
     <w:bookmarkEnd w:id="17"/>
-    <w:bookmarkStart w:id="21" w:name="Xb68f5757ebba706c680e7c5ed557ac14973d7af"/>
+    <w:bookmarkStart w:id="24" w:name="Xb68f5757ebba706c680e7c5ed557ac14973d7af"/>
     <w:p>
       <w:pPr>
         <w:pStyle w:val="Heading2"/>
@@ -1505,6 +1505,259 @@
         </w:numPr>
       </w:pPr>
       <w:r>
+        <w:t xml:space="preserve">Extract a lemma wherever feasible.</w:t>
+      </w:r>
+      <w:r>
+        <w:t xml:space="preserve"> </w:t>
+      </w:r>
+      <w:r>
+        <w:t xml:space="preserve">When a proof, solution or example states a general fact that does not depend on its setting,</w:t>
+      </w:r>
+      <w:r>
+        <w:t xml:space="preserve"> </w:t>
+      </w:r>
+      <w:r>
+        <w:t xml:space="preserve">such as</w:t>
+      </w:r>
+      <w:r>
+        <w:t xml:space="preserve"> </w:t>
+      </w:r>
+      <m:oMath>
+        <m:r>
+          <m:rPr>
+            <m:scr m:val="double-struck"/>
+            <m:sty m:val="p"/>
+          </m:rPr>
+          <m:t>E</m:t>
+        </m:r>
+        <m:r>
+          <m:t>​</m:t>
+        </m:r>
+        <m:d>
+          <m:dPr>
+            <m:begChr m:val="["/>
+            <m:sepChr m:val=""/>
+            <m:endChr m:val="]"/>
+            <m:grow/>
+          </m:dPr>
+          <m:e>
+            <m:sSup>
+              <m:e>
+                <m:r>
+                  <m:t>Z</m:t>
+                </m:r>
+              </m:e>
+              <m:sup>
+                <m:r>
+                  <m:t>2</m:t>
+                </m:r>
+              </m:sup>
+            </m:sSup>
+          </m:e>
+        </m:d>
+        <m:r>
+          <m:t>​</m:t>
+        </m:r>
+        <m:r>
+          <m:rPr>
+            <m:sty m:val="p"/>
+          </m:rPr>
+          <m:t>=</m:t>
+        </m:r>
+        <m:r>
+          <m:rPr>
+            <m:sty m:val="p"/>
+          </m:rPr>
+          <m:t>Var</m:t>
+        </m:r>
+        <m:r>
+          <m:t>​</m:t>
+        </m:r>
+        <m:d>
+          <m:dPr>
+            <m:begChr m:val="("/>
+            <m:sepChr m:val=""/>
+            <m:endChr m:val=")"/>
+            <m:grow/>
+          </m:dPr>
+          <m:e>
+            <m:r>
+              <m:t>Z</m:t>
+            </m:r>
+          </m:e>
+        </m:d>
+        <m:r>
+          <m:t>​</m:t>
+        </m:r>
+        <m:r>
+          <m:rPr>
+            <m:sty m:val="p"/>
+          </m:rPr>
+          <m:t>+</m:t>
+        </m:r>
+        <m:sSup>
+          <m:e>
+            <m:r>
+              <m:t>​</m:t>
+            </m:r>
+            <m:d>
+              <m:dPr>
+                <m:begChr m:val="("/>
+                <m:sepChr m:val=""/>
+                <m:endChr m:val=")"/>
+                <m:grow/>
+              </m:dPr>
+              <m:e>
+                <m:r>
+                  <m:rPr>
+                    <m:scr m:val="double-struck"/>
+                    <m:sty m:val="p"/>
+                  </m:rPr>
+                  <m:t>E</m:t>
+                </m:r>
+                <m:r>
+                  <m:t>​</m:t>
+                </m:r>
+                <m:d>
+                  <m:dPr>
+                    <m:begChr m:val="["/>
+                    <m:sepChr m:val=""/>
+                    <m:endChr m:val="]"/>
+                    <m:grow/>
+                  </m:dPr>
+                  <m:e>
+                    <m:r>
+                      <m:t>Z</m:t>
+                    </m:r>
+                  </m:e>
+                </m:d>
+                <m:r>
+                  <m:t>​</m:t>
+                </m:r>
+              </m:e>
+            </m:d>
+            <m:r>
+              <m:t>​</m:t>
+            </m:r>
+          </m:e>
+          <m:sup>
+            <m:r>
+              <m:t>2</m:t>
+            </m:r>
+          </m:sup>
+        </m:sSup>
+      </m:oMath>
+      <w:r>
+        <w:t xml:space="preserve"> </w:t>
+      </w:r>
+      <w:r>
+        <w:t xml:space="preserve">for any random variable</w:t>
+      </w:r>
+      <w:r>
+        <w:t xml:space="preserve"> </w:t>
+      </w:r>
+      <m:oMath>
+        <m:r>
+          <m:t>Z</m:t>
+        </m:r>
+      </m:oMath>
+      <w:r>
+        <w:t xml:space="preserve">,</w:t>
+      </w:r>
+      <w:r>
+        <w:t xml:space="preserve"> </w:t>
+      </w:r>
+      <w:r>
+        <w:t xml:space="preserve">give the fact its own lemma div before its first use,</w:t>
+      </w:r>
+      <w:r>
+        <w:t xml:space="preserve"> </w:t>
+      </w:r>
+      <w:r>
+        <w:t xml:space="preserve">and link to it from each place that uses it.</w:t>
+      </w:r>
+      <w:r>
+        <w:t xml:space="preserve"> </w:t>
+      </w:r>
+      <w:r>
+        <w:t xml:space="preserve">Put the lemma on the prerequisite site that owns the topic</w:t>
+      </w:r>
+      <w:r>
+        <w:t xml:space="preserve"> </w:t>
+      </w:r>
+      <w:r>
+        <w:t xml:space="preserve">(</w:t>
+      </w:r>
+      <w:hyperlink r:id="rId20">
+        <w:r>
+          <w:rPr>
+            <w:rStyle w:val="Hyperlink"/>
+          </w:rPr>
+          <w:t xml:space="preserve">mds</w:t>
+        </w:r>
+      </w:hyperlink>
+      <w:r>
+        <w:t xml:space="preserve">,</w:t>
+      </w:r>
+      <w:r>
+        <w:t xml:space="preserve"> </w:t>
+      </w:r>
+      <w:hyperlink r:id="rId21">
+        <w:r>
+          <w:rPr>
+            <w:rStyle w:val="Hyperlink"/>
+          </w:rPr>
+          <w:t xml:space="preserve">pds</w:t>
+        </w:r>
+      </w:hyperlink>
+      <w:r>
+        <w:t xml:space="preserve"> </w:t>
+      </w:r>
+      <w:r>
+        <w:t xml:space="preserve">or</w:t>
+      </w:r>
+      <w:r>
+        <w:t xml:space="preserve"> </w:t>
+      </w:r>
+      <w:hyperlink r:id="rId22">
+        <w:r>
+          <w:rPr>
+            <w:rStyle w:val="Hyperlink"/>
+          </w:rPr>
+          <w:t xml:space="preserve">sds</w:t>
+        </w:r>
+      </w:hyperlink>
+      <w:r>
+        <w:t xml:space="preserve">),</w:t>
+      </w:r>
+      <w:r>
+        <w:t xml:space="preserve"> </w:t>
+      </w:r>
+      <w:r>
+        <w:t xml:space="preserve">not in the course page that needs it.</w:t>
+      </w:r>
+      <w:r>
+        <w:t xml:space="preserve"> </w:t>
+      </w:r>
+      <w:r>
+        <w:t xml:space="preserve">Extract a lemma from a passage when you edit that passage anyway,</w:t>
+      </w:r>
+      <w:r>
+        <w:t xml:space="preserve"> </w:t>
+      </w:r>
+      <w:r>
+        <w:t xml:space="preserve">and do not sweep existing content.</w:t>
+      </w:r>
+    </w:p>
+    <w:p>
+      <w:pPr>
+        <w:pStyle w:val="Compact"/>
+        <w:numPr>
+          <w:ilvl w:val="0"/>
+          <w:numId w:val="1003"/>
+        </w:numPr>
+      </w:pPr>
+      <w:r>
         <w:t xml:space="preserve">A link replaces a repeated explanation.</w:t>
       </w:r>
       <w:r>
@@ -1522,7 +1775,7 @@
         <w:t xml:space="preserve">When a unit still looks long, ask what could be named and moved out.</w:t>
       </w:r>
     </w:p>
-    <w:bookmarkStart w:id="20" w:name="exm-atomic-units"/>
+    <w:bookmarkStart w:id="23" w:name="exm-atomic-units"/>
     <w:p>
       <w:pPr>
         <w:pStyle w:val="BodyText"/>
@@ -1571,9 +1824,9 @@
         <w:t xml:space="preserve">and each piece fits on a slide.</w:t>
       </w:r>
     </w:p>
-    <w:bookmarkEnd w:id="20"/>
-    <w:bookmarkEnd w:id="21"/>
-    <w:bookmarkStart w:id="23" w:name="say-what-a-yes-or-no-answer-means"/>
+    <w:bookmarkEnd w:id="23"/>
+    <w:bookmarkEnd w:id="24"/>
+    <w:bookmarkStart w:id="26" w:name="say-what-a-yes-or-no-answer-means"/>
     <w:p>
       <w:pPr>
         <w:pStyle w:val="Heading2"/>
@@ -1674,7 +1927,7 @@
         <w:t xml:space="preserve">The rule covers solutions, worked examples and any other answer to a question.</w:t>
       </w:r>
     </w:p>
-    <w:bookmarkStart w:id="22" w:name="exm-yes-no-conclusion"/>
+    <w:bookmarkStart w:id="25" w:name="exm-yes-no-conclusion"/>
     <w:p>
       <w:pPr>
         <w:pStyle w:val="BodyText"/>
@@ -1757,9 +2010,9 @@
         <w:t xml:space="preserve">so the reasons that follow support a claim the reader has already seen.</w:t>
       </w:r>
     </w:p>
-    <w:bookmarkEnd w:id="22"/>
-    <w:bookmarkEnd w:id="23"/>
-    <w:bookmarkStart w:id="24" w:name="Xcb2ea076bd2bdcde187ea355befd37150b69b89"/>
+    <w:bookmarkEnd w:id="25"/>
+    <w:bookmarkEnd w:id="26"/>
+    <w:bookmarkStart w:id="27" w:name="Xcb2ea076bd2bdcde187ea355befd37150b69b89"/>
     <w:p>
       <w:pPr>
         <w:pStyle w:val="Heading2"/>
@@ -1812,8 +2065,8 @@
         <w:t xml:space="preserve">No automated check enforces this rule, because a script cannot tell how many questions a prompt asks.</w:t>
       </w:r>
     </w:p>
-    <w:bookmarkEnd w:id="24"/>
-    <w:bookmarkStart w:id="27" w:name="give-each-defined-term-its-own-div"/>
+    <w:bookmarkEnd w:id="27"/>
+    <w:bookmarkStart w:id="30" w:name="give-each-defined-term-its-own-div"/>
     <w:p>
       <w:pPr>
         <w:pStyle w:val="Heading2"/>
@@ -1826,7 +2079,7 @@
       <w:pPr>
         <w:pStyle w:val="FirstParagraph"/>
       </w:pPr>
-      <w:hyperlink r:id="rId25">
+      <w:hyperlink r:id="rId28">
         <w:r>
           <w:rPr>
             <w:rStyle w:val="Hyperlink"/>
@@ -2077,7 +2330,7 @@
       <w:r>
         <w:t xml:space="preserve"> </w:t>
       </w:r>
-      <w:hyperlink r:id="rId26">
+      <w:hyperlink r:id="rId29">
         <w:r>
           <w:rPr>
             <w:rStyle w:val="Hyperlink"/>
@@ -2244,8 +2497,8 @@
         <w:t xml:space="preserve">and also the points where the derivative does not exist.</w:t>
       </w:r>
     </w:p>
-    <w:bookmarkEnd w:id="27"/>
-    <w:bookmarkStart w:id="28" w:name="state-the-notation-and-its-alternatives"/>
+    <w:bookmarkEnd w:id="30"/>
+    <w:bookmarkStart w:id="31" w:name="state-the-notation-and-its-alternatives"/>
     <w:p>
       <w:pPr>
         <w:pStyle w:val="Heading2"/>
@@ -2343,8 +2596,8 @@
         <w:t xml:space="preserve">to make the choice explicit.</w:t>
       </w:r>
     </w:p>
-    <w:bookmarkEnd w:id="28"/>
-    <w:bookmarkStart w:id="30" w:name="Xac7e4ead54b12ccf6544491699a177b7d16fa22"/>
+    <w:bookmarkEnd w:id="31"/>
+    <w:bookmarkStart w:id="33" w:name="Xac7e4ead54b12ccf6544491699a177b7d16fa22"/>
     <w:p>
       <w:pPr>
         <w:pStyle w:val="Heading2"/>
@@ -2375,7 +2628,7 @@
       <w:r>
         <w:t xml:space="preserve"> </w:t>
       </w:r>
-      <w:hyperlink r:id="rId29">
+      <w:hyperlink r:id="rId32">
         <w:r>
           <w:rPr>
             <w:rStyle w:val="Hyperlink"/>
@@ -2621,8 +2874,8 @@
         <w:t xml:space="preserve">The conventional form still appears in the notes, as a named result.</w:t>
       </w:r>
     </w:p>
-    <w:bookmarkEnd w:id="30"/>
-    <w:bookmarkStart w:id="31" w:name="reuse-one-written-version-of-each-result"/>
+    <w:bookmarkEnd w:id="33"/>
+    <w:bookmarkStart w:id="34" w:name="reuse-one-written-version-of-each-result"/>
     <w:p>
       <w:pPr>
         <w:pStyle w:val="Heading2"/>
@@ -2663,8 +2916,8 @@
         <w:t xml:space="preserve">instead of keeping a second wording that can drift.</w:t>
       </w:r>
     </w:p>
-    <w:bookmarkEnd w:id="31"/>
-    <w:bookmarkStart w:id="33" w:name="use-real-data-and-compute-every-number"/>
+    <w:bookmarkEnd w:id="34"/>
+    <w:bookmarkStart w:id="36" w:name="use-real-data-and-compute-every-number"/>
     <w:p>
       <w:pPr>
         <w:pStyle w:val="Heading2"/>
@@ -2793,7 +3046,7 @@
         <w:t xml:space="preserve">A number typed into prose goes stale when the data or the code changes.</w:t>
       </w:r>
     </w:p>
-    <w:bookmarkStart w:id="32" w:name="exm-show-data-first"/>
+    <w:bookmarkStart w:id="35" w:name="exm-show-data-first"/>
     <w:p>
       <w:pPr>
         <w:pStyle w:val="FirstParagraph"/>
@@ -2866,9 +3119,9 @@
         <w:t xml:space="preserve">The ✅ version lets every later slide refer to something the reader has already seen.</w:t>
       </w:r>
     </w:p>
-    <w:bookmarkEnd w:id="32"/>
-    <w:bookmarkEnd w:id="33"/>
-    <w:bookmarkStart w:id="34" w:name="Xa214254a94aa6db868b5b9577007bf4e27699b1"/>
+    <w:bookmarkEnd w:id="35"/>
+    <w:bookmarkEnd w:id="36"/>
+    <w:bookmarkStart w:id="37" w:name="Xa214254a94aa6db868b5b9577007bf4e27699b1"/>
     <w:p>
       <w:pPr>
         <w:pStyle w:val="Heading2"/>
@@ -3007,8 +3260,8 @@
         <w:t xml:space="preserve">A short list that no other page reads can stay as prose.</w:t>
       </w:r>
     </w:p>
-    <w:bookmarkEnd w:id="34"/>
-    <w:bookmarkStart w:id="39" w:name="show-each-idea-applied-and-in-a-figure"/>
+    <w:bookmarkEnd w:id="37"/>
+    <w:bookmarkStart w:id="42" w:name="show-each-idea-applied-and-in-a-figure"/>
     <w:p>
       <w:pPr>
         <w:pStyle w:val="Heading2"/>
@@ -3151,7 +3404,7 @@
       <w:r>
         <w:t xml:space="preserve"> </w:t>
       </w:r>
-      <w:hyperlink r:id="rId35">
+      <w:hyperlink r:id="rId38">
         <w:r>
           <w:rPr>
             <w:rStyle w:val="Hyperlink"/>
@@ -3332,7 +3585,7 @@
       <w:r>
         <w:t xml:space="preserve">(</w:t>
       </w:r>
-      <w:hyperlink r:id="rId36">
+      <w:hyperlink r:id="rId39">
         <w:r>
           <w:rPr>
             <w:rStyle w:val="Hyperlink"/>
@@ -3589,7 +3842,7 @@
       <w:r>
         <w:t xml:space="preserve">(</w:t>
       </w:r>
-      <w:hyperlink r:id="rId37">
+      <w:hyperlink r:id="rId40">
         <w:r>
           <w:rPr>
             <w:rStyle w:val="Hyperlink"/>
@@ -3687,7 +3940,7 @@
       <w:r>
         <w:t xml:space="preserve"> </w:t>
       </w:r>
-      <w:hyperlink r:id="rId38">
+      <w:hyperlink r:id="rId41">
         <w:r>
           <w:rPr>
             <w:rStyle w:val="Hyperlink"/>
@@ -3714,8 +3967,8 @@
         <w:t xml:space="preserve">Make each figure follow the accessibility rules below.</w:t>
       </w:r>
     </w:p>
-    <w:bookmarkEnd w:id="39"/>
-    <w:bookmarkStart w:id="41" w:name="X7f95f8ec3b796fc99108c37bb45d62741b824c4"/>
+    <w:bookmarkEnd w:id="42"/>
+    <w:bookmarkStart w:id="44" w:name="X7f95f8ec3b796fc99108c37bb45d62741b824c4"/>
     <w:p>
       <w:pPr>
         <w:pStyle w:val="Heading2"/>
@@ -3908,7 +4161,7 @@
       <w:r>
         <w:t xml:space="preserve"> </w:t>
       </w:r>
-      <w:hyperlink r:id="rId25">
+      <w:hyperlink r:id="rId28">
         <w:r>
           <w:rPr>
             <w:rStyle w:val="Hyperlink"/>
@@ -3953,7 +4206,7 @@
         <w:t xml:space="preserve">Give the practice exercise its own slug and follow the numbering and slide-break rules above.</w:t>
       </w:r>
     </w:p>
-    <w:bookmarkStart w:id="40" w:name="exm-practice-after-example"/>
+    <w:bookmarkStart w:id="43" w:name="exm-practice-after-example"/>
     <w:p>
       <w:pPr>
         <w:pStyle w:val="FirstParagraph"/>
@@ -4109,9 +4362,9 @@
         <w:t xml:space="preserve">).</w:t>
       </w:r>
     </w:p>
-    <w:bookmarkEnd w:id="40"/>
-    <w:bookmarkEnd w:id="41"/>
-    <w:bookmarkStart w:id="45" w:name="Xf27331f4c36c8d578e5fa29a37312484cc3343a"/>
+    <w:bookmarkEnd w:id="43"/>
+    <w:bookmarkEnd w:id="44"/>
+    <w:bookmarkStart w:id="48" w:name="Xf27331f4c36c8d578e5fa29a37312484cc3343a"/>
     <w:p>
       <w:pPr>
         <w:pStyle w:val="Heading2"/>
@@ -4229,7 +4482,7 @@
       <w:r>
         <w:t xml:space="preserve"> </w:t>
       </w:r>
-      <w:hyperlink r:id="rId42">
+      <w:hyperlink r:id="rId45">
         <w:r>
           <w:rPr>
             <w:rStyle w:val="Hyperlink"/>
@@ -4255,7 +4508,7 @@
       <w:r>
         <w:t xml:space="preserve"> </w:t>
       </w:r>
-      <w:hyperlink r:id="rId43">
+      <w:hyperlink r:id="rId46">
         <w:r>
           <w:rPr>
             <w:rStyle w:val="Hyperlink"/>
@@ -4323,7 +4576,7 @@
       <w:r>
         <w:t xml:space="preserve"> </w:t>
       </w:r>
-      <w:hyperlink r:id="rId44">
+      <w:hyperlink r:id="rId47">
         <w:r>
           <w:rPr>
             <w:rStyle w:val="Hyperlink"/>
@@ -4494,8 +4747,8 @@
         <w:t xml:space="preserve">so setup steps must work on a shared or hosted machine.</w:t>
       </w:r>
     </w:p>
-    <w:bookmarkEnd w:id="45"/>
-    <w:bookmarkStart w:id="46" w:name="Xf53ecb3398b87b82ffd1a126dd02e87a65bb694"/>
+    <w:bookmarkEnd w:id="48"/>
+    <w:bookmarkStart w:id="49" w:name="Xf53ecb3398b87b82ffd1a126dd02e87a65bb694"/>
     <w:p>
       <w:pPr>
         <w:pStyle w:val="Heading2"/>
@@ -4763,8 +5016,8 @@
         <w:t xml:space="preserve">End each such call with a semicolon, or assign its value.</w:t>
       </w:r>
     </w:p>
-    <w:bookmarkEnd w:id="46"/>
-    <w:bookmarkStart w:id="55" w:name="present-r-results-with-modern-packages"/>
+    <w:bookmarkEnd w:id="49"/>
+    <w:bookmarkStart w:id="58" w:name="present-r-results-with-modern-packages"/>
     <w:p>
       <w:pPr>
         <w:pStyle w:val="Heading2"/>
@@ -4849,7 +5102,7 @@
       <w:r>
         <w:t xml:space="preserve"> </w:t>
       </w:r>
-      <w:hyperlink r:id="rId47">
+      <w:hyperlink r:id="rId50">
         <w:r>
           <w:rPr>
             <w:rStyle w:val="Hyperlink"/>
@@ -4881,7 +5134,7 @@
       <w:r>
         <w:t xml:space="preserve"> </w:t>
       </w:r>
-      <w:hyperlink r:id="rId48">
+      <w:hyperlink r:id="rId51">
         <w:r>
           <w:rPr>
             <w:rStyle w:val="Hyperlink"/>
@@ -4955,7 +5208,7 @@
       <w:r>
         <w:t xml:space="preserve"> </w:t>
       </w:r>
-      <w:hyperlink r:id="rId49">
+      <w:hyperlink r:id="rId52">
         <w:r>
           <w:rPr>
             <w:rStyle w:val="Hyperlink"/>
@@ -5026,7 +5279,7 @@
       <w:r>
         <w:t xml:space="preserve"> </w:t>
       </w:r>
-      <w:hyperlink r:id="rId50">
+      <w:hyperlink r:id="rId53">
         <w:r>
           <w:rPr>
             <w:rStyle w:val="Hyperlink"/>
@@ -5043,7 +5296,7 @@
       <w:r>
         <w:t xml:space="preserve"> </w:t>
       </w:r>
-      <w:hyperlink r:id="rId51">
+      <w:hyperlink r:id="rId54">
         <w:r>
           <w:rPr>
             <w:rStyle w:val="Hyperlink"/>
@@ -5066,7 +5319,7 @@
       <w:r>
         <w:t xml:space="preserve"> </w:t>
       </w:r>
-      <w:hyperlink r:id="rId52">
+      <w:hyperlink r:id="rId55">
         <w:r>
           <w:rPr>
             <w:rStyle w:val="Hyperlink"/>
@@ -5122,7 +5375,7 @@
       <w:r>
         <w:t xml:space="preserve"> </w:t>
       </w:r>
-      <w:hyperlink r:id="rId53">
+      <w:hyperlink r:id="rId56">
         <w:r>
           <w:rPr>
             <w:rStyle w:val="Hyperlink"/>
@@ -5160,7 +5413,7 @@
       <w:r>
         <w:t xml:space="preserve"> </w:t>
       </w:r>
-      <w:hyperlink r:id="rId54">
+      <w:hyperlink r:id="rId57">
         <w:r>
           <w:rPr>
             <w:rStyle w:val="Hyperlink"/>
@@ -5175,8 +5428,8 @@
         <w:t xml:space="preserve">notes show the style.</w:t>
       </w:r>
     </w:p>
-    <w:bookmarkEnd w:id="55"/>
-    <w:bookmarkStart w:id="59" w:name="manipulate-data-with-dplyr-not-base-r"/>
+    <w:bookmarkEnd w:id="58"/>
+    <w:bookmarkStart w:id="62" w:name="manipulate-data-with-dplyr-not-base-r"/>
     <w:p>
       <w:pPr>
         <w:pStyle w:val="Heading2"/>
@@ -5213,7 +5466,7 @@
       <w:r>
         <w:t xml:space="preserve"> </w:t>
       </w:r>
-      <w:hyperlink r:id="rId56">
+      <w:hyperlink r:id="rId59">
         <w:r>
           <w:rPr>
             <w:rStyle w:val="Hyperlink"/>
@@ -5371,7 +5624,7 @@
       <w:r>
         <w:t xml:space="preserve"> </w:t>
       </w:r>
-      <w:hyperlink r:id="rId57">
+      <w:hyperlink r:id="rId60">
         <w:r>
           <w:rPr>
             <w:rStyle w:val="Hyperlink"/>
@@ -5463,7 +5716,7 @@
       <w:r>
         <w:t xml:space="preserve"> </w:t>
       </w:r>
-      <w:hyperlink r:id="rId58">
+      <w:hyperlink r:id="rId61">
         <w:r>
           <w:rPr>
             <w:rStyle w:val="Hyperlink"/>
@@ -5655,8 +5908,8 @@
         <w:t xml:space="preserve">The rule is about selecting, filtering and building data frames.</w:t>
       </w:r>
     </w:p>
-    <w:bookmarkEnd w:id="59"/>
-    <w:bookmarkStart w:id="61" w:name="X2bc6121e3a2f39a37d8a6591d77df16bd22bd0b"/>
+    <w:bookmarkEnd w:id="62"/>
+    <w:bookmarkStart w:id="64" w:name="X2bc6121e3a2f39a37d8a6591d77df16bd22bd0b"/>
     <w:p>
       <w:pPr>
         <w:pStyle w:val="Heading2"/>
@@ -5749,7 +6002,7 @@
       <w:r>
         <w:t xml:space="preserve"> </w:t>
       </w:r>
-      <w:hyperlink r:id="rId60">
+      <w:hyperlink r:id="rId63">
         <w:r>
           <w:rPr>
             <w:rStyle w:val="Hyperlink"/>
@@ -5926,8 +6179,8 @@
         <w:t xml:space="preserve">directory it creates.</w:t>
       </w:r>
     </w:p>
-    <w:bookmarkEnd w:id="61"/>
-    <w:bookmarkStart w:id="62" w:name="X7c0de8eaf50a5b2644eabf66f1f9b734b8a4a71"/>
+    <w:bookmarkEnd w:id="64"/>
+    <w:bookmarkStart w:id="65" w:name="X7c0de8eaf50a5b2644eabf66f1f9b734b8a4a71"/>
     <w:p>
       <w:pPr>
         <w:pStyle w:val="Heading2"/>
@@ -6102,8 +6355,8 @@
         <w:t xml:space="preserve">such as a transformation, a modeling choice, a tuning value or a random seed.</w:t>
       </w:r>
     </w:p>
-    <w:bookmarkEnd w:id="62"/>
-    <w:bookmarkStart w:id="63" w:name="X94063c6448bea82c8f1e8d367c642bbe2eda89b"/>
+    <w:bookmarkEnd w:id="65"/>
+    <w:bookmarkStart w:id="66" w:name="X94063c6448bea82c8f1e8d367c642bbe2eda89b"/>
     <w:p>
       <w:pPr>
         <w:pStyle w:val="Heading2"/>
@@ -6343,8 +6596,8 @@
         <w:t xml:space="preserve">.</w:t>
       </w:r>
     </w:p>
-    <w:bookmarkEnd w:id="63"/>
-    <w:bookmarkStart w:id="64" w:name="Xffa5a3357c8672d830c88e1e58a0ef107550647"/>
+    <w:bookmarkEnd w:id="66"/>
+    <w:bookmarkStart w:id="67" w:name="Xffa5a3357c8672d830c88e1e58a0ef107550647"/>
     <w:p>
       <w:pPr>
         <w:pStyle w:val="Heading2"/>
@@ -6469,8 +6722,8 @@
         <w:t xml:space="preserve">A chapter introduces those where it defines them.</w:t>
       </w:r>
     </w:p>
-    <w:bookmarkEnd w:id="64"/>
-    <w:bookmarkStart w:id="65" w:name="make-figures-accessible"/>
+    <w:bookmarkEnd w:id="67"/>
+    <w:bookmarkStart w:id="68" w:name="make-figures-accessible"/>
     <w:p>
       <w:pPr>
         <w:pStyle w:val="Heading2"/>
@@ -6605,8 +6858,8 @@
         <w:t xml:space="preserve">(observed when rendering lecture notes to PDF).</w:t>
       </w:r>
     </w:p>
-    <w:bookmarkEnd w:id="65"/>
-    <w:bookmarkStart w:id="67" w:name="structure-slides-for-the-reader"/>
+    <w:bookmarkEnd w:id="68"/>
+    <w:bookmarkStart w:id="70" w:name="structure-slides-for-the-reader"/>
     <w:p>
       <w:pPr>
         <w:pStyle w:val="Heading2"/>
@@ -6665,7 +6918,7 @@
       <w:r>
         <w:t xml:space="preserve"> </w:t>
       </w:r>
-      <w:hyperlink r:id="rId66">
+      <w:hyperlink r:id="rId69">
         <w:r>
           <w:rPr>
             <w:rStyle w:val="Hyperlink"/>
@@ -6905,8 +7158,8 @@
         <w:t xml:space="preserve">Put a slide break after the heading and move the text onto content slides.</w:t>
       </w:r>
     </w:p>
-    <w:bookmarkEnd w:id="67"/>
-    <w:bookmarkStart w:id="69" w:name="X5f21f12cbfc4e3df5e838110af4e52db506fec1"/>
+    <w:bookmarkEnd w:id="70"/>
+    <w:bookmarkStart w:id="72" w:name="X5f21f12cbfc4e3df5e838110af4e52db506fec1"/>
     <w:p>
       <w:pPr>
         <w:pStyle w:val="Heading2"/>
@@ -7049,7 +7302,7 @@
         <w:t xml:space="preserve">The same rule applies to every other reference table, such as a table of notation.</w:t>
       </w:r>
     </w:p>
-    <w:bookmarkStart w:id="68" w:name="exm-note-sheet-rows"/>
+    <w:bookmarkStart w:id="71" w:name="exm-note-sheet-rows"/>
     <w:p>
       <w:pPr>
         <w:pStyle w:val="BodyText"/>
@@ -7140,9 +7393,9 @@
         <w:t xml:space="preserve">The ✅ rows let the reader find one formula by one label.</w:t>
       </w:r>
     </w:p>
-    <w:bookmarkEnd w:id="68"/>
-    <w:bookmarkEnd w:id="69"/>
-    <w:bookmarkStart w:id="70" w:name="talk-about-the-ideas-not-the-notes"/>
+    <w:bookmarkEnd w:id="71"/>
+    <w:bookmarkEnd w:id="72"/>
+    <w:bookmarkStart w:id="73" w:name="talk-about-the-ideas-not-the-notes"/>
     <w:p>
       <w:pPr>
         <w:pStyle w:val="Heading2"/>
@@ -7331,8 +7584,8 @@
         <w:t xml:space="preserve">and it goes stale when the definition moves.</w:t>
       </w:r>
     </w:p>
-    <w:bookmarkEnd w:id="70"/>
-    <w:bookmarkStart w:id="72" w:name="write-grading-rubrics-as-checklists"/>
+    <w:bookmarkEnd w:id="73"/>
+    <w:bookmarkStart w:id="75" w:name="write-grading-rubrics-as-checklists"/>
     <w:p>
       <w:pPr>
         <w:pStyle w:val="Heading2"/>
@@ -7508,7 +7761,7 @@
         <w:t xml:space="preserve">such as a single holistic judgment of a proof’s rigor.</w:t>
       </w:r>
     </w:p>
-    <w:bookmarkStart w:id="71" w:name="exm-rubric-checklist"/>
+    <w:bookmarkStart w:id="74" w:name="exm-rubric-checklist"/>
     <w:p>
       <w:pPr>
         <w:pStyle w:val="FirstParagraph"/>
@@ -7761,9 +8014,9 @@
         <w:t xml:space="preserve">and lets a script check that the points sum to the total.</w:t>
       </w:r>
     </w:p>
-    <w:bookmarkEnd w:id="71"/>
-    <w:bookmarkEnd w:id="72"/>
-    <w:bookmarkStart w:id="76" w:name="Xcb579568ef754486ebde8b41ba4528bdf380eec"/>
+    <w:bookmarkEnd w:id="74"/>
+    <w:bookmarkEnd w:id="75"/>
+    <w:bookmarkStart w:id="79" w:name="Xcb579568ef754486ebde8b41ba4528bdf380eec"/>
     <w:p>
       <w:pPr>
         <w:pStyle w:val="Heading2"/>
@@ -7822,7 +8075,7 @@
       <w:r>
         <w:t xml:space="preserve"> </w:t>
       </w:r>
-      <w:hyperlink r:id="rId73">
+      <w:hyperlink r:id="rId76">
         <w:r>
           <w:rPr>
             <w:rStyle w:val="Hyperlink"/>
@@ -7878,7 +8131,7 @@
       <w:r>
         <w:t xml:space="preserve"> </w:t>
       </w:r>
-      <w:hyperlink r:id="rId74">
+      <w:hyperlink r:id="rId77">
         <w:r>
           <w:rPr>
             <w:rStyle w:val="Hyperlink"/>
@@ -7907,7 +8160,7 @@
       <w:r>
         <w:t xml:space="preserve"> </w:t>
       </w:r>
-      <w:hyperlink r:id="rId75">
+      <w:hyperlink r:id="rId78">
         <w:r>
           <w:rPr>
             <w:rStyle w:val="Hyperlink"/>
@@ -7940,8 +8193,8 @@
         <w:t xml:space="preserve">because a bare citation key renders as the author list.</w:t>
       </w:r>
     </w:p>
-    <w:bookmarkEnd w:id="76"/>
-    <w:bookmarkStart w:id="85" w:name="rules-that-apply-to-all-writing"/>
+    <w:bookmarkEnd w:id="79"/>
+    <w:bookmarkStart w:id="88" w:name="rules-that-apply-to-all-writing"/>
     <w:p>
       <w:pPr>
         <w:pStyle w:val="Heading2"/>
@@ -7966,7 +8219,7 @@
           <w:numId w:val="1024"/>
         </w:numPr>
       </w:pPr>
-      <w:hyperlink r:id="rId77">
+      <w:hyperlink r:id="rId80">
         <w:r>
           <w:rPr>
             <w:rStyle w:val="Hyperlink"/>
@@ -7986,7 +8239,7 @@
           <w:numId w:val="1024"/>
         </w:numPr>
       </w:pPr>
-      <w:hyperlink r:id="rId78">
+      <w:hyperlink r:id="rId81">
         <w:r>
           <w:rPr>
             <w:rStyle w:val="Hyperlink"/>
@@ -8009,7 +8262,7 @@
           <w:numId w:val="1024"/>
         </w:numPr>
       </w:pPr>
-      <w:hyperlink r:id="rId79">
+      <w:hyperlink r:id="rId82">
         <w:r>
           <w:rPr>
             <w:rStyle w:val="Hyperlink"/>
@@ -8029,7 +8282,7 @@
           <w:numId w:val="1024"/>
         </w:numPr>
       </w:pPr>
-      <w:hyperlink r:id="rId80">
+      <w:hyperlink r:id="rId83">
         <w:r>
           <w:rPr>
             <w:rStyle w:val="Hyperlink"/>
@@ -8052,7 +8305,7 @@
           <w:numId w:val="1024"/>
         </w:numPr>
       </w:pPr>
-      <w:hyperlink r:id="rId81">
+      <w:hyperlink r:id="rId84">
         <w:r>
           <w:rPr>
             <w:rStyle w:val="Hyperlink"/>
@@ -8064,8 +8317,8 @@
         <w:t xml:space="preserve">.</w:t>
       </w:r>
     </w:p>
-    <w:bookmarkStart w:id="84" w:name="refs"/>
-    <w:bookmarkStart w:id="83" w:name="ref-freeman2014active"/>
+    <w:bookmarkStart w:id="87" w:name="refs"/>
+    <w:bookmarkStart w:id="86" w:name="ref-freeman2014active"/>
     <w:p>
       <w:pPr>
         <w:pStyle w:val="Bibliography"/>
@@ -8098,7 +8351,7 @@
       <w:r>
         <w:t xml:space="preserve"> </w:t>
       </w:r>
-      <w:hyperlink r:id="rId82">
+      <w:hyperlink r:id="rId85">
         <w:r>
           <w:rPr>
             <w:rStyle w:val="Hyperlink"/>
@@ -8110,9 +8363,9 @@
         <w:t xml:space="preserve">.</w:t>
       </w:r>
     </w:p>
-    <w:bookmarkEnd w:id="83"/>
-    <w:bookmarkEnd w:id="84"/>
-    <w:bookmarkEnd w:id="85"/>
+    <w:bookmarkEnd w:id="86"/>
+    <w:bookmarkEnd w:id="87"/>
+    <w:bookmarkEnd w:id="88"/>
     <w:sectPr>
       <w:footnotePr>
         <w:numRestart w:val="eachSect"/>

</xml_diff>

<commit_message>
Deploying to gh-pages from @ Morrison-Lab/psw@6fd7bf6dff7d84d34a56948bb387f2acdaa55c4e 🚀
</commit_message>
<xml_diff>
--- a/chapters/teaching.docx
+++ b/chapters/teaching.docx
@@ -15,7 +15,7 @@
         <w:pStyle w:val="Date"/>
       </w:pPr>
       <w:r>
-        <w:t xml:space="preserve">Last modified: 2026-10-29 15:25:43 (PDT)</w:t>
+        <w:t xml:space="preserve">Last modified: 2026-10-29 15:37:42 (PDT)</w:t>
       </w:r>
     </w:p>
     <w:tbl>
@@ -8194,13 +8194,13 @@
       </w:r>
     </w:p>
     <w:bookmarkEnd w:id="79"/>
-    <w:bookmarkStart w:id="88" w:name="rules-that-apply-to-all-writing"/>
+    <w:bookmarkStart w:id="82" w:name="finish-each-unit-completely"/>
     <w:p>
       <w:pPr>
         <w:pStyle w:val="Heading2"/>
       </w:pPr>
       <w:r>
-        <w:t xml:space="preserve">27 Rules that apply to all writing</w:t>
+        <w:t xml:space="preserve">27 Finish each unit completely</w:t>
       </w:r>
     </w:p>
     <w:p>
@@ -8208,6 +8208,280 @@
         <w:pStyle w:val="FirstParagraph"/>
       </w:pPr>
       <w:r>
+        <w:t xml:space="preserve">Complete each sentence, step,</w:t>
+      </w:r>
+      <w:r>
+        <w:t xml:space="preserve"> </w:t>
+      </w:r>
+      <w:hyperlink r:id="rId14">
+        <w:r>
+          <w:rPr>
+            <w:rStyle w:val="Hyperlink"/>
+          </w:rPr>
+          <w:t xml:space="preserve">term</w:t>
+        </w:r>
+      </w:hyperlink>
+      <w:r>
+        <w:t xml:space="preserve">, result and exercise,</w:t>
+      </w:r>
+      <w:r>
+        <w:t xml:space="preserve"> </w:t>
+      </w:r>
+      <w:r>
+        <w:t xml:space="preserve">and do not leave part of it implied, merged into a neighbor, or half done.</w:t>
+      </w:r>
+      <w:r>
+        <w:t xml:space="preserve"> </w:t>
+      </w:r>
+      <w:r>
+        <w:t xml:space="preserve">A reader should never have to finish a unit for you.</w:t>
+      </w:r>
+      <w:r>
+        <w:t xml:space="preserve"> </w:t>
+      </w:r>
+      <w:r>
+        <w:t xml:space="preserve">Several rules in this guide are cases of this one:</w:t>
+      </w:r>
+    </w:p>
+    <w:p>
+      <w:pPr>
+        <w:pStyle w:val="Compact"/>
+        <w:numPr>
+          <w:ilvl w:val="0"/>
+          <w:numId w:val="1024"/>
+        </w:numPr>
+      </w:pPr>
+      <w:r>
+        <w:rPr>
+          <w:b/>
+          <w:bCs/>
+        </w:rPr>
+        <w:t xml:space="preserve">Sentence.</w:t>
+      </w:r>
+      <w:r>
+        <w:t xml:space="preserve"> </w:t>
+      </w:r>
+      <w:r>
+        <w:t xml:space="preserve">Write each sentence</w:t>
+      </w:r>
+      <w:r>
+        <w:t xml:space="preserve"> </w:t>
+      </w:r>
+      <w:hyperlink r:id="rId80">
+        <w:r>
+          <w:rPr>
+            <w:rStyle w:val="Hyperlink"/>
+          </w:rPr>
+          <w:t xml:space="preserve">in words or in math, not both</w:t>
+        </w:r>
+      </w:hyperlink>
+      <w:r>
+        <w:t xml:space="preserve">,</w:t>
+      </w:r>
+      <w:r>
+        <w:t xml:space="preserve"> </w:t>
+      </w:r>
+      <w:r>
+        <w:t xml:space="preserve">so a hybrid becomes one complete sentence of each kind.</w:t>
+      </w:r>
+    </w:p>
+    <w:p>
+      <w:pPr>
+        <w:pStyle w:val="Compact"/>
+        <w:numPr>
+          <w:ilvl w:val="0"/>
+          <w:numId w:val="1024"/>
+        </w:numPr>
+      </w:pPr>
+      <w:r>
+        <w:rPr>
+          <w:b/>
+          <w:bCs/>
+        </w:rPr>
+        <w:t xml:space="preserve">Step.</w:t>
+      </w:r>
+      <w:r>
+        <w:t xml:space="preserve"> </w:t>
+      </w:r>
+      <w:r>
+        <w:t xml:space="preserve">Give each operation</w:t>
+      </w:r>
+      <w:r>
+        <w:t xml:space="preserve"> </w:t>
+      </w:r>
+      <w:hyperlink r:id="rId81">
+        <w:r>
+          <w:rPr>
+            <w:rStyle w:val="Hyperlink"/>
+          </w:rPr>
+          <w:t xml:space="preserve">its own line and justification</w:t>
+        </w:r>
+      </w:hyperlink>
+      <w:r>
+        <w:t xml:space="preserve">,</w:t>
+      </w:r>
+      <w:r>
+        <w:t xml:space="preserve"> </w:t>
+      </w:r>
+      <w:r>
+        <w:t xml:space="preserve">and do not</w:t>
+      </w:r>
+      <w:r>
+        <w:t xml:space="preserve"> </w:t>
+      </w:r>
+      <w:r>
+        <w:t xml:space="preserve">“cancel”</w:t>
+      </w:r>
+      <w:r>
+        <w:t xml:space="preserve"> </w:t>
+      </w:r>
+      <w:r>
+        <w:t xml:space="preserve">several operations as one step.</w:t>
+      </w:r>
+    </w:p>
+    <w:p>
+      <w:pPr>
+        <w:pStyle w:val="Compact"/>
+        <w:numPr>
+          <w:ilvl w:val="0"/>
+          <w:numId w:val="1024"/>
+        </w:numPr>
+      </w:pPr>
+      <w:r>
+        <w:rPr>
+          <w:b/>
+          <w:bCs/>
+        </w:rPr>
+        <w:t xml:space="preserve">Term.</w:t>
+      </w:r>
+      <w:r>
+        <w:t xml:space="preserve"> </w:t>
+      </w:r>
+      <w:r>
+        <w:t xml:space="preserve"> </w:t>
+      </w:r>
+      <w:hyperlink w:anchor="give-each-defined-term-its-own-div">
+        <w:r>
+          <w:rPr>
+            <w:rStyle w:val="Hyperlink"/>
+          </w:rPr>
+          <w:t xml:space="preserve">Give each defined term its own div</w:t>
+        </w:r>
+      </w:hyperlink>
+      <w:r>
+        <w:t xml:space="preserve">,</w:t>
+      </w:r>
+      <w:r>
+        <w:t xml:space="preserve"> </w:t>
+      </w:r>
+      <w:r>
+        <w:t xml:space="preserve">and keep equalities and equivalences out of the definition by stating them as results.</w:t>
+      </w:r>
+    </w:p>
+    <w:p>
+      <w:pPr>
+        <w:pStyle w:val="Compact"/>
+        <w:numPr>
+          <w:ilvl w:val="0"/>
+          <w:numId w:val="1024"/>
+        </w:numPr>
+      </w:pPr>
+      <w:r>
+        <w:rPr>
+          <w:b/>
+          <w:bCs/>
+        </w:rPr>
+        <w:t xml:space="preserve">Result.</w:t>
+      </w:r>
+      <w:r>
+        <w:t xml:space="preserve"> </w:t>
+      </w:r>
+      <w:hyperlink w:anchor="X54d80540a68b433948113395869433e0fc9698c">
+        <w:r>
+          <w:rPr>
+            <w:rStyle w:val="Hyperlink"/>
+          </w:rPr>
+          <w:t xml:space="preserve">Restate a result</w:t>
+        </w:r>
+      </w:hyperlink>
+      <w:r>
+        <w:t xml:space="preserve"> </w:t>
+      </w:r>
+      <w:r>
+        <w:t xml:space="preserve">first derived in a solution as a theorem after the exercise,</w:t>
+      </w:r>
+      <w:r>
+        <w:t xml:space="preserve"> </w:t>
+      </w:r>
+      <w:r>
+        <w:t xml:space="preserve">so the result stands alone.</w:t>
+      </w:r>
+    </w:p>
+    <w:p>
+      <w:pPr>
+        <w:pStyle w:val="Compact"/>
+        <w:numPr>
+          <w:ilvl w:val="0"/>
+          <w:numId w:val="1024"/>
+        </w:numPr>
+      </w:pPr>
+      <w:r>
+        <w:rPr>
+          <w:b/>
+          <w:bCs/>
+        </w:rPr>
+        <w:t xml:space="preserve">Exercise.</w:t>
+      </w:r>
+      <w:r>
+        <w:t xml:space="preserve"> </w:t>
+      </w:r>
+      <w:hyperlink w:anchor="X54d80540a68b433948113395869433e0fc9698c">
+        <w:r>
+          <w:rPr>
+            <w:rStyle w:val="Hyperlink"/>
+          </w:rPr>
+          <w:t xml:space="preserve">Split an exercise with several parts</w:t>
+        </w:r>
+      </w:hyperlink>
+      <w:r>
+        <w:t xml:space="preserve">,</w:t>
+      </w:r>
+      <w:r>
+        <w:t xml:space="preserve"> </w:t>
+      </w:r>
+      <w:r>
+        <w:t xml:space="preserve">so each exercise asks for one thing.</w:t>
+      </w:r>
+    </w:p>
+    <w:p>
+      <w:pPr>
+        <w:pStyle w:val="FirstParagraph"/>
+      </w:pPr>
+      <w:r>
+        <w:t xml:space="preserve">When you catch yourself taking a shortcut, finish the unit instead.</w:t>
+      </w:r>
+      <w:r>
+        <w:t xml:space="preserve"> </w:t>
+      </w:r>
+      <w:r>
+        <w:t xml:space="preserve">A shortcut saves the writer a few lines and costs every reader the work of rebuilding them.</w:t>
+      </w:r>
+    </w:p>
+    <w:bookmarkEnd w:id="82"/>
+    <w:bookmarkStart w:id="91" w:name="rules-that-apply-to-all-writing"/>
+    <w:p>
+      <w:pPr>
+        <w:pStyle w:val="Heading2"/>
+      </w:pPr>
+      <w:r>
+        <w:t xml:space="preserve">28 Rules that apply to all writing</w:t>
+      </w:r>
+    </w:p>
+    <w:p>
+      <w:pPr>
+        <w:pStyle w:val="FirstParagraph"/>
+      </w:pPr>
+      <w:r>
         <w:t xml:space="preserve">These rules from the other chapters apply to teaching materials as to any other writing:</w:t>
       </w:r>
     </w:p>
@@ -8216,10 +8490,10 @@
         <w:pStyle w:val="Compact"/>
         <w:numPr>
           <w:ilvl w:val="0"/>
-          <w:numId w:val="1024"/>
-        </w:numPr>
-      </w:pPr>
-      <w:hyperlink r:id="rId80">
+          <w:numId w:val="1025"/>
+        </w:numPr>
+      </w:pPr>
+      <w:hyperlink r:id="rId83">
         <w:r>
           <w:rPr>
             <w:rStyle w:val="Hyperlink"/>
@@ -8236,10 +8510,10 @@
         <w:pStyle w:val="Compact"/>
         <w:numPr>
           <w:ilvl w:val="0"/>
-          <w:numId w:val="1024"/>
-        </w:numPr>
-      </w:pPr>
-      <w:hyperlink r:id="rId81">
+          <w:numId w:val="1025"/>
+        </w:numPr>
+      </w:pPr>
+      <w:hyperlink r:id="rId84">
         <w:r>
           <w:rPr>
             <w:rStyle w:val="Hyperlink"/>
@@ -8259,10 +8533,10 @@
         <w:pStyle w:val="Compact"/>
         <w:numPr>
           <w:ilvl w:val="0"/>
-          <w:numId w:val="1024"/>
-        </w:numPr>
-      </w:pPr>
-      <w:hyperlink r:id="rId82">
+          <w:numId w:val="1025"/>
+        </w:numPr>
+      </w:pPr>
+      <w:hyperlink r:id="rId85">
         <w:r>
           <w:rPr>
             <w:rStyle w:val="Hyperlink"/>
@@ -8279,10 +8553,10 @@
         <w:pStyle w:val="Compact"/>
         <w:numPr>
           <w:ilvl w:val="0"/>
-          <w:numId w:val="1024"/>
-        </w:numPr>
-      </w:pPr>
-      <w:hyperlink r:id="rId83">
+          <w:numId w:val="1025"/>
+        </w:numPr>
+      </w:pPr>
+      <w:hyperlink r:id="rId86">
         <w:r>
           <w:rPr>
             <w:rStyle w:val="Hyperlink"/>
@@ -8302,10 +8576,10 @@
         <w:pStyle w:val="Compact"/>
         <w:numPr>
           <w:ilvl w:val="0"/>
-          <w:numId w:val="1024"/>
-        </w:numPr>
-      </w:pPr>
-      <w:hyperlink r:id="rId84">
+          <w:numId w:val="1025"/>
+        </w:numPr>
+      </w:pPr>
+      <w:hyperlink r:id="rId87">
         <w:r>
           <w:rPr>
             <w:rStyle w:val="Hyperlink"/>
@@ -8317,8 +8591,8 @@
         <w:t xml:space="preserve">.</w:t>
       </w:r>
     </w:p>
-    <w:bookmarkStart w:id="87" w:name="refs"/>
-    <w:bookmarkStart w:id="86" w:name="ref-freeman2014active"/>
+    <w:bookmarkStart w:id="90" w:name="refs"/>
+    <w:bookmarkStart w:id="89" w:name="ref-freeman2014active"/>
     <w:p>
       <w:pPr>
         <w:pStyle w:val="Bibliography"/>
@@ -8351,7 +8625,7 @@
       <w:r>
         <w:t xml:space="preserve"> </w:t>
       </w:r>
-      <w:hyperlink r:id="rId85">
+      <w:hyperlink r:id="rId88">
         <w:r>
           <w:rPr>
             <w:rStyle w:val="Hyperlink"/>
@@ -8363,9 +8637,9 @@
         <w:t xml:space="preserve">.</w:t>
       </w:r>
     </w:p>
-    <w:bookmarkEnd w:id="86"/>
-    <w:bookmarkEnd w:id="87"/>
-    <w:bookmarkEnd w:id="88"/>
+    <w:bookmarkEnd w:id="89"/>
+    <w:bookmarkEnd w:id="90"/>
+    <w:bookmarkEnd w:id="91"/>
     <w:sectPr>
       <w:footnotePr>
         <w:numRestart w:val="eachSect"/>
@@ -8652,6 +8926,9 @@
     <w:abstractNumId w:val="991"/>
   </w:num>
   <w:num w:numId="1024">
+    <w:abstractNumId w:val="991"/>
+  </w:num>
+  <w:num w:numId="1025">
     <w:abstractNumId w:val="991"/>
   </w:num>
 </w:numbering>

</xml_diff>

<commit_message>
Deploying to gh-pages from @ Morrison-Lab/psw@dbda2c523b09aa31f6632de8c5aacdf09792e77a 🚀
</commit_message>
<xml_diff>
--- a/chapters/teaching.docx
+++ b/chapters/teaching.docx
@@ -15,7 +15,7 @@
         <w:pStyle w:val="Date"/>
       </w:pPr>
       <w:r>
-        <w:t xml:space="preserve">Last modified: 2026-10-29 16:56:32 (PDT)</w:t>
+        <w:t xml:space="preserve">Last modified: 2026-10-29 17:02:18 (PDT)</w:t>
       </w:r>
     </w:p>
     <w:tbl>
@@ -1487,6 +1487,66 @@
         </w:numPr>
       </w:pPr>
       <w:r>
+        <w:t xml:space="preserve">A theorem-type div states the result and its hypotheses, and no reasoning.</w:t>
+      </w:r>
+      <w:r>
+        <w:t xml:space="preserve"> </w:t>
+      </w:r>
+      <w:r>
+        <w:t xml:space="preserve">Words that justify the claim (</w:t>
+      </w:r>
+      <w:r>
+        <w:t xml:space="preserve">“so”</w:t>
+      </w:r>
+      <w:r>
+        <w:t xml:space="preserve">,</w:t>
+      </w:r>
+      <w:r>
+        <w:t xml:space="preserve"> </w:t>
+      </w:r>
+      <w:r>
+        <w:t xml:space="preserve">“because”</w:t>
+      </w:r>
+      <w:r>
+        <w:t xml:space="preserve">,</w:t>
+      </w:r>
+      <w:r>
+        <w:t xml:space="preserve"> </w:t>
+      </w:r>
+      <w:r>
+        <w:t xml:space="preserve">“hence”</w:t>
+      </w:r>
+      <w:r>
+        <w:t xml:space="preserve">,</w:t>
+      </w:r>
+      <w:r>
+        <w:t xml:space="preserve"> </w:t>
+      </w:r>
+      <w:r>
+        <w:t xml:space="preserve">“therefore”</w:t>
+      </w:r>
+      <w:r>
+        <w:t xml:space="preserve">,</w:t>
+      </w:r>
+      <w:r>
+        <w:t xml:space="preserve"> </w:t>
+      </w:r>
+      <w:r>
+        <w:t xml:space="preserve">“since”</w:t>
+      </w:r>
+      <w:r>
+        <w:t xml:space="preserve">) belong in the proof.</w:t>
+      </w:r>
+    </w:p>
+    <w:p>
+      <w:pPr>
+        <w:pStyle w:val="Compact"/>
+        <w:numPr>
+          <w:ilvl w:val="0"/>
+          <w:numId w:val="1003"/>
+        </w:numPr>
+      </w:pPr>
+      <w:r>
         <w:t xml:space="preserve">A proof states the lemmas it needs and links to them,</w:t>
       </w:r>
       <w:r>
@@ -6931,6 +6991,54 @@
       </w:r>
       <w:r>
         <w:t xml:space="preserve">describes.</w:t>
+      </w:r>
+    </w:p>
+    <w:p>
+      <w:pPr>
+        <w:pStyle w:val="Compact"/>
+        <w:numPr>
+          <w:ilvl w:val="0"/>
+          <w:numId w:val="1019"/>
+        </w:numPr>
+      </w:pPr>
+      <w:r>
+        <w:t xml:space="preserve">Show every proof on the slides.</w:t>
+      </w:r>
+      <w:r>
+        <w:t xml:space="preserve"> </w:t>
+      </w:r>
+      <w:r>
+        <w:t xml:space="preserve">Do not wrap a proof in</w:t>
+      </w:r>
+      <w:r>
+        <w:t xml:space="preserve"> </w:t>
+      </w:r>
+      <w:r>
+        <w:rPr>
+          <w:rStyle w:val="VerbatimChar"/>
+        </w:rPr>
+        <w:t xml:space="preserve">{.content-hidden when-format="revealjs"}</w:t>
+      </w:r>
+      <w:r>
+        <w:t xml:space="preserve">.</w:t>
+      </w:r>
+      <w:r>
+        <w:t xml:space="preserve"> </w:t>
+      </w:r>
+      <w:r>
+        <w:t xml:space="preserve">Remove an existing wrapper from a proof when you edit the file for another reason,</w:t>
+      </w:r>
+      <w:r>
+        <w:t xml:space="preserve"> </w:t>
+      </w:r>
+      <w:r>
+        <w:t xml:space="preserve">and do not sweep the others</w:t>
+      </w:r>
+      <w:r>
+        <w:t xml:space="preserve"> </w:t>
+      </w:r>
+      <w:r>
+        <w:t xml:space="preserve">(Ezra, 2026-10-29).</w:t>
       </w:r>
     </w:p>
     <w:p>

</xml_diff>

<commit_message>
Deploying to gh-pages from @ Morrison-Lab/psw@e5336ed66bfa9e47cd815685a8da03f8a863bf08 🚀
</commit_message>
<xml_diff>
--- a/chapters/teaching.docx
+++ b/chapters/teaching.docx
@@ -15,7 +15,7 @@
         <w:pStyle w:val="Date"/>
       </w:pPr>
       <w:r>
-        <w:t xml:space="preserve">Last modified: 2026-10-29 18:12:52 (PDT)</w:t>
+        <w:t xml:space="preserve">Last modified: 2026-10-31 07:13:32 (PDT)</w:t>
       </w:r>
     </w:p>
     <w:tbl>
@@ -6919,13 +6919,57 @@
       </w:r>
     </w:p>
     <w:bookmarkEnd w:id="68"/>
-    <w:bookmarkStart w:id="70" w:name="structure-slides-for-the-reader"/>
+    <w:bookmarkStart w:id="70" w:name="split-a-page-before-it-grows-too-long"/>
     <w:p>
       <w:pPr>
         <w:pStyle w:val="Heading2"/>
       </w:pPr>
       <w:r>
-        <w:t xml:space="preserve">22 Structure slides for the reader</w:t>
+        <w:t xml:space="preserve">22 Split a page before it grows too long</w:t>
+      </w:r>
+    </w:p>
+    <w:p>
+      <w:pPr>
+        <w:pStyle w:val="FirstParagraph"/>
+      </w:pPr>
+      <w:r>
+        <w:t xml:space="preserve">A page should load and finish rendering its math in under 5 seconds,</w:t>
+      </w:r>
+      <w:r>
+        <w:t xml:space="preserve"> </w:t>
+      </w:r>
+      <w:r>
+        <w:t xml:space="preserve">and its scroll bar should not shrink to its smallest length</w:t>
+      </w:r>
+      <w:r>
+        <w:t xml:space="preserve"> </w:t>
+      </w:r>
+      <w:r>
+        <w:t xml:space="preserve">(Ezra, 2026-10-31).</w:t>
+      </w:r>
+      <w:r>
+        <w:t xml:space="preserve"> </w:t>
+      </w:r>
+      <w:r>
+        <w:t xml:space="preserve">The browser typesets every formula on a page,</w:t>
+      </w:r>
+      <w:r>
+        <w:t xml:space="preserve"> </w:t>
+      </w:r>
+      <w:r>
+        <w:t xml:space="preserve">so a page with hundreds of formulas takes seconds to finish.</w:t>
+      </w:r>
+      <w:r>
+        <w:t xml:space="preserve"> </w:t>
+      </w:r>
+      <w:r>
+        <w:t xml:space="preserve">A page tall enough to shrink the scroll bar to its minimum</w:t>
+      </w:r>
+      <w:r>
+        <w:t xml:space="preserve"> </w:t>
+      </w:r>
+      <w:r>
+        <w:t xml:space="preserve">leaves the reader no way to see where they are in it.</w:t>
       </w:r>
     </w:p>
     <w:p>
@@ -6937,6 +6981,216 @@
         </w:numPr>
       </w:pPr>
       <w:r>
+        <w:t xml:space="preserve">Split a page that fails either test into several pages,</w:t>
+      </w:r>
+      <w:r>
+        <w:t xml:space="preserve"> </w:t>
+      </w:r>
+      <w:r>
+        <w:t xml:space="preserve">one coherent topic each.</w:t>
+      </w:r>
+      <w:r>
+        <w:t xml:space="preserve"> </w:t>
+      </w:r>
+      <w:r>
+        <w:t xml:space="preserve">The</w:t>
+      </w:r>
+      <w:r>
+        <w:t xml:space="preserve"> </w:t>
+      </w:r>
+      <w:hyperlink r:id="rId20">
+        <w:r>
+          <w:rPr>
+            <w:rStyle w:val="Hyperlink"/>
+          </w:rPr>
+          <w:t xml:space="preserve">math prerequisites</w:t>
+        </w:r>
+      </w:hyperlink>
+      <w:r>
+        <w:t xml:space="preserve"> </w:t>
+      </w:r>
+      <w:r>
+        <w:t xml:space="preserve">page on measures,</w:t>
+      </w:r>
+      <w:r>
+        <w:t xml:space="preserve"> </w:t>
+      </w:r>
+      <w:r>
+        <w:t xml:space="preserve">for example, became six pages for this reason.</w:t>
+      </w:r>
+    </w:p>
+    <w:p>
+      <w:pPr>
+        <w:pStyle w:val="Compact"/>
+        <w:numPr>
+          <w:ilvl w:val="0"/>
+          <w:numId w:val="1019"/>
+        </w:numPr>
+      </w:pPr>
+      <w:r>
+        <w:t xml:space="preserve">Split along the headings that already divide the page,</w:t>
+      </w:r>
+      <w:r>
+        <w:t xml:space="preserve"> </w:t>
+      </w:r>
+      <w:r>
+        <w:t xml:space="preserve">and give each new page its own title and a short introduction.</w:t>
+      </w:r>
+    </w:p>
+    <w:p>
+      <w:pPr>
+        <w:pStyle w:val="Compact"/>
+        <w:numPr>
+          <w:ilvl w:val="0"/>
+          <w:numId w:val="1019"/>
+        </w:numPr>
+      </w:pPr>
+      <w:r>
+        <w:t xml:space="preserve">Keep the old section ids as stubs that link to the new pages,</w:t>
+      </w:r>
+      <w:r>
+        <w:t xml:space="preserve"> </w:t>
+      </w:r>
+      <w:r>
+        <w:t xml:space="preserve">so links from other pages and other sites still reach the content.</w:t>
+      </w:r>
+    </w:p>
+    <w:p>
+      <w:pPr>
+        <w:pStyle w:val="Compact"/>
+        <w:numPr>
+          <w:ilvl w:val="0"/>
+          <w:numId w:val="1019"/>
+        </w:numPr>
+      </w:pPr>
+      <w:r>
+        <w:t xml:space="preserve">Link between the new pages where one page uses a concept that another page defines.</w:t>
+      </w:r>
+    </w:p>
+    <w:p>
+      <w:pPr>
+        <w:pStyle w:val="Compact"/>
+        <w:numPr>
+          <w:ilvl w:val="0"/>
+          <w:numId w:val="1019"/>
+        </w:numPr>
+      </w:pPr>
+      <w:r>
+        <w:t xml:space="preserve">Do not delete anything to shorten a page:</w:t>
+      </w:r>
+      <w:r>
+        <w:t xml:space="preserve"> </w:t>
+      </w:r>
+      <w:r>
+        <w:t xml:space="preserve">move it to the page where it belongs.</w:t>
+      </w:r>
+    </w:p>
+    <w:p>
+      <w:pPr>
+        <w:pStyle w:val="FirstParagraph"/>
+      </w:pPr>
+      <w:r>
+        <w:t xml:space="preserve">The</w:t>
+      </w:r>
+      <w:r>
+        <w:t xml:space="preserve"> </w:t>
+      </w:r>
+      <w:r>
+        <w:rPr>
+          <w:rStyle w:val="VerbatimChar"/>
+        </w:rPr>
+        <w:t xml:space="preserve">check-page-length</w:t>
+      </w:r>
+      <w:r>
+        <w:t xml:space="preserve"> </w:t>
+      </w:r>
+      <w:r>
+        <w:t xml:space="preserve">check in</w:t>
+      </w:r>
+      <w:r>
+        <w:t xml:space="preserve"> </w:t>
+      </w:r>
+      <w:hyperlink r:id="rId12">
+        <w:r>
+          <w:rPr>
+            <w:rStyle w:val="VerbatimChar"/>
+          </w:rPr>
+          <w:t xml:space="preserve">gha</w:t>
+        </w:r>
+      </w:hyperlink>
+      <w:r>
+        <w:t xml:space="preserve"> </w:t>
+      </w:r>
+      <w:r>
+        <w:t xml:space="preserve">(</w:t>
+      </w:r>
+      <w:hyperlink r:id="rId69">
+        <w:r>
+          <w:rPr>
+            <w:rStyle w:val="Hyperlink"/>
+          </w:rPr>
+          <w:t xml:space="preserve">gha#1377</w:t>
+        </w:r>
+      </w:hyperlink>
+      <w:r>
+        <w:t xml:space="preserve">)</w:t>
+      </w:r>
+      <w:r>
+        <w:t xml:space="preserve"> </w:t>
+      </w:r>
+      <w:r>
+        <w:t xml:space="preserve">warns when a pull request adds to a page that, with its includes expanded,</w:t>
+      </w:r>
+      <w:r>
+        <w:t xml:space="preserve"> </w:t>
+      </w:r>
+      <w:r>
+        <w:t xml:space="preserve">has more than 600 math expressions or 5000 source lines.</w:t>
+      </w:r>
+      <w:r>
+        <w:t xml:space="preserve"> </w:t>
+      </w:r>
+      <w:r>
+        <w:t xml:space="preserve">Those limits are proxies,</w:t>
+      </w:r>
+      <w:r>
+        <w:t xml:space="preserve"> </w:t>
+      </w:r>
+      <w:r>
+        <w:t xml:space="preserve">since the check does not run a browser.</w:t>
+      </w:r>
+      <w:r>
+        <w:t xml:space="preserve"> </w:t>
+      </w:r>
+      <w:r>
+        <w:t xml:space="preserve">It warns only on pages a pull request touches,</w:t>
+      </w:r>
+      <w:r>
+        <w:t xml:space="preserve"> </w:t>
+      </w:r>
+      <w:r>
+        <w:t xml:space="preserve">so split a long page when you next edit it, and do not sweep the others.</w:t>
+      </w:r>
+    </w:p>
+    <w:bookmarkEnd w:id="70"/>
+    <w:bookmarkStart w:id="72" w:name="structure-slides-for-the-reader"/>
+    <w:p>
+      <w:pPr>
+        <w:pStyle w:val="Heading2"/>
+      </w:pPr>
+      <w:r>
+        <w:t xml:space="preserve">23 Structure slides for the reader</w:t>
+      </w:r>
+    </w:p>
+    <w:p>
+      <w:pPr>
+        <w:pStyle w:val="Compact"/>
+        <w:numPr>
+          <w:ilvl w:val="0"/>
+          <w:numId w:val="1020"/>
+        </w:numPr>
+      </w:pPr>
+      <w:r>
         <w:t xml:space="preserve">Check the rendered slides, not only the web page.</w:t>
       </w:r>
       <w:r>
@@ -6963,7 +7217,7 @@
         <w:pStyle w:val="Compact"/>
         <w:numPr>
           <w:ilvl w:val="0"/>
-          <w:numId w:val="1019"/>
+          <w:numId w:val="1020"/>
         </w:numPr>
       </w:pPr>
       <w:r>
@@ -6978,7 +7232,7 @@
       <w:r>
         <w:t xml:space="preserve"> </w:t>
       </w:r>
-      <w:hyperlink r:id="rId69">
+      <w:hyperlink r:id="rId71">
         <w:r>
           <w:rPr>
             <w:rStyle w:val="Hyperlink"/>
@@ -6998,7 +7252,7 @@
         <w:pStyle w:val="Compact"/>
         <w:numPr>
           <w:ilvl w:val="0"/>
-          <w:numId w:val="1019"/>
+          <w:numId w:val="1020"/>
         </w:numPr>
       </w:pPr>
       <w:r>
@@ -7046,7 +7300,7 @@
         <w:pStyle w:val="Compact"/>
         <w:numPr>
           <w:ilvl w:val="0"/>
-          <w:numId w:val="1019"/>
+          <w:numId w:val="1020"/>
         </w:numPr>
       </w:pPr>
       <w:r>
@@ -7073,7 +7327,7 @@
         <w:pStyle w:val="Compact"/>
         <w:numPr>
           <w:ilvl w:val="0"/>
-          <w:numId w:val="1019"/>
+          <w:numId w:val="1020"/>
         </w:numPr>
       </w:pPr>
       <w:r>
@@ -7142,7 +7396,7 @@
         <w:pStyle w:val="Compact"/>
         <w:numPr>
           <w:ilvl w:val="0"/>
-          <w:numId w:val="1019"/>
+          <w:numId w:val="1020"/>
         </w:numPr>
       </w:pPr>
       <w:r>
@@ -7211,7 +7465,7 @@
         <w:pStyle w:val="Compact"/>
         <w:numPr>
           <w:ilvl w:val="0"/>
-          <w:numId w:val="1019"/>
+          <w:numId w:val="1020"/>
         </w:numPr>
       </w:pPr>
       <w:r>
@@ -7235,7 +7489,7 @@
         <w:pStyle w:val="Compact"/>
         <w:numPr>
           <w:ilvl w:val="0"/>
-          <w:numId w:val="1019"/>
+          <w:numId w:val="1020"/>
         </w:numPr>
       </w:pPr>
       <w:r>
@@ -7266,14 +7520,14 @@
         <w:t xml:space="preserve">Put a slide break after the heading and move the text onto content slides.</w:t>
       </w:r>
     </w:p>
-    <w:bookmarkEnd w:id="70"/>
-    <w:bookmarkStart w:id="72" w:name="X5f21f12cbfc4e3df5e838110af4e52db506fec1"/>
+    <w:bookmarkEnd w:id="72"/>
+    <w:bookmarkStart w:id="74" w:name="X5f21f12cbfc4e3df5e838110af4e52db506fec1"/>
     <w:p>
       <w:pPr>
         <w:pStyle w:val="Heading2"/>
       </w:pPr>
       <w:r>
-        <w:t xml:space="preserve">23 Give each concept in a note sheet its own row</w:t>
+        <w:t xml:space="preserve">24 Give each concept in a note sheet its own row</w:t>
       </w:r>
     </w:p>
     <w:p>
@@ -7321,7 +7575,7 @@
         <w:pStyle w:val="Compact"/>
         <w:numPr>
           <w:ilvl w:val="0"/>
-          <w:numId w:val="1020"/>
+          <w:numId w:val="1021"/>
         </w:numPr>
       </w:pPr>
       <w:r>
@@ -7333,7 +7587,7 @@
         <w:pStyle w:val="Compact"/>
         <w:numPr>
           <w:ilvl w:val="0"/>
-          <w:numId w:val="1020"/>
+          <w:numId w:val="1021"/>
         </w:numPr>
       </w:pPr>
       <w:r>
@@ -7351,7 +7605,7 @@
         <w:pStyle w:val="Compact"/>
         <w:numPr>
           <w:ilvl w:val="0"/>
-          <w:numId w:val="1020"/>
+          <w:numId w:val="1021"/>
         </w:numPr>
       </w:pPr>
       <w:r>
@@ -7369,7 +7623,7 @@
         <w:pStyle w:val="Compact"/>
         <w:numPr>
           <w:ilvl w:val="0"/>
-          <w:numId w:val="1020"/>
+          <w:numId w:val="1021"/>
         </w:numPr>
       </w:pPr>
       <w:r>
@@ -7410,7 +7664,7 @@
         <w:t xml:space="preserve">The same rule applies to every other reference table, such as a table of notation.</w:t>
       </w:r>
     </w:p>
-    <w:bookmarkStart w:id="71" w:name="exm-note-sheet-rows"/>
+    <w:bookmarkStart w:id="73" w:name="exm-note-sheet-rows"/>
     <w:p>
       <w:pPr>
         <w:pStyle w:val="BodyText"/>
@@ -7501,15 +7755,15 @@
         <w:t xml:space="preserve">The ✅ rows let the reader find one formula by one label.</w:t>
       </w:r>
     </w:p>
-    <w:bookmarkEnd w:id="71"/>
-    <w:bookmarkEnd w:id="72"/>
-    <w:bookmarkStart w:id="73" w:name="talk-about-the-ideas-not-the-notes"/>
+    <w:bookmarkEnd w:id="73"/>
+    <w:bookmarkEnd w:id="74"/>
+    <w:bookmarkStart w:id="75" w:name="talk-about-the-ideas-not-the-notes"/>
     <w:p>
       <w:pPr>
         <w:pStyle w:val="Heading2"/>
       </w:pPr>
       <w:r>
-        <w:t xml:space="preserve">24 Talk about the ideas, not the notes</w:t>
+        <w:t xml:space="preserve">25 Talk about the ideas, not the notes</w:t>
       </w:r>
     </w:p>
     <w:p>
@@ -7554,7 +7808,7 @@
         <w:pStyle w:val="Compact"/>
         <w:numPr>
           <w:ilvl w:val="0"/>
-          <w:numId w:val="1021"/>
+          <w:numId w:val="1022"/>
         </w:numPr>
       </w:pPr>
       <w:r>
@@ -7596,7 +7850,7 @@
         <w:pStyle w:val="Compact"/>
         <w:numPr>
           <w:ilvl w:val="0"/>
-          <w:numId w:val="1021"/>
+          <w:numId w:val="1022"/>
         </w:numPr>
       </w:pPr>
       <w:r>
@@ -7635,7 +7889,7 @@
         <w:pStyle w:val="Compact"/>
         <w:numPr>
           <w:ilvl w:val="0"/>
-          <w:numId w:val="1021"/>
+          <w:numId w:val="1022"/>
         </w:numPr>
       </w:pPr>
       <w:r>
@@ -7692,14 +7946,14 @@
         <w:t xml:space="preserve">and it goes stale when the definition moves.</w:t>
       </w:r>
     </w:p>
-    <w:bookmarkEnd w:id="73"/>
-    <w:bookmarkStart w:id="75" w:name="write-grading-rubrics-as-checklists"/>
+    <w:bookmarkEnd w:id="75"/>
+    <w:bookmarkStart w:id="77" w:name="write-grading-rubrics-as-checklists"/>
     <w:p>
       <w:pPr>
         <w:pStyle w:val="Heading2"/>
       </w:pPr>
       <w:r>
-        <w:t xml:space="preserve">25 Write grading rubrics as checklists</w:t>
+        <w:t xml:space="preserve">26 Write grading rubrics as checklists</w:t>
       </w:r>
     </w:p>
     <w:p>
@@ -7745,7 +7999,7 @@
         <w:pStyle w:val="Compact"/>
         <w:numPr>
           <w:ilvl w:val="0"/>
-          <w:numId w:val="1022"/>
+          <w:numId w:val="1023"/>
         </w:numPr>
       </w:pPr>
       <w:r>
@@ -7763,7 +8017,7 @@
         <w:pStyle w:val="Compact"/>
         <w:numPr>
           <w:ilvl w:val="0"/>
-          <w:numId w:val="1022"/>
+          <w:numId w:val="1023"/>
         </w:numPr>
       </w:pPr>
       <w:r>
@@ -7781,7 +8035,7 @@
         <w:pStyle w:val="Compact"/>
         <w:numPr>
           <w:ilvl w:val="0"/>
-          <w:numId w:val="1022"/>
+          <w:numId w:val="1023"/>
         </w:numPr>
       </w:pPr>
       <w:r>
@@ -7808,7 +8062,7 @@
         <w:pStyle w:val="Compact"/>
         <w:numPr>
           <w:ilvl w:val="0"/>
-          <w:numId w:val="1022"/>
+          <w:numId w:val="1023"/>
         </w:numPr>
       </w:pPr>
       <w:r>
@@ -7838,7 +8092,7 @@
         <w:pStyle w:val="Compact"/>
         <w:numPr>
           <w:ilvl w:val="0"/>
-          <w:numId w:val="1022"/>
+          <w:numId w:val="1023"/>
         </w:numPr>
       </w:pPr>
       <w:r>
@@ -7856,7 +8110,7 @@
         <w:pStyle w:val="Compact"/>
         <w:numPr>
           <w:ilvl w:val="0"/>
-          <w:numId w:val="1022"/>
+          <w:numId w:val="1023"/>
         </w:numPr>
       </w:pPr>
       <w:r>
@@ -7869,7 +8123,7 @@
         <w:t xml:space="preserve">such as a single holistic judgment of a proof’s rigor.</w:t>
       </w:r>
     </w:p>
-    <w:bookmarkStart w:id="74" w:name="exm-rubric-checklist"/>
+    <w:bookmarkStart w:id="76" w:name="exm-rubric-checklist"/>
     <w:p>
       <w:pPr>
         <w:pStyle w:val="FirstParagraph"/>
@@ -8122,23 +8376,23 @@
         <w:t xml:space="preserve">and lets a script check that the points sum to the total.</w:t>
       </w:r>
     </w:p>
-    <w:bookmarkEnd w:id="74"/>
-    <w:bookmarkEnd w:id="75"/>
-    <w:bookmarkStart w:id="79" w:name="Xcb579568ef754486ebde8b41ba4528bdf380eec"/>
+    <w:bookmarkEnd w:id="76"/>
+    <w:bookmarkEnd w:id="77"/>
+    <w:bookmarkStart w:id="81" w:name="Xcb579568ef754486ebde8b41ba4528bdf380eec"/>
     <w:p>
       <w:pPr>
         <w:pStyle w:val="Heading2"/>
       </w:pPr>
       <w:r>
-        <w:t xml:space="preserve">26 Credit other courses without summarizing them</w:t>
-      </w:r>
-    </w:p>
-    <w:p>
-      <w:pPr>
-        <w:pStyle w:val="Compact"/>
-        <w:numPr>
-          <w:ilvl w:val="0"/>
-          <w:numId w:val="1023"/>
+        <w:t xml:space="preserve">27 Credit other courses without summarizing them</w:t>
+      </w:r>
+    </w:p>
+    <w:p>
+      <w:pPr>
+        <w:pStyle w:val="Compact"/>
+        <w:numPr>
+          <w:ilvl w:val="0"/>
+          <w:numId w:val="1024"/>
         </w:numPr>
       </w:pPr>
       <w:r>
@@ -8183,7 +8437,7 @@
       <w:r>
         <w:t xml:space="preserve"> </w:t>
       </w:r>
-      <w:hyperlink r:id="rId76">
+      <w:hyperlink r:id="rId78">
         <w:r>
           <w:rPr>
             <w:rStyle w:val="Hyperlink"/>
@@ -8224,7 +8478,7 @@
         <w:pStyle w:val="Compact"/>
         <w:numPr>
           <w:ilvl w:val="0"/>
-          <w:numId w:val="1023"/>
+          <w:numId w:val="1024"/>
         </w:numPr>
       </w:pPr>
       <w:r>
@@ -8239,7 +8493,7 @@
       <w:r>
         <w:t xml:space="preserve"> </w:t>
       </w:r>
-      <w:hyperlink r:id="rId77">
+      <w:hyperlink r:id="rId79">
         <w:r>
           <w:rPr>
             <w:rStyle w:val="Hyperlink"/>
@@ -8259,7 +8513,7 @@
         <w:pStyle w:val="Compact"/>
         <w:numPr>
           <w:ilvl w:val="0"/>
-          <w:numId w:val="1023"/>
+          <w:numId w:val="1024"/>
         </w:numPr>
       </w:pPr>
       <w:r>
@@ -8268,7 +8522,7 @@
       <w:r>
         <w:t xml:space="preserve"> </w:t>
       </w:r>
-      <w:hyperlink r:id="rId78">
+      <w:hyperlink r:id="rId80">
         <w:r>
           <w:rPr>
             <w:rStyle w:val="Hyperlink"/>
@@ -8288,7 +8542,7 @@
         <w:pStyle w:val="Compact"/>
         <w:numPr>
           <w:ilvl w:val="0"/>
-          <w:numId w:val="1023"/>
+          <w:numId w:val="1024"/>
         </w:numPr>
       </w:pPr>
       <w:r>
@@ -8301,14 +8555,14 @@
         <w:t xml:space="preserve">because a bare citation key renders as the author list.</w:t>
       </w:r>
     </w:p>
-    <w:bookmarkEnd w:id="79"/>
-    <w:bookmarkStart w:id="82" w:name="finish-each-unit-completely"/>
+    <w:bookmarkEnd w:id="81"/>
+    <w:bookmarkStart w:id="84" w:name="finish-each-unit-completely"/>
     <w:p>
       <w:pPr>
         <w:pStyle w:val="Heading2"/>
       </w:pPr>
       <w:r>
-        <w:t xml:space="preserve">27 Finish each unit completely</w:t>
+        <w:t xml:space="preserve">28 Finish each unit completely</w:t>
       </w:r>
     </w:p>
     <w:p>
@@ -8356,7 +8610,7 @@
         <w:pStyle w:val="Compact"/>
         <w:numPr>
           <w:ilvl w:val="0"/>
-          <w:numId w:val="1024"/>
+          <w:numId w:val="1025"/>
         </w:numPr>
       </w:pPr>
       <w:r>
@@ -8375,7 +8629,7 @@
       <w:r>
         <w:t xml:space="preserve"> </w:t>
       </w:r>
-      <w:hyperlink r:id="rId80">
+      <w:hyperlink r:id="rId82">
         <w:r>
           <w:rPr>
             <w:rStyle w:val="Hyperlink"/>
@@ -8398,7 +8652,7 @@
         <w:pStyle w:val="Compact"/>
         <w:numPr>
           <w:ilvl w:val="0"/>
-          <w:numId w:val="1024"/>
+          <w:numId w:val="1025"/>
         </w:numPr>
       </w:pPr>
       <w:r>
@@ -8417,7 +8671,7 @@
       <w:r>
         <w:t xml:space="preserve"> </w:t>
       </w:r>
-      <w:hyperlink r:id="rId81">
+      <w:hyperlink r:id="rId83">
         <w:r>
           <w:rPr>
             <w:rStyle w:val="Hyperlink"/>
@@ -8452,7 +8706,7 @@
         <w:pStyle w:val="Compact"/>
         <w:numPr>
           <w:ilvl w:val="0"/>
-          <w:numId w:val="1024"/>
+          <w:numId w:val="1025"/>
         </w:numPr>
       </w:pPr>
       <w:r>
@@ -8491,7 +8745,7 @@
         <w:pStyle w:val="Compact"/>
         <w:numPr>
           <w:ilvl w:val="0"/>
-          <w:numId w:val="1024"/>
+          <w:numId w:val="1025"/>
         </w:numPr>
       </w:pPr>
       <w:r>
@@ -8530,7 +8784,7 @@
         <w:pStyle w:val="Compact"/>
         <w:numPr>
           <w:ilvl w:val="0"/>
-          <w:numId w:val="1024"/>
+          <w:numId w:val="1025"/>
         </w:numPr>
       </w:pPr>
       <w:r>
@@ -8575,14 +8829,14 @@
         <w:t xml:space="preserve">A shortcut saves the writer a few lines and costs every reader the work of rebuilding them.</w:t>
       </w:r>
     </w:p>
-    <w:bookmarkEnd w:id="82"/>
-    <w:bookmarkStart w:id="91" w:name="rules-that-apply-to-all-writing"/>
+    <w:bookmarkEnd w:id="84"/>
+    <w:bookmarkStart w:id="93" w:name="rules-that-apply-to-all-writing"/>
     <w:p>
       <w:pPr>
         <w:pStyle w:val="Heading2"/>
       </w:pPr>
       <w:r>
-        <w:t xml:space="preserve">28 Rules that apply to all writing</w:t>
+        <w:t xml:space="preserve">29 Rules that apply to all writing</w:t>
       </w:r>
     </w:p>
     <w:p>
@@ -8598,10 +8852,10 @@
         <w:pStyle w:val="Compact"/>
         <w:numPr>
           <w:ilvl w:val="0"/>
-          <w:numId w:val="1025"/>
-        </w:numPr>
-      </w:pPr>
-      <w:hyperlink r:id="rId83">
+          <w:numId w:val="1026"/>
+        </w:numPr>
+      </w:pPr>
+      <w:hyperlink r:id="rId85">
         <w:r>
           <w:rPr>
             <w:rStyle w:val="Hyperlink"/>
@@ -8618,10 +8872,10 @@
         <w:pStyle w:val="Compact"/>
         <w:numPr>
           <w:ilvl w:val="0"/>
-          <w:numId w:val="1025"/>
-        </w:numPr>
-      </w:pPr>
-      <w:hyperlink r:id="rId84">
+          <w:numId w:val="1026"/>
+        </w:numPr>
+      </w:pPr>
+      <w:hyperlink r:id="rId86">
         <w:r>
           <w:rPr>
             <w:rStyle w:val="Hyperlink"/>
@@ -8641,10 +8895,10 @@
         <w:pStyle w:val="Compact"/>
         <w:numPr>
           <w:ilvl w:val="0"/>
-          <w:numId w:val="1025"/>
-        </w:numPr>
-      </w:pPr>
-      <w:hyperlink r:id="rId85">
+          <w:numId w:val="1026"/>
+        </w:numPr>
+      </w:pPr>
+      <w:hyperlink r:id="rId87">
         <w:r>
           <w:rPr>
             <w:rStyle w:val="Hyperlink"/>
@@ -8661,10 +8915,10 @@
         <w:pStyle w:val="Compact"/>
         <w:numPr>
           <w:ilvl w:val="0"/>
-          <w:numId w:val="1025"/>
-        </w:numPr>
-      </w:pPr>
-      <w:hyperlink r:id="rId86">
+          <w:numId w:val="1026"/>
+        </w:numPr>
+      </w:pPr>
+      <w:hyperlink r:id="rId88">
         <w:r>
           <w:rPr>
             <w:rStyle w:val="Hyperlink"/>
@@ -8684,10 +8938,10 @@
         <w:pStyle w:val="Compact"/>
         <w:numPr>
           <w:ilvl w:val="0"/>
-          <w:numId w:val="1025"/>
-        </w:numPr>
-      </w:pPr>
-      <w:hyperlink r:id="rId87">
+          <w:numId w:val="1026"/>
+        </w:numPr>
+      </w:pPr>
+      <w:hyperlink r:id="rId89">
         <w:r>
           <w:rPr>
             <w:rStyle w:val="Hyperlink"/>
@@ -8699,8 +8953,8 @@
         <w:t xml:space="preserve">.</w:t>
       </w:r>
     </w:p>
-    <w:bookmarkStart w:id="90" w:name="refs"/>
-    <w:bookmarkStart w:id="89" w:name="ref-freeman2014active"/>
+    <w:bookmarkStart w:id="92" w:name="refs"/>
+    <w:bookmarkStart w:id="91" w:name="ref-freeman2014active"/>
     <w:p>
       <w:pPr>
         <w:pStyle w:val="Bibliography"/>
@@ -8733,7 +8987,7 @@
       <w:r>
         <w:t xml:space="preserve"> </w:t>
       </w:r>
-      <w:hyperlink r:id="rId88">
+      <w:hyperlink r:id="rId90">
         <w:r>
           <w:rPr>
             <w:rStyle w:val="Hyperlink"/>
@@ -8745,9 +8999,9 @@
         <w:t xml:space="preserve">.</w:t>
       </w:r>
     </w:p>
-    <w:bookmarkEnd w:id="89"/>
-    <w:bookmarkEnd w:id="90"/>
     <w:bookmarkEnd w:id="91"/>
+    <w:bookmarkEnd w:id="92"/>
+    <w:bookmarkEnd w:id="93"/>
     <w:sectPr>
       <w:footnotePr>
         <w:numRestart w:val="eachSect"/>
@@ -9037,6 +9291,9 @@
     <w:abstractNumId w:val="991"/>
   </w:num>
   <w:num w:numId="1025">
+    <w:abstractNumId w:val="991"/>
+  </w:num>
+  <w:num w:numId="1026">
     <w:abstractNumId w:val="991"/>
   </w:num>
 </w:numbering>

</xml_diff>